<commit_message>
Date: 10 Apr 2026
</commit_message>
<xml_diff>
--- a/Notes_SA2601010.docx
+++ b/Notes_SA2601010.docx
@@ -6950,11 +6950,588 @@
         </w:rPr>
         <w:t>browser window.</w:t>
       </w:r>
+    </w:p>
+    <w:p>
+      <w:pPr>
+        <w:pStyle w:val="ListParagraph"/>
+        <w:numPr>
+          <w:ilvl w:val="0"/>
+          <w:numId w:val="16"/>
+        </w:numPr>
+        <w:rPr>
+          <w:sz w:val="24"/>
+          <w:szCs w:val="22"/>
+          <w:lang w:val="en-US"/>
+        </w:rPr>
+      </w:pPr>
+      <w:r>
+        <w:rPr>
+          <w:sz w:val="24"/>
+          <w:szCs w:val="22"/>
+          <w:lang w:val="en-US"/>
+        </w:rPr>
+        <w:t xml:space="preserve">getTitle() </w:t>
+      </w:r>
+      <w:r>
+        <w:rPr>
+          <w:sz w:val="24"/>
+          <w:szCs w:val="22"/>
+          <w:lang w:val="en-US"/>
+        </w:rPr>
+        <w:sym w:font="Wingdings" w:char="F0E0"/>
+      </w:r>
+      <w:r>
+        <w:rPr>
+          <w:sz w:val="24"/>
+          <w:szCs w:val="22"/>
+          <w:lang w:val="en-US"/>
+        </w:rPr>
+        <w:t xml:space="preserve"> Will return the title of the page which is opened in the browser. </w:t>
+      </w:r>
+      <w:r>
+        <w:rPr>
+          <w:sz w:val="24"/>
+          <w:szCs w:val="22"/>
+          <w:lang w:val="en-US"/>
+        </w:rPr>
+        <w:t>(String)</w:t>
+      </w:r>
+    </w:p>
+    <w:p>
+      <w:pPr>
+        <w:pStyle w:val="ListParagraph"/>
+        <w:numPr>
+          <w:ilvl w:val="0"/>
+          <w:numId w:val="16"/>
+        </w:numPr>
+        <w:rPr>
+          <w:sz w:val="24"/>
+          <w:szCs w:val="22"/>
+          <w:lang w:val="en-US"/>
+        </w:rPr>
+      </w:pPr>
+      <w:r>
+        <w:rPr>
+          <w:sz w:val="24"/>
+          <w:szCs w:val="22"/>
+          <w:lang w:val="en-US"/>
+        </w:rPr>
+        <w:t xml:space="preserve">getCurrentUrl() </w:t>
+      </w:r>
+      <w:r>
+        <w:rPr>
+          <w:sz w:val="24"/>
+          <w:szCs w:val="22"/>
+          <w:lang w:val="en-US"/>
+        </w:rPr>
+        <w:sym w:font="Wingdings" w:char="F0E0"/>
+      </w:r>
+      <w:r>
+        <w:rPr>
+          <w:sz w:val="24"/>
+          <w:szCs w:val="22"/>
+          <w:lang w:val="en-US"/>
+        </w:rPr>
+        <w:t xml:space="preserve"> Will return the URL of the page. (String)</w:t>
+      </w:r>
+    </w:p>
+    <w:p>
+      <w:pPr>
+        <w:pStyle w:val="ListParagraph"/>
+        <w:numPr>
+          <w:ilvl w:val="0"/>
+          <w:numId w:val="16"/>
+        </w:numPr>
+        <w:rPr>
+          <w:sz w:val="24"/>
+          <w:szCs w:val="22"/>
+          <w:lang w:val="en-US"/>
+        </w:rPr>
+      </w:pPr>
+      <w:r>
+        <w:rPr>
+          <w:sz w:val="24"/>
+          <w:szCs w:val="22"/>
+          <w:lang w:val="en-US"/>
+        </w:rPr>
+        <w:t xml:space="preserve">findElement() </w:t>
+      </w:r>
+      <w:r>
+        <w:rPr>
+          <w:sz w:val="24"/>
+          <w:szCs w:val="22"/>
+          <w:lang w:val="en-US"/>
+        </w:rPr>
+        <w:sym w:font="Wingdings" w:char="F0E0"/>
+      </w:r>
+      <w:r>
+        <w:rPr>
+          <w:sz w:val="24"/>
+          <w:szCs w:val="22"/>
+          <w:lang w:val="en-US"/>
+        </w:rPr>
+        <w:t xml:space="preserve"> Will read and return </w:t>
+      </w:r>
+      <w:r>
+        <w:rPr>
+          <w:b/>
+          <w:bCs/>
+          <w:sz w:val="24"/>
+          <w:szCs w:val="22"/>
+          <w:lang w:val="en-US"/>
+        </w:rPr>
+        <w:t>single control</w:t>
+      </w:r>
+      <w:r>
+        <w:rPr>
+          <w:sz w:val="24"/>
+          <w:szCs w:val="22"/>
+          <w:lang w:val="en-US"/>
+        </w:rPr>
+        <w:t xml:space="preserve"> on the page. (WebElement)</w:t>
+      </w:r>
+    </w:p>
+    <w:p>
+      <w:pPr>
+        <w:rPr>
+          <w:b/>
+          <w:bCs/>
+          <w:sz w:val="24"/>
+          <w:szCs w:val="22"/>
+          <w:lang w:val="en-US"/>
+        </w:rPr>
+      </w:pPr>
+      <w:r>
+        <w:rPr>
+          <w:b/>
+          <w:bCs/>
+          <w:sz w:val="24"/>
+          <w:szCs w:val="22"/>
+          <w:lang w:val="en-US"/>
+        </w:rPr>
+        <w:t xml:space="preserve">Common Exceptions </w:t>
+      </w:r>
+    </w:p>
+    <w:p>
+      <w:pPr>
+        <w:pStyle w:val="ListParagraph"/>
+        <w:numPr>
+          <w:ilvl w:val="0"/>
+          <w:numId w:val="17"/>
+        </w:numPr>
+        <w:rPr>
+          <w:sz w:val="24"/>
+          <w:szCs w:val="22"/>
+          <w:lang w:val="en-US"/>
+        </w:rPr>
+      </w:pPr>
+      <w:r>
+        <w:rPr>
+          <w:sz w:val="24"/>
+          <w:szCs w:val="22"/>
+          <w:lang w:val="en-US"/>
+        </w:rPr>
+        <w:t xml:space="preserve">InvalidArgumentException </w:t>
+      </w:r>
+      <w:r>
+        <w:rPr>
+          <w:sz w:val="24"/>
+          <w:szCs w:val="22"/>
+          <w:lang w:val="en-US"/>
+        </w:rPr>
+        <w:sym w:font="Wingdings" w:char="F0E0"/>
+      </w:r>
+      <w:r>
+        <w:rPr>
+          <w:sz w:val="24"/>
+          <w:szCs w:val="22"/>
+          <w:lang w:val="en-US"/>
+        </w:rPr>
+        <w:t xml:space="preserve"> The URL is not in the correct format. The URL must be </w:t>
+      </w:r>
+      <w:r>
+        <w:rPr>
+          <w:b/>
+          <w:bCs/>
+          <w:sz w:val="24"/>
+          <w:szCs w:val="22"/>
+          <w:lang w:val="en-US"/>
+        </w:rPr>
+        <w:t xml:space="preserve">absolute. </w:t>
+      </w:r>
+      <w:r>
+        <w:rPr>
+          <w:sz w:val="24"/>
+          <w:szCs w:val="22"/>
+          <w:lang w:val="en-US"/>
+        </w:rPr>
+        <w:t>It should start with http/https</w:t>
+      </w:r>
+    </w:p>
+    <w:p>
+      <w:pPr>
+        <w:rPr>
+          <w:sz w:val="24"/>
+          <w:szCs w:val="22"/>
+          <w:lang w:val="en-US"/>
+        </w:rPr>
+      </w:pPr>
+    </w:p>
+    <w:p>
+      <w:pPr>
+        <w:rPr>
+          <w:b/>
+          <w:bCs/>
+          <w:sz w:val="24"/>
+          <w:szCs w:val="22"/>
+          <w:lang w:val="en-US"/>
+        </w:rPr>
+      </w:pPr>
+      <w:r>
+        <w:rPr>
+          <w:b/>
+          <w:bCs/>
+          <w:sz w:val="24"/>
+          <w:szCs w:val="22"/>
+          <w:lang w:val="en-US"/>
+        </w:rPr>
+        <w:t>WebElement</w:t>
+      </w:r>
+    </w:p>
+    <w:p>
+      <w:pPr>
+        <w:pStyle w:val="ListParagraph"/>
+        <w:numPr>
+          <w:ilvl w:val="0"/>
+          <w:numId w:val="18"/>
+        </w:numPr>
+        <w:rPr>
+          <w:sz w:val="24"/>
+          <w:szCs w:val="22"/>
+          <w:lang w:val="en-US"/>
+        </w:rPr>
+      </w:pPr>
+      <w:r>
+        <w:rPr>
+          <w:sz w:val="24"/>
+          <w:szCs w:val="22"/>
+          <w:lang w:val="en-US"/>
+        </w:rPr>
+        <w:lastRenderedPageBreak/>
+        <w:t>Every control (like text box, radio button, text, checkbox, dropdown list, link</w:t>
+      </w:r>
+      <w:r>
+        <w:rPr>
+          <w:sz w:val="24"/>
+          <w:szCs w:val="22"/>
+          <w:lang w:val="en-US"/>
+        </w:rPr>
+        <w:t xml:space="preserve"> etc.</w:t>
+      </w:r>
+      <w:r>
+        <w:rPr>
+          <w:sz w:val="24"/>
+          <w:szCs w:val="22"/>
+          <w:lang w:val="en-US"/>
+        </w:rPr>
+        <w:t>) on the page is treated as WebElement in Selenium WebDriver.</w:t>
+      </w:r>
+    </w:p>
+    <w:p>
+      <w:pPr>
+        <w:pStyle w:val="ListParagraph"/>
+        <w:numPr>
+          <w:ilvl w:val="0"/>
+          <w:numId w:val="18"/>
+        </w:numPr>
+        <w:rPr>
+          <w:sz w:val="24"/>
+          <w:szCs w:val="22"/>
+          <w:lang w:val="en-US"/>
+        </w:rPr>
+      </w:pPr>
+      <w:r>
+        <w:rPr>
+          <w:sz w:val="24"/>
+          <w:szCs w:val="22"/>
+          <w:lang w:val="en-US"/>
+        </w:rPr>
+        <w:t>WebElement is an interface.</w:t>
+      </w:r>
+    </w:p>
+    <w:p>
+      <w:pPr>
+        <w:pStyle w:val="ListParagraph"/>
+        <w:numPr>
+          <w:ilvl w:val="0"/>
+          <w:numId w:val="18"/>
+        </w:numPr>
+        <w:rPr>
+          <w:sz w:val="24"/>
+          <w:szCs w:val="22"/>
+          <w:lang w:val="en-US"/>
+        </w:rPr>
+      </w:pPr>
+      <w:r>
+        <w:rPr>
+          <w:sz w:val="24"/>
+          <w:szCs w:val="22"/>
+          <w:lang w:val="en-US"/>
+        </w:rPr>
+        <w:t xml:space="preserve">Object of WebElement can hold </w:t>
+      </w:r>
+      <w:r>
+        <w:rPr>
+          <w:b/>
+          <w:bCs/>
+          <w:sz w:val="24"/>
+          <w:szCs w:val="22"/>
+          <w:lang w:val="en-US"/>
+        </w:rPr>
+        <w:t xml:space="preserve">single control </w:t>
+      </w:r>
+      <w:r>
+        <w:rPr>
+          <w:sz w:val="24"/>
+          <w:szCs w:val="22"/>
+          <w:lang w:val="en-US"/>
+        </w:rPr>
+        <w:t xml:space="preserve">on the </w:t>
+      </w:r>
+      <w:r>
+        <w:rPr>
+          <w:sz w:val="24"/>
+          <w:szCs w:val="22"/>
+          <w:lang w:val="en-US"/>
+        </w:rPr>
+        <w:t xml:space="preserve">web </w:t>
+      </w:r>
+      <w:r>
+        <w:rPr>
+          <w:sz w:val="24"/>
+          <w:szCs w:val="22"/>
+          <w:lang w:val="en-US"/>
+        </w:rPr>
+        <w:t>page.</w:t>
+      </w:r>
+    </w:p>
+    <w:p>
+      <w:pPr>
+        <w:pStyle w:val="ListParagraph"/>
+        <w:numPr>
+          <w:ilvl w:val="0"/>
+          <w:numId w:val="18"/>
+        </w:numPr>
+        <w:rPr>
+          <w:sz w:val="24"/>
+          <w:szCs w:val="22"/>
+          <w:lang w:val="en-US"/>
+        </w:rPr>
+      </w:pPr>
+      <w:r>
+        <w:rPr>
+          <w:b/>
+          <w:bCs/>
+          <w:sz w:val="24"/>
+          <w:szCs w:val="22"/>
+          <w:lang w:val="en-US"/>
+        </w:rPr>
+        <w:t>Methods</w:t>
+      </w:r>
+    </w:p>
+    <w:p>
+      <w:pPr>
+        <w:pStyle w:val="ListParagraph"/>
+        <w:numPr>
+          <w:ilvl w:val="1"/>
+          <w:numId w:val="18"/>
+        </w:numPr>
+        <w:rPr>
+          <w:sz w:val="24"/>
+          <w:szCs w:val="22"/>
+          <w:lang w:val="en-US"/>
+        </w:rPr>
+      </w:pPr>
+      <w:r>
+        <w:rPr>
+          <w:sz w:val="24"/>
+          <w:szCs w:val="22"/>
+          <w:lang w:val="en-US"/>
+        </w:rPr>
+        <w:t xml:space="preserve">sendKeys() </w:t>
+      </w:r>
+      <w:r>
+        <w:rPr>
+          <w:sz w:val="24"/>
+          <w:szCs w:val="22"/>
+          <w:lang w:val="en-US"/>
+        </w:rPr>
+        <w:sym w:font="Wingdings" w:char="F0E0"/>
+      </w:r>
+      <w:r>
+        <w:rPr>
+          <w:sz w:val="24"/>
+          <w:szCs w:val="22"/>
+          <w:lang w:val="en-US"/>
+        </w:rPr>
+        <w:t xml:space="preserve"> Will enter the data in the text box.</w:t>
+      </w:r>
+      <w:r>
+        <w:rPr>
+          <w:sz w:val="24"/>
+          <w:szCs w:val="22"/>
+          <w:lang w:val="en-US"/>
+        </w:rPr>
+        <w:t xml:space="preserve"> </w:t>
+      </w:r>
+      <w:r>
+        <w:rPr>
+          <w:b/>
+          <w:bCs/>
+          <w:sz w:val="24"/>
+          <w:szCs w:val="22"/>
+          <w:lang w:val="en-US"/>
+        </w:rPr>
+        <w:t>It will append the text.</w:t>
+      </w:r>
       <w:bookmarkStart w:id="0" w:name="_GoBack"/>
       <w:bookmarkEnd w:id="0"/>
     </w:p>
     <w:p>
       <w:pPr>
+        <w:pStyle w:val="ListParagraph"/>
+        <w:numPr>
+          <w:ilvl w:val="1"/>
+          <w:numId w:val="18"/>
+        </w:numPr>
+        <w:rPr>
+          <w:sz w:val="24"/>
+          <w:szCs w:val="22"/>
+          <w:lang w:val="en-US"/>
+        </w:rPr>
+      </w:pPr>
+      <w:r>
+        <w:rPr>
+          <w:sz w:val="24"/>
+          <w:szCs w:val="22"/>
+          <w:lang w:val="en-US"/>
+        </w:rPr>
+        <w:t xml:space="preserve">click() </w:t>
+      </w:r>
+      <w:r>
+        <w:rPr>
+          <w:sz w:val="24"/>
+          <w:szCs w:val="22"/>
+          <w:lang w:val="en-US"/>
+        </w:rPr>
+        <w:sym w:font="Wingdings" w:char="F0E0"/>
+      </w:r>
+      <w:r>
+        <w:rPr>
+          <w:sz w:val="24"/>
+          <w:szCs w:val="22"/>
+          <w:lang w:val="en-US"/>
+        </w:rPr>
+        <w:t xml:space="preserve"> Will click on the control.</w:t>
+      </w:r>
+    </w:p>
+    <w:p>
+      <w:pPr>
+        <w:pStyle w:val="ListParagraph"/>
+        <w:numPr>
+          <w:ilvl w:val="1"/>
+          <w:numId w:val="18"/>
+        </w:numPr>
+        <w:rPr>
+          <w:sz w:val="24"/>
+          <w:szCs w:val="22"/>
+          <w:lang w:val="en-US"/>
+        </w:rPr>
+      </w:pPr>
+      <w:r>
+        <w:rPr>
+          <w:sz w:val="24"/>
+          <w:szCs w:val="22"/>
+          <w:lang w:val="en-US"/>
+        </w:rPr>
+        <w:t xml:space="preserve">getText() </w:t>
+      </w:r>
+      <w:r>
+        <w:rPr>
+          <w:sz w:val="24"/>
+          <w:szCs w:val="22"/>
+          <w:lang w:val="en-US"/>
+        </w:rPr>
+        <w:sym w:font="Wingdings" w:char="F0E0"/>
+      </w:r>
+      <w:r>
+        <w:rPr>
+          <w:sz w:val="24"/>
+          <w:szCs w:val="22"/>
+          <w:lang w:val="en-US"/>
+        </w:rPr>
+        <w:t xml:space="preserve"> Will return the text on the control. (String)</w:t>
+      </w:r>
+    </w:p>
+    <w:p>
+      <w:pPr>
+        <w:rPr>
+          <w:sz w:val="24"/>
+          <w:szCs w:val="22"/>
+          <w:lang w:val="en-US"/>
+        </w:rPr>
+      </w:pPr>
+      <w:r>
+        <w:rPr>
+          <w:noProof/>
+          <w:lang w:eastAsia="en-IN"/>
+        </w:rPr>
+        <w:drawing>
+          <wp:inline distT="0" distB="0" distL="0" distR="0" wp14:anchorId="7CDDBAE5" wp14:editId="7FE84F6B">
+            <wp:extent cx="3181350" cy="1514475"/>
+            <wp:effectExtent l="0" t="0" r="0" b="9525"/>
+            <wp:docPr id="2" name="Picture 2"/>
+            <wp:cNvGraphicFramePr>
+              <a:graphicFrameLocks xmlns:a="http://schemas.openxmlformats.org/drawingml/2006/main" noChangeAspect="1"/>
+            </wp:cNvGraphicFramePr>
+            <a:graphic xmlns:a="http://schemas.openxmlformats.org/drawingml/2006/main">
+              <a:graphicData uri="http://schemas.openxmlformats.org/drawingml/2006/picture">
+                <pic:pic xmlns:pic="http://schemas.openxmlformats.org/drawingml/2006/picture">
+                  <pic:nvPicPr>
+                    <pic:cNvPr id="1" name=""/>
+                    <pic:cNvPicPr/>
+                  </pic:nvPicPr>
+                  <pic:blipFill rotWithShape="1">
+                    <a:blip r:embed="rId11"/>
+                    <a:srcRect l="25094" t="22463" r="19400" b="30542"/>
+                    <a:stretch/>
+                  </pic:blipFill>
+                  <pic:spPr bwMode="auto">
+                    <a:xfrm>
+                      <a:off x="0" y="0"/>
+                      <a:ext cx="3181350" cy="1514475"/>
+                    </a:xfrm>
+                    <a:prstGeom prst="rect">
+                      <a:avLst/>
+                    </a:prstGeom>
+                    <a:ln>
+                      <a:noFill/>
+                    </a:ln>
+                    <a:extLst>
+                      <a:ext uri="{53640926-AAD7-44D8-BBD7-CCE9431645EC}">
+                        <a14:shadowObscured xmlns:a14="http://schemas.microsoft.com/office/drawing/2010/main"/>
+                      </a:ext>
+                    </a:extLst>
+                  </pic:spPr>
+                </pic:pic>
+              </a:graphicData>
+            </a:graphic>
+          </wp:inline>
+        </w:drawing>
+      </w:r>
+    </w:p>
+    <w:p>
+      <w:pPr>
         <w:rPr>
           <w:b/>
           <w:bCs/>
@@ -6971,7 +7548,24 @@
           <w:szCs w:val="22"/>
           <w:lang w:val="en-US"/>
         </w:rPr>
-        <w:t xml:space="preserve">Common Exceptions </w:t>
+        <w:t>Locators in Selenium</w:t>
+      </w:r>
+    </w:p>
+    <w:p>
+      <w:pPr>
+        <w:rPr>
+          <w:sz w:val="24"/>
+          <w:szCs w:val="22"/>
+          <w:lang w:val="en-US"/>
+        </w:rPr>
+      </w:pPr>
+      <w:r>
+        <w:rPr>
+          <w:sz w:val="24"/>
+          <w:szCs w:val="22"/>
+          <w:lang w:val="en-US"/>
+        </w:rPr>
+        <w:t>Locators are the ways of locating any control on the web page. These are the strategies to identify any control / WebElement on the page.</w:t>
       </w:r>
     </w:p>
     <w:p>
@@ -6979,39 +7573,197 @@
         <w:pStyle w:val="ListParagraph"/>
         <w:numPr>
           <w:ilvl w:val="0"/>
-          <w:numId w:val="17"/>
-        </w:numPr>
-        <w:rPr>
-          <w:sz w:val="24"/>
-          <w:szCs w:val="22"/>
-          <w:lang w:val="en-US"/>
-        </w:rPr>
-      </w:pPr>
-      <w:r>
-        <w:rPr>
-          <w:sz w:val="24"/>
-          <w:szCs w:val="22"/>
-          <w:lang w:val="en-US"/>
-        </w:rPr>
-        <w:t xml:space="preserve">InvalidArgumentException </w:t>
-      </w:r>
-      <w:r>
-        <w:rPr>
-          <w:sz w:val="24"/>
-          <w:szCs w:val="22"/>
-          <w:lang w:val="en-US"/>
-        </w:rPr>
-        <w:sym w:font="Wingdings" w:char="F0E0"/>
-      </w:r>
-      <w:r>
-        <w:rPr>
-          <w:sz w:val="24"/>
-          <w:szCs w:val="22"/>
-          <w:lang w:val="en-US"/>
-        </w:rPr>
-        <w:t xml:space="preserve"> The URL is not in the correct format. The URL must be </w:t>
-      </w:r>
-      <w:r>
+          <w:numId w:val="19"/>
+        </w:numPr>
+        <w:rPr>
+          <w:sz w:val="24"/>
+          <w:szCs w:val="22"/>
+          <w:lang w:val="en-US"/>
+        </w:rPr>
+      </w:pPr>
+      <w:r>
+        <w:rPr>
+          <w:sz w:val="24"/>
+          <w:szCs w:val="22"/>
+          <w:lang w:val="en-US"/>
+        </w:rPr>
+        <w:t>Id</w:t>
+      </w:r>
+    </w:p>
+    <w:p>
+      <w:pPr>
+        <w:pStyle w:val="ListParagraph"/>
+        <w:numPr>
+          <w:ilvl w:val="0"/>
+          <w:numId w:val="19"/>
+        </w:numPr>
+        <w:rPr>
+          <w:sz w:val="24"/>
+          <w:szCs w:val="22"/>
+          <w:lang w:val="en-US"/>
+        </w:rPr>
+      </w:pPr>
+      <w:r>
+        <w:rPr>
+          <w:sz w:val="24"/>
+          <w:szCs w:val="22"/>
+          <w:lang w:val="en-US"/>
+        </w:rPr>
+        <w:t>Name</w:t>
+      </w:r>
+    </w:p>
+    <w:p>
+      <w:pPr>
+        <w:pStyle w:val="ListParagraph"/>
+        <w:numPr>
+          <w:ilvl w:val="0"/>
+          <w:numId w:val="19"/>
+        </w:numPr>
+        <w:rPr>
+          <w:sz w:val="24"/>
+          <w:szCs w:val="22"/>
+          <w:lang w:val="en-US"/>
+        </w:rPr>
+      </w:pPr>
+      <w:r>
+        <w:rPr>
+          <w:sz w:val="24"/>
+          <w:szCs w:val="22"/>
+          <w:lang w:val="en-US"/>
+        </w:rPr>
+        <w:t>ClassName</w:t>
+      </w:r>
+    </w:p>
+    <w:p>
+      <w:pPr>
+        <w:pStyle w:val="ListParagraph"/>
+        <w:numPr>
+          <w:ilvl w:val="0"/>
+          <w:numId w:val="19"/>
+        </w:numPr>
+        <w:rPr>
+          <w:sz w:val="24"/>
+          <w:szCs w:val="22"/>
+          <w:lang w:val="en-US"/>
+        </w:rPr>
+      </w:pPr>
+      <w:r>
+        <w:rPr>
+          <w:sz w:val="24"/>
+          <w:szCs w:val="22"/>
+          <w:lang w:val="en-US"/>
+        </w:rPr>
+        <w:t>CssSelector</w:t>
+      </w:r>
+    </w:p>
+    <w:p>
+      <w:pPr>
+        <w:pStyle w:val="ListParagraph"/>
+        <w:numPr>
+          <w:ilvl w:val="0"/>
+          <w:numId w:val="19"/>
+        </w:numPr>
+        <w:rPr>
+          <w:sz w:val="24"/>
+          <w:szCs w:val="22"/>
+          <w:lang w:val="en-US"/>
+        </w:rPr>
+      </w:pPr>
+      <w:r>
+        <w:rPr>
+          <w:sz w:val="24"/>
+          <w:szCs w:val="22"/>
+          <w:lang w:val="en-US"/>
+        </w:rPr>
+        <w:t>XPath</w:t>
+      </w:r>
+    </w:p>
+    <w:p>
+      <w:pPr>
+        <w:pStyle w:val="ListParagraph"/>
+        <w:numPr>
+          <w:ilvl w:val="0"/>
+          <w:numId w:val="19"/>
+        </w:numPr>
+        <w:rPr>
+          <w:sz w:val="24"/>
+          <w:szCs w:val="22"/>
+          <w:lang w:val="en-US"/>
+        </w:rPr>
+      </w:pPr>
+      <w:r>
+        <w:rPr>
+          <w:sz w:val="24"/>
+          <w:szCs w:val="22"/>
+          <w:lang w:val="en-US"/>
+        </w:rPr>
+        <w:t>LinkText</w:t>
+      </w:r>
+    </w:p>
+    <w:p>
+      <w:pPr>
+        <w:pStyle w:val="ListParagraph"/>
+        <w:numPr>
+          <w:ilvl w:val="0"/>
+          <w:numId w:val="19"/>
+        </w:numPr>
+        <w:rPr>
+          <w:sz w:val="24"/>
+          <w:szCs w:val="22"/>
+          <w:lang w:val="en-US"/>
+        </w:rPr>
+      </w:pPr>
+      <w:r>
+        <w:rPr>
+          <w:sz w:val="24"/>
+          <w:szCs w:val="22"/>
+          <w:lang w:val="en-US"/>
+        </w:rPr>
+        <w:t>PartialLinkText</w:t>
+      </w:r>
+    </w:p>
+    <w:p>
+      <w:pPr>
+        <w:pStyle w:val="ListParagraph"/>
+        <w:numPr>
+          <w:ilvl w:val="0"/>
+          <w:numId w:val="19"/>
+        </w:numPr>
+        <w:rPr>
+          <w:sz w:val="24"/>
+          <w:szCs w:val="22"/>
+          <w:lang w:val="en-US"/>
+        </w:rPr>
+      </w:pPr>
+      <w:r>
+        <w:rPr>
+          <w:sz w:val="24"/>
+          <w:szCs w:val="22"/>
+          <w:lang w:val="en-US"/>
+        </w:rPr>
+        <w:t>TagName</w:t>
+      </w:r>
+    </w:p>
+    <w:p>
+      <w:pPr>
+        <w:rPr>
+          <w:sz w:val="24"/>
+          <w:szCs w:val="22"/>
+          <w:lang w:val="en-US"/>
+        </w:rPr>
+      </w:pPr>
+    </w:p>
+    <w:p>
+      <w:pPr>
+        <w:rPr>
+          <w:sz w:val="24"/>
+          <w:szCs w:val="22"/>
+          <w:lang w:val="en-US"/>
+        </w:rPr>
+      </w:pPr>
+    </w:p>
+    <w:p>
+      <w:pPr>
         <w:rPr>
           <w:b/>
           <w:bCs/>
@@ -7019,16 +7771,63 @@
           <w:szCs w:val="22"/>
           <w:lang w:val="en-US"/>
         </w:rPr>
-        <w:t xml:space="preserve">absolute. </w:t>
-      </w:r>
-      <w:r>
-        <w:rPr>
-          <w:sz w:val="24"/>
-          <w:szCs w:val="22"/>
-          <w:lang w:val="en-US"/>
-        </w:rPr>
-        <w:t>It should start with http/https</w:t>
-      </w:r>
+      </w:pPr>
+      <w:r>
+        <w:rPr>
+          <w:b/>
+          <w:bCs/>
+          <w:sz w:val="24"/>
+          <w:szCs w:val="22"/>
+          <w:lang w:val="en-US"/>
+        </w:rPr>
+        <w:t>Locator ClassName</w:t>
+      </w:r>
+    </w:p>
+    <w:p>
+      <w:pPr>
+        <w:pStyle w:val="ListParagraph"/>
+        <w:numPr>
+          <w:ilvl w:val="0"/>
+          <w:numId w:val="20"/>
+        </w:numPr>
+        <w:rPr>
+          <w:sz w:val="24"/>
+          <w:szCs w:val="22"/>
+          <w:lang w:val="en-US"/>
+        </w:rPr>
+      </w:pPr>
+      <w:r>
+        <w:rPr>
+          <w:sz w:val="24"/>
+          <w:szCs w:val="22"/>
+          <w:lang w:val="en-US"/>
+        </w:rPr>
+        <w:t xml:space="preserve">Used to locate a control using the value of attribute </w:t>
+      </w:r>
+      <w:r>
+        <w:rPr>
+          <w:b/>
+          <w:bCs/>
+          <w:sz w:val="24"/>
+          <w:szCs w:val="22"/>
+          <w:lang w:val="en-US"/>
+        </w:rPr>
+        <w:t>class.</w:t>
+      </w:r>
+    </w:p>
+    <w:p>
+      <w:pPr>
+        <w:pStyle w:val="ListParagraph"/>
+        <w:numPr>
+          <w:ilvl w:val="0"/>
+          <w:numId w:val="20"/>
+        </w:numPr>
+        <w:rPr>
+          <w:sz w:val="24"/>
+          <w:szCs w:val="22"/>
+          <w:lang w:val="en-US"/>
+        </w:rPr>
+      </w:pPr>
     </w:p>
     <w:sectPr>
       <w:pgSz w:w="11906" w:h="16838"/>
@@ -7043,6 +7842,119 @@
 <file path=word/numbering.xml><?xml version="1.0" encoding="utf-8"?>
 <w:numbering xmlns:wpc="http://schemas.microsoft.com/office/word/2010/wordprocessingCanvas" xmlns:mc="http://schemas.openxmlformats.org/markup-compatibility/2006" xmlns:o="urn:schemas-microsoft-com:office:office" xmlns:r="http://schemas.openxmlformats.org/officeDocument/2006/relationships" xmlns:m="http://schemas.openxmlformats.org/officeDocument/2006/math" xmlns:v="urn:schemas-microsoft-com:vml" xmlns:wp14="http://schemas.microsoft.com/office/word/2010/wordprocessingDrawing" xmlns:wp="http://schemas.openxmlformats.org/drawingml/2006/wordprocessingDrawing" xmlns:w10="urn:schemas-microsoft-com:office:word" xmlns:w="http://schemas.openxmlformats.org/wordprocessingml/2006/main" xmlns:w14="http://schemas.microsoft.com/office/word/2010/wordml" xmlns:w15="http://schemas.microsoft.com/office/word/2012/wordml" xmlns:wpg="http://schemas.microsoft.com/office/word/2010/wordprocessingGroup" xmlns:wpi="http://schemas.microsoft.com/office/word/2010/wordprocessingInk" xmlns:wne="http://schemas.microsoft.com/office/word/2006/wordml" xmlns:wps="http://schemas.microsoft.com/office/word/2010/wordprocessingShape" mc:Ignorable="w14 w15 wp14">
   <w:abstractNum w:abstractNumId="0">
+    <w:nsid w:val="086A0A27"/>
+    <w:multiLevelType w:val="hybridMultilevel"/>
+    <w:tmpl w:val="55E0F612"/>
+    <w:lvl w:ilvl="0" w:tplc="40090001">
+      <w:start w:val="1"/>
+      <w:numFmt w:val="bullet"/>
+      <w:lvlText w:val=""/>
+      <w:lvlJc w:val="left"/>
+      <w:pPr>
+        <w:ind w:left="720" w:hanging="360"/>
+      </w:pPr>
+      <w:rPr>
+        <w:rFonts w:ascii="Symbol" w:hAnsi="Symbol" w:hint="default"/>
+      </w:rPr>
+    </w:lvl>
+    <w:lvl w:ilvl="1" w:tplc="40090003">
+      <w:start w:val="1"/>
+      <w:numFmt w:val="bullet"/>
+      <w:lvlText w:val="o"/>
+      <w:lvlJc w:val="left"/>
+      <w:pPr>
+        <w:ind w:left="1440" w:hanging="360"/>
+      </w:pPr>
+      <w:rPr>
+        <w:rFonts w:ascii="Courier New" w:hAnsi="Courier New" w:cs="Courier New" w:hint="default"/>
+      </w:rPr>
+    </w:lvl>
+    <w:lvl w:ilvl="2" w:tplc="40090005" w:tentative="1">
+      <w:start w:val="1"/>
+      <w:numFmt w:val="bullet"/>
+      <w:lvlText w:val=""/>
+      <w:lvlJc w:val="left"/>
+      <w:pPr>
+        <w:ind w:left="2160" w:hanging="360"/>
+      </w:pPr>
+      <w:rPr>
+        <w:rFonts w:ascii="Wingdings" w:hAnsi="Wingdings" w:hint="default"/>
+      </w:rPr>
+    </w:lvl>
+    <w:lvl w:ilvl="3" w:tplc="40090001" w:tentative="1">
+      <w:start w:val="1"/>
+      <w:numFmt w:val="bullet"/>
+      <w:lvlText w:val=""/>
+      <w:lvlJc w:val="left"/>
+      <w:pPr>
+        <w:ind w:left="2880" w:hanging="360"/>
+      </w:pPr>
+      <w:rPr>
+        <w:rFonts w:ascii="Symbol" w:hAnsi="Symbol" w:hint="default"/>
+      </w:rPr>
+    </w:lvl>
+    <w:lvl w:ilvl="4" w:tplc="40090003" w:tentative="1">
+      <w:start w:val="1"/>
+      <w:numFmt w:val="bullet"/>
+      <w:lvlText w:val="o"/>
+      <w:lvlJc w:val="left"/>
+      <w:pPr>
+        <w:ind w:left="3600" w:hanging="360"/>
+      </w:pPr>
+      <w:rPr>
+        <w:rFonts w:ascii="Courier New" w:hAnsi="Courier New" w:cs="Courier New" w:hint="default"/>
+      </w:rPr>
+    </w:lvl>
+    <w:lvl w:ilvl="5" w:tplc="40090005" w:tentative="1">
+      <w:start w:val="1"/>
+      <w:numFmt w:val="bullet"/>
+      <w:lvlText w:val=""/>
+      <w:lvlJc w:val="left"/>
+      <w:pPr>
+        <w:ind w:left="4320" w:hanging="360"/>
+      </w:pPr>
+      <w:rPr>
+        <w:rFonts w:ascii="Wingdings" w:hAnsi="Wingdings" w:hint="default"/>
+      </w:rPr>
+    </w:lvl>
+    <w:lvl w:ilvl="6" w:tplc="40090001" w:tentative="1">
+      <w:start w:val="1"/>
+      <w:numFmt w:val="bullet"/>
+      <w:lvlText w:val=""/>
+      <w:lvlJc w:val="left"/>
+      <w:pPr>
+        <w:ind w:left="5040" w:hanging="360"/>
+      </w:pPr>
+      <w:rPr>
+        <w:rFonts w:ascii="Symbol" w:hAnsi="Symbol" w:hint="default"/>
+      </w:rPr>
+    </w:lvl>
+    <w:lvl w:ilvl="7" w:tplc="40090003" w:tentative="1">
+      <w:start w:val="1"/>
+      <w:numFmt w:val="bullet"/>
+      <w:lvlText w:val="o"/>
+      <w:lvlJc w:val="left"/>
+      <w:pPr>
+        <w:ind w:left="5760" w:hanging="360"/>
+      </w:pPr>
+      <w:rPr>
+        <w:rFonts w:ascii="Courier New" w:hAnsi="Courier New" w:cs="Courier New" w:hint="default"/>
+      </w:rPr>
+    </w:lvl>
+    <w:lvl w:ilvl="8" w:tplc="40090005" w:tentative="1">
+      <w:start w:val="1"/>
+      <w:numFmt w:val="bullet"/>
+      <w:lvlText w:val=""/>
+      <w:lvlJc w:val="left"/>
+      <w:pPr>
+        <w:ind w:left="6480" w:hanging="360"/>
+      </w:pPr>
+      <w:rPr>
+        <w:rFonts w:ascii="Wingdings" w:hAnsi="Wingdings" w:hint="default"/>
+      </w:rPr>
+    </w:lvl>
+  </w:abstractNum>
+  <w:abstractNum w:abstractNumId="1">
     <w:nsid w:val="0F5B4400"/>
     <w:multiLevelType w:val="hybridMultilevel"/>
     <w:tmpl w:val="EF82DA1A"/>
@@ -7155,7 +8067,7 @@
       </w:rPr>
     </w:lvl>
   </w:abstractNum>
-  <w:abstractNum w:abstractNumId="1">
+  <w:abstractNum w:abstractNumId="2">
     <w:nsid w:val="105D6FD0"/>
     <w:multiLevelType w:val="hybridMultilevel"/>
     <w:tmpl w:val="D66A1D8C"/>
@@ -7244,7 +8156,96 @@
       </w:pPr>
     </w:lvl>
   </w:abstractNum>
-  <w:abstractNum w:abstractNumId="2">
+  <w:abstractNum w:abstractNumId="3">
+    <w:nsid w:val="17A97564"/>
+    <w:multiLevelType w:val="hybridMultilevel"/>
+    <w:tmpl w:val="CA967136"/>
+    <w:lvl w:ilvl="0" w:tplc="4009000F">
+      <w:start w:val="1"/>
+      <w:numFmt w:val="decimal"/>
+      <w:lvlText w:val="%1."/>
+      <w:lvlJc w:val="left"/>
+      <w:pPr>
+        <w:ind w:left="720" w:hanging="360"/>
+      </w:pPr>
+      <w:rPr>
+        <w:rFonts w:hint="default"/>
+      </w:rPr>
+    </w:lvl>
+    <w:lvl w:ilvl="1" w:tplc="40090019" w:tentative="1">
+      <w:start w:val="1"/>
+      <w:numFmt w:val="lowerLetter"/>
+      <w:lvlText w:val="%2."/>
+      <w:lvlJc w:val="left"/>
+      <w:pPr>
+        <w:ind w:left="1440" w:hanging="360"/>
+      </w:pPr>
+    </w:lvl>
+    <w:lvl w:ilvl="2" w:tplc="4009001B" w:tentative="1">
+      <w:start w:val="1"/>
+      <w:numFmt w:val="lowerRoman"/>
+      <w:lvlText w:val="%3."/>
+      <w:lvlJc w:val="right"/>
+      <w:pPr>
+        <w:ind w:left="2160" w:hanging="180"/>
+      </w:pPr>
+    </w:lvl>
+    <w:lvl w:ilvl="3" w:tplc="4009000F" w:tentative="1">
+      <w:start w:val="1"/>
+      <w:numFmt w:val="decimal"/>
+      <w:lvlText w:val="%4."/>
+      <w:lvlJc w:val="left"/>
+      <w:pPr>
+        <w:ind w:left="2880" w:hanging="360"/>
+      </w:pPr>
+    </w:lvl>
+    <w:lvl w:ilvl="4" w:tplc="40090019" w:tentative="1">
+      <w:start w:val="1"/>
+      <w:numFmt w:val="lowerLetter"/>
+      <w:lvlText w:val="%5."/>
+      <w:lvlJc w:val="left"/>
+      <w:pPr>
+        <w:ind w:left="3600" w:hanging="360"/>
+      </w:pPr>
+    </w:lvl>
+    <w:lvl w:ilvl="5" w:tplc="4009001B" w:tentative="1">
+      <w:start w:val="1"/>
+      <w:numFmt w:val="lowerRoman"/>
+      <w:lvlText w:val="%6."/>
+      <w:lvlJc w:val="right"/>
+      <w:pPr>
+        <w:ind w:left="4320" w:hanging="180"/>
+      </w:pPr>
+    </w:lvl>
+    <w:lvl w:ilvl="6" w:tplc="4009000F" w:tentative="1">
+      <w:start w:val="1"/>
+      <w:numFmt w:val="decimal"/>
+      <w:lvlText w:val="%7."/>
+      <w:lvlJc w:val="left"/>
+      <w:pPr>
+        <w:ind w:left="5040" w:hanging="360"/>
+      </w:pPr>
+    </w:lvl>
+    <w:lvl w:ilvl="7" w:tplc="40090019" w:tentative="1">
+      <w:start w:val="1"/>
+      <w:numFmt w:val="lowerLetter"/>
+      <w:lvlText w:val="%8."/>
+      <w:lvlJc w:val="left"/>
+      <w:pPr>
+        <w:ind w:left="5760" w:hanging="360"/>
+      </w:pPr>
+    </w:lvl>
+    <w:lvl w:ilvl="8" w:tplc="4009001B" w:tentative="1">
+      <w:start w:val="1"/>
+      <w:numFmt w:val="lowerRoman"/>
+      <w:lvlText w:val="%9."/>
+      <w:lvlJc w:val="right"/>
+      <w:pPr>
+        <w:ind w:left="6480" w:hanging="180"/>
+      </w:pPr>
+    </w:lvl>
+  </w:abstractNum>
+  <w:abstractNum w:abstractNumId="4">
     <w:nsid w:val="1DD814BD"/>
     <w:multiLevelType w:val="hybridMultilevel"/>
     <w:tmpl w:val="6052B25A"/>
@@ -7333,7 +8334,7 @@
       </w:pPr>
     </w:lvl>
   </w:abstractNum>
-  <w:abstractNum w:abstractNumId="3">
+  <w:abstractNum w:abstractNumId="5">
     <w:nsid w:val="22D50F4A"/>
     <w:multiLevelType w:val="hybridMultilevel"/>
     <w:tmpl w:val="564C3158"/>
@@ -7446,7 +8447,7 @@
       </w:rPr>
     </w:lvl>
   </w:abstractNum>
-  <w:abstractNum w:abstractNumId="4">
+  <w:abstractNum w:abstractNumId="6">
     <w:nsid w:val="2AA11AFE"/>
     <w:multiLevelType w:val="hybridMultilevel"/>
     <w:tmpl w:val="551C87B4"/>
@@ -7535,7 +8536,7 @@
       </w:pPr>
     </w:lvl>
   </w:abstractNum>
-  <w:abstractNum w:abstractNumId="5">
+  <w:abstractNum w:abstractNumId="7">
     <w:nsid w:val="323F4A11"/>
     <w:multiLevelType w:val="hybridMultilevel"/>
     <w:tmpl w:val="5862F962"/>
@@ -7621,7 +8622,7 @@
       </w:pPr>
     </w:lvl>
   </w:abstractNum>
-  <w:abstractNum w:abstractNumId="6">
+  <w:abstractNum w:abstractNumId="8">
     <w:nsid w:val="390953F8"/>
     <w:multiLevelType w:val="hybridMultilevel"/>
     <w:tmpl w:val="13E456E4"/>
@@ -7707,10 +8708,10 @@
       </w:pPr>
     </w:lvl>
   </w:abstractNum>
-  <w:abstractNum w:abstractNumId="7">
+  <w:abstractNum w:abstractNumId="9">
     <w:nsid w:val="3C875259"/>
     <w:multiLevelType w:val="hybridMultilevel"/>
-    <w:tmpl w:val="03089B9C"/>
+    <w:tmpl w:val="CA62BF82"/>
     <w:lvl w:ilvl="0" w:tplc="4009000F">
       <w:start w:val="1"/>
       <w:numFmt w:val="decimal"/>
@@ -7796,7 +8797,120 @@
       </w:pPr>
     </w:lvl>
   </w:abstractNum>
-  <w:abstractNum w:abstractNumId="8">
+  <w:abstractNum w:abstractNumId="10">
+    <w:nsid w:val="402B0604"/>
+    <w:multiLevelType w:val="hybridMultilevel"/>
+    <w:tmpl w:val="D8EEBC8C"/>
+    <w:lvl w:ilvl="0" w:tplc="40090001">
+      <w:start w:val="1"/>
+      <w:numFmt w:val="bullet"/>
+      <w:lvlText w:val=""/>
+      <w:lvlJc w:val="left"/>
+      <w:pPr>
+        <w:ind w:left="720" w:hanging="360"/>
+      </w:pPr>
+      <w:rPr>
+        <w:rFonts w:ascii="Symbol" w:hAnsi="Symbol" w:hint="default"/>
+      </w:rPr>
+    </w:lvl>
+    <w:lvl w:ilvl="1" w:tplc="40090003" w:tentative="1">
+      <w:start w:val="1"/>
+      <w:numFmt w:val="bullet"/>
+      <w:lvlText w:val="o"/>
+      <w:lvlJc w:val="left"/>
+      <w:pPr>
+        <w:ind w:left="1440" w:hanging="360"/>
+      </w:pPr>
+      <w:rPr>
+        <w:rFonts w:ascii="Courier New" w:hAnsi="Courier New" w:cs="Courier New" w:hint="default"/>
+      </w:rPr>
+    </w:lvl>
+    <w:lvl w:ilvl="2" w:tplc="40090005" w:tentative="1">
+      <w:start w:val="1"/>
+      <w:numFmt w:val="bullet"/>
+      <w:lvlText w:val=""/>
+      <w:lvlJc w:val="left"/>
+      <w:pPr>
+        <w:ind w:left="2160" w:hanging="360"/>
+      </w:pPr>
+      <w:rPr>
+        <w:rFonts w:ascii="Wingdings" w:hAnsi="Wingdings" w:hint="default"/>
+      </w:rPr>
+    </w:lvl>
+    <w:lvl w:ilvl="3" w:tplc="40090001" w:tentative="1">
+      <w:start w:val="1"/>
+      <w:numFmt w:val="bullet"/>
+      <w:lvlText w:val=""/>
+      <w:lvlJc w:val="left"/>
+      <w:pPr>
+        <w:ind w:left="2880" w:hanging="360"/>
+      </w:pPr>
+      <w:rPr>
+        <w:rFonts w:ascii="Symbol" w:hAnsi="Symbol" w:hint="default"/>
+      </w:rPr>
+    </w:lvl>
+    <w:lvl w:ilvl="4" w:tplc="40090003" w:tentative="1">
+      <w:start w:val="1"/>
+      <w:numFmt w:val="bullet"/>
+      <w:lvlText w:val="o"/>
+      <w:lvlJc w:val="left"/>
+      <w:pPr>
+        <w:ind w:left="3600" w:hanging="360"/>
+      </w:pPr>
+      <w:rPr>
+        <w:rFonts w:ascii="Courier New" w:hAnsi="Courier New" w:cs="Courier New" w:hint="default"/>
+      </w:rPr>
+    </w:lvl>
+    <w:lvl w:ilvl="5" w:tplc="40090005" w:tentative="1">
+      <w:start w:val="1"/>
+      <w:numFmt w:val="bullet"/>
+      <w:lvlText w:val=""/>
+      <w:lvlJc w:val="left"/>
+      <w:pPr>
+        <w:ind w:left="4320" w:hanging="360"/>
+      </w:pPr>
+      <w:rPr>
+        <w:rFonts w:ascii="Wingdings" w:hAnsi="Wingdings" w:hint="default"/>
+      </w:rPr>
+    </w:lvl>
+    <w:lvl w:ilvl="6" w:tplc="40090001" w:tentative="1">
+      <w:start w:val="1"/>
+      <w:numFmt w:val="bullet"/>
+      <w:lvlText w:val=""/>
+      <w:lvlJc w:val="left"/>
+      <w:pPr>
+        <w:ind w:left="5040" w:hanging="360"/>
+      </w:pPr>
+      <w:rPr>
+        <w:rFonts w:ascii="Symbol" w:hAnsi="Symbol" w:hint="default"/>
+      </w:rPr>
+    </w:lvl>
+    <w:lvl w:ilvl="7" w:tplc="40090003" w:tentative="1">
+      <w:start w:val="1"/>
+      <w:numFmt w:val="bullet"/>
+      <w:lvlText w:val="o"/>
+      <w:lvlJc w:val="left"/>
+      <w:pPr>
+        <w:ind w:left="5760" w:hanging="360"/>
+      </w:pPr>
+      <w:rPr>
+        <w:rFonts w:ascii="Courier New" w:hAnsi="Courier New" w:cs="Courier New" w:hint="default"/>
+      </w:rPr>
+    </w:lvl>
+    <w:lvl w:ilvl="8" w:tplc="40090005" w:tentative="1">
+      <w:start w:val="1"/>
+      <w:numFmt w:val="bullet"/>
+      <w:lvlText w:val=""/>
+      <w:lvlJc w:val="left"/>
+      <w:pPr>
+        <w:ind w:left="6480" w:hanging="360"/>
+      </w:pPr>
+      <w:rPr>
+        <w:rFonts w:ascii="Wingdings" w:hAnsi="Wingdings" w:hint="default"/>
+      </w:rPr>
+    </w:lvl>
+  </w:abstractNum>
+  <w:abstractNum w:abstractNumId="11">
     <w:nsid w:val="40FE0FCF"/>
     <w:multiLevelType w:val="hybridMultilevel"/>
     <w:tmpl w:val="39DC3034"/>
@@ -7909,7 +9023,7 @@
       </w:rPr>
     </w:lvl>
   </w:abstractNum>
-  <w:abstractNum w:abstractNumId="9">
+  <w:abstractNum w:abstractNumId="12">
     <w:nsid w:val="496607A1"/>
     <w:multiLevelType w:val="hybridMultilevel"/>
     <w:tmpl w:val="D6727F44"/>
@@ -8022,7 +9136,7 @@
       </w:rPr>
     </w:lvl>
   </w:abstractNum>
-  <w:abstractNum w:abstractNumId="10">
+  <w:abstractNum w:abstractNumId="13">
     <w:nsid w:val="49B72ACE"/>
     <w:multiLevelType w:val="hybridMultilevel"/>
     <w:tmpl w:val="F09897B0"/>
@@ -8111,7 +9225,7 @@
       </w:pPr>
     </w:lvl>
   </w:abstractNum>
-  <w:abstractNum w:abstractNumId="11">
+  <w:abstractNum w:abstractNumId="14">
     <w:nsid w:val="56BB04A8"/>
     <w:multiLevelType w:val="hybridMultilevel"/>
     <w:tmpl w:val="7FDC8606"/>
@@ -8224,7 +9338,7 @@
       </w:rPr>
     </w:lvl>
   </w:abstractNum>
-  <w:abstractNum w:abstractNumId="12">
+  <w:abstractNum w:abstractNumId="15">
     <w:nsid w:val="5C58581A"/>
     <w:multiLevelType w:val="hybridMultilevel"/>
     <w:tmpl w:val="3D4E3154"/>
@@ -8337,7 +9451,7 @@
       </w:rPr>
     </w:lvl>
   </w:abstractNum>
-  <w:abstractNum w:abstractNumId="13">
+  <w:abstractNum w:abstractNumId="16">
     <w:nsid w:val="5F383176"/>
     <w:multiLevelType w:val="hybridMultilevel"/>
     <w:tmpl w:val="4C76D014"/>
@@ -8450,7 +9564,7 @@
       </w:rPr>
     </w:lvl>
   </w:abstractNum>
-  <w:abstractNum w:abstractNumId="14">
+  <w:abstractNum w:abstractNumId="17">
     <w:nsid w:val="6DF222BD"/>
     <w:multiLevelType w:val="hybridMultilevel"/>
     <w:tmpl w:val="CB58A112"/>
@@ -8563,7 +9677,7 @@
       </w:rPr>
     </w:lvl>
   </w:abstractNum>
-  <w:abstractNum w:abstractNumId="15">
+  <w:abstractNum w:abstractNumId="18">
     <w:nsid w:val="700B3448"/>
     <w:multiLevelType w:val="hybridMultilevel"/>
     <w:tmpl w:val="D4F8B1EA"/>
@@ -8652,7 +9766,7 @@
       </w:pPr>
     </w:lvl>
   </w:abstractNum>
-  <w:abstractNum w:abstractNumId="16">
+  <w:abstractNum w:abstractNumId="19">
     <w:nsid w:val="7BD5777C"/>
     <w:multiLevelType w:val="hybridMultilevel"/>
     <w:tmpl w:val="53D46EE2"/>
@@ -8742,55 +9856,64 @@
     </w:lvl>
   </w:abstractNum>
   <w:num w:numId="1">
+    <w:abstractNumId w:val="11"/>
+  </w:num>
+  <w:num w:numId="2">
+    <w:abstractNumId w:val="12"/>
+  </w:num>
+  <w:num w:numId="3">
+    <w:abstractNumId w:val="18"/>
+  </w:num>
+  <w:num w:numId="4">
     <w:abstractNumId w:val="8"/>
   </w:num>
-  <w:num w:numId="2">
+  <w:num w:numId="5">
+    <w:abstractNumId w:val="1"/>
+  </w:num>
+  <w:num w:numId="6">
+    <w:abstractNumId w:val="5"/>
+  </w:num>
+  <w:num w:numId="7">
+    <w:abstractNumId w:val="17"/>
+  </w:num>
+  <w:num w:numId="8">
+    <w:abstractNumId w:val="13"/>
+  </w:num>
+  <w:num w:numId="9">
+    <w:abstractNumId w:val="7"/>
+  </w:num>
+  <w:num w:numId="10">
+    <w:abstractNumId w:val="15"/>
+  </w:num>
+  <w:num w:numId="11">
+    <w:abstractNumId w:val="16"/>
+  </w:num>
+  <w:num w:numId="12">
+    <w:abstractNumId w:val="14"/>
+  </w:num>
+  <w:num w:numId="13">
+    <w:abstractNumId w:val="6"/>
+  </w:num>
+  <w:num w:numId="14">
+    <w:abstractNumId w:val="4"/>
+  </w:num>
+  <w:num w:numId="15">
+    <w:abstractNumId w:val="19"/>
+  </w:num>
+  <w:num w:numId="16">
+    <w:abstractNumId w:val="2"/>
+  </w:num>
+  <w:num w:numId="17">
     <w:abstractNumId w:val="9"/>
   </w:num>
-  <w:num w:numId="3">
-    <w:abstractNumId w:val="15"/>
-  </w:num>
-  <w:num w:numId="4">
-    <w:abstractNumId w:val="6"/>
-  </w:num>
-  <w:num w:numId="5">
+  <w:num w:numId="18">
     <w:abstractNumId w:val="0"/>
   </w:num>
-  <w:num w:numId="6">
+  <w:num w:numId="19">
     <w:abstractNumId w:val="3"/>
   </w:num>
-  <w:num w:numId="7">
-    <w:abstractNumId w:val="14"/>
-  </w:num>
-  <w:num w:numId="8">
+  <w:num w:numId="20">
     <w:abstractNumId w:val="10"/>
-  </w:num>
-  <w:num w:numId="9">
-    <w:abstractNumId w:val="5"/>
-  </w:num>
-  <w:num w:numId="10">
-    <w:abstractNumId w:val="12"/>
-  </w:num>
-  <w:num w:numId="11">
-    <w:abstractNumId w:val="13"/>
-  </w:num>
-  <w:num w:numId="12">
-    <w:abstractNumId w:val="11"/>
-  </w:num>
-  <w:num w:numId="13">
-    <w:abstractNumId w:val="4"/>
-  </w:num>
-  <w:num w:numId="14">
-    <w:abstractNumId w:val="2"/>
-  </w:num>
-  <w:num w:numId="15">
-    <w:abstractNumId w:val="16"/>
-  </w:num>
-  <w:num w:numId="16">
-    <w:abstractNumId w:val="1"/>
-  </w:num>
-  <w:num w:numId="17">
-    <w:abstractNumId w:val="7"/>
   </w:num>
 </w:numbering>
 </file>
@@ -10204,10 +11327,24 @@
     <dgm:pt modelId="{ABB6D0E9-231F-49FF-8F6A-CBD756BB2A07}" type="pres">
       <dgm:prSet presAssocID="{2F2C6037-AE48-4650-B998-EBABF88D0464}" presName="sibTrans" presStyleLbl="sibTrans2D1" presStyleIdx="0" presStyleCnt="3"/>
       <dgm:spPr/>
+      <dgm:t>
+        <a:bodyPr/>
+        <a:lstStyle/>
+        <a:p>
+          <a:endParaRPr lang="en-IN"/>
+        </a:p>
+      </dgm:t>
     </dgm:pt>
     <dgm:pt modelId="{8D8E620F-A309-4628-986D-B0F92ABF739C}" type="pres">
       <dgm:prSet presAssocID="{2F2C6037-AE48-4650-B998-EBABF88D0464}" presName="connectorText" presStyleLbl="sibTrans2D1" presStyleIdx="0" presStyleCnt="3"/>
       <dgm:spPr/>
+      <dgm:t>
+        <a:bodyPr/>
+        <a:lstStyle/>
+        <a:p>
+          <a:endParaRPr lang="en-IN"/>
+        </a:p>
+      </dgm:t>
     </dgm:pt>
     <dgm:pt modelId="{45B120D8-A283-4DB0-AE48-CD1028B5A1CA}" type="pres">
       <dgm:prSet presAssocID="{B2F67260-32B4-49EF-BEA7-6376ABEBC356}" presName="node" presStyleLbl="node1" presStyleIdx="1" presStyleCnt="4">
@@ -10216,14 +11353,35 @@
         </dgm:presLayoutVars>
       </dgm:prSet>
       <dgm:spPr/>
+      <dgm:t>
+        <a:bodyPr/>
+        <a:lstStyle/>
+        <a:p>
+          <a:endParaRPr lang="en-IN"/>
+        </a:p>
+      </dgm:t>
     </dgm:pt>
     <dgm:pt modelId="{1C61394E-D32F-4A43-ADD4-F46D3A33D38F}" type="pres">
       <dgm:prSet presAssocID="{58F8E6FA-8E5F-4590-8E91-7D425686736E}" presName="sibTrans" presStyleLbl="sibTrans2D1" presStyleIdx="1" presStyleCnt="3"/>
       <dgm:spPr/>
+      <dgm:t>
+        <a:bodyPr/>
+        <a:lstStyle/>
+        <a:p>
+          <a:endParaRPr lang="en-IN"/>
+        </a:p>
+      </dgm:t>
     </dgm:pt>
     <dgm:pt modelId="{38F30BB8-19AC-4F2C-997E-D6C87643D812}" type="pres">
       <dgm:prSet presAssocID="{58F8E6FA-8E5F-4590-8E91-7D425686736E}" presName="connectorText" presStyleLbl="sibTrans2D1" presStyleIdx="1" presStyleCnt="3"/>
       <dgm:spPr/>
+      <dgm:t>
+        <a:bodyPr/>
+        <a:lstStyle/>
+        <a:p>
+          <a:endParaRPr lang="en-IN"/>
+        </a:p>
+      </dgm:t>
     </dgm:pt>
     <dgm:pt modelId="{CA09568C-529F-4056-BB14-75FC27EA3A57}" type="pres">
       <dgm:prSet presAssocID="{D4DE5EA1-C98A-4001-96ED-0D8A4099152C}" presName="node" presStyleLbl="node1" presStyleIdx="2" presStyleCnt="4">
@@ -10232,14 +11390,35 @@
         </dgm:presLayoutVars>
       </dgm:prSet>
       <dgm:spPr/>
+      <dgm:t>
+        <a:bodyPr/>
+        <a:lstStyle/>
+        <a:p>
+          <a:endParaRPr lang="en-IN"/>
+        </a:p>
+      </dgm:t>
     </dgm:pt>
     <dgm:pt modelId="{E6A79763-2175-4FE6-AF39-65BAD7E8A94D}" type="pres">
       <dgm:prSet presAssocID="{C6470392-B547-42B7-BBE1-49D9BF3297A5}" presName="sibTrans" presStyleLbl="sibTrans2D1" presStyleIdx="2" presStyleCnt="3"/>
       <dgm:spPr/>
+      <dgm:t>
+        <a:bodyPr/>
+        <a:lstStyle/>
+        <a:p>
+          <a:endParaRPr lang="en-IN"/>
+        </a:p>
+      </dgm:t>
     </dgm:pt>
     <dgm:pt modelId="{D17F71C8-684F-40E9-B9CF-89D188A27816}" type="pres">
       <dgm:prSet presAssocID="{C6470392-B547-42B7-BBE1-49D9BF3297A5}" presName="connectorText" presStyleLbl="sibTrans2D1" presStyleIdx="2" presStyleCnt="3"/>
       <dgm:spPr/>
+      <dgm:t>
+        <a:bodyPr/>
+        <a:lstStyle/>
+        <a:p>
+          <a:endParaRPr lang="en-IN"/>
+        </a:p>
+      </dgm:t>
     </dgm:pt>
     <dgm:pt modelId="{FCE3B9A4-214A-4502-B3DF-ACB3E0BC61C7}" type="pres">
       <dgm:prSet presAssocID="{B0DAEDAB-33B3-4821-A91B-D05361312CE9}" presName="node" presStyleLbl="node1" presStyleIdx="3" presStyleCnt="4">
@@ -10248,34 +11427,41 @@
         </dgm:presLayoutVars>
       </dgm:prSet>
       <dgm:spPr/>
+      <dgm:t>
+        <a:bodyPr/>
+        <a:lstStyle/>
+        <a:p>
+          <a:endParaRPr lang="en-IN"/>
+        </a:p>
+      </dgm:t>
     </dgm:pt>
   </dgm:ptLst>
   <dgm:cxnLst>
+    <dgm:cxn modelId="{E1C4DBA6-EA62-4AEC-9A87-AE90662F14FC}" type="presOf" srcId="{58F8E6FA-8E5F-4590-8E91-7D425686736E}" destId="{38F30BB8-19AC-4F2C-997E-D6C87643D812}" srcOrd="1" destOrd="0" presId="urn:microsoft.com/office/officeart/2005/8/layout/process1"/>
+    <dgm:cxn modelId="{2C47CD0E-64A0-4DAE-B08A-52D6CD707C49}" type="presOf" srcId="{58F8E6FA-8E5F-4590-8E91-7D425686736E}" destId="{1C61394E-D32F-4A43-ADD4-F46D3A33D38F}" srcOrd="0" destOrd="0" presId="urn:microsoft.com/office/officeart/2005/8/layout/process1"/>
+    <dgm:cxn modelId="{916CD402-046A-49C3-919C-E8874C6452BD}" srcId="{C787D0C9-C4AA-4BF8-AAA9-EFDCDDDFB8C5}" destId="{B0DAEDAB-33B3-4821-A91B-D05361312CE9}" srcOrd="3" destOrd="0" parTransId="{1B396FDD-FE98-44AA-BBFD-EFDF9B52D4CD}" sibTransId="{2689B6F1-8FF1-4D68-9639-E8E505EA5AB0}"/>
+    <dgm:cxn modelId="{90A0D5B0-120C-4CE5-8613-D3685BBC0D1F}" type="presOf" srcId="{C787D0C9-C4AA-4BF8-AAA9-EFDCDDDFB8C5}" destId="{ECE2E50F-1EF0-49E9-A2A2-C09D34379E86}" srcOrd="0" destOrd="0" presId="urn:microsoft.com/office/officeart/2005/8/layout/process1"/>
+    <dgm:cxn modelId="{DCDE8B87-83AC-4377-9757-B54BD1F51616}" type="presOf" srcId="{B0DAEDAB-33B3-4821-A91B-D05361312CE9}" destId="{FCE3B9A4-214A-4502-B3DF-ACB3E0BC61C7}" srcOrd="0" destOrd="0" presId="urn:microsoft.com/office/officeart/2005/8/layout/process1"/>
+    <dgm:cxn modelId="{EAE55776-FA68-468F-BB61-91F1FE8296FE}" type="presOf" srcId="{C6470392-B547-42B7-BBE1-49D9BF3297A5}" destId="{E6A79763-2175-4FE6-AF39-65BAD7E8A94D}" srcOrd="0" destOrd="0" presId="urn:microsoft.com/office/officeart/2005/8/layout/process1"/>
+    <dgm:cxn modelId="{F27277EA-BDDA-4005-9170-FBB0A209E462}" srcId="{C787D0C9-C4AA-4BF8-AAA9-EFDCDDDFB8C5}" destId="{CB734D05-6005-4A33-891F-8F6E9F0BE629}" srcOrd="0" destOrd="0" parTransId="{D88A1106-7499-4EC1-A955-12C926757BDC}" sibTransId="{2F2C6037-AE48-4650-B998-EBABF88D0464}"/>
     <dgm:cxn modelId="{407416C7-D9A4-49CF-A1D9-63129D12A5E9}" srcId="{C787D0C9-C4AA-4BF8-AAA9-EFDCDDDFB8C5}" destId="{B2F67260-32B4-49EF-BEA7-6376ABEBC356}" srcOrd="1" destOrd="0" parTransId="{452FD36E-8C97-458A-9189-BC15B3E0AB1F}" sibTransId="{58F8E6FA-8E5F-4590-8E91-7D425686736E}"/>
-    <dgm:cxn modelId="{6CBE1BFB-2A3D-4DC6-9015-F2830E8AE25E}" type="presOf" srcId="{C6470392-B547-42B7-BBE1-49D9BF3297A5}" destId="{D17F71C8-684F-40E9-B9CF-89D188A27816}" srcOrd="1" destOrd="0" presId="urn:microsoft.com/office/officeart/2005/8/layout/process1"/>
-    <dgm:cxn modelId="{1AF22E24-3E6E-40BA-AB31-97538E55CE65}" type="presOf" srcId="{C6470392-B547-42B7-BBE1-49D9BF3297A5}" destId="{E6A79763-2175-4FE6-AF39-65BAD7E8A94D}" srcOrd="0" destOrd="0" presId="urn:microsoft.com/office/officeart/2005/8/layout/process1"/>
-    <dgm:cxn modelId="{410BFA2A-BC2F-4C44-BF1C-532E45BA1D5A}" type="presOf" srcId="{D4DE5EA1-C98A-4001-96ED-0D8A4099152C}" destId="{CA09568C-529F-4056-BB14-75FC27EA3A57}" srcOrd="0" destOrd="0" presId="urn:microsoft.com/office/officeart/2005/8/layout/process1"/>
-    <dgm:cxn modelId="{F907170E-F565-497C-A58A-46459B3C8F2D}" type="presOf" srcId="{2F2C6037-AE48-4650-B998-EBABF88D0464}" destId="{ABB6D0E9-231F-49FF-8F6A-CBD756BB2A07}" srcOrd="0" destOrd="0" presId="urn:microsoft.com/office/officeart/2005/8/layout/process1"/>
-    <dgm:cxn modelId="{8A882318-817B-4DE5-B108-8E879243C24F}" type="presOf" srcId="{B0DAEDAB-33B3-4821-A91B-D05361312CE9}" destId="{FCE3B9A4-214A-4502-B3DF-ACB3E0BC61C7}" srcOrd="0" destOrd="0" presId="urn:microsoft.com/office/officeart/2005/8/layout/process1"/>
-    <dgm:cxn modelId="{647F0E08-FE07-4747-A684-B3343F7C493A}" type="presOf" srcId="{B2F67260-32B4-49EF-BEA7-6376ABEBC356}" destId="{45B120D8-A283-4DB0-AE48-CD1028B5A1CA}" srcOrd="0" destOrd="0" presId="urn:microsoft.com/office/officeart/2005/8/layout/process1"/>
-    <dgm:cxn modelId="{1DFBF9D5-29F6-4ACB-8874-E53E4E9B3514}" type="presOf" srcId="{2F2C6037-AE48-4650-B998-EBABF88D0464}" destId="{8D8E620F-A309-4628-986D-B0F92ABF739C}" srcOrd="1" destOrd="0" presId="urn:microsoft.com/office/officeart/2005/8/layout/process1"/>
+    <dgm:cxn modelId="{4DC00BEC-DD6E-4F97-B721-3D6FD2750034}" type="presOf" srcId="{2F2C6037-AE48-4650-B998-EBABF88D0464}" destId="{ABB6D0E9-231F-49FF-8F6A-CBD756BB2A07}" srcOrd="0" destOrd="0" presId="urn:microsoft.com/office/officeart/2005/8/layout/process1"/>
+    <dgm:cxn modelId="{D9C14588-5005-40EA-A924-D7B700B2EA93}" type="presOf" srcId="{B2F67260-32B4-49EF-BEA7-6376ABEBC356}" destId="{45B120D8-A283-4DB0-AE48-CD1028B5A1CA}" srcOrd="0" destOrd="0" presId="urn:microsoft.com/office/officeart/2005/8/layout/process1"/>
+    <dgm:cxn modelId="{B37C6AB6-921F-47EC-9AA8-53D63293195A}" type="presOf" srcId="{C6470392-B547-42B7-BBE1-49D9BF3297A5}" destId="{D17F71C8-684F-40E9-B9CF-89D188A27816}" srcOrd="1" destOrd="0" presId="urn:microsoft.com/office/officeart/2005/8/layout/process1"/>
+    <dgm:cxn modelId="{D14DC18B-9208-4C19-BCA9-8A5E88B8E080}" type="presOf" srcId="{D4DE5EA1-C98A-4001-96ED-0D8A4099152C}" destId="{CA09568C-529F-4056-BB14-75FC27EA3A57}" srcOrd="0" destOrd="0" presId="urn:microsoft.com/office/officeart/2005/8/layout/process1"/>
     <dgm:cxn modelId="{A358B1AA-45ED-4C0A-A925-911C6E3E177E}" srcId="{C787D0C9-C4AA-4BF8-AAA9-EFDCDDDFB8C5}" destId="{D4DE5EA1-C98A-4001-96ED-0D8A4099152C}" srcOrd="2" destOrd="0" parTransId="{DDD45587-67C2-4B3F-892B-0153C2E010D0}" sibTransId="{C6470392-B547-42B7-BBE1-49D9BF3297A5}"/>
-    <dgm:cxn modelId="{916CD402-046A-49C3-919C-E8874C6452BD}" srcId="{C787D0C9-C4AA-4BF8-AAA9-EFDCDDDFB8C5}" destId="{B0DAEDAB-33B3-4821-A91B-D05361312CE9}" srcOrd="3" destOrd="0" parTransId="{1B396FDD-FE98-44AA-BBFD-EFDF9B52D4CD}" sibTransId="{2689B6F1-8FF1-4D68-9639-E8E505EA5AB0}"/>
-    <dgm:cxn modelId="{4FCD67B8-3BDC-4997-B4D4-90E49DF9BD23}" type="presOf" srcId="{C787D0C9-C4AA-4BF8-AAA9-EFDCDDDFB8C5}" destId="{ECE2E50F-1EF0-49E9-A2A2-C09D34379E86}" srcOrd="0" destOrd="0" presId="urn:microsoft.com/office/officeart/2005/8/layout/process1"/>
-    <dgm:cxn modelId="{F284903A-BA95-4784-9884-0956CD6D6115}" type="presOf" srcId="{CB734D05-6005-4A33-891F-8F6E9F0BE629}" destId="{9346448E-7772-4989-9A73-02FD2DA61B93}" srcOrd="0" destOrd="0" presId="urn:microsoft.com/office/officeart/2005/8/layout/process1"/>
-    <dgm:cxn modelId="{D2F3C409-71FC-4924-A4AA-912761BD70C6}" type="presOf" srcId="{58F8E6FA-8E5F-4590-8E91-7D425686736E}" destId="{38F30BB8-19AC-4F2C-997E-D6C87643D812}" srcOrd="1" destOrd="0" presId="urn:microsoft.com/office/officeart/2005/8/layout/process1"/>
-    <dgm:cxn modelId="{F27277EA-BDDA-4005-9170-FBB0A209E462}" srcId="{C787D0C9-C4AA-4BF8-AAA9-EFDCDDDFB8C5}" destId="{CB734D05-6005-4A33-891F-8F6E9F0BE629}" srcOrd="0" destOrd="0" parTransId="{D88A1106-7499-4EC1-A955-12C926757BDC}" sibTransId="{2F2C6037-AE48-4650-B998-EBABF88D0464}"/>
-    <dgm:cxn modelId="{0AE54931-35A1-4C07-91FE-DF90BD093AD7}" type="presOf" srcId="{58F8E6FA-8E5F-4590-8E91-7D425686736E}" destId="{1C61394E-D32F-4A43-ADD4-F46D3A33D38F}" srcOrd="0" destOrd="0" presId="urn:microsoft.com/office/officeart/2005/8/layout/process1"/>
-    <dgm:cxn modelId="{1A52947A-DA01-4974-B558-4D3D1B98C038}" type="presParOf" srcId="{ECE2E50F-1EF0-49E9-A2A2-C09D34379E86}" destId="{9346448E-7772-4989-9A73-02FD2DA61B93}" srcOrd="0" destOrd="0" presId="urn:microsoft.com/office/officeart/2005/8/layout/process1"/>
-    <dgm:cxn modelId="{F656C7AB-27BB-4F79-93C6-0673456032D6}" type="presParOf" srcId="{ECE2E50F-1EF0-49E9-A2A2-C09D34379E86}" destId="{ABB6D0E9-231F-49FF-8F6A-CBD756BB2A07}" srcOrd="1" destOrd="0" presId="urn:microsoft.com/office/officeart/2005/8/layout/process1"/>
-    <dgm:cxn modelId="{7F3FF85E-1590-40D8-A098-01CD705474A3}" type="presParOf" srcId="{ABB6D0E9-231F-49FF-8F6A-CBD756BB2A07}" destId="{8D8E620F-A309-4628-986D-B0F92ABF739C}" srcOrd="0" destOrd="0" presId="urn:microsoft.com/office/officeart/2005/8/layout/process1"/>
-    <dgm:cxn modelId="{D2A3C373-E6B5-4EED-AB03-582B5D8D6EC6}" type="presParOf" srcId="{ECE2E50F-1EF0-49E9-A2A2-C09D34379E86}" destId="{45B120D8-A283-4DB0-AE48-CD1028B5A1CA}" srcOrd="2" destOrd="0" presId="urn:microsoft.com/office/officeart/2005/8/layout/process1"/>
-    <dgm:cxn modelId="{728EE44B-F930-443F-8A1B-50FBE8618FBD}" type="presParOf" srcId="{ECE2E50F-1EF0-49E9-A2A2-C09D34379E86}" destId="{1C61394E-D32F-4A43-ADD4-F46D3A33D38F}" srcOrd="3" destOrd="0" presId="urn:microsoft.com/office/officeart/2005/8/layout/process1"/>
-    <dgm:cxn modelId="{E62D7DFB-D10B-44B2-B598-30D0A87083EA}" type="presParOf" srcId="{1C61394E-D32F-4A43-ADD4-F46D3A33D38F}" destId="{38F30BB8-19AC-4F2C-997E-D6C87643D812}" srcOrd="0" destOrd="0" presId="urn:microsoft.com/office/officeart/2005/8/layout/process1"/>
-    <dgm:cxn modelId="{108CFF94-53D1-45AF-B7C4-D3F0CA5D7E97}" type="presParOf" srcId="{ECE2E50F-1EF0-49E9-A2A2-C09D34379E86}" destId="{CA09568C-529F-4056-BB14-75FC27EA3A57}" srcOrd="4" destOrd="0" presId="urn:microsoft.com/office/officeart/2005/8/layout/process1"/>
-    <dgm:cxn modelId="{261AFA65-6EEB-45B1-B5F5-B4626EB626FB}" type="presParOf" srcId="{ECE2E50F-1EF0-49E9-A2A2-C09D34379E86}" destId="{E6A79763-2175-4FE6-AF39-65BAD7E8A94D}" srcOrd="5" destOrd="0" presId="urn:microsoft.com/office/officeart/2005/8/layout/process1"/>
-    <dgm:cxn modelId="{653CAE44-D0C4-46C1-82BA-0C21ED15938F}" type="presParOf" srcId="{E6A79763-2175-4FE6-AF39-65BAD7E8A94D}" destId="{D17F71C8-684F-40E9-B9CF-89D188A27816}" srcOrd="0" destOrd="0" presId="urn:microsoft.com/office/officeart/2005/8/layout/process1"/>
-    <dgm:cxn modelId="{F1FAC1F0-7F7C-47A9-B06F-28A2E32C01C6}" type="presParOf" srcId="{ECE2E50F-1EF0-49E9-A2A2-C09D34379E86}" destId="{FCE3B9A4-214A-4502-B3DF-ACB3E0BC61C7}" srcOrd="6" destOrd="0" presId="urn:microsoft.com/office/officeart/2005/8/layout/process1"/>
+    <dgm:cxn modelId="{22EBAA80-6B2B-4A4C-96E0-5769B98C7698}" type="presOf" srcId="{2F2C6037-AE48-4650-B998-EBABF88D0464}" destId="{8D8E620F-A309-4628-986D-B0F92ABF739C}" srcOrd="1" destOrd="0" presId="urn:microsoft.com/office/officeart/2005/8/layout/process1"/>
+    <dgm:cxn modelId="{B3F9236C-C797-4512-B4EE-DFDD12A93B93}" type="presOf" srcId="{CB734D05-6005-4A33-891F-8F6E9F0BE629}" destId="{9346448E-7772-4989-9A73-02FD2DA61B93}" srcOrd="0" destOrd="0" presId="urn:microsoft.com/office/officeart/2005/8/layout/process1"/>
+    <dgm:cxn modelId="{535DCF44-81C9-4003-B949-43ED597DE267}" type="presParOf" srcId="{ECE2E50F-1EF0-49E9-A2A2-C09D34379E86}" destId="{9346448E-7772-4989-9A73-02FD2DA61B93}" srcOrd="0" destOrd="0" presId="urn:microsoft.com/office/officeart/2005/8/layout/process1"/>
+    <dgm:cxn modelId="{E79ADBD6-E665-43DB-BED5-AFEBDD228387}" type="presParOf" srcId="{ECE2E50F-1EF0-49E9-A2A2-C09D34379E86}" destId="{ABB6D0E9-231F-49FF-8F6A-CBD756BB2A07}" srcOrd="1" destOrd="0" presId="urn:microsoft.com/office/officeart/2005/8/layout/process1"/>
+    <dgm:cxn modelId="{DB798C16-23D7-45F0-A83C-71F7EE38E253}" type="presParOf" srcId="{ABB6D0E9-231F-49FF-8F6A-CBD756BB2A07}" destId="{8D8E620F-A309-4628-986D-B0F92ABF739C}" srcOrd="0" destOrd="0" presId="urn:microsoft.com/office/officeart/2005/8/layout/process1"/>
+    <dgm:cxn modelId="{FFC9A645-13C0-48C6-A0E2-A710571EC565}" type="presParOf" srcId="{ECE2E50F-1EF0-49E9-A2A2-C09D34379E86}" destId="{45B120D8-A283-4DB0-AE48-CD1028B5A1CA}" srcOrd="2" destOrd="0" presId="urn:microsoft.com/office/officeart/2005/8/layout/process1"/>
+    <dgm:cxn modelId="{B16FBF58-1E0C-44F8-A777-840B0BB18CCF}" type="presParOf" srcId="{ECE2E50F-1EF0-49E9-A2A2-C09D34379E86}" destId="{1C61394E-D32F-4A43-ADD4-F46D3A33D38F}" srcOrd="3" destOrd="0" presId="urn:microsoft.com/office/officeart/2005/8/layout/process1"/>
+    <dgm:cxn modelId="{BF85E869-E335-4F50-B6C1-B72699DFEC0C}" type="presParOf" srcId="{1C61394E-D32F-4A43-ADD4-F46D3A33D38F}" destId="{38F30BB8-19AC-4F2C-997E-D6C87643D812}" srcOrd="0" destOrd="0" presId="urn:microsoft.com/office/officeart/2005/8/layout/process1"/>
+    <dgm:cxn modelId="{4B255075-B2FC-46F6-A114-C0D0073A283A}" type="presParOf" srcId="{ECE2E50F-1EF0-49E9-A2A2-C09D34379E86}" destId="{CA09568C-529F-4056-BB14-75FC27EA3A57}" srcOrd="4" destOrd="0" presId="urn:microsoft.com/office/officeart/2005/8/layout/process1"/>
+    <dgm:cxn modelId="{97CD140D-8CC9-4AA2-B387-A336149E4CC3}" type="presParOf" srcId="{ECE2E50F-1EF0-49E9-A2A2-C09D34379E86}" destId="{E6A79763-2175-4FE6-AF39-65BAD7E8A94D}" srcOrd="5" destOrd="0" presId="urn:microsoft.com/office/officeart/2005/8/layout/process1"/>
+    <dgm:cxn modelId="{FD21BA91-C92C-41D0-B5A2-292097E88C5E}" type="presParOf" srcId="{E6A79763-2175-4FE6-AF39-65BAD7E8A94D}" destId="{D17F71C8-684F-40E9-B9CF-89D188A27816}" srcOrd="0" destOrd="0" presId="urn:microsoft.com/office/officeart/2005/8/layout/process1"/>
+    <dgm:cxn modelId="{6F1F60A7-F150-4C1C-98E2-9ECE73AA52C0}" type="presParOf" srcId="{ECE2E50F-1EF0-49E9-A2A2-C09D34379E86}" destId="{FCE3B9A4-214A-4502-B3DF-ACB3E0BC61C7}" srcOrd="6" destOrd="0" presId="urn:microsoft.com/office/officeart/2005/8/layout/process1"/>
   </dgm:cxnLst>
   <dgm:bg/>
   <dgm:whole/>

</xml_diff>

<commit_message>
Date: 29 Apr 2026
</commit_message>
<xml_diff>
--- a/Notes_SA2601010.docx
+++ b/Notes_SA2601010.docx
@@ -779,13 +779,23 @@
           <w:lang w:val="en-US"/>
         </w:rPr>
       </w:pPr>
-      <w:r>
-        <w:rPr>
-          <w:sz w:val="24"/>
-          <w:szCs w:val="22"/>
-          <w:lang w:val="en-US"/>
-        </w:rPr>
-        <w:t>Thread.sleep()</w:t>
+      <w:proofErr w:type="spellStart"/>
+      <w:r>
+        <w:rPr>
+          <w:sz w:val="24"/>
+          <w:szCs w:val="22"/>
+          <w:lang w:val="en-US"/>
+        </w:rPr>
+        <w:t>Thread.sleep</w:t>
+      </w:r>
+      <w:proofErr w:type="spellEnd"/>
+      <w:r>
+        <w:rPr>
+          <w:sz w:val="24"/>
+          <w:szCs w:val="22"/>
+          <w:lang w:val="en-US"/>
+        </w:rPr>
+        <w:t>()</w:t>
       </w:r>
     </w:p>
     <w:p>
@@ -3610,7 +3620,25 @@
           <w:szCs w:val="22"/>
           <w:lang w:val="en-US"/>
         </w:rPr>
-        <w:t>Instructions to the tool can be provided via any one of the supporting programming language (like Java, JavaScript, Python, C#, Ruby, TypeScript)</w:t>
+        <w:t xml:space="preserve">Instructions to the tool can be provided via any one of the supporting programming language (like Java, JavaScript, Python, C#, Ruby, </w:t>
+      </w:r>
+      <w:proofErr w:type="spellStart"/>
+      <w:r>
+        <w:rPr>
+          <w:sz w:val="24"/>
+          <w:szCs w:val="22"/>
+          <w:lang w:val="en-US"/>
+        </w:rPr>
+        <w:t>TypeScript</w:t>
+      </w:r>
+      <w:proofErr w:type="spellEnd"/>
+      <w:r>
+        <w:rPr>
+          <w:sz w:val="24"/>
+          <w:szCs w:val="22"/>
+          <w:lang w:val="en-US"/>
+        </w:rPr>
+        <w:t>)</w:t>
       </w:r>
     </w:p>
     <w:p>
@@ -5715,13 +5743,41 @@
           <w:lang w:val="en-US"/>
         </w:rPr>
       </w:pPr>
-      <w:r>
-        <w:rPr>
-          <w:sz w:val="24"/>
-          <w:szCs w:val="22"/>
-          <w:lang w:val="en-US"/>
-        </w:rPr>
-        <w:t>YourName_SeleniumDemos (Lakshmi_SeleniumDemos)</w:t>
+      <w:proofErr w:type="spellStart"/>
+      <w:r>
+        <w:rPr>
+          <w:sz w:val="24"/>
+          <w:szCs w:val="22"/>
+          <w:lang w:val="en-US"/>
+        </w:rPr>
+        <w:t>YourName_SeleniumDemos</w:t>
+      </w:r>
+      <w:proofErr w:type="spellEnd"/>
+      <w:r>
+        <w:rPr>
+          <w:sz w:val="24"/>
+          <w:szCs w:val="22"/>
+          <w:lang w:val="en-US"/>
+        </w:rPr>
+        <w:t xml:space="preserve"> (</w:t>
+      </w:r>
+      <w:proofErr w:type="spellStart"/>
+      <w:r>
+        <w:rPr>
+          <w:sz w:val="24"/>
+          <w:szCs w:val="22"/>
+          <w:lang w:val="en-US"/>
+        </w:rPr>
+        <w:t>Lakshmi_SeleniumDemos</w:t>
+      </w:r>
+      <w:proofErr w:type="spellEnd"/>
+      <w:r>
+        <w:rPr>
+          <w:sz w:val="24"/>
+          <w:szCs w:val="22"/>
+          <w:lang w:val="en-US"/>
+        </w:rPr>
+        <w:t>)</w:t>
       </w:r>
     </w:p>
     <w:p>
@@ -5795,7 +5851,25 @@
           <w:szCs w:val="22"/>
           <w:lang w:val="en-US"/>
         </w:rPr>
-        <w:t>Open selenium.dev website</w:t>
+        <w:t xml:space="preserve">Open </w:t>
+      </w:r>
+      <w:proofErr w:type="spellStart"/>
+      <w:r>
+        <w:rPr>
+          <w:sz w:val="24"/>
+          <w:szCs w:val="22"/>
+          <w:lang w:val="en-US"/>
+        </w:rPr>
+        <w:t>selenium.dev</w:t>
+      </w:r>
+      <w:proofErr w:type="spellEnd"/>
+      <w:r>
+        <w:rPr>
+          <w:sz w:val="24"/>
+          <w:szCs w:val="22"/>
+          <w:lang w:val="en-US"/>
+        </w:rPr>
+        <w:t xml:space="preserve"> website</w:t>
       </w:r>
     </w:p>
     <w:p>
@@ -6788,13 +6862,23 @@
           <w:lang w:val="en-US"/>
         </w:rPr>
       </w:pPr>
-      <w:r>
-        <w:rPr>
-          <w:sz w:val="24"/>
-          <w:szCs w:val="22"/>
-          <w:lang w:val="en-US"/>
-        </w:rPr>
-        <w:t xml:space="preserve">get() </w:t>
+      <w:proofErr w:type="gramStart"/>
+      <w:r>
+        <w:rPr>
+          <w:sz w:val="24"/>
+          <w:szCs w:val="22"/>
+          <w:lang w:val="en-US"/>
+        </w:rPr>
+        <w:t>get(</w:t>
+      </w:r>
+      <w:proofErr w:type="gramEnd"/>
+      <w:r>
+        <w:rPr>
+          <w:sz w:val="24"/>
+          <w:szCs w:val="22"/>
+          <w:lang w:val="en-US"/>
+        </w:rPr>
+        <w:t xml:space="preserve">) </w:t>
       </w:r>
       <w:r>
         <w:rPr>
@@ -6862,6 +6946,8 @@
           <w:lang w:val="en-US"/>
         </w:rPr>
       </w:pPr>
+      <w:proofErr w:type="spellStart"/>
+      <w:proofErr w:type="gramStart"/>
       <w:r>
         <w:rPr>
           <w:sz w:val="24"/>
@@ -6876,7 +6962,25 @@
           <w:szCs w:val="22"/>
           <w:lang w:val="en-US"/>
         </w:rPr>
-        <w:t xml:space="preserve">er.manage().window().maximize() </w:t>
+        <w:t>er.manage</w:t>
+      </w:r>
+      <w:proofErr w:type="spellEnd"/>
+      <w:r>
+        <w:rPr>
+          <w:sz w:val="24"/>
+          <w:szCs w:val="22"/>
+          <w:lang w:val="en-US"/>
+        </w:rPr>
+        <w:t>(</w:t>
+      </w:r>
+      <w:proofErr w:type="gramEnd"/>
+      <w:r>
+        <w:rPr>
+          <w:sz w:val="24"/>
+          <w:szCs w:val="22"/>
+          <w:lang w:val="en-US"/>
+        </w:rPr>
+        <w:t xml:space="preserve">).window().maximize() </w:t>
       </w:r>
       <w:r>
         <w:rPr>
@@ -6908,13 +7012,23 @@
           <w:lang w:val="en-US"/>
         </w:rPr>
       </w:pPr>
-      <w:r>
-        <w:rPr>
-          <w:sz w:val="24"/>
-          <w:szCs w:val="22"/>
-          <w:lang w:val="en-US"/>
-        </w:rPr>
-        <w:t xml:space="preserve">close() </w:t>
+      <w:proofErr w:type="gramStart"/>
+      <w:r>
+        <w:rPr>
+          <w:sz w:val="24"/>
+          <w:szCs w:val="22"/>
+          <w:lang w:val="en-US"/>
+        </w:rPr>
+        <w:t>close(</w:t>
+      </w:r>
+      <w:proofErr w:type="gramEnd"/>
+      <w:r>
+        <w:rPr>
+          <w:sz w:val="24"/>
+          <w:szCs w:val="22"/>
+          <w:lang w:val="en-US"/>
+        </w:rPr>
+        <w:t xml:space="preserve">) </w:t>
       </w:r>
       <w:r>
         <w:rPr>
@@ -6964,13 +7078,23 @@
           <w:lang w:val="en-US"/>
         </w:rPr>
       </w:pPr>
-      <w:r>
-        <w:rPr>
-          <w:sz w:val="24"/>
-          <w:szCs w:val="22"/>
-          <w:lang w:val="en-US"/>
-        </w:rPr>
-        <w:t xml:space="preserve">getTitle() </w:t>
+      <w:proofErr w:type="gramStart"/>
+      <w:r>
+        <w:rPr>
+          <w:sz w:val="24"/>
+          <w:szCs w:val="22"/>
+          <w:lang w:val="en-US"/>
+        </w:rPr>
+        <w:t>getTitle(</w:t>
+      </w:r>
+      <w:proofErr w:type="gramEnd"/>
+      <w:r>
+        <w:rPr>
+          <w:sz w:val="24"/>
+          <w:szCs w:val="22"/>
+          <w:lang w:val="en-US"/>
+        </w:rPr>
+        <w:t xml:space="preserve">) </w:t>
       </w:r>
       <w:r>
         <w:rPr>
@@ -7010,13 +7134,23 @@
           <w:lang w:val="en-US"/>
         </w:rPr>
       </w:pPr>
-      <w:r>
-        <w:rPr>
-          <w:sz w:val="24"/>
-          <w:szCs w:val="22"/>
-          <w:lang w:val="en-US"/>
-        </w:rPr>
-        <w:t xml:space="preserve">getCurrentUrl() </w:t>
+      <w:proofErr w:type="gramStart"/>
+      <w:r>
+        <w:rPr>
+          <w:sz w:val="24"/>
+          <w:szCs w:val="22"/>
+          <w:lang w:val="en-US"/>
+        </w:rPr>
+        <w:t>getCurrentUrl(</w:t>
+      </w:r>
+      <w:proofErr w:type="gramEnd"/>
+      <w:r>
+        <w:rPr>
+          <w:sz w:val="24"/>
+          <w:szCs w:val="22"/>
+          <w:lang w:val="en-US"/>
+        </w:rPr>
+        <w:t xml:space="preserve">) </w:t>
       </w:r>
       <w:r>
         <w:rPr>
@@ -7048,13 +7182,23 @@
           <w:lang w:val="en-US"/>
         </w:rPr>
       </w:pPr>
-      <w:r>
-        <w:rPr>
-          <w:sz w:val="24"/>
-          <w:szCs w:val="22"/>
-          <w:lang w:val="en-US"/>
-        </w:rPr>
-        <w:t xml:space="preserve">getPageSource() </w:t>
+      <w:proofErr w:type="gramStart"/>
+      <w:r>
+        <w:rPr>
+          <w:sz w:val="24"/>
+          <w:szCs w:val="22"/>
+          <w:lang w:val="en-US"/>
+        </w:rPr>
+        <w:t>getPageSource(</w:t>
+      </w:r>
+      <w:proofErr w:type="gramEnd"/>
+      <w:r>
+        <w:rPr>
+          <w:sz w:val="24"/>
+          <w:szCs w:val="22"/>
+          <w:lang w:val="en-US"/>
+        </w:rPr>
+        <w:t xml:space="preserve">) </w:t>
       </w:r>
       <w:r>
         <w:rPr>
@@ -7086,13 +7230,23 @@
           <w:lang w:val="en-US"/>
         </w:rPr>
       </w:pPr>
-      <w:r>
-        <w:rPr>
-          <w:sz w:val="24"/>
-          <w:szCs w:val="22"/>
-          <w:lang w:val="en-US"/>
-        </w:rPr>
-        <w:t xml:space="preserve">findElement() </w:t>
+      <w:proofErr w:type="gramStart"/>
+      <w:r>
+        <w:rPr>
+          <w:sz w:val="24"/>
+          <w:szCs w:val="22"/>
+          <w:lang w:val="en-US"/>
+        </w:rPr>
+        <w:t>findElement(</w:t>
+      </w:r>
+      <w:proofErr w:type="gramEnd"/>
+      <w:r>
+        <w:rPr>
+          <w:sz w:val="24"/>
+          <w:szCs w:val="22"/>
+          <w:lang w:val="en-US"/>
+        </w:rPr>
+        <w:t xml:space="preserve">) </w:t>
       </w:r>
       <w:r>
         <w:rPr>
@@ -7190,13 +7344,23 @@
           <w:lang w:val="en-US"/>
         </w:rPr>
       </w:pPr>
-      <w:r>
-        <w:rPr>
-          <w:sz w:val="24"/>
-          <w:szCs w:val="22"/>
-          <w:lang w:val="en-US"/>
-        </w:rPr>
-        <w:t xml:space="preserve">findElements() </w:t>
+      <w:proofErr w:type="gramStart"/>
+      <w:r>
+        <w:rPr>
+          <w:sz w:val="24"/>
+          <w:szCs w:val="22"/>
+          <w:lang w:val="en-US"/>
+        </w:rPr>
+        <w:t>findElements(</w:t>
+      </w:r>
+      <w:proofErr w:type="gramEnd"/>
+      <w:r>
+        <w:rPr>
+          <w:sz w:val="24"/>
+          <w:szCs w:val="22"/>
+          <w:lang w:val="en-US"/>
+        </w:rPr>
+        <w:t xml:space="preserve">) </w:t>
       </w:r>
       <w:r>
         <w:rPr>
@@ -7258,13 +7422,23 @@
           <w:lang w:val="en-US"/>
         </w:rPr>
       </w:pPr>
-      <w:r>
-        <w:rPr>
-          <w:sz w:val="24"/>
-          <w:szCs w:val="22"/>
-          <w:lang w:val="en-US"/>
-        </w:rPr>
-        <w:t xml:space="preserve">getWindowHandles() </w:t>
+      <w:proofErr w:type="gramStart"/>
+      <w:r>
+        <w:rPr>
+          <w:sz w:val="24"/>
+          <w:szCs w:val="22"/>
+          <w:lang w:val="en-US"/>
+        </w:rPr>
+        <w:t>getWindowHandles(</w:t>
+      </w:r>
+      <w:proofErr w:type="gramEnd"/>
+      <w:r>
+        <w:rPr>
+          <w:sz w:val="24"/>
+          <w:szCs w:val="22"/>
+          <w:lang w:val="en-US"/>
+        </w:rPr>
+        <w:t xml:space="preserve">) </w:t>
       </w:r>
       <w:r>
         <w:rPr>
@@ -7298,13 +7472,23 @@
           <w:lang w:val="en-US"/>
         </w:rPr>
       </w:pPr>
-      <w:r>
-        <w:rPr>
-          <w:sz w:val="24"/>
-          <w:szCs w:val="22"/>
-          <w:lang w:val="en-US"/>
-        </w:rPr>
-        <w:t xml:space="preserve">quit() </w:t>
+      <w:proofErr w:type="gramStart"/>
+      <w:r>
+        <w:rPr>
+          <w:sz w:val="24"/>
+          <w:szCs w:val="22"/>
+          <w:lang w:val="en-US"/>
+        </w:rPr>
+        <w:t>quit(</w:t>
+      </w:r>
+      <w:proofErr w:type="gramEnd"/>
+      <w:r>
+        <w:rPr>
+          <w:sz w:val="24"/>
+          <w:szCs w:val="22"/>
+          <w:lang w:val="en-US"/>
+        </w:rPr>
+        <w:t xml:space="preserve">) </w:t>
       </w:r>
       <w:r>
         <w:rPr>
@@ -7660,7 +7844,35 @@
           <w:szCs w:val="22"/>
           <w:lang w:val="en-US"/>
         </w:rPr>
-        <w:t xml:space="preserve"> Selenium waits for maximum 30 seconds till the page get loaded while calling driver.get(). But if the page is not getting loaded within 30 seconds then Selenium will throw SessionTimeoutException</w:t>
+        <w:t xml:space="preserve"> Selenium waits for maximum 30 seconds till the page get loaded while calling </w:t>
+      </w:r>
+      <w:proofErr w:type="spellStart"/>
+      <w:proofErr w:type="gramStart"/>
+      <w:r>
+        <w:rPr>
+          <w:sz w:val="24"/>
+          <w:szCs w:val="22"/>
+          <w:lang w:val="en-US"/>
+        </w:rPr>
+        <w:t>driver.get</w:t>
+      </w:r>
+      <w:proofErr w:type="spellEnd"/>
+      <w:r>
+        <w:rPr>
+          <w:sz w:val="24"/>
+          <w:szCs w:val="22"/>
+          <w:lang w:val="en-US"/>
+        </w:rPr>
+        <w:t>(</w:t>
+      </w:r>
+      <w:proofErr w:type="gramEnd"/>
+      <w:r>
+        <w:rPr>
+          <w:sz w:val="24"/>
+          <w:szCs w:val="22"/>
+          <w:lang w:val="en-US"/>
+        </w:rPr>
+        <w:t>). But if the page is not getting loaded within 30 seconds then Selenium will throw SessionTimeoutException</w:t>
       </w:r>
       <w:r>
         <w:rPr>
@@ -7900,13 +8112,23 @@
           <w:lang w:val="en-US"/>
         </w:rPr>
       </w:pPr>
-      <w:r>
-        <w:rPr>
-          <w:sz w:val="24"/>
-          <w:szCs w:val="22"/>
-          <w:lang w:val="en-US"/>
-        </w:rPr>
-        <w:t xml:space="preserve">sendKeys() </w:t>
+      <w:proofErr w:type="gramStart"/>
+      <w:r>
+        <w:rPr>
+          <w:sz w:val="24"/>
+          <w:szCs w:val="22"/>
+          <w:lang w:val="en-US"/>
+        </w:rPr>
+        <w:t>sendKeys(</w:t>
+      </w:r>
+      <w:proofErr w:type="gramEnd"/>
+      <w:r>
+        <w:rPr>
+          <w:sz w:val="24"/>
+          <w:szCs w:val="22"/>
+          <w:lang w:val="en-US"/>
+        </w:rPr>
+        <w:t xml:space="preserve">) </w:t>
       </w:r>
       <w:r>
         <w:rPr>
@@ -7956,13 +8178,23 @@
           <w:lang w:val="en-US"/>
         </w:rPr>
       </w:pPr>
-      <w:r>
-        <w:rPr>
-          <w:sz w:val="24"/>
-          <w:szCs w:val="22"/>
-          <w:lang w:val="en-US"/>
-        </w:rPr>
-        <w:t xml:space="preserve">click() </w:t>
+      <w:proofErr w:type="gramStart"/>
+      <w:r>
+        <w:rPr>
+          <w:sz w:val="24"/>
+          <w:szCs w:val="22"/>
+          <w:lang w:val="en-US"/>
+        </w:rPr>
+        <w:t>click(</w:t>
+      </w:r>
+      <w:proofErr w:type="gramEnd"/>
+      <w:r>
+        <w:rPr>
+          <w:sz w:val="24"/>
+          <w:szCs w:val="22"/>
+          <w:lang w:val="en-US"/>
+        </w:rPr>
+        <w:t xml:space="preserve">) </w:t>
       </w:r>
       <w:r>
         <w:rPr>
@@ -7994,13 +8226,23 @@
           <w:lang w:val="en-US"/>
         </w:rPr>
       </w:pPr>
-      <w:r>
-        <w:rPr>
-          <w:sz w:val="24"/>
-          <w:szCs w:val="22"/>
-          <w:lang w:val="en-US"/>
-        </w:rPr>
-        <w:t xml:space="preserve">getText() </w:t>
+      <w:proofErr w:type="gramStart"/>
+      <w:r>
+        <w:rPr>
+          <w:sz w:val="24"/>
+          <w:szCs w:val="22"/>
+          <w:lang w:val="en-US"/>
+        </w:rPr>
+        <w:t>getText(</w:t>
+      </w:r>
+      <w:proofErr w:type="gramEnd"/>
+      <w:r>
+        <w:rPr>
+          <w:sz w:val="24"/>
+          <w:szCs w:val="22"/>
+          <w:lang w:val="en-US"/>
+        </w:rPr>
+        <w:t xml:space="preserve">) </w:t>
       </w:r>
       <w:r>
         <w:rPr>
@@ -8070,13 +8312,23 @@
           <w:lang w:val="en-US"/>
         </w:rPr>
       </w:pPr>
-      <w:r>
-        <w:rPr>
-          <w:sz w:val="24"/>
-          <w:szCs w:val="22"/>
-          <w:lang w:val="en-US"/>
-        </w:rPr>
-        <w:t xml:space="preserve">isSelected() </w:t>
+      <w:proofErr w:type="gramStart"/>
+      <w:r>
+        <w:rPr>
+          <w:sz w:val="24"/>
+          <w:szCs w:val="22"/>
+          <w:lang w:val="en-US"/>
+        </w:rPr>
+        <w:t>isSelected(</w:t>
+      </w:r>
+      <w:proofErr w:type="gramEnd"/>
+      <w:r>
+        <w:rPr>
+          <w:sz w:val="24"/>
+          <w:szCs w:val="22"/>
+          <w:lang w:val="en-US"/>
+        </w:rPr>
+        <w:t xml:space="preserve">) </w:t>
       </w:r>
       <w:r>
         <w:rPr>
@@ -8108,13 +8360,23 @@
           <w:lang w:val="en-US"/>
         </w:rPr>
       </w:pPr>
-      <w:r>
-        <w:rPr>
-          <w:sz w:val="24"/>
-          <w:szCs w:val="22"/>
-          <w:lang w:val="en-US"/>
-        </w:rPr>
-        <w:t xml:space="preserve">isEnabled() </w:t>
+      <w:proofErr w:type="gramStart"/>
+      <w:r>
+        <w:rPr>
+          <w:sz w:val="24"/>
+          <w:szCs w:val="22"/>
+          <w:lang w:val="en-US"/>
+        </w:rPr>
+        <w:t>isEnabled(</w:t>
+      </w:r>
+      <w:proofErr w:type="gramEnd"/>
+      <w:r>
+        <w:rPr>
+          <w:sz w:val="24"/>
+          <w:szCs w:val="22"/>
+          <w:lang w:val="en-US"/>
+        </w:rPr>
+        <w:t xml:space="preserve">) </w:t>
       </w:r>
       <w:r>
         <w:rPr>
@@ -8146,13 +8408,23 @@
           <w:lang w:val="en-US"/>
         </w:rPr>
       </w:pPr>
-      <w:r>
-        <w:rPr>
-          <w:sz w:val="24"/>
-          <w:szCs w:val="22"/>
-          <w:lang w:val="en-US"/>
-        </w:rPr>
-        <w:t xml:space="preserve">isDisplayed() </w:t>
+      <w:proofErr w:type="gramStart"/>
+      <w:r>
+        <w:rPr>
+          <w:sz w:val="24"/>
+          <w:szCs w:val="22"/>
+          <w:lang w:val="en-US"/>
+        </w:rPr>
+        <w:t>isDisplayed(</w:t>
+      </w:r>
+      <w:proofErr w:type="gramEnd"/>
+      <w:r>
+        <w:rPr>
+          <w:sz w:val="24"/>
+          <w:szCs w:val="22"/>
+          <w:lang w:val="en-US"/>
+        </w:rPr>
+        <w:t xml:space="preserve">) </w:t>
       </w:r>
       <w:r>
         <w:rPr>
@@ -9428,7 +9700,25 @@
           <w:szCs w:val="22"/>
           <w:lang w:val="en-US"/>
         </w:rPr>
-        <w:t>//input[@type='password']</w:t>
+        <w:t>//</w:t>
+      </w:r>
+      <w:proofErr w:type="gramStart"/>
+      <w:r>
+        <w:rPr>
+          <w:sz w:val="24"/>
+          <w:szCs w:val="22"/>
+          <w:lang w:val="en-US"/>
+        </w:rPr>
+        <w:t>input[</w:t>
+      </w:r>
+      <w:proofErr w:type="gramEnd"/>
+      <w:r>
+        <w:rPr>
+          <w:sz w:val="24"/>
+          <w:szCs w:val="22"/>
+          <w:lang w:val="en-US"/>
+        </w:rPr>
+        <w:t>@type='password']</w:t>
       </w:r>
     </w:p>
     <w:p>
@@ -9560,13 +9850,23 @@
           <w:lang w:val="en-US"/>
         </w:rPr>
       </w:pPr>
-      <w:r>
-        <w:rPr>
-          <w:sz w:val="24"/>
-          <w:szCs w:val="22"/>
-          <w:lang w:val="en-US"/>
-        </w:rPr>
-        <w:t xml:space="preserve">getFirstSelectedOption() </w:t>
+      <w:proofErr w:type="gramStart"/>
+      <w:r>
+        <w:rPr>
+          <w:sz w:val="24"/>
+          <w:szCs w:val="22"/>
+          <w:lang w:val="en-US"/>
+        </w:rPr>
+        <w:t>getFirstSelectedOption(</w:t>
+      </w:r>
+      <w:proofErr w:type="gramEnd"/>
+      <w:r>
+        <w:rPr>
+          <w:sz w:val="24"/>
+          <w:szCs w:val="22"/>
+          <w:lang w:val="en-US"/>
+        </w:rPr>
+        <w:t xml:space="preserve">) </w:t>
       </w:r>
       <w:r>
         <w:rPr>
@@ -9608,13 +9908,23 @@
           <w:lang w:val="en-US"/>
         </w:rPr>
       </w:pPr>
-      <w:r>
-        <w:rPr>
-          <w:sz w:val="24"/>
-          <w:szCs w:val="22"/>
-          <w:lang w:val="en-US"/>
-        </w:rPr>
-        <w:t xml:space="preserve">getOptions() </w:t>
+      <w:proofErr w:type="gramStart"/>
+      <w:r>
+        <w:rPr>
+          <w:sz w:val="24"/>
+          <w:szCs w:val="22"/>
+          <w:lang w:val="en-US"/>
+        </w:rPr>
+        <w:t>getOptions(</w:t>
+      </w:r>
+      <w:proofErr w:type="gramEnd"/>
+      <w:r>
+        <w:rPr>
+          <w:sz w:val="24"/>
+          <w:szCs w:val="22"/>
+          <w:lang w:val="en-US"/>
+        </w:rPr>
+        <w:t xml:space="preserve">) </w:t>
       </w:r>
       <w:r>
         <w:rPr>
@@ -9648,13 +9958,23 @@
           <w:lang w:val="en-US"/>
         </w:rPr>
       </w:pPr>
-      <w:r>
-        <w:rPr>
-          <w:sz w:val="24"/>
-          <w:szCs w:val="22"/>
-          <w:lang w:val="en-US"/>
-        </w:rPr>
-        <w:t xml:space="preserve">selectByVisibleText() </w:t>
+      <w:proofErr w:type="gramStart"/>
+      <w:r>
+        <w:rPr>
+          <w:sz w:val="24"/>
+          <w:szCs w:val="22"/>
+          <w:lang w:val="en-US"/>
+        </w:rPr>
+        <w:t>selectByVisibleText(</w:t>
+      </w:r>
+      <w:proofErr w:type="gramEnd"/>
+      <w:r>
+        <w:rPr>
+          <w:sz w:val="24"/>
+          <w:szCs w:val="22"/>
+          <w:lang w:val="en-US"/>
+        </w:rPr>
+        <w:t xml:space="preserve">) </w:t>
       </w:r>
       <w:r>
         <w:rPr>
@@ -9688,13 +10008,23 @@
           <w:lang w:val="en-US"/>
         </w:rPr>
       </w:pPr>
-      <w:r>
-        <w:rPr>
-          <w:sz w:val="24"/>
-          <w:szCs w:val="22"/>
-          <w:lang w:val="en-US"/>
-        </w:rPr>
-        <w:t xml:space="preserve">selectByContainsVisibleText() </w:t>
+      <w:proofErr w:type="gramStart"/>
+      <w:r>
+        <w:rPr>
+          <w:sz w:val="24"/>
+          <w:szCs w:val="22"/>
+          <w:lang w:val="en-US"/>
+        </w:rPr>
+        <w:t>selectByContainsVisibleText(</w:t>
+      </w:r>
+      <w:proofErr w:type="gramEnd"/>
+      <w:r>
+        <w:rPr>
+          <w:sz w:val="24"/>
+          <w:szCs w:val="22"/>
+          <w:lang w:val="en-US"/>
+        </w:rPr>
+        <w:t xml:space="preserve">) </w:t>
       </w:r>
       <w:r>
         <w:rPr>
@@ -9728,13 +10058,23 @@
           <w:lang w:val="en-US"/>
         </w:rPr>
       </w:pPr>
-      <w:r>
-        <w:rPr>
-          <w:sz w:val="24"/>
-          <w:szCs w:val="22"/>
-          <w:lang w:val="en-US"/>
-        </w:rPr>
-        <w:t xml:space="preserve">selectByValue() </w:t>
+      <w:proofErr w:type="gramStart"/>
+      <w:r>
+        <w:rPr>
+          <w:sz w:val="24"/>
+          <w:szCs w:val="22"/>
+          <w:lang w:val="en-US"/>
+        </w:rPr>
+        <w:t>selectByValue(</w:t>
+      </w:r>
+      <w:proofErr w:type="gramEnd"/>
+      <w:r>
+        <w:rPr>
+          <w:sz w:val="24"/>
+          <w:szCs w:val="22"/>
+          <w:lang w:val="en-US"/>
+        </w:rPr>
+        <w:t xml:space="preserve">) </w:t>
       </w:r>
       <w:r>
         <w:rPr>
@@ -9768,6 +10108,7 @@
           <w:lang w:val="en-US"/>
         </w:rPr>
       </w:pPr>
+      <w:proofErr w:type="gramStart"/>
       <w:r>
         <w:rPr>
           <w:sz w:val="24"/>
@@ -9775,7 +10116,16 @@
           <w:lang w:val="en-US"/>
         </w:rPr>
         <w:lastRenderedPageBreak/>
-        <w:t xml:space="preserve">selectByIndex() </w:t>
+        <w:t>selectByIndex(</w:t>
+      </w:r>
+      <w:proofErr w:type="gramEnd"/>
+      <w:r>
+        <w:rPr>
+          <w:sz w:val="24"/>
+          <w:szCs w:val="22"/>
+          <w:lang w:val="en-US"/>
+        </w:rPr>
+        <w:t xml:space="preserve">) </w:t>
       </w:r>
       <w:r>
         <w:rPr>
@@ -9809,13 +10159,23 @@
           <w:lang w:val="en-US"/>
         </w:rPr>
       </w:pPr>
-      <w:r>
-        <w:rPr>
-          <w:sz w:val="24"/>
-          <w:szCs w:val="22"/>
-          <w:lang w:val="en-US"/>
-        </w:rPr>
-        <w:t xml:space="preserve">getAllSelectedOptions() </w:t>
+      <w:proofErr w:type="gramStart"/>
+      <w:r>
+        <w:rPr>
+          <w:sz w:val="24"/>
+          <w:szCs w:val="22"/>
+          <w:lang w:val="en-US"/>
+        </w:rPr>
+        <w:t>getAllSelectedOptions(</w:t>
+      </w:r>
+      <w:proofErr w:type="gramEnd"/>
+      <w:r>
+        <w:rPr>
+          <w:sz w:val="24"/>
+          <w:szCs w:val="22"/>
+          <w:lang w:val="en-US"/>
+        </w:rPr>
+        <w:t xml:space="preserve">) </w:t>
       </w:r>
       <w:r>
         <w:rPr>
@@ -9849,13 +10209,23 @@
           <w:lang w:val="en-US"/>
         </w:rPr>
       </w:pPr>
-      <w:r>
-        <w:rPr>
-          <w:sz w:val="24"/>
-          <w:szCs w:val="22"/>
-          <w:lang w:val="en-US"/>
-        </w:rPr>
-        <w:t xml:space="preserve">isMultiple() </w:t>
+      <w:proofErr w:type="gramStart"/>
+      <w:r>
+        <w:rPr>
+          <w:sz w:val="24"/>
+          <w:szCs w:val="22"/>
+          <w:lang w:val="en-US"/>
+        </w:rPr>
+        <w:t>isMultiple(</w:t>
+      </w:r>
+      <w:proofErr w:type="gramEnd"/>
+      <w:r>
+        <w:rPr>
+          <w:sz w:val="24"/>
+          <w:szCs w:val="22"/>
+          <w:lang w:val="en-US"/>
+        </w:rPr>
+        <w:t xml:space="preserve">) </w:t>
       </w:r>
       <w:r>
         <w:rPr>
@@ -10056,13 +10426,33 @@
           <w:lang w:val="en-US"/>
         </w:rPr>
       </w:pPr>
-      <w:r>
-        <w:rPr>
-          <w:sz w:val="24"/>
-          <w:szCs w:val="22"/>
-          <w:lang w:val="en-US"/>
-        </w:rPr>
-        <w:t>Thread.sleep()</w:t>
+      <w:proofErr w:type="spellStart"/>
+      <w:proofErr w:type="gramStart"/>
+      <w:r>
+        <w:rPr>
+          <w:sz w:val="24"/>
+          <w:szCs w:val="22"/>
+          <w:lang w:val="en-US"/>
+        </w:rPr>
+        <w:t>Thread.sleep</w:t>
+      </w:r>
+      <w:proofErr w:type="spellEnd"/>
+      <w:r>
+        <w:rPr>
+          <w:sz w:val="24"/>
+          <w:szCs w:val="22"/>
+          <w:lang w:val="en-US"/>
+        </w:rPr>
+        <w:t>(</w:t>
+      </w:r>
+      <w:proofErr w:type="gramEnd"/>
+      <w:r>
+        <w:rPr>
+          <w:sz w:val="24"/>
+          <w:szCs w:val="22"/>
+          <w:lang w:val="en-US"/>
+        </w:rPr>
+        <w:t>)</w:t>
       </w:r>
       <w:r>
         <w:rPr>
@@ -10518,13 +10908,23 @@
           <w:lang w:val="en-US"/>
         </w:rPr>
       </w:pPr>
-      <w:r>
-        <w:rPr>
-          <w:sz w:val="24"/>
-          <w:szCs w:val="22"/>
-          <w:lang w:val="en-US"/>
-        </w:rPr>
-        <w:t xml:space="preserve">i – ignoring </w:t>
+      <w:proofErr w:type="spellStart"/>
+      <w:r>
+        <w:rPr>
+          <w:sz w:val="24"/>
+          <w:szCs w:val="22"/>
+          <w:lang w:val="en-US"/>
+        </w:rPr>
+        <w:t>i</w:t>
+      </w:r>
+      <w:proofErr w:type="spellEnd"/>
+      <w:r>
+        <w:rPr>
+          <w:sz w:val="24"/>
+          <w:szCs w:val="22"/>
+          <w:lang w:val="en-US"/>
+        </w:rPr>
+        <w:t xml:space="preserve"> – ignoring </w:t>
       </w:r>
     </w:p>
     <w:p>
@@ -10849,7 +11249,25 @@
           <w:szCs w:val="22"/>
           <w:lang w:val="en-US"/>
         </w:rPr>
-        <w:t>&lt;table&gt;</w:t>
+        <w:t>&lt;</w:t>
+      </w:r>
+      <w:proofErr w:type="gramStart"/>
+      <w:r>
+        <w:rPr>
+          <w:sz w:val="24"/>
+          <w:szCs w:val="22"/>
+          <w:lang w:val="en-US"/>
+        </w:rPr>
+        <w:t>table</w:t>
+      </w:r>
+      <w:proofErr w:type="gramEnd"/>
+      <w:r>
+        <w:rPr>
+          <w:sz w:val="24"/>
+          <w:szCs w:val="22"/>
+          <w:lang w:val="en-US"/>
+        </w:rPr>
+        <w:t>&gt;</w:t>
       </w:r>
     </w:p>
     <w:p>
@@ -10867,7 +11285,27 @@
           <w:lang w:val="en-US"/>
         </w:rPr>
         <w:tab/>
-        <w:t>&lt;thead&gt;</w:t>
+        <w:t>&lt;</w:t>
+      </w:r>
+      <w:proofErr w:type="spellStart"/>
+      <w:proofErr w:type="gramStart"/>
+      <w:r>
+        <w:rPr>
+          <w:sz w:val="24"/>
+          <w:szCs w:val="22"/>
+          <w:lang w:val="en-US"/>
+        </w:rPr>
+        <w:t>thead</w:t>
+      </w:r>
+      <w:proofErr w:type="spellEnd"/>
+      <w:proofErr w:type="gramEnd"/>
+      <w:r>
+        <w:rPr>
+          <w:sz w:val="24"/>
+          <w:szCs w:val="22"/>
+          <w:lang w:val="en-US"/>
+        </w:rPr>
+        <w:t>&gt;</w:t>
       </w:r>
     </w:p>
     <w:p>
@@ -10893,7 +11331,27 @@
           <w:lang w:val="en-US"/>
         </w:rPr>
         <w:tab/>
-        <w:t>&lt;tr&gt;</w:t>
+        <w:t>&lt;</w:t>
+      </w:r>
+      <w:proofErr w:type="spellStart"/>
+      <w:proofErr w:type="gramStart"/>
+      <w:r>
+        <w:rPr>
+          <w:sz w:val="24"/>
+          <w:szCs w:val="22"/>
+          <w:lang w:val="en-US"/>
+        </w:rPr>
+        <w:t>tr</w:t>
+      </w:r>
+      <w:proofErr w:type="spellEnd"/>
+      <w:proofErr w:type="gramEnd"/>
+      <w:r>
+        <w:rPr>
+          <w:sz w:val="24"/>
+          <w:szCs w:val="22"/>
+          <w:lang w:val="en-US"/>
+        </w:rPr>
+        <w:t>&gt;</w:t>
       </w:r>
     </w:p>
     <w:p>
@@ -10927,7 +11385,53 @@
           <w:lang w:val="en-US"/>
         </w:rPr>
         <w:tab/>
-        <w:t>&lt;th&gt;Roll No&lt;/th&gt;</w:t>
+        <w:t>&lt;</w:t>
+      </w:r>
+      <w:proofErr w:type="spellStart"/>
+      <w:proofErr w:type="gramStart"/>
+      <w:r>
+        <w:rPr>
+          <w:sz w:val="24"/>
+          <w:szCs w:val="22"/>
+          <w:lang w:val="en-US"/>
+        </w:rPr>
+        <w:t>th</w:t>
+      </w:r>
+      <w:proofErr w:type="spellEnd"/>
+      <w:r>
+        <w:rPr>
+          <w:sz w:val="24"/>
+          <w:szCs w:val="22"/>
+          <w:lang w:val="en-US"/>
+        </w:rPr>
+        <w:t>&gt;</w:t>
+      </w:r>
+      <w:proofErr w:type="gramEnd"/>
+      <w:r>
+        <w:rPr>
+          <w:sz w:val="24"/>
+          <w:szCs w:val="22"/>
+          <w:lang w:val="en-US"/>
+        </w:rPr>
+        <w:t>Roll No&lt;/</w:t>
+      </w:r>
+      <w:proofErr w:type="spellStart"/>
+      <w:r>
+        <w:rPr>
+          <w:sz w:val="24"/>
+          <w:szCs w:val="22"/>
+          <w:lang w:val="en-US"/>
+        </w:rPr>
+        <w:t>th</w:t>
+      </w:r>
+      <w:proofErr w:type="spellEnd"/>
+      <w:r>
+        <w:rPr>
+          <w:sz w:val="24"/>
+          <w:szCs w:val="22"/>
+          <w:lang w:val="en-US"/>
+        </w:rPr>
+        <w:t>&gt;</w:t>
       </w:r>
     </w:p>
     <w:p>
@@ -10961,7 +11465,53 @@
           <w:lang w:val="en-US"/>
         </w:rPr>
         <w:tab/>
-        <w:t>&lt;th&gt;Name&lt;/th&gt;</w:t>
+        <w:t>&lt;</w:t>
+      </w:r>
+      <w:proofErr w:type="spellStart"/>
+      <w:proofErr w:type="gramStart"/>
+      <w:r>
+        <w:rPr>
+          <w:sz w:val="24"/>
+          <w:szCs w:val="22"/>
+          <w:lang w:val="en-US"/>
+        </w:rPr>
+        <w:t>th</w:t>
+      </w:r>
+      <w:proofErr w:type="spellEnd"/>
+      <w:r>
+        <w:rPr>
+          <w:sz w:val="24"/>
+          <w:szCs w:val="22"/>
+          <w:lang w:val="en-US"/>
+        </w:rPr>
+        <w:t>&gt;</w:t>
+      </w:r>
+      <w:proofErr w:type="gramEnd"/>
+      <w:r>
+        <w:rPr>
+          <w:sz w:val="24"/>
+          <w:szCs w:val="22"/>
+          <w:lang w:val="en-US"/>
+        </w:rPr>
+        <w:t>Name&lt;/</w:t>
+      </w:r>
+      <w:proofErr w:type="spellStart"/>
+      <w:r>
+        <w:rPr>
+          <w:sz w:val="24"/>
+          <w:szCs w:val="22"/>
+          <w:lang w:val="en-US"/>
+        </w:rPr>
+        <w:t>th</w:t>
+      </w:r>
+      <w:proofErr w:type="spellEnd"/>
+      <w:r>
+        <w:rPr>
+          <w:sz w:val="24"/>
+          <w:szCs w:val="22"/>
+          <w:lang w:val="en-US"/>
+        </w:rPr>
+        <w:t>&gt;</w:t>
       </w:r>
     </w:p>
     <w:p>
@@ -10987,7 +11537,27 @@
           <w:lang w:val="en-US"/>
         </w:rPr>
         <w:tab/>
-        <w:t>&lt;/tr&gt;</w:t>
+        <w:t>&lt;/</w:t>
+      </w:r>
+      <w:proofErr w:type="spellStart"/>
+      <w:proofErr w:type="gramStart"/>
+      <w:r>
+        <w:rPr>
+          <w:sz w:val="24"/>
+          <w:szCs w:val="22"/>
+          <w:lang w:val="en-US"/>
+        </w:rPr>
+        <w:t>tr</w:t>
+      </w:r>
+      <w:proofErr w:type="spellEnd"/>
+      <w:proofErr w:type="gramEnd"/>
+      <w:r>
+        <w:rPr>
+          <w:sz w:val="24"/>
+          <w:szCs w:val="22"/>
+          <w:lang w:val="en-US"/>
+        </w:rPr>
+        <w:t>&gt;</w:t>
       </w:r>
     </w:p>
     <w:p>
@@ -11005,7 +11575,25 @@
           <w:lang w:val="en-US"/>
         </w:rPr>
         <w:tab/>
-        <w:t>&lt;/thead&gt;</w:t>
+        <w:t>&lt;/</w:t>
+      </w:r>
+      <w:proofErr w:type="spellStart"/>
+      <w:r>
+        <w:rPr>
+          <w:sz w:val="24"/>
+          <w:szCs w:val="22"/>
+          <w:lang w:val="en-US"/>
+        </w:rPr>
+        <w:t>thead</w:t>
+      </w:r>
+      <w:proofErr w:type="spellEnd"/>
+      <w:r>
+        <w:rPr>
+          <w:sz w:val="24"/>
+          <w:szCs w:val="22"/>
+          <w:lang w:val="en-US"/>
+        </w:rPr>
+        <w:t>&gt;</w:t>
       </w:r>
     </w:p>
     <w:p>
@@ -11023,7 +11611,27 @@
           <w:lang w:val="en-US"/>
         </w:rPr>
         <w:tab/>
-        <w:t>&lt;tbody&gt;</w:t>
+        <w:t>&lt;</w:t>
+      </w:r>
+      <w:proofErr w:type="spellStart"/>
+      <w:proofErr w:type="gramStart"/>
+      <w:r>
+        <w:rPr>
+          <w:sz w:val="24"/>
+          <w:szCs w:val="22"/>
+          <w:lang w:val="en-US"/>
+        </w:rPr>
+        <w:t>tbody</w:t>
+      </w:r>
+      <w:proofErr w:type="spellEnd"/>
+      <w:proofErr w:type="gramEnd"/>
+      <w:r>
+        <w:rPr>
+          <w:sz w:val="24"/>
+          <w:szCs w:val="22"/>
+          <w:lang w:val="en-US"/>
+        </w:rPr>
+        <w:t>&gt;</w:t>
       </w:r>
     </w:p>
     <w:p>
@@ -11049,7 +11657,27 @@
           <w:lang w:val="en-US"/>
         </w:rPr>
         <w:tab/>
-        <w:t>&lt;tr&gt;</w:t>
+        <w:t>&lt;</w:t>
+      </w:r>
+      <w:proofErr w:type="spellStart"/>
+      <w:proofErr w:type="gramStart"/>
+      <w:r>
+        <w:rPr>
+          <w:sz w:val="24"/>
+          <w:szCs w:val="22"/>
+          <w:lang w:val="en-US"/>
+        </w:rPr>
+        <w:t>tr</w:t>
+      </w:r>
+      <w:proofErr w:type="spellEnd"/>
+      <w:proofErr w:type="gramEnd"/>
+      <w:r>
+        <w:rPr>
+          <w:sz w:val="24"/>
+          <w:szCs w:val="22"/>
+          <w:lang w:val="en-US"/>
+        </w:rPr>
+        <w:t>&gt;</w:t>
       </w:r>
     </w:p>
     <w:p>
@@ -11083,7 +11711,25 @@
           <w:lang w:val="en-US"/>
         </w:rPr>
         <w:tab/>
-        <w:t>&lt;td&gt;1&lt;/td&gt;</w:t>
+        <w:t>&lt;</w:t>
+      </w:r>
+      <w:proofErr w:type="gramStart"/>
+      <w:r>
+        <w:rPr>
+          <w:sz w:val="24"/>
+          <w:szCs w:val="22"/>
+          <w:lang w:val="en-US"/>
+        </w:rPr>
+        <w:t>td&gt;</w:t>
+      </w:r>
+      <w:proofErr w:type="gramEnd"/>
+      <w:r>
+        <w:rPr>
+          <w:sz w:val="24"/>
+          <w:szCs w:val="22"/>
+          <w:lang w:val="en-US"/>
+        </w:rPr>
+        <w:t>1&lt;/td&gt;</w:t>
       </w:r>
     </w:p>
     <w:p>
@@ -11117,7 +11763,35 @@
           <w:lang w:val="en-US"/>
         </w:rPr>
         <w:tab/>
-        <w:t>&lt;td&gt;Diksha&lt;/td</w:t>
+        <w:t>&lt;</w:t>
+      </w:r>
+      <w:proofErr w:type="gramStart"/>
+      <w:r>
+        <w:rPr>
+          <w:sz w:val="24"/>
+          <w:szCs w:val="22"/>
+          <w:lang w:val="en-US"/>
+        </w:rPr>
+        <w:t>td&gt;</w:t>
+      </w:r>
+      <w:proofErr w:type="spellStart"/>
+      <w:proofErr w:type="gramEnd"/>
+      <w:r>
+        <w:rPr>
+          <w:sz w:val="24"/>
+          <w:szCs w:val="22"/>
+          <w:lang w:val="en-US"/>
+        </w:rPr>
+        <w:t>Diksha</w:t>
+      </w:r>
+      <w:proofErr w:type="spellEnd"/>
+      <w:r>
+        <w:rPr>
+          <w:sz w:val="24"/>
+          <w:szCs w:val="22"/>
+          <w:lang w:val="en-US"/>
+        </w:rPr>
+        <w:t>&lt;/td</w:t>
       </w:r>
     </w:p>
     <w:p>
@@ -11143,7 +11817,27 @@
           <w:lang w:val="en-US"/>
         </w:rPr>
         <w:tab/>
-        <w:t>&lt;/tr&gt;</w:t>
+        <w:t>&lt;/</w:t>
+      </w:r>
+      <w:proofErr w:type="spellStart"/>
+      <w:proofErr w:type="gramStart"/>
+      <w:r>
+        <w:rPr>
+          <w:sz w:val="24"/>
+          <w:szCs w:val="22"/>
+          <w:lang w:val="en-US"/>
+        </w:rPr>
+        <w:t>tr</w:t>
+      </w:r>
+      <w:proofErr w:type="spellEnd"/>
+      <w:proofErr w:type="gramEnd"/>
+      <w:r>
+        <w:rPr>
+          <w:sz w:val="24"/>
+          <w:szCs w:val="22"/>
+          <w:lang w:val="en-US"/>
+        </w:rPr>
+        <w:t>&gt;</w:t>
       </w:r>
     </w:p>
     <w:p>
@@ -11169,7 +11863,27 @@
           <w:lang w:val="en-US"/>
         </w:rPr>
         <w:tab/>
-        <w:t>&lt;tr&gt;</w:t>
+        <w:t>&lt;</w:t>
+      </w:r>
+      <w:proofErr w:type="spellStart"/>
+      <w:proofErr w:type="gramStart"/>
+      <w:r>
+        <w:rPr>
+          <w:sz w:val="24"/>
+          <w:szCs w:val="22"/>
+          <w:lang w:val="en-US"/>
+        </w:rPr>
+        <w:t>tr</w:t>
+      </w:r>
+      <w:proofErr w:type="spellEnd"/>
+      <w:proofErr w:type="gramEnd"/>
+      <w:r>
+        <w:rPr>
+          <w:sz w:val="24"/>
+          <w:szCs w:val="22"/>
+          <w:lang w:val="en-US"/>
+        </w:rPr>
+        <w:t>&gt;</w:t>
       </w:r>
       <w:r>
         <w:rPr>
@@ -11211,7 +11925,25 @@
           <w:lang w:val="en-US"/>
         </w:rPr>
         <w:tab/>
-        <w:t>&lt;td&gt;2&lt;/td&gt;</w:t>
+        <w:t>&lt;</w:t>
+      </w:r>
+      <w:proofErr w:type="gramStart"/>
+      <w:r>
+        <w:rPr>
+          <w:sz w:val="24"/>
+          <w:szCs w:val="22"/>
+          <w:lang w:val="en-US"/>
+        </w:rPr>
+        <w:t>td&gt;</w:t>
+      </w:r>
+      <w:proofErr w:type="gramEnd"/>
+      <w:r>
+        <w:rPr>
+          <w:sz w:val="24"/>
+          <w:szCs w:val="22"/>
+          <w:lang w:val="en-US"/>
+        </w:rPr>
+        <w:t>2&lt;/td&gt;</w:t>
       </w:r>
     </w:p>
     <w:p>
@@ -11245,7 +11977,35 @@
           <w:lang w:val="en-US"/>
         </w:rPr>
         <w:tab/>
-        <w:t>&lt;td&gt;Dilshad&lt;/td&gt;</w:t>
+        <w:t>&lt;</w:t>
+      </w:r>
+      <w:proofErr w:type="gramStart"/>
+      <w:r>
+        <w:rPr>
+          <w:sz w:val="24"/>
+          <w:szCs w:val="22"/>
+          <w:lang w:val="en-US"/>
+        </w:rPr>
+        <w:t>td&gt;</w:t>
+      </w:r>
+      <w:proofErr w:type="spellStart"/>
+      <w:proofErr w:type="gramEnd"/>
+      <w:r>
+        <w:rPr>
+          <w:sz w:val="24"/>
+          <w:szCs w:val="22"/>
+          <w:lang w:val="en-US"/>
+        </w:rPr>
+        <w:t>Dilshad</w:t>
+      </w:r>
+      <w:proofErr w:type="spellEnd"/>
+      <w:r>
+        <w:rPr>
+          <w:sz w:val="24"/>
+          <w:szCs w:val="22"/>
+          <w:lang w:val="en-US"/>
+        </w:rPr>
+        <w:t>&lt;/td&gt;</w:t>
       </w:r>
     </w:p>
     <w:p>
@@ -11271,7 +12031,27 @@
           <w:lang w:val="en-US"/>
         </w:rPr>
         <w:tab/>
-        <w:t>&lt;/tr&gt;</w:t>
+        <w:t>&lt;/</w:t>
+      </w:r>
+      <w:proofErr w:type="spellStart"/>
+      <w:proofErr w:type="gramStart"/>
+      <w:r>
+        <w:rPr>
+          <w:sz w:val="24"/>
+          <w:szCs w:val="22"/>
+          <w:lang w:val="en-US"/>
+        </w:rPr>
+        <w:t>tr</w:t>
+      </w:r>
+      <w:proofErr w:type="spellEnd"/>
+      <w:proofErr w:type="gramEnd"/>
+      <w:r>
+        <w:rPr>
+          <w:sz w:val="24"/>
+          <w:szCs w:val="22"/>
+          <w:lang w:val="en-US"/>
+        </w:rPr>
+        <w:t>&gt;</w:t>
       </w:r>
     </w:p>
     <w:p>
@@ -11289,24 +12069,60 @@
           <w:lang w:val="en-US"/>
         </w:rPr>
         <w:tab/>
-        <w:t>&lt;/tbody&gt;</w:t>
-      </w:r>
-    </w:p>
-    <w:p>
-      <w:pPr>
-        <w:rPr>
-          <w:sz w:val="24"/>
-          <w:szCs w:val="22"/>
-          <w:lang w:val="en-US"/>
-        </w:rPr>
-      </w:pPr>
-      <w:r>
-        <w:rPr>
-          <w:sz w:val="24"/>
-          <w:szCs w:val="22"/>
-          <w:lang w:val="en-US"/>
-        </w:rPr>
-        <w:t>&lt;table&gt;</w:t>
+        <w:t>&lt;/</w:t>
+      </w:r>
+      <w:proofErr w:type="spellStart"/>
+      <w:r>
+        <w:rPr>
+          <w:sz w:val="24"/>
+          <w:szCs w:val="22"/>
+          <w:lang w:val="en-US"/>
+        </w:rPr>
+        <w:t>tbody</w:t>
+      </w:r>
+      <w:proofErr w:type="spellEnd"/>
+      <w:r>
+        <w:rPr>
+          <w:sz w:val="24"/>
+          <w:szCs w:val="22"/>
+          <w:lang w:val="en-US"/>
+        </w:rPr>
+        <w:t>&gt;</w:t>
+      </w:r>
+    </w:p>
+    <w:p>
+      <w:pPr>
+        <w:rPr>
+          <w:sz w:val="24"/>
+          <w:szCs w:val="22"/>
+          <w:lang w:val="en-US"/>
+        </w:rPr>
+      </w:pPr>
+      <w:r>
+        <w:rPr>
+          <w:sz w:val="24"/>
+          <w:szCs w:val="22"/>
+          <w:lang w:val="en-US"/>
+        </w:rPr>
+        <w:t>&lt;</w:t>
+      </w:r>
+      <w:proofErr w:type="gramStart"/>
+      <w:r>
+        <w:rPr>
+          <w:sz w:val="24"/>
+          <w:szCs w:val="22"/>
+          <w:lang w:val="en-US"/>
+        </w:rPr>
+        <w:t>table</w:t>
+      </w:r>
+      <w:proofErr w:type="gramEnd"/>
+      <w:r>
+        <w:rPr>
+          <w:sz w:val="24"/>
+          <w:szCs w:val="22"/>
+          <w:lang w:val="en-US"/>
+        </w:rPr>
+        <w:t>&gt;</w:t>
       </w:r>
     </w:p>
     <w:p>
@@ -11381,7 +12197,43 @@
           <w:szCs w:val="22"/>
           <w:lang w:val="en-US"/>
         </w:rPr>
-        <w:t>To upload any file on such control simply call .sendKeys() method on this control. And pass the path of file as a parameter to sendKeys() method.</w:t>
+        <w:t>To upload any file on such control simply call .</w:t>
+      </w:r>
+      <w:proofErr w:type="gramStart"/>
+      <w:r>
+        <w:rPr>
+          <w:sz w:val="24"/>
+          <w:szCs w:val="22"/>
+          <w:lang w:val="en-US"/>
+        </w:rPr>
+        <w:t>sendKeys(</w:t>
+      </w:r>
+      <w:proofErr w:type="gramEnd"/>
+      <w:r>
+        <w:rPr>
+          <w:sz w:val="24"/>
+          <w:szCs w:val="22"/>
+          <w:lang w:val="en-US"/>
+        </w:rPr>
+        <w:t xml:space="preserve">) method on this control. And pass the path of file as a parameter to </w:t>
+      </w:r>
+      <w:proofErr w:type="gramStart"/>
+      <w:r>
+        <w:rPr>
+          <w:sz w:val="24"/>
+          <w:szCs w:val="22"/>
+          <w:lang w:val="en-US"/>
+        </w:rPr>
+        <w:t>sendKeys(</w:t>
+      </w:r>
+      <w:proofErr w:type="gramEnd"/>
+      <w:r>
+        <w:rPr>
+          <w:sz w:val="24"/>
+          <w:szCs w:val="22"/>
+          <w:lang w:val="en-US"/>
+        </w:rPr>
+        <w:t>) method.</w:t>
       </w:r>
     </w:p>
     <w:p>
@@ -11876,13 +12728,23 @@
           <w:lang w:val="en-US"/>
         </w:rPr>
       </w:pPr>
-      <w:r>
-        <w:rPr>
-          <w:sz w:val="24"/>
-          <w:szCs w:val="22"/>
-          <w:lang w:val="en-US"/>
-        </w:rPr>
-        <w:t xml:space="preserve">driver.switchTo().alert() </w:t>
+      <w:proofErr w:type="spellStart"/>
+      <w:r>
+        <w:rPr>
+          <w:sz w:val="24"/>
+          <w:szCs w:val="22"/>
+          <w:lang w:val="en-US"/>
+        </w:rPr>
+        <w:t>driver.switchTo</w:t>
+      </w:r>
+      <w:proofErr w:type="spellEnd"/>
+      <w:r>
+        <w:rPr>
+          <w:sz w:val="24"/>
+          <w:szCs w:val="22"/>
+          <w:lang w:val="en-US"/>
+        </w:rPr>
+        <w:t xml:space="preserve">().alert() </w:t>
       </w:r>
       <w:r>
         <w:rPr>
@@ -12028,13 +12890,23 @@
           <w:lang w:val="en-US"/>
         </w:rPr>
       </w:pPr>
-      <w:r>
-        <w:rPr>
-          <w:sz w:val="24"/>
-          <w:szCs w:val="22"/>
-          <w:lang w:val="en-US"/>
-        </w:rPr>
-        <w:t xml:space="preserve">sendKeys() </w:t>
+      <w:proofErr w:type="gramStart"/>
+      <w:r>
+        <w:rPr>
+          <w:sz w:val="24"/>
+          <w:szCs w:val="22"/>
+          <w:lang w:val="en-US"/>
+        </w:rPr>
+        <w:t>sendKeys(</w:t>
+      </w:r>
+      <w:proofErr w:type="gramEnd"/>
+      <w:r>
+        <w:rPr>
+          <w:sz w:val="24"/>
+          <w:szCs w:val="22"/>
+          <w:lang w:val="en-US"/>
+        </w:rPr>
+        <w:t xml:space="preserve">) </w:t>
       </w:r>
       <w:r>
         <w:rPr>
@@ -12284,13 +13156,23 @@
           <w:lang w:val="en-US"/>
         </w:rPr>
       </w:pPr>
-      <w:r>
-        <w:rPr>
-          <w:sz w:val="24"/>
-          <w:szCs w:val="22"/>
-          <w:lang w:val="en-US"/>
-        </w:rPr>
-        <w:t xml:space="preserve">moveToElement() </w:t>
+      <w:proofErr w:type="gramStart"/>
+      <w:r>
+        <w:rPr>
+          <w:sz w:val="24"/>
+          <w:szCs w:val="22"/>
+          <w:lang w:val="en-US"/>
+        </w:rPr>
+        <w:t>moveToElement(</w:t>
+      </w:r>
+      <w:proofErr w:type="gramEnd"/>
+      <w:r>
+        <w:rPr>
+          <w:sz w:val="24"/>
+          <w:szCs w:val="22"/>
+          <w:lang w:val="en-US"/>
+        </w:rPr>
+        <w:t xml:space="preserve">) </w:t>
       </w:r>
       <w:r>
         <w:rPr>
@@ -12322,13 +13204,23 @@
           <w:lang w:val="en-US"/>
         </w:rPr>
       </w:pPr>
-      <w:r>
-        <w:rPr>
-          <w:sz w:val="24"/>
-          <w:szCs w:val="22"/>
-          <w:lang w:val="en-US"/>
-        </w:rPr>
-        <w:t xml:space="preserve">perform() </w:t>
+      <w:proofErr w:type="gramStart"/>
+      <w:r>
+        <w:rPr>
+          <w:sz w:val="24"/>
+          <w:szCs w:val="22"/>
+          <w:lang w:val="en-US"/>
+        </w:rPr>
+        <w:t>perform(</w:t>
+      </w:r>
+      <w:proofErr w:type="gramEnd"/>
+      <w:r>
+        <w:rPr>
+          <w:sz w:val="24"/>
+          <w:szCs w:val="22"/>
+          <w:lang w:val="en-US"/>
+        </w:rPr>
+        <w:t xml:space="preserve">) </w:t>
       </w:r>
       <w:r>
         <w:rPr>
@@ -12589,7 +13481,25 @@
           <w:szCs w:val="22"/>
           <w:lang w:val="en-US"/>
         </w:rPr>
-        <w:t xml:space="preserve"> which will make automation testing more easy.</w:t>
+        <w:t xml:space="preserve"> which will make automation testing more </w:t>
+      </w:r>
+      <w:proofErr w:type="gramStart"/>
+      <w:r>
+        <w:rPr>
+          <w:sz w:val="24"/>
+          <w:szCs w:val="22"/>
+          <w:lang w:val="en-US"/>
+        </w:rPr>
+        <w:t>easy</w:t>
+      </w:r>
+      <w:proofErr w:type="gramEnd"/>
+      <w:r>
+        <w:rPr>
+          <w:sz w:val="24"/>
+          <w:szCs w:val="22"/>
+          <w:lang w:val="en-US"/>
+        </w:rPr>
+        <w:t>.</w:t>
       </w:r>
     </w:p>
     <w:p>
@@ -13287,7 +14197,24 @@
           <w:lang w:val="en-US"/>
         </w:rPr>
         <w:br/>
-        <w:t xml:space="preserve">By default all tests are having priority as 0 (zero). </w:t>
+      </w:r>
+      <w:proofErr w:type="gramStart"/>
+      <w:r>
+        <w:rPr>
+          <w:sz w:val="24"/>
+          <w:szCs w:val="22"/>
+          <w:lang w:val="en-US"/>
+        </w:rPr>
+        <w:t>By</w:t>
+      </w:r>
+      <w:proofErr w:type="gramEnd"/>
+      <w:r>
+        <w:rPr>
+          <w:sz w:val="24"/>
+          <w:szCs w:val="22"/>
+          <w:lang w:val="en-US"/>
+        </w:rPr>
+        <w:t xml:space="preserve"> default all tests are having priority as 0 (zero). </w:t>
       </w:r>
       <w:r>
         <w:rPr>
@@ -14030,8 +14957,6 @@
         <w:tab/>
         <w:t>Test 3</w:t>
       </w:r>
-      <w:bookmarkStart w:id="0" w:name="_GoBack"/>
-      <w:bookmarkEnd w:id="0"/>
     </w:p>
     <w:p>
       <w:pPr>
@@ -14264,7 +15189,31 @@
           <w:szCs w:val="22"/>
           <w:lang w:val="en-US"/>
         </w:rPr>
-        <w:t>??</w:t>
+        <w:t>Hard Assertion (Assertion)</w:t>
+      </w:r>
+    </w:p>
+    <w:p>
+      <w:pPr>
+        <w:pStyle w:val="ListParagraph"/>
+        <w:numPr>
+          <w:ilvl w:val="2"/>
+          <w:numId w:val="38"/>
+        </w:numPr>
+        <w:rPr>
+          <w:b/>
+          <w:bCs/>
+          <w:sz w:val="24"/>
+          <w:szCs w:val="22"/>
+          <w:lang w:val="en-US"/>
+        </w:rPr>
+      </w:pPr>
+      <w:r>
+        <w:rPr>
+          <w:sz w:val="24"/>
+          <w:szCs w:val="22"/>
+          <w:lang w:val="en-US"/>
+        </w:rPr>
+        <w:t>Will terminates the execution of test case if assertion is fail.</w:t>
       </w:r>
     </w:p>
     <w:p>
@@ -14288,7 +15237,31 @@
           <w:szCs w:val="22"/>
           <w:lang w:val="en-US"/>
         </w:rPr>
-        <w:t>??</w:t>
+        <w:t>Soft Assertion (Verify)</w:t>
+      </w:r>
+    </w:p>
+    <w:p>
+      <w:pPr>
+        <w:pStyle w:val="ListParagraph"/>
+        <w:numPr>
+          <w:ilvl w:val="2"/>
+          <w:numId w:val="38"/>
+        </w:numPr>
+        <w:rPr>
+          <w:b/>
+          <w:bCs/>
+          <w:sz w:val="24"/>
+          <w:szCs w:val="22"/>
+          <w:lang w:val="en-US"/>
+        </w:rPr>
+      </w:pPr>
+      <w:r>
+        <w:rPr>
+          <w:sz w:val="24"/>
+          <w:szCs w:val="22"/>
+          <w:lang w:val="en-US"/>
+        </w:rPr>
+        <w:t>Will not terminate the execution and Exception will be thrown when you are calling AssertAll() method</w:t>
       </w:r>
     </w:p>
     <w:p>
@@ -14499,17 +15472,72 @@
     </w:p>
     <w:p>
       <w:pPr>
-        <w:pStyle w:val="ListParagraph"/>
-        <w:numPr>
-          <w:ilvl w:val="1"/>
-          <w:numId w:val="39"/>
-        </w:numPr>
-        <w:rPr>
-          <w:sz w:val="24"/>
-          <w:szCs w:val="22"/>
-          <w:lang w:val="en-US"/>
-        </w:rPr>
-      </w:pPr>
+        <w:rPr>
+          <w:sz w:val="24"/>
+          <w:szCs w:val="22"/>
+          <w:lang w:val="en-US"/>
+        </w:rPr>
+      </w:pPr>
+    </w:p>
+    <w:p>
+      <w:pPr>
+        <w:rPr>
+          <w:sz w:val="24"/>
+          <w:szCs w:val="22"/>
+          <w:lang w:val="en-US"/>
+        </w:rPr>
+      </w:pPr>
+      <w:r>
+        <w:rPr>
+          <w:noProof/>
+          <w:lang w:eastAsia="en-IN"/>
+        </w:rPr>
+        <w:lastRenderedPageBreak/>
+        <w:drawing>
+          <wp:inline distT="0" distB="0" distL="0" distR="0" wp14:anchorId="31A2B8F4" wp14:editId="3B33B378">
+            <wp:extent cx="5219700" cy="3115206"/>
+            <wp:effectExtent l="0" t="0" r="0" b="9525"/>
+            <wp:docPr id="3" name="Picture 3"/>
+            <wp:cNvGraphicFramePr>
+              <a:graphicFrameLocks xmlns:a="http://schemas.openxmlformats.org/drawingml/2006/main" noChangeAspect="1"/>
+            </wp:cNvGraphicFramePr>
+            <a:graphic xmlns:a="http://schemas.openxmlformats.org/drawingml/2006/main">
+              <a:graphicData uri="http://schemas.openxmlformats.org/drawingml/2006/picture">
+                <pic:pic xmlns:pic="http://schemas.openxmlformats.org/drawingml/2006/picture">
+                  <pic:nvPicPr>
+                    <pic:cNvPr id="1" name=""/>
+                    <pic:cNvPicPr/>
+                  </pic:nvPicPr>
+                  <pic:blipFill rotWithShape="1">
+                    <a:blip r:embed="rId12"/>
+                    <a:srcRect l="23931" t="18915" r="13417" b="14582"/>
+                    <a:stretch/>
+                  </pic:blipFill>
+                  <pic:spPr bwMode="auto">
+                    <a:xfrm>
+                      <a:off x="0" y="0"/>
+                      <a:ext cx="5240139" cy="3127404"/>
+                    </a:xfrm>
+                    <a:prstGeom prst="rect">
+                      <a:avLst/>
+                    </a:prstGeom>
+                    <a:ln>
+                      <a:noFill/>
+                    </a:ln>
+                    <a:extLst>
+                      <a:ext uri="{53640926-AAD7-44D8-BBD7-CCE9431645EC}">
+                        <a14:shadowObscured xmlns:a14="http://schemas.microsoft.com/office/drawing/2010/main"/>
+                      </a:ext>
+                    </a:extLst>
+                  </pic:spPr>
+                </pic:pic>
+              </a:graphicData>
+            </a:graphic>
+          </wp:inline>
+        </w:drawing>
+      </w:r>
+      <w:bookmarkStart w:id="0" w:name="_GoBack"/>
+      <w:bookmarkEnd w:id="0"/>
     </w:p>
     <w:sectPr>
       <w:pgSz w:w="11906" w:h="16838"/>
@@ -15897,7 +16925,7 @@
         <w:rFonts w:ascii="Courier New" w:hAnsi="Courier New" w:cs="Courier New" w:hint="default"/>
       </w:rPr>
     </w:lvl>
-    <w:lvl w:ilvl="2" w:tplc="40090005" w:tentative="1">
+    <w:lvl w:ilvl="2" w:tplc="40090005">
       <w:start w:val="1"/>
       <w:numFmt w:val="bullet"/>
       <w:lvlText w:val=""/>
@@ -20231,31 +21259,31 @@
     </dgm:pt>
   </dgm:ptLst>
   <dgm:cxnLst>
-    <dgm:cxn modelId="{2ECBD648-F8A6-41F9-B9A5-5DDEFF24877D}" type="presOf" srcId="{B2F67260-32B4-49EF-BEA7-6376ABEBC356}" destId="{45B120D8-A283-4DB0-AE48-CD1028B5A1CA}" srcOrd="0" destOrd="0" presId="urn:microsoft.com/office/officeart/2005/8/layout/process1"/>
-    <dgm:cxn modelId="{0C5D2741-46E1-4BF1-B0BC-645E981C46A2}" type="presOf" srcId="{2F2C6037-AE48-4650-B998-EBABF88D0464}" destId="{ABB6D0E9-231F-49FF-8F6A-CBD756BB2A07}" srcOrd="0" destOrd="0" presId="urn:microsoft.com/office/officeart/2005/8/layout/process1"/>
-    <dgm:cxn modelId="{A1ADD528-398F-48C5-B7E2-19CC9C4DBB4C}" type="presOf" srcId="{B0DAEDAB-33B3-4821-A91B-D05361312CE9}" destId="{FCE3B9A4-214A-4502-B3DF-ACB3E0BC61C7}" srcOrd="0" destOrd="0" presId="urn:microsoft.com/office/officeart/2005/8/layout/process1"/>
-    <dgm:cxn modelId="{73405E2C-33B9-4A51-AFA5-455F5D87D133}" type="presOf" srcId="{CB734D05-6005-4A33-891F-8F6E9F0BE629}" destId="{9346448E-7772-4989-9A73-02FD2DA61B93}" srcOrd="0" destOrd="0" presId="urn:microsoft.com/office/officeart/2005/8/layout/process1"/>
+    <dgm:cxn modelId="{5A74D654-12CC-4E06-8621-AEF421C840DD}" type="presOf" srcId="{D4DE5EA1-C98A-4001-96ED-0D8A4099152C}" destId="{CA09568C-529F-4056-BB14-75FC27EA3A57}" srcOrd="0" destOrd="0" presId="urn:microsoft.com/office/officeart/2005/8/layout/process1"/>
     <dgm:cxn modelId="{916CD402-046A-49C3-919C-E8874C6452BD}" srcId="{C787D0C9-C4AA-4BF8-AAA9-EFDCDDDFB8C5}" destId="{B0DAEDAB-33B3-4821-A91B-D05361312CE9}" srcOrd="3" destOrd="0" parTransId="{1B396FDD-FE98-44AA-BBFD-EFDF9B52D4CD}" sibTransId="{2689B6F1-8FF1-4D68-9639-E8E505EA5AB0}"/>
-    <dgm:cxn modelId="{4C3A073C-A19C-4E19-88E7-500E367BC93A}" type="presOf" srcId="{58F8E6FA-8E5F-4590-8E91-7D425686736E}" destId="{38F30BB8-19AC-4F2C-997E-D6C87643D812}" srcOrd="1" destOrd="0" presId="urn:microsoft.com/office/officeart/2005/8/layout/process1"/>
-    <dgm:cxn modelId="{D878DECF-7C14-4B0C-B9B9-516C074A2A02}" type="presOf" srcId="{C6470392-B547-42B7-BBE1-49D9BF3297A5}" destId="{E6A79763-2175-4FE6-AF39-65BAD7E8A94D}" srcOrd="0" destOrd="0" presId="urn:microsoft.com/office/officeart/2005/8/layout/process1"/>
+    <dgm:cxn modelId="{A988C70E-225B-4A4F-8747-7124EA2DA6E3}" type="presOf" srcId="{B2F67260-32B4-49EF-BEA7-6376ABEBC356}" destId="{45B120D8-A283-4DB0-AE48-CD1028B5A1CA}" srcOrd="0" destOrd="0" presId="urn:microsoft.com/office/officeart/2005/8/layout/process1"/>
+    <dgm:cxn modelId="{9C130AD9-60E3-4C76-9E91-534C97217FF3}" type="presOf" srcId="{CB734D05-6005-4A33-891F-8F6E9F0BE629}" destId="{9346448E-7772-4989-9A73-02FD2DA61B93}" srcOrd="0" destOrd="0" presId="urn:microsoft.com/office/officeart/2005/8/layout/process1"/>
+    <dgm:cxn modelId="{53198675-A76A-4550-BCD6-BC9F5F28219B}" type="presOf" srcId="{C787D0C9-C4AA-4BF8-AAA9-EFDCDDDFB8C5}" destId="{ECE2E50F-1EF0-49E9-A2A2-C09D34379E86}" srcOrd="0" destOrd="0" presId="urn:microsoft.com/office/officeart/2005/8/layout/process1"/>
     <dgm:cxn modelId="{407416C7-D9A4-49CF-A1D9-63129D12A5E9}" srcId="{C787D0C9-C4AA-4BF8-AAA9-EFDCDDDFB8C5}" destId="{B2F67260-32B4-49EF-BEA7-6376ABEBC356}" srcOrd="1" destOrd="0" parTransId="{452FD36E-8C97-458A-9189-BC15B3E0AB1F}" sibTransId="{58F8E6FA-8E5F-4590-8E91-7D425686736E}"/>
+    <dgm:cxn modelId="{44C3CB94-77BC-4F34-A4B2-525FEE31D8BC}" type="presOf" srcId="{B0DAEDAB-33B3-4821-A91B-D05361312CE9}" destId="{FCE3B9A4-214A-4502-B3DF-ACB3E0BC61C7}" srcOrd="0" destOrd="0" presId="urn:microsoft.com/office/officeart/2005/8/layout/process1"/>
     <dgm:cxn modelId="{F27277EA-BDDA-4005-9170-FBB0A209E462}" srcId="{C787D0C9-C4AA-4BF8-AAA9-EFDCDDDFB8C5}" destId="{CB734D05-6005-4A33-891F-8F6E9F0BE629}" srcOrd="0" destOrd="0" parTransId="{D88A1106-7499-4EC1-A955-12C926757BDC}" sibTransId="{2F2C6037-AE48-4650-B998-EBABF88D0464}"/>
+    <dgm:cxn modelId="{F074FF38-7937-451A-9B80-7DDEFC6CD546}" type="presOf" srcId="{2F2C6037-AE48-4650-B998-EBABF88D0464}" destId="{ABB6D0E9-231F-49FF-8F6A-CBD756BB2A07}" srcOrd="0" destOrd="0" presId="urn:microsoft.com/office/officeart/2005/8/layout/process1"/>
     <dgm:cxn modelId="{A358B1AA-45ED-4C0A-A925-911C6E3E177E}" srcId="{C787D0C9-C4AA-4BF8-AAA9-EFDCDDDFB8C5}" destId="{D4DE5EA1-C98A-4001-96ED-0D8A4099152C}" srcOrd="2" destOrd="0" parTransId="{DDD45587-67C2-4B3F-892B-0153C2E010D0}" sibTransId="{C6470392-B547-42B7-BBE1-49D9BF3297A5}"/>
-    <dgm:cxn modelId="{D87E3C4F-E11D-45C6-9F69-D0C081905656}" type="presOf" srcId="{58F8E6FA-8E5F-4590-8E91-7D425686736E}" destId="{1C61394E-D32F-4A43-ADD4-F46D3A33D38F}" srcOrd="0" destOrd="0" presId="urn:microsoft.com/office/officeart/2005/8/layout/process1"/>
-    <dgm:cxn modelId="{769A1C9D-169C-4716-963D-0C406D2002F5}" type="presOf" srcId="{D4DE5EA1-C98A-4001-96ED-0D8A4099152C}" destId="{CA09568C-529F-4056-BB14-75FC27EA3A57}" srcOrd="0" destOrd="0" presId="urn:microsoft.com/office/officeart/2005/8/layout/process1"/>
-    <dgm:cxn modelId="{2483787B-5F72-4AB1-BA1C-DDCA90B5C70E}" type="presOf" srcId="{C787D0C9-C4AA-4BF8-AAA9-EFDCDDDFB8C5}" destId="{ECE2E50F-1EF0-49E9-A2A2-C09D34379E86}" srcOrd="0" destOrd="0" presId="urn:microsoft.com/office/officeart/2005/8/layout/process1"/>
-    <dgm:cxn modelId="{8EB2C626-4F32-4452-A9D9-BCBF37DE34C8}" type="presOf" srcId="{C6470392-B547-42B7-BBE1-49D9BF3297A5}" destId="{D17F71C8-684F-40E9-B9CF-89D188A27816}" srcOrd="1" destOrd="0" presId="urn:microsoft.com/office/officeart/2005/8/layout/process1"/>
-    <dgm:cxn modelId="{FAD13037-3F61-48E0-BD27-DAD45F08C091}" type="presOf" srcId="{2F2C6037-AE48-4650-B998-EBABF88D0464}" destId="{8D8E620F-A309-4628-986D-B0F92ABF739C}" srcOrd="1" destOrd="0" presId="urn:microsoft.com/office/officeart/2005/8/layout/process1"/>
-    <dgm:cxn modelId="{15475C0D-30BC-4459-8AC1-8AC39E9C73AC}" type="presParOf" srcId="{ECE2E50F-1EF0-49E9-A2A2-C09D34379E86}" destId="{9346448E-7772-4989-9A73-02FD2DA61B93}" srcOrd="0" destOrd="0" presId="urn:microsoft.com/office/officeart/2005/8/layout/process1"/>
-    <dgm:cxn modelId="{0284457B-DEB1-4B5A-A67F-0A13C0D139FC}" type="presParOf" srcId="{ECE2E50F-1EF0-49E9-A2A2-C09D34379E86}" destId="{ABB6D0E9-231F-49FF-8F6A-CBD756BB2A07}" srcOrd="1" destOrd="0" presId="urn:microsoft.com/office/officeart/2005/8/layout/process1"/>
-    <dgm:cxn modelId="{E92408DE-E0C9-4BE2-8BEB-3E738CAFA001}" type="presParOf" srcId="{ABB6D0E9-231F-49FF-8F6A-CBD756BB2A07}" destId="{8D8E620F-A309-4628-986D-B0F92ABF739C}" srcOrd="0" destOrd="0" presId="urn:microsoft.com/office/officeart/2005/8/layout/process1"/>
-    <dgm:cxn modelId="{6FDC089F-E8A9-4514-8371-3B65F570B306}" type="presParOf" srcId="{ECE2E50F-1EF0-49E9-A2A2-C09D34379E86}" destId="{45B120D8-A283-4DB0-AE48-CD1028B5A1CA}" srcOrd="2" destOrd="0" presId="urn:microsoft.com/office/officeart/2005/8/layout/process1"/>
-    <dgm:cxn modelId="{05C2919C-8E3A-40D2-AF80-BC0EFE6E73DD}" type="presParOf" srcId="{ECE2E50F-1EF0-49E9-A2A2-C09D34379E86}" destId="{1C61394E-D32F-4A43-ADD4-F46D3A33D38F}" srcOrd="3" destOrd="0" presId="urn:microsoft.com/office/officeart/2005/8/layout/process1"/>
-    <dgm:cxn modelId="{B1C974F4-CA99-4FAA-84AB-A26C80D56774}" type="presParOf" srcId="{1C61394E-D32F-4A43-ADD4-F46D3A33D38F}" destId="{38F30BB8-19AC-4F2C-997E-D6C87643D812}" srcOrd="0" destOrd="0" presId="urn:microsoft.com/office/officeart/2005/8/layout/process1"/>
-    <dgm:cxn modelId="{630FA685-9106-4D4A-9D3A-8D1A9F3A696C}" type="presParOf" srcId="{ECE2E50F-1EF0-49E9-A2A2-C09D34379E86}" destId="{CA09568C-529F-4056-BB14-75FC27EA3A57}" srcOrd="4" destOrd="0" presId="urn:microsoft.com/office/officeart/2005/8/layout/process1"/>
-    <dgm:cxn modelId="{DBBF5F6D-F15E-4C11-B244-90BB48DB5B71}" type="presParOf" srcId="{ECE2E50F-1EF0-49E9-A2A2-C09D34379E86}" destId="{E6A79763-2175-4FE6-AF39-65BAD7E8A94D}" srcOrd="5" destOrd="0" presId="urn:microsoft.com/office/officeart/2005/8/layout/process1"/>
-    <dgm:cxn modelId="{930E070A-C1A7-4E70-A013-CA92F103DA73}" type="presParOf" srcId="{E6A79763-2175-4FE6-AF39-65BAD7E8A94D}" destId="{D17F71C8-684F-40E9-B9CF-89D188A27816}" srcOrd="0" destOrd="0" presId="urn:microsoft.com/office/officeart/2005/8/layout/process1"/>
-    <dgm:cxn modelId="{9CB06501-A9B7-4668-86C9-C92DBA83A4DF}" type="presParOf" srcId="{ECE2E50F-1EF0-49E9-A2A2-C09D34379E86}" destId="{FCE3B9A4-214A-4502-B3DF-ACB3E0BC61C7}" srcOrd="6" destOrd="0" presId="urn:microsoft.com/office/officeart/2005/8/layout/process1"/>
+    <dgm:cxn modelId="{D3D1A98E-8705-4ED5-8895-CB896B99BAEC}" type="presOf" srcId="{C6470392-B547-42B7-BBE1-49D9BF3297A5}" destId="{D17F71C8-684F-40E9-B9CF-89D188A27816}" srcOrd="1" destOrd="0" presId="urn:microsoft.com/office/officeart/2005/8/layout/process1"/>
+    <dgm:cxn modelId="{F555DC1A-7DEC-4950-B153-8491BEE72511}" type="presOf" srcId="{58F8E6FA-8E5F-4590-8E91-7D425686736E}" destId="{1C61394E-D32F-4A43-ADD4-F46D3A33D38F}" srcOrd="0" destOrd="0" presId="urn:microsoft.com/office/officeart/2005/8/layout/process1"/>
+    <dgm:cxn modelId="{4F36BA2C-8BCD-48D4-AB82-8E3F774536F9}" type="presOf" srcId="{C6470392-B547-42B7-BBE1-49D9BF3297A5}" destId="{E6A79763-2175-4FE6-AF39-65BAD7E8A94D}" srcOrd="0" destOrd="0" presId="urn:microsoft.com/office/officeart/2005/8/layout/process1"/>
+    <dgm:cxn modelId="{89FA56D7-52D8-40E5-914F-B284D7EF46E3}" type="presOf" srcId="{2F2C6037-AE48-4650-B998-EBABF88D0464}" destId="{8D8E620F-A309-4628-986D-B0F92ABF739C}" srcOrd="1" destOrd="0" presId="urn:microsoft.com/office/officeart/2005/8/layout/process1"/>
+    <dgm:cxn modelId="{9BA90B6B-7E2C-4040-B598-56883AEA6BD1}" type="presOf" srcId="{58F8E6FA-8E5F-4590-8E91-7D425686736E}" destId="{38F30BB8-19AC-4F2C-997E-D6C87643D812}" srcOrd="1" destOrd="0" presId="urn:microsoft.com/office/officeart/2005/8/layout/process1"/>
+    <dgm:cxn modelId="{D84CEEA1-149D-4811-B4A9-72EFF32A8D22}" type="presParOf" srcId="{ECE2E50F-1EF0-49E9-A2A2-C09D34379E86}" destId="{9346448E-7772-4989-9A73-02FD2DA61B93}" srcOrd="0" destOrd="0" presId="urn:microsoft.com/office/officeart/2005/8/layout/process1"/>
+    <dgm:cxn modelId="{00AD218E-2816-42DB-B0B9-2FC962993D55}" type="presParOf" srcId="{ECE2E50F-1EF0-49E9-A2A2-C09D34379E86}" destId="{ABB6D0E9-231F-49FF-8F6A-CBD756BB2A07}" srcOrd="1" destOrd="0" presId="urn:microsoft.com/office/officeart/2005/8/layout/process1"/>
+    <dgm:cxn modelId="{1959E59B-0C1A-4A20-80BA-F95CADD47870}" type="presParOf" srcId="{ABB6D0E9-231F-49FF-8F6A-CBD756BB2A07}" destId="{8D8E620F-A309-4628-986D-B0F92ABF739C}" srcOrd="0" destOrd="0" presId="urn:microsoft.com/office/officeart/2005/8/layout/process1"/>
+    <dgm:cxn modelId="{A74614B0-6E2B-4CF4-AA4B-AE0DA79D835E}" type="presParOf" srcId="{ECE2E50F-1EF0-49E9-A2A2-C09D34379E86}" destId="{45B120D8-A283-4DB0-AE48-CD1028B5A1CA}" srcOrd="2" destOrd="0" presId="urn:microsoft.com/office/officeart/2005/8/layout/process1"/>
+    <dgm:cxn modelId="{CEE76190-7051-42C6-8777-6D18F0DF5A89}" type="presParOf" srcId="{ECE2E50F-1EF0-49E9-A2A2-C09D34379E86}" destId="{1C61394E-D32F-4A43-ADD4-F46D3A33D38F}" srcOrd="3" destOrd="0" presId="urn:microsoft.com/office/officeart/2005/8/layout/process1"/>
+    <dgm:cxn modelId="{864721A6-FDEC-4D06-8CAF-5D12C6027830}" type="presParOf" srcId="{1C61394E-D32F-4A43-ADD4-F46D3A33D38F}" destId="{38F30BB8-19AC-4F2C-997E-D6C87643D812}" srcOrd="0" destOrd="0" presId="urn:microsoft.com/office/officeart/2005/8/layout/process1"/>
+    <dgm:cxn modelId="{369BCB4C-4A3D-412D-AF71-0B4239782C78}" type="presParOf" srcId="{ECE2E50F-1EF0-49E9-A2A2-C09D34379E86}" destId="{CA09568C-529F-4056-BB14-75FC27EA3A57}" srcOrd="4" destOrd="0" presId="urn:microsoft.com/office/officeart/2005/8/layout/process1"/>
+    <dgm:cxn modelId="{A9D7C63C-71CE-417F-AF78-DAF3103289B0}" type="presParOf" srcId="{ECE2E50F-1EF0-49E9-A2A2-C09D34379E86}" destId="{E6A79763-2175-4FE6-AF39-65BAD7E8A94D}" srcOrd="5" destOrd="0" presId="urn:microsoft.com/office/officeart/2005/8/layout/process1"/>
+    <dgm:cxn modelId="{21367DDF-30CA-4B55-BB7F-205574400648}" type="presParOf" srcId="{E6A79763-2175-4FE6-AF39-65BAD7E8A94D}" destId="{D17F71C8-684F-40E9-B9CF-89D188A27816}" srcOrd="0" destOrd="0" presId="urn:microsoft.com/office/officeart/2005/8/layout/process1"/>
+    <dgm:cxn modelId="{6AD89435-F2CD-4B8E-9C91-A912AAF0F91F}" type="presParOf" srcId="{ECE2E50F-1EF0-49E9-A2A2-C09D34379E86}" destId="{FCE3B9A4-214A-4502-B3DF-ACB3E0BC61C7}" srcOrd="6" destOrd="0" presId="urn:microsoft.com/office/officeart/2005/8/layout/process1"/>
   </dgm:cxnLst>
   <dgm:bg/>
   <dgm:whole/>

</xml_diff>

<commit_message>
Date: 05 May 2026
</commit_message>
<xml_diff>
--- a/Notes_SA2601010.docx
+++ b/Notes_SA2601010.docx
@@ -15116,6 +15116,451 @@
         </w:rPr>
         <w:t xml:space="preserve"> (Use the same process which we have used to configure Selenium WebDriver jar file)</w:t>
       </w:r>
+    </w:p>
+    <w:p>
+      <w:pPr>
+        <w:rPr>
+          <w:sz w:val="24"/>
+          <w:szCs w:val="22"/>
+          <w:lang w:val="en-US"/>
+        </w:rPr>
+      </w:pPr>
+    </w:p>
+    <w:p>
+      <w:pPr>
+        <w:rPr>
+          <w:sz w:val="24"/>
+          <w:szCs w:val="22"/>
+          <w:lang w:val="en-US"/>
+        </w:rPr>
+      </w:pPr>
+      <w:r>
+        <w:rPr>
+          <w:sz w:val="24"/>
+          <w:szCs w:val="22"/>
+          <w:lang w:val="en-US"/>
+        </w:rPr>
+        <w:br w:type="page"/>
+      </w:r>
+    </w:p>
+    <w:p>
+      <w:pPr>
+        <w:rPr>
+          <w:b/>
+          <w:bCs/>
+          <w:sz w:val="24"/>
+          <w:szCs w:val="22"/>
+          <w:lang w:val="en-US"/>
+        </w:rPr>
+      </w:pPr>
+      <w:r>
+        <w:rPr>
+          <w:b/>
+          <w:bCs/>
+          <w:sz w:val="24"/>
+          <w:szCs w:val="22"/>
+          <w:lang w:val="en-US"/>
+        </w:rPr>
+        <w:lastRenderedPageBreak/>
+        <w:t>Maven</w:t>
+      </w:r>
+    </w:p>
+    <w:p>
+      <w:pPr>
+        <w:pStyle w:val="ListParagraph"/>
+        <w:numPr>
+          <w:ilvl w:val="0"/>
+          <w:numId w:val="43"/>
+        </w:numPr>
+        <w:rPr>
+          <w:b/>
+          <w:bCs/>
+          <w:sz w:val="24"/>
+          <w:szCs w:val="22"/>
+          <w:lang w:val="en-US"/>
+        </w:rPr>
+      </w:pPr>
+      <w:r>
+        <w:rPr>
+          <w:sz w:val="24"/>
+          <w:szCs w:val="22"/>
+          <w:lang w:val="en-US"/>
+        </w:rPr>
+        <w:t>Maven is build management tool.</w:t>
+      </w:r>
+    </w:p>
+    <w:p>
+      <w:pPr>
+        <w:pStyle w:val="ListParagraph"/>
+        <w:numPr>
+          <w:ilvl w:val="0"/>
+          <w:numId w:val="43"/>
+        </w:numPr>
+        <w:rPr>
+          <w:b/>
+          <w:bCs/>
+          <w:sz w:val="24"/>
+          <w:szCs w:val="22"/>
+          <w:lang w:val="en-US"/>
+        </w:rPr>
+      </w:pPr>
+      <w:r>
+        <w:rPr>
+          <w:sz w:val="24"/>
+          <w:szCs w:val="22"/>
+          <w:lang w:val="en-US"/>
+        </w:rPr>
+        <w:t>It is open source tool</w:t>
+      </w:r>
+    </w:p>
+    <w:p>
+      <w:pPr>
+        <w:pStyle w:val="ListParagraph"/>
+        <w:numPr>
+          <w:ilvl w:val="0"/>
+          <w:numId w:val="43"/>
+        </w:numPr>
+        <w:rPr>
+          <w:b/>
+          <w:bCs/>
+          <w:sz w:val="24"/>
+          <w:szCs w:val="22"/>
+          <w:lang w:val="en-US"/>
+        </w:rPr>
+      </w:pPr>
+      <w:r>
+        <w:rPr>
+          <w:sz w:val="24"/>
+          <w:szCs w:val="22"/>
+          <w:lang w:val="en-US"/>
+        </w:rPr>
+        <w:t>It is Apache product</w:t>
+      </w:r>
+    </w:p>
+    <w:p>
+      <w:pPr>
+        <w:pStyle w:val="ListParagraph"/>
+        <w:numPr>
+          <w:ilvl w:val="0"/>
+          <w:numId w:val="43"/>
+        </w:numPr>
+        <w:rPr>
+          <w:b/>
+          <w:bCs/>
+          <w:sz w:val="24"/>
+          <w:szCs w:val="22"/>
+          <w:lang w:val="en-US"/>
+        </w:rPr>
+      </w:pPr>
+      <w:r>
+        <w:rPr>
+          <w:sz w:val="24"/>
+          <w:szCs w:val="22"/>
+          <w:lang w:val="en-US"/>
+        </w:rPr>
+        <w:t>Can be used by both developer and tester.</w:t>
+      </w:r>
+    </w:p>
+    <w:p>
+      <w:pPr>
+        <w:pStyle w:val="ListParagraph"/>
+        <w:numPr>
+          <w:ilvl w:val="0"/>
+          <w:numId w:val="43"/>
+        </w:numPr>
+        <w:rPr>
+          <w:b/>
+          <w:bCs/>
+          <w:sz w:val="24"/>
+          <w:szCs w:val="22"/>
+          <w:lang w:val="en-US"/>
+        </w:rPr>
+      </w:pPr>
+      <w:r>
+        <w:rPr>
+          <w:sz w:val="24"/>
+          <w:szCs w:val="22"/>
+          <w:lang w:val="en-US"/>
+        </w:rPr>
+        <w:t>Single project can be shared by both developer and tester</w:t>
+      </w:r>
+    </w:p>
+    <w:p>
+      <w:pPr>
+        <w:pStyle w:val="ListParagraph"/>
+        <w:numPr>
+          <w:ilvl w:val="0"/>
+          <w:numId w:val="43"/>
+        </w:numPr>
+        <w:rPr>
+          <w:b/>
+          <w:bCs/>
+          <w:sz w:val="24"/>
+          <w:szCs w:val="22"/>
+          <w:lang w:val="en-US"/>
+        </w:rPr>
+      </w:pPr>
+      <w:r>
+        <w:rPr>
+          <w:sz w:val="24"/>
+          <w:szCs w:val="22"/>
+          <w:lang w:val="en-US"/>
+        </w:rPr>
+        <w:t>Easy configuration via pom.xml file.</w:t>
+      </w:r>
+    </w:p>
+    <w:p>
+      <w:pPr>
+        <w:pStyle w:val="ListParagraph"/>
+        <w:numPr>
+          <w:ilvl w:val="0"/>
+          <w:numId w:val="43"/>
+        </w:numPr>
+        <w:rPr>
+          <w:b/>
+          <w:bCs/>
+          <w:sz w:val="24"/>
+          <w:szCs w:val="22"/>
+          <w:lang w:val="en-US"/>
+        </w:rPr>
+      </w:pPr>
+      <w:r>
+        <w:rPr>
+          <w:b/>
+          <w:bCs/>
+          <w:sz w:val="24"/>
+          <w:szCs w:val="22"/>
+          <w:lang w:val="en-US"/>
+        </w:rPr>
+        <w:t>Uses dependencies (is a code of 6 to 7 lines that will automatically download and add the required jar files to your project.)</w:t>
+      </w:r>
+    </w:p>
+    <w:p>
+      <w:pPr>
+        <w:rPr>
+          <w:b/>
+          <w:bCs/>
+          <w:sz w:val="24"/>
+          <w:szCs w:val="22"/>
+          <w:lang w:val="en-US"/>
+        </w:rPr>
+      </w:pPr>
+    </w:p>
+    <w:p>
+      <w:pPr>
+        <w:rPr>
+          <w:b/>
+          <w:bCs/>
+          <w:sz w:val="24"/>
+          <w:szCs w:val="22"/>
+          <w:lang w:val="en-US"/>
+        </w:rPr>
+      </w:pPr>
+      <w:r>
+        <w:rPr>
+          <w:b/>
+          <w:bCs/>
+          <w:sz w:val="24"/>
+          <w:szCs w:val="22"/>
+          <w:lang w:val="en-US"/>
+        </w:rPr>
+        <w:t>Creating Maven Project</w:t>
+      </w:r>
+    </w:p>
+    <w:p>
+      <w:pPr>
+        <w:pStyle w:val="ListParagraph"/>
+        <w:numPr>
+          <w:ilvl w:val="0"/>
+          <w:numId w:val="44"/>
+        </w:numPr>
+        <w:rPr>
+          <w:sz w:val="24"/>
+          <w:szCs w:val="22"/>
+          <w:lang w:val="en-US"/>
+        </w:rPr>
+      </w:pPr>
+      <w:r>
+        <w:rPr>
+          <w:sz w:val="24"/>
+          <w:szCs w:val="22"/>
+          <w:lang w:val="en-US"/>
+        </w:rPr>
+        <w:t xml:space="preserve">File Menu </w:t>
+      </w:r>
+      <w:r>
+        <w:rPr>
+          <w:sz w:val="24"/>
+          <w:szCs w:val="22"/>
+          <w:lang w:val="en-US"/>
+        </w:rPr>
+        <w:sym w:font="Wingdings" w:char="F0E0"/>
+      </w:r>
+      <w:r>
+        <w:rPr>
+          <w:sz w:val="24"/>
+          <w:szCs w:val="22"/>
+          <w:lang w:val="en-US"/>
+        </w:rPr>
+        <w:t xml:space="preserve"> New </w:t>
+      </w:r>
+      <w:r>
+        <w:rPr>
+          <w:sz w:val="24"/>
+          <w:szCs w:val="22"/>
+          <w:lang w:val="en-US"/>
+        </w:rPr>
+        <w:sym w:font="Wingdings" w:char="F0E0"/>
+      </w:r>
+      <w:r>
+        <w:rPr>
+          <w:sz w:val="24"/>
+          <w:szCs w:val="22"/>
+          <w:lang w:val="en-US"/>
+        </w:rPr>
+        <w:t xml:space="preserve"> Maven Project</w:t>
+      </w:r>
+    </w:p>
+    <w:p>
+      <w:pPr>
+        <w:pStyle w:val="ListParagraph"/>
+        <w:numPr>
+          <w:ilvl w:val="0"/>
+          <w:numId w:val="44"/>
+        </w:numPr>
+        <w:rPr>
+          <w:sz w:val="24"/>
+          <w:szCs w:val="22"/>
+          <w:lang w:val="en-US"/>
+        </w:rPr>
+      </w:pPr>
+      <w:r>
+        <w:rPr>
+          <w:sz w:val="24"/>
+          <w:szCs w:val="22"/>
+          <w:lang w:val="en-US"/>
+        </w:rPr>
+        <w:t>Select 1</w:t>
+      </w:r>
+      <w:r>
+        <w:rPr>
+          <w:sz w:val="24"/>
+          <w:szCs w:val="22"/>
+          <w:vertAlign w:val="superscript"/>
+          <w:lang w:val="en-US"/>
+        </w:rPr>
+        <w:t>st</w:t>
+      </w:r>
+      <w:r>
+        <w:rPr>
+          <w:sz w:val="24"/>
+          <w:szCs w:val="22"/>
+          <w:lang w:val="en-US"/>
+        </w:rPr>
+        <w:t xml:space="preserve"> Check Box (Create simple project skip archetype selection)</w:t>
+      </w:r>
+    </w:p>
+    <w:p>
+      <w:pPr>
+        <w:pStyle w:val="ListParagraph"/>
+        <w:numPr>
+          <w:ilvl w:val="0"/>
+          <w:numId w:val="44"/>
+        </w:numPr>
+        <w:rPr>
+          <w:sz w:val="24"/>
+          <w:szCs w:val="22"/>
+          <w:lang w:val="en-US"/>
+        </w:rPr>
+      </w:pPr>
+      <w:r>
+        <w:rPr>
+          <w:sz w:val="24"/>
+          <w:szCs w:val="22"/>
+          <w:lang w:val="en-US"/>
+        </w:rPr>
+        <w:t>Click on Next Button</w:t>
+      </w:r>
+    </w:p>
+    <w:p>
+      <w:pPr>
+        <w:pStyle w:val="ListParagraph"/>
+        <w:numPr>
+          <w:ilvl w:val="0"/>
+          <w:numId w:val="44"/>
+        </w:numPr>
+        <w:rPr>
+          <w:sz w:val="24"/>
+          <w:szCs w:val="22"/>
+          <w:lang w:val="en-US"/>
+        </w:rPr>
+      </w:pPr>
+      <w:r>
+        <w:rPr>
+          <w:sz w:val="24"/>
+          <w:szCs w:val="22"/>
+          <w:lang w:val="en-US"/>
+        </w:rPr>
+        <w:t>Enter GroupID (Name of Company) &amp; ArtifactId (Name of Project)</w:t>
+      </w:r>
+    </w:p>
+    <w:p>
+      <w:pPr>
+        <w:pStyle w:val="ListParagraph"/>
+        <w:numPr>
+          <w:ilvl w:val="1"/>
+          <w:numId w:val="44"/>
+        </w:numPr>
+        <w:rPr>
+          <w:sz w:val="24"/>
+          <w:szCs w:val="22"/>
+          <w:lang w:val="en-US"/>
+        </w:rPr>
+      </w:pPr>
+      <w:r>
+        <w:rPr>
+          <w:sz w:val="24"/>
+          <w:szCs w:val="22"/>
+          <w:lang w:val="en-US"/>
+        </w:rPr>
+        <w:t>Generally both should be same</w:t>
+      </w:r>
+    </w:p>
+    <w:p>
+      <w:pPr>
+        <w:pStyle w:val="ListParagraph"/>
+        <w:numPr>
+          <w:ilvl w:val="0"/>
+          <w:numId w:val="44"/>
+        </w:numPr>
+        <w:rPr>
+          <w:sz w:val="24"/>
+          <w:szCs w:val="22"/>
+          <w:lang w:val="en-US"/>
+        </w:rPr>
+      </w:pPr>
+      <w:r>
+        <w:rPr>
+          <w:sz w:val="24"/>
+          <w:szCs w:val="22"/>
+          <w:lang w:val="en-US"/>
+        </w:rPr>
+        <w:t>Click on Finish button</w:t>
+      </w:r>
+    </w:p>
+    <w:p>
+      <w:pPr>
+        <w:pStyle w:val="ListParagraph"/>
+        <w:numPr>
+          <w:ilvl w:val="0"/>
+          <w:numId w:val="44"/>
+        </w:numPr>
+        <w:rPr>
+          <w:sz w:val="24"/>
+          <w:szCs w:val="22"/>
+          <w:lang w:val="en-US"/>
+        </w:rPr>
+      </w:pPr>
       <w:bookmarkStart w:id="0" w:name="_GoBack"/>
       <w:bookmarkEnd w:id="0"/>
     </w:p>
@@ -15560,6 +16005,119 @@
     </w:lvl>
   </w:abstractNum>
   <w:abstractNum w:abstractNumId="4">
+    <w:nsid w:val="134D1409"/>
+    <w:multiLevelType w:val="hybridMultilevel"/>
+    <w:tmpl w:val="7F265676"/>
+    <w:lvl w:ilvl="0" w:tplc="40090001">
+      <w:start w:val="1"/>
+      <w:numFmt w:val="bullet"/>
+      <w:lvlText w:val=""/>
+      <w:lvlJc w:val="left"/>
+      <w:pPr>
+        <w:ind w:left="720" w:hanging="360"/>
+      </w:pPr>
+      <w:rPr>
+        <w:rFonts w:ascii="Symbol" w:hAnsi="Symbol" w:hint="default"/>
+      </w:rPr>
+    </w:lvl>
+    <w:lvl w:ilvl="1" w:tplc="40090003" w:tentative="1">
+      <w:start w:val="1"/>
+      <w:numFmt w:val="bullet"/>
+      <w:lvlText w:val="o"/>
+      <w:lvlJc w:val="left"/>
+      <w:pPr>
+        <w:ind w:left="1440" w:hanging="360"/>
+      </w:pPr>
+      <w:rPr>
+        <w:rFonts w:ascii="Courier New" w:hAnsi="Courier New" w:cs="Courier New" w:hint="default"/>
+      </w:rPr>
+    </w:lvl>
+    <w:lvl w:ilvl="2" w:tplc="40090005" w:tentative="1">
+      <w:start w:val="1"/>
+      <w:numFmt w:val="bullet"/>
+      <w:lvlText w:val=""/>
+      <w:lvlJc w:val="left"/>
+      <w:pPr>
+        <w:ind w:left="2160" w:hanging="360"/>
+      </w:pPr>
+      <w:rPr>
+        <w:rFonts w:ascii="Wingdings" w:hAnsi="Wingdings" w:hint="default"/>
+      </w:rPr>
+    </w:lvl>
+    <w:lvl w:ilvl="3" w:tplc="40090001" w:tentative="1">
+      <w:start w:val="1"/>
+      <w:numFmt w:val="bullet"/>
+      <w:lvlText w:val=""/>
+      <w:lvlJc w:val="left"/>
+      <w:pPr>
+        <w:ind w:left="2880" w:hanging="360"/>
+      </w:pPr>
+      <w:rPr>
+        <w:rFonts w:ascii="Symbol" w:hAnsi="Symbol" w:hint="default"/>
+      </w:rPr>
+    </w:lvl>
+    <w:lvl w:ilvl="4" w:tplc="40090003" w:tentative="1">
+      <w:start w:val="1"/>
+      <w:numFmt w:val="bullet"/>
+      <w:lvlText w:val="o"/>
+      <w:lvlJc w:val="left"/>
+      <w:pPr>
+        <w:ind w:left="3600" w:hanging="360"/>
+      </w:pPr>
+      <w:rPr>
+        <w:rFonts w:ascii="Courier New" w:hAnsi="Courier New" w:cs="Courier New" w:hint="default"/>
+      </w:rPr>
+    </w:lvl>
+    <w:lvl w:ilvl="5" w:tplc="40090005" w:tentative="1">
+      <w:start w:val="1"/>
+      <w:numFmt w:val="bullet"/>
+      <w:lvlText w:val=""/>
+      <w:lvlJc w:val="left"/>
+      <w:pPr>
+        <w:ind w:left="4320" w:hanging="360"/>
+      </w:pPr>
+      <w:rPr>
+        <w:rFonts w:ascii="Wingdings" w:hAnsi="Wingdings" w:hint="default"/>
+      </w:rPr>
+    </w:lvl>
+    <w:lvl w:ilvl="6" w:tplc="40090001" w:tentative="1">
+      <w:start w:val="1"/>
+      <w:numFmt w:val="bullet"/>
+      <w:lvlText w:val=""/>
+      <w:lvlJc w:val="left"/>
+      <w:pPr>
+        <w:ind w:left="5040" w:hanging="360"/>
+      </w:pPr>
+      <w:rPr>
+        <w:rFonts w:ascii="Symbol" w:hAnsi="Symbol" w:hint="default"/>
+      </w:rPr>
+    </w:lvl>
+    <w:lvl w:ilvl="7" w:tplc="40090003" w:tentative="1">
+      <w:start w:val="1"/>
+      <w:numFmt w:val="bullet"/>
+      <w:lvlText w:val="o"/>
+      <w:lvlJc w:val="left"/>
+      <w:pPr>
+        <w:ind w:left="5760" w:hanging="360"/>
+      </w:pPr>
+      <w:rPr>
+        <w:rFonts w:ascii="Courier New" w:hAnsi="Courier New" w:cs="Courier New" w:hint="default"/>
+      </w:rPr>
+    </w:lvl>
+    <w:lvl w:ilvl="8" w:tplc="40090005" w:tentative="1">
+      <w:start w:val="1"/>
+      <w:numFmt w:val="bullet"/>
+      <w:lvlText w:val=""/>
+      <w:lvlJc w:val="left"/>
+      <w:pPr>
+        <w:ind w:left="6480" w:hanging="360"/>
+      </w:pPr>
+      <w:rPr>
+        <w:rFonts w:ascii="Wingdings" w:hAnsi="Wingdings" w:hint="default"/>
+      </w:rPr>
+    </w:lvl>
+  </w:abstractNum>
+  <w:abstractNum w:abstractNumId="5">
     <w:nsid w:val="13D740A2"/>
     <w:multiLevelType w:val="hybridMultilevel"/>
     <w:tmpl w:val="A53ECF44"/>
@@ -15672,7 +16230,7 @@
       </w:rPr>
     </w:lvl>
   </w:abstractNum>
-  <w:abstractNum w:abstractNumId="5">
+  <w:abstractNum w:abstractNumId="6">
     <w:nsid w:val="140F3A6B"/>
     <w:multiLevelType w:val="hybridMultilevel"/>
     <w:tmpl w:val="B1742718"/>
@@ -15785,7 +16343,93 @@
       </w:rPr>
     </w:lvl>
   </w:abstractNum>
-  <w:abstractNum w:abstractNumId="6">
+  <w:abstractNum w:abstractNumId="7">
+    <w:nsid w:val="16043D20"/>
+    <w:multiLevelType w:val="hybridMultilevel"/>
+    <w:tmpl w:val="6A444494"/>
+    <w:lvl w:ilvl="0" w:tplc="4009000F">
+      <w:start w:val="1"/>
+      <w:numFmt w:val="decimal"/>
+      <w:lvlText w:val="%1."/>
+      <w:lvlJc w:val="left"/>
+      <w:pPr>
+        <w:ind w:left="720" w:hanging="360"/>
+      </w:pPr>
+    </w:lvl>
+    <w:lvl w:ilvl="1" w:tplc="40090019">
+      <w:start w:val="1"/>
+      <w:numFmt w:val="lowerLetter"/>
+      <w:lvlText w:val="%2."/>
+      <w:lvlJc w:val="left"/>
+      <w:pPr>
+        <w:ind w:left="1440" w:hanging="360"/>
+      </w:pPr>
+    </w:lvl>
+    <w:lvl w:ilvl="2" w:tplc="4009001B" w:tentative="1">
+      <w:start w:val="1"/>
+      <w:numFmt w:val="lowerRoman"/>
+      <w:lvlText w:val="%3."/>
+      <w:lvlJc w:val="right"/>
+      <w:pPr>
+        <w:ind w:left="2160" w:hanging="180"/>
+      </w:pPr>
+    </w:lvl>
+    <w:lvl w:ilvl="3" w:tplc="4009000F" w:tentative="1">
+      <w:start w:val="1"/>
+      <w:numFmt w:val="decimal"/>
+      <w:lvlText w:val="%4."/>
+      <w:lvlJc w:val="left"/>
+      <w:pPr>
+        <w:ind w:left="2880" w:hanging="360"/>
+      </w:pPr>
+    </w:lvl>
+    <w:lvl w:ilvl="4" w:tplc="40090019" w:tentative="1">
+      <w:start w:val="1"/>
+      <w:numFmt w:val="lowerLetter"/>
+      <w:lvlText w:val="%5."/>
+      <w:lvlJc w:val="left"/>
+      <w:pPr>
+        <w:ind w:left="3600" w:hanging="360"/>
+      </w:pPr>
+    </w:lvl>
+    <w:lvl w:ilvl="5" w:tplc="4009001B" w:tentative="1">
+      <w:start w:val="1"/>
+      <w:numFmt w:val="lowerRoman"/>
+      <w:lvlText w:val="%6."/>
+      <w:lvlJc w:val="right"/>
+      <w:pPr>
+        <w:ind w:left="4320" w:hanging="180"/>
+      </w:pPr>
+    </w:lvl>
+    <w:lvl w:ilvl="6" w:tplc="4009000F" w:tentative="1">
+      <w:start w:val="1"/>
+      <w:numFmt w:val="decimal"/>
+      <w:lvlText w:val="%7."/>
+      <w:lvlJc w:val="left"/>
+      <w:pPr>
+        <w:ind w:left="5040" w:hanging="360"/>
+      </w:pPr>
+    </w:lvl>
+    <w:lvl w:ilvl="7" w:tplc="40090019" w:tentative="1">
+      <w:start w:val="1"/>
+      <w:numFmt w:val="lowerLetter"/>
+      <w:lvlText w:val="%8."/>
+      <w:lvlJc w:val="left"/>
+      <w:pPr>
+        <w:ind w:left="5760" w:hanging="360"/>
+      </w:pPr>
+    </w:lvl>
+    <w:lvl w:ilvl="8" w:tplc="4009001B" w:tentative="1">
+      <w:start w:val="1"/>
+      <w:numFmt w:val="lowerRoman"/>
+      <w:lvlText w:val="%9."/>
+      <w:lvlJc w:val="right"/>
+      <w:pPr>
+        <w:ind w:left="6480" w:hanging="180"/>
+      </w:pPr>
+    </w:lvl>
+  </w:abstractNum>
+  <w:abstractNum w:abstractNumId="8">
     <w:nsid w:val="17A97564"/>
     <w:multiLevelType w:val="hybridMultilevel"/>
     <w:tmpl w:val="CA967136"/>
@@ -15874,7 +16518,7 @@
       </w:pPr>
     </w:lvl>
   </w:abstractNum>
-  <w:abstractNum w:abstractNumId="7">
+  <w:abstractNum w:abstractNumId="9">
     <w:nsid w:val="1DD814BD"/>
     <w:multiLevelType w:val="hybridMultilevel"/>
     <w:tmpl w:val="6052B25A"/>
@@ -15963,7 +16607,7 @@
       </w:pPr>
     </w:lvl>
   </w:abstractNum>
-  <w:abstractNum w:abstractNumId="8">
+  <w:abstractNum w:abstractNumId="10">
     <w:nsid w:val="20BE5C1D"/>
     <w:multiLevelType w:val="hybridMultilevel"/>
     <w:tmpl w:val="27D8D70E"/>
@@ -16076,7 +16720,7 @@
       </w:rPr>
     </w:lvl>
   </w:abstractNum>
-  <w:abstractNum w:abstractNumId="9">
+  <w:abstractNum w:abstractNumId="11">
     <w:nsid w:val="22D50F4A"/>
     <w:multiLevelType w:val="hybridMultilevel"/>
     <w:tmpl w:val="564C3158"/>
@@ -16189,7 +16833,7 @@
       </w:rPr>
     </w:lvl>
   </w:abstractNum>
-  <w:abstractNum w:abstractNumId="10">
+  <w:abstractNum w:abstractNumId="12">
     <w:nsid w:val="2AA11AFE"/>
     <w:multiLevelType w:val="hybridMultilevel"/>
     <w:tmpl w:val="551C87B4"/>
@@ -16278,7 +16922,7 @@
       </w:pPr>
     </w:lvl>
   </w:abstractNum>
-  <w:abstractNum w:abstractNumId="11">
+  <w:abstractNum w:abstractNumId="13">
     <w:nsid w:val="31D74EB3"/>
     <w:multiLevelType w:val="hybridMultilevel"/>
     <w:tmpl w:val="DFC4DDF0"/>
@@ -16391,7 +17035,7 @@
       </w:rPr>
     </w:lvl>
   </w:abstractNum>
-  <w:abstractNum w:abstractNumId="12">
+  <w:abstractNum w:abstractNumId="14">
     <w:nsid w:val="323F4A11"/>
     <w:multiLevelType w:val="hybridMultilevel"/>
     <w:tmpl w:val="5862F962"/>
@@ -16477,7 +17121,7 @@
       </w:pPr>
     </w:lvl>
   </w:abstractNum>
-  <w:abstractNum w:abstractNumId="13">
+  <w:abstractNum w:abstractNumId="15">
     <w:nsid w:val="353C7880"/>
     <w:multiLevelType w:val="hybridMultilevel"/>
     <w:tmpl w:val="38CAF664"/>
@@ -16590,7 +17234,7 @@
       </w:rPr>
     </w:lvl>
   </w:abstractNum>
-  <w:abstractNum w:abstractNumId="14">
+  <w:abstractNum w:abstractNumId="16">
     <w:nsid w:val="390953F8"/>
     <w:multiLevelType w:val="hybridMultilevel"/>
     <w:tmpl w:val="13E456E4"/>
@@ -16676,7 +17320,7 @@
       </w:pPr>
     </w:lvl>
   </w:abstractNum>
-  <w:abstractNum w:abstractNumId="15">
+  <w:abstractNum w:abstractNumId="17">
     <w:nsid w:val="39C87324"/>
     <w:multiLevelType w:val="hybridMultilevel"/>
     <w:tmpl w:val="DB9EB66C"/>
@@ -16789,7 +17433,7 @@
       </w:rPr>
     </w:lvl>
   </w:abstractNum>
-  <w:abstractNum w:abstractNumId="16">
+  <w:abstractNum w:abstractNumId="18">
     <w:nsid w:val="3A464A66"/>
     <w:multiLevelType w:val="hybridMultilevel"/>
     <w:tmpl w:val="B9BE5E06"/>
@@ -16878,7 +17522,7 @@
       </w:pPr>
     </w:lvl>
   </w:abstractNum>
-  <w:abstractNum w:abstractNumId="17">
+  <w:abstractNum w:abstractNumId="19">
     <w:nsid w:val="3C875259"/>
     <w:multiLevelType w:val="hybridMultilevel"/>
     <w:tmpl w:val="CA62BF82"/>
@@ -16967,7 +17611,7 @@
       </w:pPr>
     </w:lvl>
   </w:abstractNum>
-  <w:abstractNum w:abstractNumId="18">
+  <w:abstractNum w:abstractNumId="20">
     <w:nsid w:val="3FB25765"/>
     <w:multiLevelType w:val="hybridMultilevel"/>
     <w:tmpl w:val="2286C50C"/>
@@ -17056,7 +17700,7 @@
       </w:pPr>
     </w:lvl>
   </w:abstractNum>
-  <w:abstractNum w:abstractNumId="19">
+  <w:abstractNum w:abstractNumId="21">
     <w:nsid w:val="402B0604"/>
     <w:multiLevelType w:val="hybridMultilevel"/>
     <w:tmpl w:val="D8EEBC8C"/>
@@ -17169,7 +17813,7 @@
       </w:rPr>
     </w:lvl>
   </w:abstractNum>
-  <w:abstractNum w:abstractNumId="20">
+  <w:abstractNum w:abstractNumId="22">
     <w:nsid w:val="40FE0FCF"/>
     <w:multiLevelType w:val="hybridMultilevel"/>
     <w:tmpl w:val="39DC3034"/>
@@ -17282,7 +17926,7 @@
       </w:rPr>
     </w:lvl>
   </w:abstractNum>
-  <w:abstractNum w:abstractNumId="21">
+  <w:abstractNum w:abstractNumId="23">
     <w:nsid w:val="475E2AA1"/>
     <w:multiLevelType w:val="hybridMultilevel"/>
     <w:tmpl w:val="8A50C5CE"/>
@@ -17371,7 +18015,7 @@
       </w:pPr>
     </w:lvl>
   </w:abstractNum>
-  <w:abstractNum w:abstractNumId="22">
+  <w:abstractNum w:abstractNumId="24">
     <w:nsid w:val="496607A1"/>
     <w:multiLevelType w:val="hybridMultilevel"/>
     <w:tmpl w:val="D6727F44"/>
@@ -17484,7 +18128,7 @@
       </w:rPr>
     </w:lvl>
   </w:abstractNum>
-  <w:abstractNum w:abstractNumId="23">
+  <w:abstractNum w:abstractNumId="25">
     <w:nsid w:val="49B72ACE"/>
     <w:multiLevelType w:val="hybridMultilevel"/>
     <w:tmpl w:val="F09897B0"/>
@@ -17573,7 +18217,7 @@
       </w:pPr>
     </w:lvl>
   </w:abstractNum>
-  <w:abstractNum w:abstractNumId="24">
+  <w:abstractNum w:abstractNumId="26">
     <w:nsid w:val="52764C0C"/>
     <w:multiLevelType w:val="hybridMultilevel"/>
     <w:tmpl w:val="080E6010"/>
@@ -17662,7 +18306,7 @@
       </w:pPr>
     </w:lvl>
   </w:abstractNum>
-  <w:abstractNum w:abstractNumId="25">
+  <w:abstractNum w:abstractNumId="27">
     <w:nsid w:val="5406246A"/>
     <w:multiLevelType w:val="hybridMultilevel"/>
     <w:tmpl w:val="59A4463E"/>
@@ -17775,7 +18419,7 @@
       </w:rPr>
     </w:lvl>
   </w:abstractNum>
-  <w:abstractNum w:abstractNumId="26">
+  <w:abstractNum w:abstractNumId="28">
     <w:nsid w:val="56BB04A8"/>
     <w:multiLevelType w:val="hybridMultilevel"/>
     <w:tmpl w:val="7FDC8606"/>
@@ -17888,7 +18532,7 @@
       </w:rPr>
     </w:lvl>
   </w:abstractNum>
-  <w:abstractNum w:abstractNumId="27">
+  <w:abstractNum w:abstractNumId="29">
     <w:nsid w:val="58671E31"/>
     <w:multiLevelType w:val="hybridMultilevel"/>
     <w:tmpl w:val="D23271B4"/>
@@ -17977,7 +18621,7 @@
       </w:pPr>
     </w:lvl>
   </w:abstractNum>
-  <w:abstractNum w:abstractNumId="28">
+  <w:abstractNum w:abstractNumId="30">
     <w:nsid w:val="5963738B"/>
     <w:multiLevelType w:val="hybridMultilevel"/>
     <w:tmpl w:val="8D50AB70"/>
@@ -18066,7 +18710,7 @@
       </w:pPr>
     </w:lvl>
   </w:abstractNum>
-  <w:abstractNum w:abstractNumId="29">
+  <w:abstractNum w:abstractNumId="31">
     <w:nsid w:val="5C58581A"/>
     <w:multiLevelType w:val="hybridMultilevel"/>
     <w:tmpl w:val="3D4E3154"/>
@@ -18179,7 +18823,7 @@
       </w:rPr>
     </w:lvl>
   </w:abstractNum>
-  <w:abstractNum w:abstractNumId="30">
+  <w:abstractNum w:abstractNumId="32">
     <w:nsid w:val="5F383176"/>
     <w:multiLevelType w:val="hybridMultilevel"/>
     <w:tmpl w:val="4C76D014"/>
@@ -18292,7 +18936,7 @@
       </w:rPr>
     </w:lvl>
   </w:abstractNum>
-  <w:abstractNum w:abstractNumId="31">
+  <w:abstractNum w:abstractNumId="33">
     <w:nsid w:val="64887AB4"/>
     <w:multiLevelType w:val="hybridMultilevel"/>
     <w:tmpl w:val="D67CE9E8"/>
@@ -18381,7 +19025,7 @@
       </w:pPr>
     </w:lvl>
   </w:abstractNum>
-  <w:abstractNum w:abstractNumId="32">
+  <w:abstractNum w:abstractNumId="34">
     <w:nsid w:val="649E4E2C"/>
     <w:multiLevelType w:val="hybridMultilevel"/>
     <w:tmpl w:val="5DB8C8EC"/>
@@ -18494,7 +19138,7 @@
       </w:rPr>
     </w:lvl>
   </w:abstractNum>
-  <w:abstractNum w:abstractNumId="33">
+  <w:abstractNum w:abstractNumId="35">
     <w:nsid w:val="66C96AEF"/>
     <w:multiLevelType w:val="hybridMultilevel"/>
     <w:tmpl w:val="2DDCC122"/>
@@ -18607,7 +19251,7 @@
       </w:rPr>
     </w:lvl>
   </w:abstractNum>
-  <w:abstractNum w:abstractNumId="34">
+  <w:abstractNum w:abstractNumId="36">
     <w:nsid w:val="6C096D1C"/>
     <w:multiLevelType w:val="hybridMultilevel"/>
     <w:tmpl w:val="35CADD6E"/>
@@ -18720,7 +19364,7 @@
       </w:rPr>
     </w:lvl>
   </w:abstractNum>
-  <w:abstractNum w:abstractNumId="35">
+  <w:abstractNum w:abstractNumId="37">
     <w:nsid w:val="6DF222BD"/>
     <w:multiLevelType w:val="hybridMultilevel"/>
     <w:tmpl w:val="CB58A112"/>
@@ -18833,7 +19477,7 @@
       </w:rPr>
     </w:lvl>
   </w:abstractNum>
-  <w:abstractNum w:abstractNumId="36">
+  <w:abstractNum w:abstractNumId="38">
     <w:nsid w:val="700B3448"/>
     <w:multiLevelType w:val="hybridMultilevel"/>
     <w:tmpl w:val="D4F8B1EA"/>
@@ -18922,7 +19566,7 @@
       </w:pPr>
     </w:lvl>
   </w:abstractNum>
-  <w:abstractNum w:abstractNumId="37">
+  <w:abstractNum w:abstractNumId="39">
     <w:nsid w:val="75631C59"/>
     <w:multiLevelType w:val="hybridMultilevel"/>
     <w:tmpl w:val="7E6A29CC"/>
@@ -19035,7 +19679,7 @@
       </w:rPr>
     </w:lvl>
   </w:abstractNum>
-  <w:abstractNum w:abstractNumId="38">
+  <w:abstractNum w:abstractNumId="40">
     <w:nsid w:val="7BD5777C"/>
     <w:multiLevelType w:val="hybridMultilevel"/>
     <w:tmpl w:val="53D46EE2"/>
@@ -19124,7 +19768,7 @@
       </w:pPr>
     </w:lvl>
   </w:abstractNum>
-  <w:abstractNum w:abstractNumId="39">
+  <w:abstractNum w:abstractNumId="41">
     <w:nsid w:val="7BF715C6"/>
     <w:multiLevelType w:val="hybridMultilevel"/>
     <w:tmpl w:val="F8B83480"/>
@@ -19213,7 +19857,7 @@
       </w:pPr>
     </w:lvl>
   </w:abstractNum>
-  <w:abstractNum w:abstractNumId="40">
+  <w:abstractNum w:abstractNumId="42">
     <w:nsid w:val="7C2320E0"/>
     <w:multiLevelType w:val="hybridMultilevel"/>
     <w:tmpl w:val="B4EC2F1C"/>
@@ -19326,7 +19970,7 @@
       </w:rPr>
     </w:lvl>
   </w:abstractNum>
-  <w:abstractNum w:abstractNumId="41">
+  <w:abstractNum w:abstractNumId="43">
     <w:nsid w:val="7E2F2A24"/>
     <w:multiLevelType w:val="hybridMultilevel"/>
     <w:tmpl w:val="CF9414DC"/>
@@ -19440,130 +20084,136 @@
     </w:lvl>
   </w:abstractNum>
   <w:num w:numId="1">
-    <w:abstractNumId w:val="20"/>
+    <w:abstractNumId w:val="22"/>
   </w:num>
   <w:num w:numId="2">
-    <w:abstractNumId w:val="22"/>
+    <w:abstractNumId w:val="24"/>
   </w:num>
   <w:num w:numId="3">
-    <w:abstractNumId w:val="36"/>
+    <w:abstractNumId w:val="38"/>
   </w:num>
   <w:num w:numId="4">
-    <w:abstractNumId w:val="14"/>
+    <w:abstractNumId w:val="16"/>
   </w:num>
   <w:num w:numId="5">
     <w:abstractNumId w:val="2"/>
   </w:num>
   <w:num w:numId="6">
+    <w:abstractNumId w:val="11"/>
+  </w:num>
+  <w:num w:numId="7">
+    <w:abstractNumId w:val="37"/>
+  </w:num>
+  <w:num w:numId="8">
+    <w:abstractNumId w:val="25"/>
+  </w:num>
+  <w:num w:numId="9">
+    <w:abstractNumId w:val="14"/>
+  </w:num>
+  <w:num w:numId="10">
+    <w:abstractNumId w:val="31"/>
+  </w:num>
+  <w:num w:numId="11">
+    <w:abstractNumId w:val="32"/>
+  </w:num>
+  <w:num w:numId="12">
+    <w:abstractNumId w:val="28"/>
+  </w:num>
+  <w:num w:numId="13">
+    <w:abstractNumId w:val="12"/>
+  </w:num>
+  <w:num w:numId="14">
     <w:abstractNumId w:val="9"/>
   </w:num>
-  <w:num w:numId="7">
-    <w:abstractNumId w:val="35"/>
-  </w:num>
-  <w:num w:numId="8">
-    <w:abstractNumId w:val="23"/>
-  </w:num>
-  <w:num w:numId="9">
-    <w:abstractNumId w:val="12"/>
-  </w:num>
-  <w:num w:numId="10">
-    <w:abstractNumId w:val="29"/>
-  </w:num>
-  <w:num w:numId="11">
-    <w:abstractNumId w:val="30"/>
-  </w:num>
-  <w:num w:numId="12">
-    <w:abstractNumId w:val="26"/>
-  </w:num>
-  <w:num w:numId="13">
-    <w:abstractNumId w:val="10"/>
-  </w:num>
-  <w:num w:numId="14">
-    <w:abstractNumId w:val="7"/>
-  </w:num>
   <w:num w:numId="15">
-    <w:abstractNumId w:val="38"/>
+    <w:abstractNumId w:val="40"/>
   </w:num>
   <w:num w:numId="16">
     <w:abstractNumId w:val="3"/>
   </w:num>
   <w:num w:numId="17">
-    <w:abstractNumId w:val="17"/>
+    <w:abstractNumId w:val="19"/>
   </w:num>
   <w:num w:numId="18">
     <w:abstractNumId w:val="1"/>
   </w:num>
   <w:num w:numId="19">
+    <w:abstractNumId w:val="8"/>
+  </w:num>
+  <w:num w:numId="20">
+    <w:abstractNumId w:val="21"/>
+  </w:num>
+  <w:num w:numId="21">
+    <w:abstractNumId w:val="34"/>
+  </w:num>
+  <w:num w:numId="22">
     <w:abstractNumId w:val="6"/>
   </w:num>
-  <w:num w:numId="20">
-    <w:abstractNumId w:val="19"/>
+  <w:num w:numId="23">
+    <w:abstractNumId w:val="42"/>
   </w:num>
-  <w:num w:numId="21">
-    <w:abstractNumId w:val="32"/>
+  <w:num w:numId="24">
+    <w:abstractNumId w:val="13"/>
   </w:num>
-  <w:num w:numId="22">
+  <w:num w:numId="25">
+    <w:abstractNumId w:val="17"/>
+  </w:num>
+  <w:num w:numId="26">
+    <w:abstractNumId w:val="18"/>
+  </w:num>
+  <w:num w:numId="27">
+    <w:abstractNumId w:val="23"/>
+  </w:num>
+  <w:num w:numId="28">
+    <w:abstractNumId w:val="10"/>
+  </w:num>
+  <w:num w:numId="29">
     <w:abstractNumId w:val="5"/>
   </w:num>
-  <w:num w:numId="23">
-    <w:abstractNumId w:val="40"/>
+  <w:num w:numId="30">
+    <w:abstractNumId w:val="35"/>
   </w:num>
-  <w:num w:numId="24">
-    <w:abstractNumId w:val="11"/>
+  <w:num w:numId="31">
+    <w:abstractNumId w:val="26"/>
   </w:num>
-  <w:num w:numId="25">
-    <w:abstractNumId w:val="15"/>
+  <w:num w:numId="32">
+    <w:abstractNumId w:val="30"/>
   </w:num>
-  <w:num w:numId="26">
-    <w:abstractNumId w:val="16"/>
-  </w:num>
-  <w:num w:numId="27">
-    <w:abstractNumId w:val="21"/>
-  </w:num>
-  <w:num w:numId="28">
-    <w:abstractNumId w:val="8"/>
-  </w:num>
-  <w:num w:numId="29">
-    <w:abstractNumId w:val="4"/>
-  </w:num>
-  <w:num w:numId="30">
+  <w:num w:numId="33">
     <w:abstractNumId w:val="33"/>
   </w:num>
-  <w:num w:numId="31">
-    <w:abstractNumId w:val="24"/>
-  </w:num>
-  <w:num w:numId="32">
-    <w:abstractNumId w:val="28"/>
-  </w:num>
-  <w:num w:numId="33">
-    <w:abstractNumId w:val="31"/>
-  </w:num>
   <w:num w:numId="34">
-    <w:abstractNumId w:val="18"/>
+    <w:abstractNumId w:val="20"/>
   </w:num>
   <w:num w:numId="35">
-    <w:abstractNumId w:val="39"/>
+    <w:abstractNumId w:val="41"/>
   </w:num>
   <w:num w:numId="36">
-    <w:abstractNumId w:val="27"/>
+    <w:abstractNumId w:val="29"/>
   </w:num>
   <w:num w:numId="37">
     <w:abstractNumId w:val="0"/>
   </w:num>
   <w:num w:numId="38">
-    <w:abstractNumId w:val="13"/>
+    <w:abstractNumId w:val="15"/>
   </w:num>
   <w:num w:numId="39">
-    <w:abstractNumId w:val="41"/>
+    <w:abstractNumId w:val="43"/>
   </w:num>
   <w:num w:numId="40">
-    <w:abstractNumId w:val="25"/>
+    <w:abstractNumId w:val="27"/>
   </w:num>
   <w:num w:numId="41">
-    <w:abstractNumId w:val="37"/>
+    <w:abstractNumId w:val="39"/>
   </w:num>
   <w:num w:numId="42">
-    <w:abstractNumId w:val="34"/>
+    <w:abstractNumId w:val="36"/>
+  </w:num>
+  <w:num w:numId="43">
+    <w:abstractNumId w:val="4"/>
+  </w:num>
+  <w:num w:numId="44">
+    <w:abstractNumId w:val="7"/>
   </w:num>
 </w:numbering>
 </file>
@@ -21234,31 +21884,31 @@
     </dgm:pt>
   </dgm:ptLst>
   <dgm:cxnLst>
+    <dgm:cxn modelId="{2F032135-CAFE-452F-8127-7E762B7DCD5F}" type="presOf" srcId="{B2F67260-32B4-49EF-BEA7-6376ABEBC356}" destId="{45B120D8-A283-4DB0-AE48-CD1028B5A1CA}" srcOrd="0" destOrd="0" presId="urn:microsoft.com/office/officeart/2005/8/layout/process1"/>
+    <dgm:cxn modelId="{76FEEE46-CBBE-4BE5-A019-C699E9F39BA4}" type="presOf" srcId="{58F8E6FA-8E5F-4590-8E91-7D425686736E}" destId="{1C61394E-D32F-4A43-ADD4-F46D3A33D38F}" srcOrd="0" destOrd="0" presId="urn:microsoft.com/office/officeart/2005/8/layout/process1"/>
+    <dgm:cxn modelId="{916CD402-046A-49C3-919C-E8874C6452BD}" srcId="{C787D0C9-C4AA-4BF8-AAA9-EFDCDDDFB8C5}" destId="{B0DAEDAB-33B3-4821-A91B-D05361312CE9}" srcOrd="3" destOrd="0" parTransId="{1B396FDD-FE98-44AA-BBFD-EFDF9B52D4CD}" sibTransId="{2689B6F1-8FF1-4D68-9639-E8E505EA5AB0}"/>
+    <dgm:cxn modelId="{24B88B39-74DC-4C23-B2C5-1F856356ABE4}" type="presOf" srcId="{D4DE5EA1-C98A-4001-96ED-0D8A4099152C}" destId="{CA09568C-529F-4056-BB14-75FC27EA3A57}" srcOrd="0" destOrd="0" presId="urn:microsoft.com/office/officeart/2005/8/layout/process1"/>
+    <dgm:cxn modelId="{EF89E012-843D-4773-B462-990630480382}" type="presOf" srcId="{C787D0C9-C4AA-4BF8-AAA9-EFDCDDDFB8C5}" destId="{ECE2E50F-1EF0-49E9-A2A2-C09D34379E86}" srcOrd="0" destOrd="0" presId="urn:microsoft.com/office/officeart/2005/8/layout/process1"/>
+    <dgm:cxn modelId="{EF58C0EE-DE28-4DFF-9746-16C32CF4612E}" type="presOf" srcId="{B0DAEDAB-33B3-4821-A91B-D05361312CE9}" destId="{FCE3B9A4-214A-4502-B3DF-ACB3E0BC61C7}" srcOrd="0" destOrd="0" presId="urn:microsoft.com/office/officeart/2005/8/layout/process1"/>
+    <dgm:cxn modelId="{6FD0C3CD-8CC6-40FC-A77B-67563CBD191B}" type="presOf" srcId="{2F2C6037-AE48-4650-B998-EBABF88D0464}" destId="{ABB6D0E9-231F-49FF-8F6A-CBD756BB2A07}" srcOrd="0" destOrd="0" presId="urn:microsoft.com/office/officeart/2005/8/layout/process1"/>
+    <dgm:cxn modelId="{B838BD8A-FD59-4869-9840-3F7C3438E35E}" type="presOf" srcId="{CB734D05-6005-4A33-891F-8F6E9F0BE629}" destId="{9346448E-7772-4989-9A73-02FD2DA61B93}" srcOrd="0" destOrd="0" presId="urn:microsoft.com/office/officeart/2005/8/layout/process1"/>
     <dgm:cxn modelId="{407416C7-D9A4-49CF-A1D9-63129D12A5E9}" srcId="{C787D0C9-C4AA-4BF8-AAA9-EFDCDDDFB8C5}" destId="{B2F67260-32B4-49EF-BEA7-6376ABEBC356}" srcOrd="1" destOrd="0" parTransId="{452FD36E-8C97-458A-9189-BC15B3E0AB1F}" sibTransId="{58F8E6FA-8E5F-4590-8E91-7D425686736E}"/>
-    <dgm:cxn modelId="{CFFF6FB7-606C-49B5-8CFC-45DDB26FB694}" type="presOf" srcId="{C6470392-B547-42B7-BBE1-49D9BF3297A5}" destId="{D17F71C8-684F-40E9-B9CF-89D188A27816}" srcOrd="1" destOrd="0" presId="urn:microsoft.com/office/officeart/2005/8/layout/process1"/>
-    <dgm:cxn modelId="{CF494D31-49AA-424D-8ABB-ACAC6DAA59F2}" type="presOf" srcId="{B0DAEDAB-33B3-4821-A91B-D05361312CE9}" destId="{FCE3B9A4-214A-4502-B3DF-ACB3E0BC61C7}" srcOrd="0" destOrd="0" presId="urn:microsoft.com/office/officeart/2005/8/layout/process1"/>
-    <dgm:cxn modelId="{5F69ECC1-36B9-4D46-91C4-41ED387B5E8D}" type="presOf" srcId="{2F2C6037-AE48-4650-B998-EBABF88D0464}" destId="{8D8E620F-A309-4628-986D-B0F92ABF739C}" srcOrd="1" destOrd="0" presId="urn:microsoft.com/office/officeart/2005/8/layout/process1"/>
-    <dgm:cxn modelId="{D4A4DF8A-0FEC-4601-ABA1-1B72089A362D}" type="presOf" srcId="{C787D0C9-C4AA-4BF8-AAA9-EFDCDDDFB8C5}" destId="{ECE2E50F-1EF0-49E9-A2A2-C09D34379E86}" srcOrd="0" destOrd="0" presId="urn:microsoft.com/office/officeart/2005/8/layout/process1"/>
-    <dgm:cxn modelId="{5C573742-914B-479F-8A07-2CBA2DF670DC}" type="presOf" srcId="{B2F67260-32B4-49EF-BEA7-6376ABEBC356}" destId="{45B120D8-A283-4DB0-AE48-CD1028B5A1CA}" srcOrd="0" destOrd="0" presId="urn:microsoft.com/office/officeart/2005/8/layout/process1"/>
-    <dgm:cxn modelId="{6AEDDA44-0BB1-426C-A901-60C72BAA71D6}" type="presOf" srcId="{C6470392-B547-42B7-BBE1-49D9BF3297A5}" destId="{E6A79763-2175-4FE6-AF39-65BAD7E8A94D}" srcOrd="0" destOrd="0" presId="urn:microsoft.com/office/officeart/2005/8/layout/process1"/>
+    <dgm:cxn modelId="{F27277EA-BDDA-4005-9170-FBB0A209E462}" srcId="{C787D0C9-C4AA-4BF8-AAA9-EFDCDDDFB8C5}" destId="{CB734D05-6005-4A33-891F-8F6E9F0BE629}" srcOrd="0" destOrd="0" parTransId="{D88A1106-7499-4EC1-A955-12C926757BDC}" sibTransId="{2F2C6037-AE48-4650-B998-EBABF88D0464}"/>
+    <dgm:cxn modelId="{EC1B6D80-3DB8-4840-A3D5-69302AD4F91B}" type="presOf" srcId="{2F2C6037-AE48-4650-B998-EBABF88D0464}" destId="{8D8E620F-A309-4628-986D-B0F92ABF739C}" srcOrd="1" destOrd="0" presId="urn:microsoft.com/office/officeart/2005/8/layout/process1"/>
+    <dgm:cxn modelId="{2B34C34C-058A-4024-BE7F-B910DAC69EE5}" type="presOf" srcId="{58F8E6FA-8E5F-4590-8E91-7D425686736E}" destId="{38F30BB8-19AC-4F2C-997E-D6C87643D812}" srcOrd="1" destOrd="0" presId="urn:microsoft.com/office/officeart/2005/8/layout/process1"/>
     <dgm:cxn modelId="{A358B1AA-45ED-4C0A-A925-911C6E3E177E}" srcId="{C787D0C9-C4AA-4BF8-AAA9-EFDCDDDFB8C5}" destId="{D4DE5EA1-C98A-4001-96ED-0D8A4099152C}" srcOrd="2" destOrd="0" parTransId="{DDD45587-67C2-4B3F-892B-0153C2E010D0}" sibTransId="{C6470392-B547-42B7-BBE1-49D9BF3297A5}"/>
-    <dgm:cxn modelId="{90AC3622-377D-460E-8850-E591FA5D82D2}" type="presOf" srcId="{D4DE5EA1-C98A-4001-96ED-0D8A4099152C}" destId="{CA09568C-529F-4056-BB14-75FC27EA3A57}" srcOrd="0" destOrd="0" presId="urn:microsoft.com/office/officeart/2005/8/layout/process1"/>
-    <dgm:cxn modelId="{916CD402-046A-49C3-919C-E8874C6452BD}" srcId="{C787D0C9-C4AA-4BF8-AAA9-EFDCDDDFB8C5}" destId="{B0DAEDAB-33B3-4821-A91B-D05361312CE9}" srcOrd="3" destOrd="0" parTransId="{1B396FDD-FE98-44AA-BBFD-EFDF9B52D4CD}" sibTransId="{2689B6F1-8FF1-4D68-9639-E8E505EA5AB0}"/>
-    <dgm:cxn modelId="{6BC7D6C5-28AE-4A35-9E2F-52C688F07DCE}" type="presOf" srcId="{58F8E6FA-8E5F-4590-8E91-7D425686736E}" destId="{1C61394E-D32F-4A43-ADD4-F46D3A33D38F}" srcOrd="0" destOrd="0" presId="urn:microsoft.com/office/officeart/2005/8/layout/process1"/>
-    <dgm:cxn modelId="{F27277EA-BDDA-4005-9170-FBB0A209E462}" srcId="{C787D0C9-C4AA-4BF8-AAA9-EFDCDDDFB8C5}" destId="{CB734D05-6005-4A33-891F-8F6E9F0BE629}" srcOrd="0" destOrd="0" parTransId="{D88A1106-7499-4EC1-A955-12C926757BDC}" sibTransId="{2F2C6037-AE48-4650-B998-EBABF88D0464}"/>
-    <dgm:cxn modelId="{4F7F94F0-67BF-45AC-BA6E-44E557FFF62D}" type="presOf" srcId="{2F2C6037-AE48-4650-B998-EBABF88D0464}" destId="{ABB6D0E9-231F-49FF-8F6A-CBD756BB2A07}" srcOrd="0" destOrd="0" presId="urn:microsoft.com/office/officeart/2005/8/layout/process1"/>
-    <dgm:cxn modelId="{91F41DE9-D729-41E5-A1F8-31A9372AB7AA}" type="presOf" srcId="{CB734D05-6005-4A33-891F-8F6E9F0BE629}" destId="{9346448E-7772-4989-9A73-02FD2DA61B93}" srcOrd="0" destOrd="0" presId="urn:microsoft.com/office/officeart/2005/8/layout/process1"/>
-    <dgm:cxn modelId="{45741B47-9087-4261-BA30-A21D83EE9448}" type="presOf" srcId="{58F8E6FA-8E5F-4590-8E91-7D425686736E}" destId="{38F30BB8-19AC-4F2C-997E-D6C87643D812}" srcOrd="1" destOrd="0" presId="urn:microsoft.com/office/officeart/2005/8/layout/process1"/>
-    <dgm:cxn modelId="{6837B0F1-F881-4D8E-B4A2-D8BA64A469E7}" type="presParOf" srcId="{ECE2E50F-1EF0-49E9-A2A2-C09D34379E86}" destId="{9346448E-7772-4989-9A73-02FD2DA61B93}" srcOrd="0" destOrd="0" presId="urn:microsoft.com/office/officeart/2005/8/layout/process1"/>
-    <dgm:cxn modelId="{7BAAE934-9CBC-42BB-92BE-E411E0A9D3C9}" type="presParOf" srcId="{ECE2E50F-1EF0-49E9-A2A2-C09D34379E86}" destId="{ABB6D0E9-231F-49FF-8F6A-CBD756BB2A07}" srcOrd="1" destOrd="0" presId="urn:microsoft.com/office/officeart/2005/8/layout/process1"/>
-    <dgm:cxn modelId="{C503862C-6396-48C7-9833-E556A0345A80}" type="presParOf" srcId="{ABB6D0E9-231F-49FF-8F6A-CBD756BB2A07}" destId="{8D8E620F-A309-4628-986D-B0F92ABF739C}" srcOrd="0" destOrd="0" presId="urn:microsoft.com/office/officeart/2005/8/layout/process1"/>
-    <dgm:cxn modelId="{7BAAA1C7-8141-4840-B8A4-34D8899E7348}" type="presParOf" srcId="{ECE2E50F-1EF0-49E9-A2A2-C09D34379E86}" destId="{45B120D8-A283-4DB0-AE48-CD1028B5A1CA}" srcOrd="2" destOrd="0" presId="urn:microsoft.com/office/officeart/2005/8/layout/process1"/>
-    <dgm:cxn modelId="{64652317-C0EF-4FC3-BDB3-84783092A439}" type="presParOf" srcId="{ECE2E50F-1EF0-49E9-A2A2-C09D34379E86}" destId="{1C61394E-D32F-4A43-ADD4-F46D3A33D38F}" srcOrd="3" destOrd="0" presId="urn:microsoft.com/office/officeart/2005/8/layout/process1"/>
-    <dgm:cxn modelId="{8E3ED66C-0BD3-4C61-9A6A-68A10CA22692}" type="presParOf" srcId="{1C61394E-D32F-4A43-ADD4-F46D3A33D38F}" destId="{38F30BB8-19AC-4F2C-997E-D6C87643D812}" srcOrd="0" destOrd="0" presId="urn:microsoft.com/office/officeart/2005/8/layout/process1"/>
-    <dgm:cxn modelId="{9820A729-A278-4408-AFD6-4072220A3F5E}" type="presParOf" srcId="{ECE2E50F-1EF0-49E9-A2A2-C09D34379E86}" destId="{CA09568C-529F-4056-BB14-75FC27EA3A57}" srcOrd="4" destOrd="0" presId="urn:microsoft.com/office/officeart/2005/8/layout/process1"/>
-    <dgm:cxn modelId="{7B2E4F46-04BA-48CA-A23C-2B516D24D657}" type="presParOf" srcId="{ECE2E50F-1EF0-49E9-A2A2-C09D34379E86}" destId="{E6A79763-2175-4FE6-AF39-65BAD7E8A94D}" srcOrd="5" destOrd="0" presId="urn:microsoft.com/office/officeart/2005/8/layout/process1"/>
-    <dgm:cxn modelId="{05D6CE8C-A977-4E91-A7EB-FCD2CDAFB099}" type="presParOf" srcId="{E6A79763-2175-4FE6-AF39-65BAD7E8A94D}" destId="{D17F71C8-684F-40E9-B9CF-89D188A27816}" srcOrd="0" destOrd="0" presId="urn:microsoft.com/office/officeart/2005/8/layout/process1"/>
-    <dgm:cxn modelId="{5EFC210D-9A5C-4966-8CA1-3F003F1E6797}" type="presParOf" srcId="{ECE2E50F-1EF0-49E9-A2A2-C09D34379E86}" destId="{FCE3B9A4-214A-4502-B3DF-ACB3E0BC61C7}" srcOrd="6" destOrd="0" presId="urn:microsoft.com/office/officeart/2005/8/layout/process1"/>
+    <dgm:cxn modelId="{64D29015-8CF2-477E-A2D2-D67077E290E1}" type="presOf" srcId="{C6470392-B547-42B7-BBE1-49D9BF3297A5}" destId="{D17F71C8-684F-40E9-B9CF-89D188A27816}" srcOrd="1" destOrd="0" presId="urn:microsoft.com/office/officeart/2005/8/layout/process1"/>
+    <dgm:cxn modelId="{E8E6CC04-DD6F-420B-9626-E8746F09C844}" type="presOf" srcId="{C6470392-B547-42B7-BBE1-49D9BF3297A5}" destId="{E6A79763-2175-4FE6-AF39-65BAD7E8A94D}" srcOrd="0" destOrd="0" presId="urn:microsoft.com/office/officeart/2005/8/layout/process1"/>
+    <dgm:cxn modelId="{402C3361-7A5E-41D7-8AFB-30F7AA44C7E7}" type="presParOf" srcId="{ECE2E50F-1EF0-49E9-A2A2-C09D34379E86}" destId="{9346448E-7772-4989-9A73-02FD2DA61B93}" srcOrd="0" destOrd="0" presId="urn:microsoft.com/office/officeart/2005/8/layout/process1"/>
+    <dgm:cxn modelId="{A390454B-1E30-4878-8417-1AD4B8455A3A}" type="presParOf" srcId="{ECE2E50F-1EF0-49E9-A2A2-C09D34379E86}" destId="{ABB6D0E9-231F-49FF-8F6A-CBD756BB2A07}" srcOrd="1" destOrd="0" presId="urn:microsoft.com/office/officeart/2005/8/layout/process1"/>
+    <dgm:cxn modelId="{3841CE9E-F6F4-42B0-BAA3-F976085D3DD2}" type="presParOf" srcId="{ABB6D0E9-231F-49FF-8F6A-CBD756BB2A07}" destId="{8D8E620F-A309-4628-986D-B0F92ABF739C}" srcOrd="0" destOrd="0" presId="urn:microsoft.com/office/officeart/2005/8/layout/process1"/>
+    <dgm:cxn modelId="{14FC35DB-A9AA-47F0-AA58-7A70F5AE11CA}" type="presParOf" srcId="{ECE2E50F-1EF0-49E9-A2A2-C09D34379E86}" destId="{45B120D8-A283-4DB0-AE48-CD1028B5A1CA}" srcOrd="2" destOrd="0" presId="urn:microsoft.com/office/officeart/2005/8/layout/process1"/>
+    <dgm:cxn modelId="{F92677AC-7062-413B-B8A7-82B5CCB19B9D}" type="presParOf" srcId="{ECE2E50F-1EF0-49E9-A2A2-C09D34379E86}" destId="{1C61394E-D32F-4A43-ADD4-F46D3A33D38F}" srcOrd="3" destOrd="0" presId="urn:microsoft.com/office/officeart/2005/8/layout/process1"/>
+    <dgm:cxn modelId="{02D4380E-5B30-4242-A96E-836D5A4201D2}" type="presParOf" srcId="{1C61394E-D32F-4A43-ADD4-F46D3A33D38F}" destId="{38F30BB8-19AC-4F2C-997E-D6C87643D812}" srcOrd="0" destOrd="0" presId="urn:microsoft.com/office/officeart/2005/8/layout/process1"/>
+    <dgm:cxn modelId="{E5DF3B55-7576-4BE5-80E4-7B574F619BA1}" type="presParOf" srcId="{ECE2E50F-1EF0-49E9-A2A2-C09D34379E86}" destId="{CA09568C-529F-4056-BB14-75FC27EA3A57}" srcOrd="4" destOrd="0" presId="urn:microsoft.com/office/officeart/2005/8/layout/process1"/>
+    <dgm:cxn modelId="{EC50ABAE-CFDB-4BA0-8872-9559915A60A1}" type="presParOf" srcId="{ECE2E50F-1EF0-49E9-A2A2-C09D34379E86}" destId="{E6A79763-2175-4FE6-AF39-65BAD7E8A94D}" srcOrd="5" destOrd="0" presId="urn:microsoft.com/office/officeart/2005/8/layout/process1"/>
+    <dgm:cxn modelId="{C270E239-D04C-43B5-A138-01C1FAB52CBF}" type="presParOf" srcId="{E6A79763-2175-4FE6-AF39-65BAD7E8A94D}" destId="{D17F71C8-684F-40E9-B9CF-89D188A27816}" srcOrd="0" destOrd="0" presId="urn:microsoft.com/office/officeart/2005/8/layout/process1"/>
+    <dgm:cxn modelId="{2EC8A510-63C3-4423-874F-8226F6E613E2}" type="presParOf" srcId="{ECE2E50F-1EF0-49E9-A2A2-C09D34379E86}" destId="{FCE3B9A4-214A-4502-B3DF-ACB3E0BC61C7}" srcOrd="6" destOrd="0" presId="urn:microsoft.com/office/officeart/2005/8/layout/process1"/>
   </dgm:cxnLst>
   <dgm:bg/>
   <dgm:whole/>

</xml_diff>

<commit_message>
Date: 06 May 2026
</commit_message>
<xml_diff>
--- a/Notes_SA2601010.docx
+++ b/Notes_SA2601010.docx
@@ -779,13 +779,23 @@
           <w:lang w:val="en-US"/>
         </w:rPr>
       </w:pPr>
-      <w:r>
-        <w:rPr>
-          <w:sz w:val="24"/>
-          <w:szCs w:val="22"/>
-          <w:lang w:val="en-US"/>
-        </w:rPr>
-        <w:t>Thread.sleep()</w:t>
+      <w:proofErr w:type="spellStart"/>
+      <w:r>
+        <w:rPr>
+          <w:sz w:val="24"/>
+          <w:szCs w:val="22"/>
+          <w:lang w:val="en-US"/>
+        </w:rPr>
+        <w:t>Thread.sleep</w:t>
+      </w:r>
+      <w:proofErr w:type="spellEnd"/>
+      <w:r>
+        <w:rPr>
+          <w:sz w:val="24"/>
+          <w:szCs w:val="22"/>
+          <w:lang w:val="en-US"/>
+        </w:rPr>
+        <w:t>()</w:t>
       </w:r>
     </w:p>
     <w:p>
@@ -3610,7 +3620,25 @@
           <w:szCs w:val="22"/>
           <w:lang w:val="en-US"/>
         </w:rPr>
-        <w:t>Instructions to the tool can be provided via any one of the supporting programming language (like Java, JavaScript, Python, C#, Ruby, TypeScript)</w:t>
+        <w:t xml:space="preserve">Instructions to the tool can be provided via any one of the supporting programming language (like Java, JavaScript, Python, C#, Ruby, </w:t>
+      </w:r>
+      <w:proofErr w:type="spellStart"/>
+      <w:r>
+        <w:rPr>
+          <w:sz w:val="24"/>
+          <w:szCs w:val="22"/>
+          <w:lang w:val="en-US"/>
+        </w:rPr>
+        <w:t>TypeScript</w:t>
+      </w:r>
+      <w:proofErr w:type="spellEnd"/>
+      <w:r>
+        <w:rPr>
+          <w:sz w:val="24"/>
+          <w:szCs w:val="22"/>
+          <w:lang w:val="en-US"/>
+        </w:rPr>
+        <w:t>)</w:t>
       </w:r>
     </w:p>
     <w:p>
@@ -5715,13 +5743,41 @@
           <w:lang w:val="en-US"/>
         </w:rPr>
       </w:pPr>
-      <w:r>
-        <w:rPr>
-          <w:sz w:val="24"/>
-          <w:szCs w:val="22"/>
-          <w:lang w:val="en-US"/>
-        </w:rPr>
-        <w:t>YourName_SeleniumDemos (Lakshmi_SeleniumDemos)</w:t>
+      <w:proofErr w:type="spellStart"/>
+      <w:r>
+        <w:rPr>
+          <w:sz w:val="24"/>
+          <w:szCs w:val="22"/>
+          <w:lang w:val="en-US"/>
+        </w:rPr>
+        <w:t>YourName_SeleniumDemos</w:t>
+      </w:r>
+      <w:proofErr w:type="spellEnd"/>
+      <w:r>
+        <w:rPr>
+          <w:sz w:val="24"/>
+          <w:szCs w:val="22"/>
+          <w:lang w:val="en-US"/>
+        </w:rPr>
+        <w:t xml:space="preserve"> (</w:t>
+      </w:r>
+      <w:proofErr w:type="spellStart"/>
+      <w:r>
+        <w:rPr>
+          <w:sz w:val="24"/>
+          <w:szCs w:val="22"/>
+          <w:lang w:val="en-US"/>
+        </w:rPr>
+        <w:t>Lakshmi_SeleniumDemos</w:t>
+      </w:r>
+      <w:proofErr w:type="spellEnd"/>
+      <w:r>
+        <w:rPr>
+          <w:sz w:val="24"/>
+          <w:szCs w:val="22"/>
+          <w:lang w:val="en-US"/>
+        </w:rPr>
+        <w:t>)</w:t>
       </w:r>
     </w:p>
     <w:p>
@@ -5795,7 +5851,25 @@
           <w:szCs w:val="22"/>
           <w:lang w:val="en-US"/>
         </w:rPr>
-        <w:t>Open selenium.dev website</w:t>
+        <w:t xml:space="preserve">Open </w:t>
+      </w:r>
+      <w:proofErr w:type="spellStart"/>
+      <w:r>
+        <w:rPr>
+          <w:sz w:val="24"/>
+          <w:szCs w:val="22"/>
+          <w:lang w:val="en-US"/>
+        </w:rPr>
+        <w:t>selenium.dev</w:t>
+      </w:r>
+      <w:proofErr w:type="spellEnd"/>
+      <w:r>
+        <w:rPr>
+          <w:sz w:val="24"/>
+          <w:szCs w:val="22"/>
+          <w:lang w:val="en-US"/>
+        </w:rPr>
+        <w:t xml:space="preserve"> website</w:t>
       </w:r>
     </w:p>
     <w:p>
@@ -6788,13 +6862,23 @@
           <w:lang w:val="en-US"/>
         </w:rPr>
       </w:pPr>
-      <w:r>
-        <w:rPr>
-          <w:sz w:val="24"/>
-          <w:szCs w:val="22"/>
-          <w:lang w:val="en-US"/>
-        </w:rPr>
-        <w:t xml:space="preserve">get() </w:t>
+      <w:proofErr w:type="gramStart"/>
+      <w:r>
+        <w:rPr>
+          <w:sz w:val="24"/>
+          <w:szCs w:val="22"/>
+          <w:lang w:val="en-US"/>
+        </w:rPr>
+        <w:t>get(</w:t>
+      </w:r>
+      <w:proofErr w:type="gramEnd"/>
+      <w:r>
+        <w:rPr>
+          <w:sz w:val="24"/>
+          <w:szCs w:val="22"/>
+          <w:lang w:val="en-US"/>
+        </w:rPr>
+        <w:t xml:space="preserve">) </w:t>
       </w:r>
       <w:r>
         <w:rPr>
@@ -6862,6 +6946,8 @@
           <w:lang w:val="en-US"/>
         </w:rPr>
       </w:pPr>
+      <w:proofErr w:type="spellStart"/>
+      <w:proofErr w:type="gramStart"/>
       <w:r>
         <w:rPr>
           <w:sz w:val="24"/>
@@ -6876,7 +6962,25 @@
           <w:szCs w:val="22"/>
           <w:lang w:val="en-US"/>
         </w:rPr>
-        <w:t xml:space="preserve">er.manage().window().maximize() </w:t>
+        <w:t>er.manage</w:t>
+      </w:r>
+      <w:proofErr w:type="spellEnd"/>
+      <w:r>
+        <w:rPr>
+          <w:sz w:val="24"/>
+          <w:szCs w:val="22"/>
+          <w:lang w:val="en-US"/>
+        </w:rPr>
+        <w:t>(</w:t>
+      </w:r>
+      <w:proofErr w:type="gramEnd"/>
+      <w:r>
+        <w:rPr>
+          <w:sz w:val="24"/>
+          <w:szCs w:val="22"/>
+          <w:lang w:val="en-US"/>
+        </w:rPr>
+        <w:t xml:space="preserve">).window().maximize() </w:t>
       </w:r>
       <w:r>
         <w:rPr>
@@ -6908,13 +7012,23 @@
           <w:lang w:val="en-US"/>
         </w:rPr>
       </w:pPr>
-      <w:r>
-        <w:rPr>
-          <w:sz w:val="24"/>
-          <w:szCs w:val="22"/>
-          <w:lang w:val="en-US"/>
-        </w:rPr>
-        <w:t xml:space="preserve">close() </w:t>
+      <w:proofErr w:type="gramStart"/>
+      <w:r>
+        <w:rPr>
+          <w:sz w:val="24"/>
+          <w:szCs w:val="22"/>
+          <w:lang w:val="en-US"/>
+        </w:rPr>
+        <w:t>close(</w:t>
+      </w:r>
+      <w:proofErr w:type="gramEnd"/>
+      <w:r>
+        <w:rPr>
+          <w:sz w:val="24"/>
+          <w:szCs w:val="22"/>
+          <w:lang w:val="en-US"/>
+        </w:rPr>
+        <w:t xml:space="preserve">) </w:t>
       </w:r>
       <w:r>
         <w:rPr>
@@ -6964,13 +7078,23 @@
           <w:lang w:val="en-US"/>
         </w:rPr>
       </w:pPr>
-      <w:r>
-        <w:rPr>
-          <w:sz w:val="24"/>
-          <w:szCs w:val="22"/>
-          <w:lang w:val="en-US"/>
-        </w:rPr>
-        <w:t xml:space="preserve">getTitle() </w:t>
+      <w:proofErr w:type="gramStart"/>
+      <w:r>
+        <w:rPr>
+          <w:sz w:val="24"/>
+          <w:szCs w:val="22"/>
+          <w:lang w:val="en-US"/>
+        </w:rPr>
+        <w:t>getTitle(</w:t>
+      </w:r>
+      <w:proofErr w:type="gramEnd"/>
+      <w:r>
+        <w:rPr>
+          <w:sz w:val="24"/>
+          <w:szCs w:val="22"/>
+          <w:lang w:val="en-US"/>
+        </w:rPr>
+        <w:t xml:space="preserve">) </w:t>
       </w:r>
       <w:r>
         <w:rPr>
@@ -7010,13 +7134,23 @@
           <w:lang w:val="en-US"/>
         </w:rPr>
       </w:pPr>
-      <w:r>
-        <w:rPr>
-          <w:sz w:val="24"/>
-          <w:szCs w:val="22"/>
-          <w:lang w:val="en-US"/>
-        </w:rPr>
-        <w:t xml:space="preserve">getCurrentUrl() </w:t>
+      <w:proofErr w:type="gramStart"/>
+      <w:r>
+        <w:rPr>
+          <w:sz w:val="24"/>
+          <w:szCs w:val="22"/>
+          <w:lang w:val="en-US"/>
+        </w:rPr>
+        <w:t>getCurrentUrl(</w:t>
+      </w:r>
+      <w:proofErr w:type="gramEnd"/>
+      <w:r>
+        <w:rPr>
+          <w:sz w:val="24"/>
+          <w:szCs w:val="22"/>
+          <w:lang w:val="en-US"/>
+        </w:rPr>
+        <w:t xml:space="preserve">) </w:t>
       </w:r>
       <w:r>
         <w:rPr>
@@ -7048,13 +7182,23 @@
           <w:lang w:val="en-US"/>
         </w:rPr>
       </w:pPr>
-      <w:r>
-        <w:rPr>
-          <w:sz w:val="24"/>
-          <w:szCs w:val="22"/>
-          <w:lang w:val="en-US"/>
-        </w:rPr>
-        <w:t xml:space="preserve">getPageSource() </w:t>
+      <w:proofErr w:type="gramStart"/>
+      <w:r>
+        <w:rPr>
+          <w:sz w:val="24"/>
+          <w:szCs w:val="22"/>
+          <w:lang w:val="en-US"/>
+        </w:rPr>
+        <w:t>getPageSource(</w:t>
+      </w:r>
+      <w:proofErr w:type="gramEnd"/>
+      <w:r>
+        <w:rPr>
+          <w:sz w:val="24"/>
+          <w:szCs w:val="22"/>
+          <w:lang w:val="en-US"/>
+        </w:rPr>
+        <w:t xml:space="preserve">) </w:t>
       </w:r>
       <w:r>
         <w:rPr>
@@ -7086,13 +7230,23 @@
           <w:lang w:val="en-US"/>
         </w:rPr>
       </w:pPr>
-      <w:r>
-        <w:rPr>
-          <w:sz w:val="24"/>
-          <w:szCs w:val="22"/>
-          <w:lang w:val="en-US"/>
-        </w:rPr>
-        <w:t xml:space="preserve">findElement() </w:t>
+      <w:proofErr w:type="gramStart"/>
+      <w:r>
+        <w:rPr>
+          <w:sz w:val="24"/>
+          <w:szCs w:val="22"/>
+          <w:lang w:val="en-US"/>
+        </w:rPr>
+        <w:t>findElement(</w:t>
+      </w:r>
+      <w:proofErr w:type="gramEnd"/>
+      <w:r>
+        <w:rPr>
+          <w:sz w:val="24"/>
+          <w:szCs w:val="22"/>
+          <w:lang w:val="en-US"/>
+        </w:rPr>
+        <w:t xml:space="preserve">) </w:t>
       </w:r>
       <w:r>
         <w:rPr>
@@ -7190,13 +7344,23 @@
           <w:lang w:val="en-US"/>
         </w:rPr>
       </w:pPr>
-      <w:r>
-        <w:rPr>
-          <w:sz w:val="24"/>
-          <w:szCs w:val="22"/>
-          <w:lang w:val="en-US"/>
-        </w:rPr>
-        <w:t xml:space="preserve">findElements() </w:t>
+      <w:proofErr w:type="gramStart"/>
+      <w:r>
+        <w:rPr>
+          <w:sz w:val="24"/>
+          <w:szCs w:val="22"/>
+          <w:lang w:val="en-US"/>
+        </w:rPr>
+        <w:t>findElements(</w:t>
+      </w:r>
+      <w:proofErr w:type="gramEnd"/>
+      <w:r>
+        <w:rPr>
+          <w:sz w:val="24"/>
+          <w:szCs w:val="22"/>
+          <w:lang w:val="en-US"/>
+        </w:rPr>
+        <w:t xml:space="preserve">) </w:t>
       </w:r>
       <w:r>
         <w:rPr>
@@ -7258,13 +7422,23 @@
           <w:lang w:val="en-US"/>
         </w:rPr>
       </w:pPr>
-      <w:r>
-        <w:rPr>
-          <w:sz w:val="24"/>
-          <w:szCs w:val="22"/>
-          <w:lang w:val="en-US"/>
-        </w:rPr>
-        <w:t xml:space="preserve">getWindowHandles() </w:t>
+      <w:proofErr w:type="gramStart"/>
+      <w:r>
+        <w:rPr>
+          <w:sz w:val="24"/>
+          <w:szCs w:val="22"/>
+          <w:lang w:val="en-US"/>
+        </w:rPr>
+        <w:t>getWindowHandles(</w:t>
+      </w:r>
+      <w:proofErr w:type="gramEnd"/>
+      <w:r>
+        <w:rPr>
+          <w:sz w:val="24"/>
+          <w:szCs w:val="22"/>
+          <w:lang w:val="en-US"/>
+        </w:rPr>
+        <w:t xml:space="preserve">) </w:t>
       </w:r>
       <w:r>
         <w:rPr>
@@ -7298,13 +7472,23 @@
           <w:lang w:val="en-US"/>
         </w:rPr>
       </w:pPr>
-      <w:r>
-        <w:rPr>
-          <w:sz w:val="24"/>
-          <w:szCs w:val="22"/>
-          <w:lang w:val="en-US"/>
-        </w:rPr>
-        <w:t xml:space="preserve">quit() </w:t>
+      <w:proofErr w:type="gramStart"/>
+      <w:r>
+        <w:rPr>
+          <w:sz w:val="24"/>
+          <w:szCs w:val="22"/>
+          <w:lang w:val="en-US"/>
+        </w:rPr>
+        <w:t>quit(</w:t>
+      </w:r>
+      <w:proofErr w:type="gramEnd"/>
+      <w:r>
+        <w:rPr>
+          <w:sz w:val="24"/>
+          <w:szCs w:val="22"/>
+          <w:lang w:val="en-US"/>
+        </w:rPr>
+        <w:t xml:space="preserve">) </w:t>
       </w:r>
       <w:r>
         <w:rPr>
@@ -7660,7 +7844,35 @@
           <w:szCs w:val="22"/>
           <w:lang w:val="en-US"/>
         </w:rPr>
-        <w:t xml:space="preserve"> Selenium waits for maximum 30 seconds till the page get loaded while calling driver.get(). But if the page is not getting loaded within 30 seconds then Selenium will throw SessionTimeoutException</w:t>
+        <w:t xml:space="preserve"> Selenium waits for maximum 30 seconds till the page get loaded while calling </w:t>
+      </w:r>
+      <w:proofErr w:type="spellStart"/>
+      <w:proofErr w:type="gramStart"/>
+      <w:r>
+        <w:rPr>
+          <w:sz w:val="24"/>
+          <w:szCs w:val="22"/>
+          <w:lang w:val="en-US"/>
+        </w:rPr>
+        <w:t>driver.get</w:t>
+      </w:r>
+      <w:proofErr w:type="spellEnd"/>
+      <w:r>
+        <w:rPr>
+          <w:sz w:val="24"/>
+          <w:szCs w:val="22"/>
+          <w:lang w:val="en-US"/>
+        </w:rPr>
+        <w:t>(</w:t>
+      </w:r>
+      <w:proofErr w:type="gramEnd"/>
+      <w:r>
+        <w:rPr>
+          <w:sz w:val="24"/>
+          <w:szCs w:val="22"/>
+          <w:lang w:val="en-US"/>
+        </w:rPr>
+        <w:t>). But if the page is not getting loaded within 30 seconds then Selenium will throw SessionTimeoutException</w:t>
       </w:r>
       <w:r>
         <w:rPr>
@@ -7900,13 +8112,23 @@
           <w:lang w:val="en-US"/>
         </w:rPr>
       </w:pPr>
-      <w:r>
-        <w:rPr>
-          <w:sz w:val="24"/>
-          <w:szCs w:val="22"/>
-          <w:lang w:val="en-US"/>
-        </w:rPr>
-        <w:t xml:space="preserve">sendKeys() </w:t>
+      <w:proofErr w:type="gramStart"/>
+      <w:r>
+        <w:rPr>
+          <w:sz w:val="24"/>
+          <w:szCs w:val="22"/>
+          <w:lang w:val="en-US"/>
+        </w:rPr>
+        <w:t>sendKeys(</w:t>
+      </w:r>
+      <w:proofErr w:type="gramEnd"/>
+      <w:r>
+        <w:rPr>
+          <w:sz w:val="24"/>
+          <w:szCs w:val="22"/>
+          <w:lang w:val="en-US"/>
+        </w:rPr>
+        <w:t xml:space="preserve">) </w:t>
       </w:r>
       <w:r>
         <w:rPr>
@@ -7956,13 +8178,23 @@
           <w:lang w:val="en-US"/>
         </w:rPr>
       </w:pPr>
-      <w:r>
-        <w:rPr>
-          <w:sz w:val="24"/>
-          <w:szCs w:val="22"/>
-          <w:lang w:val="en-US"/>
-        </w:rPr>
-        <w:t xml:space="preserve">click() </w:t>
+      <w:proofErr w:type="gramStart"/>
+      <w:r>
+        <w:rPr>
+          <w:sz w:val="24"/>
+          <w:szCs w:val="22"/>
+          <w:lang w:val="en-US"/>
+        </w:rPr>
+        <w:t>click(</w:t>
+      </w:r>
+      <w:proofErr w:type="gramEnd"/>
+      <w:r>
+        <w:rPr>
+          <w:sz w:val="24"/>
+          <w:szCs w:val="22"/>
+          <w:lang w:val="en-US"/>
+        </w:rPr>
+        <w:t xml:space="preserve">) </w:t>
       </w:r>
       <w:r>
         <w:rPr>
@@ -7994,13 +8226,23 @@
           <w:lang w:val="en-US"/>
         </w:rPr>
       </w:pPr>
-      <w:r>
-        <w:rPr>
-          <w:sz w:val="24"/>
-          <w:szCs w:val="22"/>
-          <w:lang w:val="en-US"/>
-        </w:rPr>
-        <w:t xml:space="preserve">getText() </w:t>
+      <w:proofErr w:type="gramStart"/>
+      <w:r>
+        <w:rPr>
+          <w:sz w:val="24"/>
+          <w:szCs w:val="22"/>
+          <w:lang w:val="en-US"/>
+        </w:rPr>
+        <w:t>getText(</w:t>
+      </w:r>
+      <w:proofErr w:type="gramEnd"/>
+      <w:r>
+        <w:rPr>
+          <w:sz w:val="24"/>
+          <w:szCs w:val="22"/>
+          <w:lang w:val="en-US"/>
+        </w:rPr>
+        <w:t xml:space="preserve">) </w:t>
       </w:r>
       <w:r>
         <w:rPr>
@@ -8070,13 +8312,23 @@
           <w:lang w:val="en-US"/>
         </w:rPr>
       </w:pPr>
-      <w:r>
-        <w:rPr>
-          <w:sz w:val="24"/>
-          <w:szCs w:val="22"/>
-          <w:lang w:val="en-US"/>
-        </w:rPr>
-        <w:t xml:space="preserve">isSelected() </w:t>
+      <w:proofErr w:type="gramStart"/>
+      <w:r>
+        <w:rPr>
+          <w:sz w:val="24"/>
+          <w:szCs w:val="22"/>
+          <w:lang w:val="en-US"/>
+        </w:rPr>
+        <w:t>isSelected(</w:t>
+      </w:r>
+      <w:proofErr w:type="gramEnd"/>
+      <w:r>
+        <w:rPr>
+          <w:sz w:val="24"/>
+          <w:szCs w:val="22"/>
+          <w:lang w:val="en-US"/>
+        </w:rPr>
+        <w:t xml:space="preserve">) </w:t>
       </w:r>
       <w:r>
         <w:rPr>
@@ -8108,13 +8360,23 @@
           <w:lang w:val="en-US"/>
         </w:rPr>
       </w:pPr>
-      <w:r>
-        <w:rPr>
-          <w:sz w:val="24"/>
-          <w:szCs w:val="22"/>
-          <w:lang w:val="en-US"/>
-        </w:rPr>
-        <w:t xml:space="preserve">isEnabled() </w:t>
+      <w:proofErr w:type="gramStart"/>
+      <w:r>
+        <w:rPr>
+          <w:sz w:val="24"/>
+          <w:szCs w:val="22"/>
+          <w:lang w:val="en-US"/>
+        </w:rPr>
+        <w:t>isEnabled(</w:t>
+      </w:r>
+      <w:proofErr w:type="gramEnd"/>
+      <w:r>
+        <w:rPr>
+          <w:sz w:val="24"/>
+          <w:szCs w:val="22"/>
+          <w:lang w:val="en-US"/>
+        </w:rPr>
+        <w:t xml:space="preserve">) </w:t>
       </w:r>
       <w:r>
         <w:rPr>
@@ -8146,13 +8408,23 @@
           <w:lang w:val="en-US"/>
         </w:rPr>
       </w:pPr>
-      <w:r>
-        <w:rPr>
-          <w:sz w:val="24"/>
-          <w:szCs w:val="22"/>
-          <w:lang w:val="en-US"/>
-        </w:rPr>
-        <w:t xml:space="preserve">isDisplayed() </w:t>
+      <w:proofErr w:type="gramStart"/>
+      <w:r>
+        <w:rPr>
+          <w:sz w:val="24"/>
+          <w:szCs w:val="22"/>
+          <w:lang w:val="en-US"/>
+        </w:rPr>
+        <w:t>isDisplayed(</w:t>
+      </w:r>
+      <w:proofErr w:type="gramEnd"/>
+      <w:r>
+        <w:rPr>
+          <w:sz w:val="24"/>
+          <w:szCs w:val="22"/>
+          <w:lang w:val="en-US"/>
+        </w:rPr>
+        <w:t xml:space="preserve">) </w:t>
       </w:r>
       <w:r>
         <w:rPr>
@@ -9428,7 +9700,25 @@
           <w:szCs w:val="22"/>
           <w:lang w:val="en-US"/>
         </w:rPr>
-        <w:t>//input[@type='password']</w:t>
+        <w:t>//</w:t>
+      </w:r>
+      <w:proofErr w:type="gramStart"/>
+      <w:r>
+        <w:rPr>
+          <w:sz w:val="24"/>
+          <w:szCs w:val="22"/>
+          <w:lang w:val="en-US"/>
+        </w:rPr>
+        <w:t>input[</w:t>
+      </w:r>
+      <w:proofErr w:type="gramEnd"/>
+      <w:r>
+        <w:rPr>
+          <w:sz w:val="24"/>
+          <w:szCs w:val="22"/>
+          <w:lang w:val="en-US"/>
+        </w:rPr>
+        <w:t>@type='password']</w:t>
       </w:r>
     </w:p>
     <w:p>
@@ -9560,13 +9850,23 @@
           <w:lang w:val="en-US"/>
         </w:rPr>
       </w:pPr>
-      <w:r>
-        <w:rPr>
-          <w:sz w:val="24"/>
-          <w:szCs w:val="22"/>
-          <w:lang w:val="en-US"/>
-        </w:rPr>
-        <w:t xml:space="preserve">getFirstSelectedOption() </w:t>
+      <w:proofErr w:type="gramStart"/>
+      <w:r>
+        <w:rPr>
+          <w:sz w:val="24"/>
+          <w:szCs w:val="22"/>
+          <w:lang w:val="en-US"/>
+        </w:rPr>
+        <w:t>getFirstSelectedOption(</w:t>
+      </w:r>
+      <w:proofErr w:type="gramEnd"/>
+      <w:r>
+        <w:rPr>
+          <w:sz w:val="24"/>
+          <w:szCs w:val="22"/>
+          <w:lang w:val="en-US"/>
+        </w:rPr>
+        <w:t xml:space="preserve">) </w:t>
       </w:r>
       <w:r>
         <w:rPr>
@@ -9608,13 +9908,23 @@
           <w:lang w:val="en-US"/>
         </w:rPr>
       </w:pPr>
-      <w:r>
-        <w:rPr>
-          <w:sz w:val="24"/>
-          <w:szCs w:val="22"/>
-          <w:lang w:val="en-US"/>
-        </w:rPr>
-        <w:t xml:space="preserve">getOptions() </w:t>
+      <w:proofErr w:type="gramStart"/>
+      <w:r>
+        <w:rPr>
+          <w:sz w:val="24"/>
+          <w:szCs w:val="22"/>
+          <w:lang w:val="en-US"/>
+        </w:rPr>
+        <w:t>getOptions(</w:t>
+      </w:r>
+      <w:proofErr w:type="gramEnd"/>
+      <w:r>
+        <w:rPr>
+          <w:sz w:val="24"/>
+          <w:szCs w:val="22"/>
+          <w:lang w:val="en-US"/>
+        </w:rPr>
+        <w:t xml:space="preserve">) </w:t>
       </w:r>
       <w:r>
         <w:rPr>
@@ -9648,13 +9958,23 @@
           <w:lang w:val="en-US"/>
         </w:rPr>
       </w:pPr>
-      <w:r>
-        <w:rPr>
-          <w:sz w:val="24"/>
-          <w:szCs w:val="22"/>
-          <w:lang w:val="en-US"/>
-        </w:rPr>
-        <w:t xml:space="preserve">selectByVisibleText() </w:t>
+      <w:proofErr w:type="gramStart"/>
+      <w:r>
+        <w:rPr>
+          <w:sz w:val="24"/>
+          <w:szCs w:val="22"/>
+          <w:lang w:val="en-US"/>
+        </w:rPr>
+        <w:t>selectByVisibleText(</w:t>
+      </w:r>
+      <w:proofErr w:type="gramEnd"/>
+      <w:r>
+        <w:rPr>
+          <w:sz w:val="24"/>
+          <w:szCs w:val="22"/>
+          <w:lang w:val="en-US"/>
+        </w:rPr>
+        <w:t xml:space="preserve">) </w:t>
       </w:r>
       <w:r>
         <w:rPr>
@@ -9688,13 +10008,23 @@
           <w:lang w:val="en-US"/>
         </w:rPr>
       </w:pPr>
-      <w:r>
-        <w:rPr>
-          <w:sz w:val="24"/>
-          <w:szCs w:val="22"/>
-          <w:lang w:val="en-US"/>
-        </w:rPr>
-        <w:t xml:space="preserve">selectByContainsVisibleText() </w:t>
+      <w:proofErr w:type="gramStart"/>
+      <w:r>
+        <w:rPr>
+          <w:sz w:val="24"/>
+          <w:szCs w:val="22"/>
+          <w:lang w:val="en-US"/>
+        </w:rPr>
+        <w:t>selectByContainsVisibleText(</w:t>
+      </w:r>
+      <w:proofErr w:type="gramEnd"/>
+      <w:r>
+        <w:rPr>
+          <w:sz w:val="24"/>
+          <w:szCs w:val="22"/>
+          <w:lang w:val="en-US"/>
+        </w:rPr>
+        <w:t xml:space="preserve">) </w:t>
       </w:r>
       <w:r>
         <w:rPr>
@@ -9728,13 +10058,23 @@
           <w:lang w:val="en-US"/>
         </w:rPr>
       </w:pPr>
-      <w:r>
-        <w:rPr>
-          <w:sz w:val="24"/>
-          <w:szCs w:val="22"/>
-          <w:lang w:val="en-US"/>
-        </w:rPr>
-        <w:t xml:space="preserve">selectByValue() </w:t>
+      <w:proofErr w:type="gramStart"/>
+      <w:r>
+        <w:rPr>
+          <w:sz w:val="24"/>
+          <w:szCs w:val="22"/>
+          <w:lang w:val="en-US"/>
+        </w:rPr>
+        <w:t>selectByValue(</w:t>
+      </w:r>
+      <w:proofErr w:type="gramEnd"/>
+      <w:r>
+        <w:rPr>
+          <w:sz w:val="24"/>
+          <w:szCs w:val="22"/>
+          <w:lang w:val="en-US"/>
+        </w:rPr>
+        <w:t xml:space="preserve">) </w:t>
       </w:r>
       <w:r>
         <w:rPr>
@@ -9768,6 +10108,7 @@
           <w:lang w:val="en-US"/>
         </w:rPr>
       </w:pPr>
+      <w:proofErr w:type="gramStart"/>
       <w:r>
         <w:rPr>
           <w:sz w:val="24"/>
@@ -9775,7 +10116,16 @@
           <w:lang w:val="en-US"/>
         </w:rPr>
         <w:lastRenderedPageBreak/>
-        <w:t xml:space="preserve">selectByIndex() </w:t>
+        <w:t>selectByIndex(</w:t>
+      </w:r>
+      <w:proofErr w:type="gramEnd"/>
+      <w:r>
+        <w:rPr>
+          <w:sz w:val="24"/>
+          <w:szCs w:val="22"/>
+          <w:lang w:val="en-US"/>
+        </w:rPr>
+        <w:t xml:space="preserve">) </w:t>
       </w:r>
       <w:r>
         <w:rPr>
@@ -9809,13 +10159,23 @@
           <w:lang w:val="en-US"/>
         </w:rPr>
       </w:pPr>
-      <w:r>
-        <w:rPr>
-          <w:sz w:val="24"/>
-          <w:szCs w:val="22"/>
-          <w:lang w:val="en-US"/>
-        </w:rPr>
-        <w:t xml:space="preserve">getAllSelectedOptions() </w:t>
+      <w:proofErr w:type="gramStart"/>
+      <w:r>
+        <w:rPr>
+          <w:sz w:val="24"/>
+          <w:szCs w:val="22"/>
+          <w:lang w:val="en-US"/>
+        </w:rPr>
+        <w:t>getAllSelectedOptions(</w:t>
+      </w:r>
+      <w:proofErr w:type="gramEnd"/>
+      <w:r>
+        <w:rPr>
+          <w:sz w:val="24"/>
+          <w:szCs w:val="22"/>
+          <w:lang w:val="en-US"/>
+        </w:rPr>
+        <w:t xml:space="preserve">) </w:t>
       </w:r>
       <w:r>
         <w:rPr>
@@ -9849,13 +10209,23 @@
           <w:lang w:val="en-US"/>
         </w:rPr>
       </w:pPr>
-      <w:r>
-        <w:rPr>
-          <w:sz w:val="24"/>
-          <w:szCs w:val="22"/>
-          <w:lang w:val="en-US"/>
-        </w:rPr>
-        <w:t xml:space="preserve">isMultiple() </w:t>
+      <w:proofErr w:type="gramStart"/>
+      <w:r>
+        <w:rPr>
+          <w:sz w:val="24"/>
+          <w:szCs w:val="22"/>
+          <w:lang w:val="en-US"/>
+        </w:rPr>
+        <w:t>isMultiple(</w:t>
+      </w:r>
+      <w:proofErr w:type="gramEnd"/>
+      <w:r>
+        <w:rPr>
+          <w:sz w:val="24"/>
+          <w:szCs w:val="22"/>
+          <w:lang w:val="en-US"/>
+        </w:rPr>
+        <w:t xml:space="preserve">) </w:t>
       </w:r>
       <w:r>
         <w:rPr>
@@ -10056,13 +10426,33 @@
           <w:lang w:val="en-US"/>
         </w:rPr>
       </w:pPr>
-      <w:r>
-        <w:rPr>
-          <w:sz w:val="24"/>
-          <w:szCs w:val="22"/>
-          <w:lang w:val="en-US"/>
-        </w:rPr>
-        <w:t>Thread.sleep()</w:t>
+      <w:proofErr w:type="spellStart"/>
+      <w:proofErr w:type="gramStart"/>
+      <w:r>
+        <w:rPr>
+          <w:sz w:val="24"/>
+          <w:szCs w:val="22"/>
+          <w:lang w:val="en-US"/>
+        </w:rPr>
+        <w:t>Thread.sleep</w:t>
+      </w:r>
+      <w:proofErr w:type="spellEnd"/>
+      <w:r>
+        <w:rPr>
+          <w:sz w:val="24"/>
+          <w:szCs w:val="22"/>
+          <w:lang w:val="en-US"/>
+        </w:rPr>
+        <w:t>(</w:t>
+      </w:r>
+      <w:proofErr w:type="gramEnd"/>
+      <w:r>
+        <w:rPr>
+          <w:sz w:val="24"/>
+          <w:szCs w:val="22"/>
+          <w:lang w:val="en-US"/>
+        </w:rPr>
+        <w:t>)</w:t>
       </w:r>
       <w:r>
         <w:rPr>
@@ -10518,13 +10908,23 @@
           <w:lang w:val="en-US"/>
         </w:rPr>
       </w:pPr>
-      <w:r>
-        <w:rPr>
-          <w:sz w:val="24"/>
-          <w:szCs w:val="22"/>
-          <w:lang w:val="en-US"/>
-        </w:rPr>
-        <w:t xml:space="preserve">i – ignoring </w:t>
+      <w:proofErr w:type="spellStart"/>
+      <w:r>
+        <w:rPr>
+          <w:sz w:val="24"/>
+          <w:szCs w:val="22"/>
+          <w:lang w:val="en-US"/>
+        </w:rPr>
+        <w:t>i</w:t>
+      </w:r>
+      <w:proofErr w:type="spellEnd"/>
+      <w:r>
+        <w:rPr>
+          <w:sz w:val="24"/>
+          <w:szCs w:val="22"/>
+          <w:lang w:val="en-US"/>
+        </w:rPr>
+        <w:t xml:space="preserve"> – ignoring </w:t>
       </w:r>
     </w:p>
     <w:p>
@@ -10849,7 +11249,25 @@
           <w:szCs w:val="22"/>
           <w:lang w:val="en-US"/>
         </w:rPr>
-        <w:t>&lt;table&gt;</w:t>
+        <w:t>&lt;</w:t>
+      </w:r>
+      <w:proofErr w:type="gramStart"/>
+      <w:r>
+        <w:rPr>
+          <w:sz w:val="24"/>
+          <w:szCs w:val="22"/>
+          <w:lang w:val="en-US"/>
+        </w:rPr>
+        <w:t>table</w:t>
+      </w:r>
+      <w:proofErr w:type="gramEnd"/>
+      <w:r>
+        <w:rPr>
+          <w:sz w:val="24"/>
+          <w:szCs w:val="22"/>
+          <w:lang w:val="en-US"/>
+        </w:rPr>
+        <w:t>&gt;</w:t>
       </w:r>
     </w:p>
     <w:p>
@@ -10867,7 +11285,27 @@
           <w:lang w:val="en-US"/>
         </w:rPr>
         <w:tab/>
-        <w:t>&lt;thead&gt;</w:t>
+        <w:t>&lt;</w:t>
+      </w:r>
+      <w:proofErr w:type="spellStart"/>
+      <w:proofErr w:type="gramStart"/>
+      <w:r>
+        <w:rPr>
+          <w:sz w:val="24"/>
+          <w:szCs w:val="22"/>
+          <w:lang w:val="en-US"/>
+        </w:rPr>
+        <w:t>thead</w:t>
+      </w:r>
+      <w:proofErr w:type="spellEnd"/>
+      <w:proofErr w:type="gramEnd"/>
+      <w:r>
+        <w:rPr>
+          <w:sz w:val="24"/>
+          <w:szCs w:val="22"/>
+          <w:lang w:val="en-US"/>
+        </w:rPr>
+        <w:t>&gt;</w:t>
       </w:r>
     </w:p>
     <w:p>
@@ -10893,7 +11331,27 @@
           <w:lang w:val="en-US"/>
         </w:rPr>
         <w:tab/>
-        <w:t>&lt;tr&gt;</w:t>
+        <w:t>&lt;</w:t>
+      </w:r>
+      <w:proofErr w:type="spellStart"/>
+      <w:proofErr w:type="gramStart"/>
+      <w:r>
+        <w:rPr>
+          <w:sz w:val="24"/>
+          <w:szCs w:val="22"/>
+          <w:lang w:val="en-US"/>
+        </w:rPr>
+        <w:t>tr</w:t>
+      </w:r>
+      <w:proofErr w:type="spellEnd"/>
+      <w:proofErr w:type="gramEnd"/>
+      <w:r>
+        <w:rPr>
+          <w:sz w:val="24"/>
+          <w:szCs w:val="22"/>
+          <w:lang w:val="en-US"/>
+        </w:rPr>
+        <w:t>&gt;</w:t>
       </w:r>
     </w:p>
     <w:p>
@@ -10927,7 +11385,53 @@
           <w:lang w:val="en-US"/>
         </w:rPr>
         <w:tab/>
-        <w:t>&lt;th&gt;Roll No&lt;/th&gt;</w:t>
+        <w:t>&lt;</w:t>
+      </w:r>
+      <w:proofErr w:type="spellStart"/>
+      <w:proofErr w:type="gramStart"/>
+      <w:r>
+        <w:rPr>
+          <w:sz w:val="24"/>
+          <w:szCs w:val="22"/>
+          <w:lang w:val="en-US"/>
+        </w:rPr>
+        <w:t>th</w:t>
+      </w:r>
+      <w:proofErr w:type="spellEnd"/>
+      <w:r>
+        <w:rPr>
+          <w:sz w:val="24"/>
+          <w:szCs w:val="22"/>
+          <w:lang w:val="en-US"/>
+        </w:rPr>
+        <w:t>&gt;</w:t>
+      </w:r>
+      <w:proofErr w:type="gramEnd"/>
+      <w:r>
+        <w:rPr>
+          <w:sz w:val="24"/>
+          <w:szCs w:val="22"/>
+          <w:lang w:val="en-US"/>
+        </w:rPr>
+        <w:t>Roll No&lt;/</w:t>
+      </w:r>
+      <w:proofErr w:type="spellStart"/>
+      <w:r>
+        <w:rPr>
+          <w:sz w:val="24"/>
+          <w:szCs w:val="22"/>
+          <w:lang w:val="en-US"/>
+        </w:rPr>
+        <w:t>th</w:t>
+      </w:r>
+      <w:proofErr w:type="spellEnd"/>
+      <w:r>
+        <w:rPr>
+          <w:sz w:val="24"/>
+          <w:szCs w:val="22"/>
+          <w:lang w:val="en-US"/>
+        </w:rPr>
+        <w:t>&gt;</w:t>
       </w:r>
     </w:p>
     <w:p>
@@ -10961,7 +11465,53 @@
           <w:lang w:val="en-US"/>
         </w:rPr>
         <w:tab/>
-        <w:t>&lt;th&gt;Name&lt;/th&gt;</w:t>
+        <w:t>&lt;</w:t>
+      </w:r>
+      <w:proofErr w:type="spellStart"/>
+      <w:proofErr w:type="gramStart"/>
+      <w:r>
+        <w:rPr>
+          <w:sz w:val="24"/>
+          <w:szCs w:val="22"/>
+          <w:lang w:val="en-US"/>
+        </w:rPr>
+        <w:t>th</w:t>
+      </w:r>
+      <w:proofErr w:type="spellEnd"/>
+      <w:r>
+        <w:rPr>
+          <w:sz w:val="24"/>
+          <w:szCs w:val="22"/>
+          <w:lang w:val="en-US"/>
+        </w:rPr>
+        <w:t>&gt;</w:t>
+      </w:r>
+      <w:proofErr w:type="gramEnd"/>
+      <w:r>
+        <w:rPr>
+          <w:sz w:val="24"/>
+          <w:szCs w:val="22"/>
+          <w:lang w:val="en-US"/>
+        </w:rPr>
+        <w:t>Name&lt;/</w:t>
+      </w:r>
+      <w:proofErr w:type="spellStart"/>
+      <w:r>
+        <w:rPr>
+          <w:sz w:val="24"/>
+          <w:szCs w:val="22"/>
+          <w:lang w:val="en-US"/>
+        </w:rPr>
+        <w:t>th</w:t>
+      </w:r>
+      <w:proofErr w:type="spellEnd"/>
+      <w:r>
+        <w:rPr>
+          <w:sz w:val="24"/>
+          <w:szCs w:val="22"/>
+          <w:lang w:val="en-US"/>
+        </w:rPr>
+        <w:t>&gt;</w:t>
       </w:r>
     </w:p>
     <w:p>
@@ -10987,7 +11537,27 @@
           <w:lang w:val="en-US"/>
         </w:rPr>
         <w:tab/>
-        <w:t>&lt;/tr&gt;</w:t>
+        <w:t>&lt;/</w:t>
+      </w:r>
+      <w:proofErr w:type="spellStart"/>
+      <w:proofErr w:type="gramStart"/>
+      <w:r>
+        <w:rPr>
+          <w:sz w:val="24"/>
+          <w:szCs w:val="22"/>
+          <w:lang w:val="en-US"/>
+        </w:rPr>
+        <w:t>tr</w:t>
+      </w:r>
+      <w:proofErr w:type="spellEnd"/>
+      <w:proofErr w:type="gramEnd"/>
+      <w:r>
+        <w:rPr>
+          <w:sz w:val="24"/>
+          <w:szCs w:val="22"/>
+          <w:lang w:val="en-US"/>
+        </w:rPr>
+        <w:t>&gt;</w:t>
       </w:r>
     </w:p>
     <w:p>
@@ -11005,7 +11575,25 @@
           <w:lang w:val="en-US"/>
         </w:rPr>
         <w:tab/>
-        <w:t>&lt;/thead&gt;</w:t>
+        <w:t>&lt;/</w:t>
+      </w:r>
+      <w:proofErr w:type="spellStart"/>
+      <w:r>
+        <w:rPr>
+          <w:sz w:val="24"/>
+          <w:szCs w:val="22"/>
+          <w:lang w:val="en-US"/>
+        </w:rPr>
+        <w:t>thead</w:t>
+      </w:r>
+      <w:proofErr w:type="spellEnd"/>
+      <w:r>
+        <w:rPr>
+          <w:sz w:val="24"/>
+          <w:szCs w:val="22"/>
+          <w:lang w:val="en-US"/>
+        </w:rPr>
+        <w:t>&gt;</w:t>
       </w:r>
     </w:p>
     <w:p>
@@ -11023,7 +11611,27 @@
           <w:lang w:val="en-US"/>
         </w:rPr>
         <w:tab/>
-        <w:t>&lt;tbody&gt;</w:t>
+        <w:t>&lt;</w:t>
+      </w:r>
+      <w:proofErr w:type="spellStart"/>
+      <w:proofErr w:type="gramStart"/>
+      <w:r>
+        <w:rPr>
+          <w:sz w:val="24"/>
+          <w:szCs w:val="22"/>
+          <w:lang w:val="en-US"/>
+        </w:rPr>
+        <w:t>tbody</w:t>
+      </w:r>
+      <w:proofErr w:type="spellEnd"/>
+      <w:proofErr w:type="gramEnd"/>
+      <w:r>
+        <w:rPr>
+          <w:sz w:val="24"/>
+          <w:szCs w:val="22"/>
+          <w:lang w:val="en-US"/>
+        </w:rPr>
+        <w:t>&gt;</w:t>
       </w:r>
     </w:p>
     <w:p>
@@ -11049,7 +11657,27 @@
           <w:lang w:val="en-US"/>
         </w:rPr>
         <w:tab/>
-        <w:t>&lt;tr&gt;</w:t>
+        <w:t>&lt;</w:t>
+      </w:r>
+      <w:proofErr w:type="spellStart"/>
+      <w:proofErr w:type="gramStart"/>
+      <w:r>
+        <w:rPr>
+          <w:sz w:val="24"/>
+          <w:szCs w:val="22"/>
+          <w:lang w:val="en-US"/>
+        </w:rPr>
+        <w:t>tr</w:t>
+      </w:r>
+      <w:proofErr w:type="spellEnd"/>
+      <w:proofErr w:type="gramEnd"/>
+      <w:r>
+        <w:rPr>
+          <w:sz w:val="24"/>
+          <w:szCs w:val="22"/>
+          <w:lang w:val="en-US"/>
+        </w:rPr>
+        <w:t>&gt;</w:t>
       </w:r>
     </w:p>
     <w:p>
@@ -11083,7 +11711,25 @@
           <w:lang w:val="en-US"/>
         </w:rPr>
         <w:tab/>
-        <w:t>&lt;td&gt;1&lt;/td&gt;</w:t>
+        <w:t>&lt;</w:t>
+      </w:r>
+      <w:proofErr w:type="gramStart"/>
+      <w:r>
+        <w:rPr>
+          <w:sz w:val="24"/>
+          <w:szCs w:val="22"/>
+          <w:lang w:val="en-US"/>
+        </w:rPr>
+        <w:t>td&gt;</w:t>
+      </w:r>
+      <w:proofErr w:type="gramEnd"/>
+      <w:r>
+        <w:rPr>
+          <w:sz w:val="24"/>
+          <w:szCs w:val="22"/>
+          <w:lang w:val="en-US"/>
+        </w:rPr>
+        <w:t>1&lt;/td&gt;</w:t>
       </w:r>
     </w:p>
     <w:p>
@@ -11117,7 +11763,35 @@
           <w:lang w:val="en-US"/>
         </w:rPr>
         <w:tab/>
-        <w:t>&lt;td&gt;Diksha&lt;/td</w:t>
+        <w:t>&lt;</w:t>
+      </w:r>
+      <w:proofErr w:type="gramStart"/>
+      <w:r>
+        <w:rPr>
+          <w:sz w:val="24"/>
+          <w:szCs w:val="22"/>
+          <w:lang w:val="en-US"/>
+        </w:rPr>
+        <w:t>td&gt;</w:t>
+      </w:r>
+      <w:proofErr w:type="spellStart"/>
+      <w:proofErr w:type="gramEnd"/>
+      <w:r>
+        <w:rPr>
+          <w:sz w:val="24"/>
+          <w:szCs w:val="22"/>
+          <w:lang w:val="en-US"/>
+        </w:rPr>
+        <w:t>Diksha</w:t>
+      </w:r>
+      <w:proofErr w:type="spellEnd"/>
+      <w:r>
+        <w:rPr>
+          <w:sz w:val="24"/>
+          <w:szCs w:val="22"/>
+          <w:lang w:val="en-US"/>
+        </w:rPr>
+        <w:t>&lt;/td</w:t>
       </w:r>
     </w:p>
     <w:p>
@@ -11143,7 +11817,27 @@
           <w:lang w:val="en-US"/>
         </w:rPr>
         <w:tab/>
-        <w:t>&lt;/tr&gt;</w:t>
+        <w:t>&lt;/</w:t>
+      </w:r>
+      <w:proofErr w:type="spellStart"/>
+      <w:proofErr w:type="gramStart"/>
+      <w:r>
+        <w:rPr>
+          <w:sz w:val="24"/>
+          <w:szCs w:val="22"/>
+          <w:lang w:val="en-US"/>
+        </w:rPr>
+        <w:t>tr</w:t>
+      </w:r>
+      <w:proofErr w:type="spellEnd"/>
+      <w:proofErr w:type="gramEnd"/>
+      <w:r>
+        <w:rPr>
+          <w:sz w:val="24"/>
+          <w:szCs w:val="22"/>
+          <w:lang w:val="en-US"/>
+        </w:rPr>
+        <w:t>&gt;</w:t>
       </w:r>
     </w:p>
     <w:p>
@@ -11169,7 +11863,27 @@
           <w:lang w:val="en-US"/>
         </w:rPr>
         <w:tab/>
-        <w:t>&lt;tr&gt;</w:t>
+        <w:t>&lt;</w:t>
+      </w:r>
+      <w:proofErr w:type="spellStart"/>
+      <w:proofErr w:type="gramStart"/>
+      <w:r>
+        <w:rPr>
+          <w:sz w:val="24"/>
+          <w:szCs w:val="22"/>
+          <w:lang w:val="en-US"/>
+        </w:rPr>
+        <w:t>tr</w:t>
+      </w:r>
+      <w:proofErr w:type="spellEnd"/>
+      <w:proofErr w:type="gramEnd"/>
+      <w:r>
+        <w:rPr>
+          <w:sz w:val="24"/>
+          <w:szCs w:val="22"/>
+          <w:lang w:val="en-US"/>
+        </w:rPr>
+        <w:t>&gt;</w:t>
       </w:r>
       <w:r>
         <w:rPr>
@@ -11211,7 +11925,25 @@
           <w:lang w:val="en-US"/>
         </w:rPr>
         <w:tab/>
-        <w:t>&lt;td&gt;2&lt;/td&gt;</w:t>
+        <w:t>&lt;</w:t>
+      </w:r>
+      <w:proofErr w:type="gramStart"/>
+      <w:r>
+        <w:rPr>
+          <w:sz w:val="24"/>
+          <w:szCs w:val="22"/>
+          <w:lang w:val="en-US"/>
+        </w:rPr>
+        <w:t>td&gt;</w:t>
+      </w:r>
+      <w:proofErr w:type="gramEnd"/>
+      <w:r>
+        <w:rPr>
+          <w:sz w:val="24"/>
+          <w:szCs w:val="22"/>
+          <w:lang w:val="en-US"/>
+        </w:rPr>
+        <w:t>2&lt;/td&gt;</w:t>
       </w:r>
     </w:p>
     <w:p>
@@ -11245,7 +11977,35 @@
           <w:lang w:val="en-US"/>
         </w:rPr>
         <w:tab/>
-        <w:t>&lt;td&gt;Dilshad&lt;/td&gt;</w:t>
+        <w:t>&lt;</w:t>
+      </w:r>
+      <w:proofErr w:type="gramStart"/>
+      <w:r>
+        <w:rPr>
+          <w:sz w:val="24"/>
+          <w:szCs w:val="22"/>
+          <w:lang w:val="en-US"/>
+        </w:rPr>
+        <w:t>td&gt;</w:t>
+      </w:r>
+      <w:proofErr w:type="spellStart"/>
+      <w:proofErr w:type="gramEnd"/>
+      <w:r>
+        <w:rPr>
+          <w:sz w:val="24"/>
+          <w:szCs w:val="22"/>
+          <w:lang w:val="en-US"/>
+        </w:rPr>
+        <w:t>Dilshad</w:t>
+      </w:r>
+      <w:proofErr w:type="spellEnd"/>
+      <w:r>
+        <w:rPr>
+          <w:sz w:val="24"/>
+          <w:szCs w:val="22"/>
+          <w:lang w:val="en-US"/>
+        </w:rPr>
+        <w:t>&lt;/td&gt;</w:t>
       </w:r>
     </w:p>
     <w:p>
@@ -11271,7 +12031,27 @@
           <w:lang w:val="en-US"/>
         </w:rPr>
         <w:tab/>
-        <w:t>&lt;/tr&gt;</w:t>
+        <w:t>&lt;/</w:t>
+      </w:r>
+      <w:proofErr w:type="spellStart"/>
+      <w:proofErr w:type="gramStart"/>
+      <w:r>
+        <w:rPr>
+          <w:sz w:val="24"/>
+          <w:szCs w:val="22"/>
+          <w:lang w:val="en-US"/>
+        </w:rPr>
+        <w:t>tr</w:t>
+      </w:r>
+      <w:proofErr w:type="spellEnd"/>
+      <w:proofErr w:type="gramEnd"/>
+      <w:r>
+        <w:rPr>
+          <w:sz w:val="24"/>
+          <w:szCs w:val="22"/>
+          <w:lang w:val="en-US"/>
+        </w:rPr>
+        <w:t>&gt;</w:t>
       </w:r>
     </w:p>
     <w:p>
@@ -11289,24 +12069,60 @@
           <w:lang w:val="en-US"/>
         </w:rPr>
         <w:tab/>
-        <w:t>&lt;/tbody&gt;</w:t>
-      </w:r>
-    </w:p>
-    <w:p>
-      <w:pPr>
-        <w:rPr>
-          <w:sz w:val="24"/>
-          <w:szCs w:val="22"/>
-          <w:lang w:val="en-US"/>
-        </w:rPr>
-      </w:pPr>
-      <w:r>
-        <w:rPr>
-          <w:sz w:val="24"/>
-          <w:szCs w:val="22"/>
-          <w:lang w:val="en-US"/>
-        </w:rPr>
-        <w:t>&lt;table&gt;</w:t>
+        <w:t>&lt;/</w:t>
+      </w:r>
+      <w:proofErr w:type="spellStart"/>
+      <w:r>
+        <w:rPr>
+          <w:sz w:val="24"/>
+          <w:szCs w:val="22"/>
+          <w:lang w:val="en-US"/>
+        </w:rPr>
+        <w:t>tbody</w:t>
+      </w:r>
+      <w:proofErr w:type="spellEnd"/>
+      <w:r>
+        <w:rPr>
+          <w:sz w:val="24"/>
+          <w:szCs w:val="22"/>
+          <w:lang w:val="en-US"/>
+        </w:rPr>
+        <w:t>&gt;</w:t>
+      </w:r>
+    </w:p>
+    <w:p>
+      <w:pPr>
+        <w:rPr>
+          <w:sz w:val="24"/>
+          <w:szCs w:val="22"/>
+          <w:lang w:val="en-US"/>
+        </w:rPr>
+      </w:pPr>
+      <w:r>
+        <w:rPr>
+          <w:sz w:val="24"/>
+          <w:szCs w:val="22"/>
+          <w:lang w:val="en-US"/>
+        </w:rPr>
+        <w:t>&lt;</w:t>
+      </w:r>
+      <w:proofErr w:type="gramStart"/>
+      <w:r>
+        <w:rPr>
+          <w:sz w:val="24"/>
+          <w:szCs w:val="22"/>
+          <w:lang w:val="en-US"/>
+        </w:rPr>
+        <w:t>table</w:t>
+      </w:r>
+      <w:proofErr w:type="gramEnd"/>
+      <w:r>
+        <w:rPr>
+          <w:sz w:val="24"/>
+          <w:szCs w:val="22"/>
+          <w:lang w:val="en-US"/>
+        </w:rPr>
+        <w:t>&gt;</w:t>
       </w:r>
     </w:p>
     <w:p>
@@ -11381,7 +12197,43 @@
           <w:szCs w:val="22"/>
           <w:lang w:val="en-US"/>
         </w:rPr>
-        <w:t>To upload any file on such control simply call .sendKeys() method on this control. And pass the path of file as a parameter to sendKeys() method.</w:t>
+        <w:t>To upload any file on such control simply call .</w:t>
+      </w:r>
+      <w:proofErr w:type="gramStart"/>
+      <w:r>
+        <w:rPr>
+          <w:sz w:val="24"/>
+          <w:szCs w:val="22"/>
+          <w:lang w:val="en-US"/>
+        </w:rPr>
+        <w:t>sendKeys(</w:t>
+      </w:r>
+      <w:proofErr w:type="gramEnd"/>
+      <w:r>
+        <w:rPr>
+          <w:sz w:val="24"/>
+          <w:szCs w:val="22"/>
+          <w:lang w:val="en-US"/>
+        </w:rPr>
+        <w:t xml:space="preserve">) method on this control. And pass the path of file as a parameter to </w:t>
+      </w:r>
+      <w:proofErr w:type="gramStart"/>
+      <w:r>
+        <w:rPr>
+          <w:sz w:val="24"/>
+          <w:szCs w:val="22"/>
+          <w:lang w:val="en-US"/>
+        </w:rPr>
+        <w:t>sendKeys(</w:t>
+      </w:r>
+      <w:proofErr w:type="gramEnd"/>
+      <w:r>
+        <w:rPr>
+          <w:sz w:val="24"/>
+          <w:szCs w:val="22"/>
+          <w:lang w:val="en-US"/>
+        </w:rPr>
+        <w:t>) method.</w:t>
       </w:r>
     </w:p>
     <w:p>
@@ -11876,13 +12728,23 @@
           <w:lang w:val="en-US"/>
         </w:rPr>
       </w:pPr>
-      <w:r>
-        <w:rPr>
-          <w:sz w:val="24"/>
-          <w:szCs w:val="22"/>
-          <w:lang w:val="en-US"/>
-        </w:rPr>
-        <w:t xml:space="preserve">driver.switchTo().alert() </w:t>
+      <w:proofErr w:type="spellStart"/>
+      <w:r>
+        <w:rPr>
+          <w:sz w:val="24"/>
+          <w:szCs w:val="22"/>
+          <w:lang w:val="en-US"/>
+        </w:rPr>
+        <w:t>driver.switchTo</w:t>
+      </w:r>
+      <w:proofErr w:type="spellEnd"/>
+      <w:r>
+        <w:rPr>
+          <w:sz w:val="24"/>
+          <w:szCs w:val="22"/>
+          <w:lang w:val="en-US"/>
+        </w:rPr>
+        <w:t xml:space="preserve">().alert() </w:t>
       </w:r>
       <w:r>
         <w:rPr>
@@ -12028,13 +12890,23 @@
           <w:lang w:val="en-US"/>
         </w:rPr>
       </w:pPr>
-      <w:r>
-        <w:rPr>
-          <w:sz w:val="24"/>
-          <w:szCs w:val="22"/>
-          <w:lang w:val="en-US"/>
-        </w:rPr>
-        <w:t xml:space="preserve">sendKeys() </w:t>
+      <w:proofErr w:type="gramStart"/>
+      <w:r>
+        <w:rPr>
+          <w:sz w:val="24"/>
+          <w:szCs w:val="22"/>
+          <w:lang w:val="en-US"/>
+        </w:rPr>
+        <w:t>sendKeys(</w:t>
+      </w:r>
+      <w:proofErr w:type="gramEnd"/>
+      <w:r>
+        <w:rPr>
+          <w:sz w:val="24"/>
+          <w:szCs w:val="22"/>
+          <w:lang w:val="en-US"/>
+        </w:rPr>
+        <w:t xml:space="preserve">) </w:t>
       </w:r>
       <w:r>
         <w:rPr>
@@ -12284,13 +13156,23 @@
           <w:lang w:val="en-US"/>
         </w:rPr>
       </w:pPr>
-      <w:r>
-        <w:rPr>
-          <w:sz w:val="24"/>
-          <w:szCs w:val="22"/>
-          <w:lang w:val="en-US"/>
-        </w:rPr>
-        <w:t xml:space="preserve">moveToElement() </w:t>
+      <w:proofErr w:type="gramStart"/>
+      <w:r>
+        <w:rPr>
+          <w:sz w:val="24"/>
+          <w:szCs w:val="22"/>
+          <w:lang w:val="en-US"/>
+        </w:rPr>
+        <w:t>moveToElement(</w:t>
+      </w:r>
+      <w:proofErr w:type="gramEnd"/>
+      <w:r>
+        <w:rPr>
+          <w:sz w:val="24"/>
+          <w:szCs w:val="22"/>
+          <w:lang w:val="en-US"/>
+        </w:rPr>
+        <w:t xml:space="preserve">) </w:t>
       </w:r>
       <w:r>
         <w:rPr>
@@ -12322,13 +13204,23 @@
           <w:lang w:val="en-US"/>
         </w:rPr>
       </w:pPr>
-      <w:r>
-        <w:rPr>
-          <w:sz w:val="24"/>
-          <w:szCs w:val="22"/>
-          <w:lang w:val="en-US"/>
-        </w:rPr>
-        <w:t xml:space="preserve">perform() </w:t>
+      <w:proofErr w:type="gramStart"/>
+      <w:r>
+        <w:rPr>
+          <w:sz w:val="24"/>
+          <w:szCs w:val="22"/>
+          <w:lang w:val="en-US"/>
+        </w:rPr>
+        <w:t>perform(</w:t>
+      </w:r>
+      <w:proofErr w:type="gramEnd"/>
+      <w:r>
+        <w:rPr>
+          <w:sz w:val="24"/>
+          <w:szCs w:val="22"/>
+          <w:lang w:val="en-US"/>
+        </w:rPr>
+        <w:t xml:space="preserve">) </w:t>
       </w:r>
       <w:r>
         <w:rPr>
@@ -12589,7 +13481,25 @@
           <w:szCs w:val="22"/>
           <w:lang w:val="en-US"/>
         </w:rPr>
-        <w:t xml:space="preserve"> which will make automation testing more easy.</w:t>
+        <w:t xml:space="preserve"> which will make automation testing more </w:t>
+      </w:r>
+      <w:proofErr w:type="gramStart"/>
+      <w:r>
+        <w:rPr>
+          <w:sz w:val="24"/>
+          <w:szCs w:val="22"/>
+          <w:lang w:val="en-US"/>
+        </w:rPr>
+        <w:t>easy</w:t>
+      </w:r>
+      <w:proofErr w:type="gramEnd"/>
+      <w:r>
+        <w:rPr>
+          <w:sz w:val="24"/>
+          <w:szCs w:val="22"/>
+          <w:lang w:val="en-US"/>
+        </w:rPr>
+        <w:t>.</w:t>
       </w:r>
     </w:p>
     <w:p>
@@ -13287,7 +14197,24 @@
           <w:lang w:val="en-US"/>
         </w:rPr>
         <w:br/>
-        <w:t xml:space="preserve">By default all tests are having priority as 0 (zero). </w:t>
+      </w:r>
+      <w:proofErr w:type="gramStart"/>
+      <w:r>
+        <w:rPr>
+          <w:sz w:val="24"/>
+          <w:szCs w:val="22"/>
+          <w:lang w:val="en-US"/>
+        </w:rPr>
+        <w:t>By</w:t>
+      </w:r>
+      <w:proofErr w:type="gramEnd"/>
+      <w:r>
+        <w:rPr>
+          <w:sz w:val="24"/>
+          <w:szCs w:val="22"/>
+          <w:lang w:val="en-US"/>
+        </w:rPr>
+        <w:t xml:space="preserve"> default all tests are having priority as 0 (zero). </w:t>
       </w:r>
       <w:r>
         <w:rPr>
@@ -14853,7 +15780,25 @@
           <w:szCs w:val="22"/>
           <w:lang w:val="en-US"/>
         </w:rPr>
-        <w:t>This represents the Object Repository, that can store all the controls in various objects.</w:t>
+        <w:t xml:space="preserve">This represents the Object </w:t>
+      </w:r>
+      <w:proofErr w:type="gramStart"/>
+      <w:r>
+        <w:rPr>
+          <w:sz w:val="24"/>
+          <w:szCs w:val="22"/>
+          <w:lang w:val="en-US"/>
+        </w:rPr>
+        <w:t>Repository, that</w:t>
+      </w:r>
+      <w:proofErr w:type="gramEnd"/>
+      <w:r>
+        <w:rPr>
+          <w:sz w:val="24"/>
+          <w:szCs w:val="22"/>
+          <w:lang w:val="en-US"/>
+        </w:rPr>
+        <w:t xml:space="preserve"> can store all the controls in various objects.</w:t>
       </w:r>
     </w:p>
     <w:p>
@@ -15501,7 +16446,43 @@
           <w:szCs w:val="22"/>
           <w:lang w:val="en-US"/>
         </w:rPr>
-        <w:t>Enter GroupID (Name of Company) &amp; ArtifactId (Name of Project)</w:t>
+        <w:t xml:space="preserve">Enter </w:t>
+      </w:r>
+      <w:proofErr w:type="spellStart"/>
+      <w:r>
+        <w:rPr>
+          <w:sz w:val="24"/>
+          <w:szCs w:val="22"/>
+          <w:lang w:val="en-US"/>
+        </w:rPr>
+        <w:t>GroupID</w:t>
+      </w:r>
+      <w:proofErr w:type="spellEnd"/>
+      <w:r>
+        <w:rPr>
+          <w:sz w:val="24"/>
+          <w:szCs w:val="22"/>
+          <w:lang w:val="en-US"/>
+        </w:rPr>
+        <w:t xml:space="preserve"> (Name of Company) &amp; </w:t>
+      </w:r>
+      <w:proofErr w:type="spellStart"/>
+      <w:r>
+        <w:rPr>
+          <w:sz w:val="24"/>
+          <w:szCs w:val="22"/>
+          <w:lang w:val="en-US"/>
+        </w:rPr>
+        <w:t>ArtifactId</w:t>
+      </w:r>
+      <w:proofErr w:type="spellEnd"/>
+      <w:r>
+        <w:rPr>
+          <w:sz w:val="24"/>
+          <w:szCs w:val="22"/>
+          <w:lang w:val="en-US"/>
+        </w:rPr>
+        <w:t xml:space="preserve"> (Name of Project)</w:t>
       </w:r>
     </w:p>
     <w:p>
@@ -15550,11 +16531,517 @@
     </w:p>
     <w:p>
       <w:pPr>
+        <w:rPr>
+          <w:sz w:val="24"/>
+          <w:szCs w:val="22"/>
+          <w:lang w:val="en-US"/>
+        </w:rPr>
+      </w:pPr>
+    </w:p>
+    <w:p>
+      <w:pPr>
+        <w:rPr>
+          <w:sz w:val="24"/>
+          <w:szCs w:val="22"/>
+          <w:lang w:val="en-US"/>
+        </w:rPr>
+      </w:pPr>
+      <w:r>
+        <w:rPr>
+          <w:noProof/>
+          <w:lang w:eastAsia="en-IN"/>
+        </w:rPr>
+        <w:drawing>
+          <wp:inline distT="0" distB="0" distL="0" distR="0" wp14:anchorId="1A89AA6F" wp14:editId="65FC1A95">
+            <wp:extent cx="5920689" cy="3530009"/>
+            <wp:effectExtent l="0" t="0" r="4445" b="0"/>
+            <wp:docPr id="4" name="Picture 4"/>
+            <wp:cNvGraphicFramePr>
+              <a:graphicFrameLocks xmlns:a="http://schemas.openxmlformats.org/drawingml/2006/main" noChangeAspect="1"/>
+            </wp:cNvGraphicFramePr>
+            <a:graphic xmlns:a="http://schemas.openxmlformats.org/drawingml/2006/main">
+              <a:graphicData uri="http://schemas.openxmlformats.org/drawingml/2006/picture">
+                <pic:pic xmlns:pic="http://schemas.openxmlformats.org/drawingml/2006/picture">
+                  <pic:nvPicPr>
+                    <pic:cNvPr id="1" name=""/>
+                    <pic:cNvPicPr/>
+                  </pic:nvPicPr>
+                  <pic:blipFill rotWithShape="1">
+                    <a:blip r:embed="rId15"/>
+                    <a:srcRect l="22637" t="20456" r="11697" b="9914"/>
+                    <a:stretch/>
+                  </pic:blipFill>
+                  <pic:spPr bwMode="auto">
+                    <a:xfrm>
+                      <a:off x="0" y="0"/>
+                      <a:ext cx="5946194" cy="3545215"/>
+                    </a:xfrm>
+                    <a:prstGeom prst="rect">
+                      <a:avLst/>
+                    </a:prstGeom>
+                    <a:ln>
+                      <a:noFill/>
+                    </a:ln>
+                    <a:extLst>
+                      <a:ext uri="{53640926-AAD7-44D8-BBD7-CCE9431645EC}">
+                        <a14:shadowObscured xmlns:a14="http://schemas.microsoft.com/office/drawing/2010/main"/>
+                      </a:ext>
+                    </a:extLst>
+                  </pic:spPr>
+                </pic:pic>
+              </a:graphicData>
+            </a:graphic>
+          </wp:inline>
+        </w:drawing>
+      </w:r>
+    </w:p>
+    <w:p>
+      <w:pPr>
+        <w:rPr>
+          <w:sz w:val="24"/>
+          <w:szCs w:val="22"/>
+          <w:lang w:val="en-US"/>
+        </w:rPr>
+      </w:pPr>
+    </w:p>
+    <w:p>
+      <w:pPr>
+        <w:rPr>
+          <w:sz w:val="24"/>
+          <w:szCs w:val="22"/>
+          <w:lang w:val="en-US"/>
+        </w:rPr>
+      </w:pPr>
+      <w:r>
+        <w:rPr>
+          <w:sz w:val="24"/>
+          <w:szCs w:val="22"/>
+          <w:lang w:val="en-US"/>
+        </w:rPr>
+        <w:t>Plugins for Maven Execution</w:t>
+      </w:r>
+    </w:p>
+    <w:p>
+      <w:pPr>
         <w:pStyle w:val="ListParagraph"/>
         <w:numPr>
           <w:ilvl w:val="0"/>
-          <w:numId w:val="44"/>
-        </w:numPr>
+          <w:numId w:val="45"/>
+        </w:numPr>
+        <w:rPr>
+          <w:sz w:val="24"/>
+          <w:szCs w:val="22"/>
+          <w:lang w:val="en-US"/>
+        </w:rPr>
+      </w:pPr>
+      <w:r>
+        <w:rPr>
+          <w:sz w:val="24"/>
+          <w:szCs w:val="22"/>
+          <w:lang w:val="en-US"/>
+        </w:rPr>
+        <w:t>Maven Compiler Plugin</w:t>
+      </w:r>
+    </w:p>
+    <w:p>
+      <w:pPr>
+        <w:pStyle w:val="ListParagraph"/>
+        <w:numPr>
+          <w:ilvl w:val="0"/>
+          <w:numId w:val="45"/>
+        </w:numPr>
+        <w:rPr>
+          <w:sz w:val="24"/>
+          <w:szCs w:val="22"/>
+          <w:lang w:val="en-US"/>
+        </w:rPr>
+      </w:pPr>
+      <w:r>
+        <w:rPr>
+          <w:sz w:val="24"/>
+          <w:szCs w:val="22"/>
+          <w:lang w:val="en-US"/>
+        </w:rPr>
+        <w:lastRenderedPageBreak/>
+        <w:t>Maven Surefire Plugin</w:t>
+      </w:r>
+    </w:p>
+    <w:p>
+      <w:pPr>
+        <w:rPr>
+          <w:sz w:val="24"/>
+          <w:szCs w:val="22"/>
+          <w:lang w:val="en-US"/>
+        </w:rPr>
+      </w:pPr>
+      <w:r>
+        <w:rPr>
+          <w:sz w:val="24"/>
+          <w:szCs w:val="22"/>
+          <w:lang w:val="en-US"/>
+        </w:rPr>
+        <w:br w:type="page"/>
+      </w:r>
+    </w:p>
+    <w:p>
+      <w:pPr>
+        <w:rPr>
+          <w:b/>
+          <w:bCs/>
+          <w:sz w:val="24"/>
+          <w:szCs w:val="22"/>
+          <w:lang w:val="en-US"/>
+        </w:rPr>
+      </w:pPr>
+      <w:r>
+        <w:rPr>
+          <w:b/>
+          <w:bCs/>
+          <w:sz w:val="24"/>
+          <w:szCs w:val="22"/>
+          <w:lang w:val="en-US"/>
+        </w:rPr>
+        <w:lastRenderedPageBreak/>
+        <w:t>BDD (Behavior Driven Development)</w:t>
+      </w:r>
+    </w:p>
+    <w:p>
+      <w:pPr>
+        <w:pStyle w:val="ListParagraph"/>
+        <w:numPr>
+          <w:ilvl w:val="0"/>
+          <w:numId w:val="46"/>
+        </w:numPr>
+        <w:rPr>
+          <w:sz w:val="24"/>
+          <w:szCs w:val="22"/>
+          <w:lang w:val="en-US"/>
+        </w:rPr>
+      </w:pPr>
+      <w:r>
+        <w:rPr>
+          <w:sz w:val="24"/>
+          <w:szCs w:val="22"/>
+          <w:lang w:val="en-US"/>
+        </w:rPr>
+        <w:t>BA, Development Team &amp; Testing Team will gather the requirements from client.</w:t>
+      </w:r>
+    </w:p>
+    <w:p>
+      <w:pPr>
+        <w:pStyle w:val="ListParagraph"/>
+        <w:numPr>
+          <w:ilvl w:val="0"/>
+          <w:numId w:val="46"/>
+        </w:numPr>
+        <w:rPr>
+          <w:sz w:val="24"/>
+          <w:szCs w:val="22"/>
+          <w:lang w:val="en-US"/>
+        </w:rPr>
+      </w:pPr>
+      <w:r>
+        <w:rPr>
+          <w:sz w:val="24"/>
+          <w:szCs w:val="22"/>
+          <w:lang w:val="en-US"/>
+        </w:rPr>
+        <w:t>The finalized requirements will be shared with QA team.</w:t>
+      </w:r>
+    </w:p>
+    <w:p>
+      <w:pPr>
+        <w:pStyle w:val="ListParagraph"/>
+        <w:numPr>
+          <w:ilvl w:val="0"/>
+          <w:numId w:val="46"/>
+        </w:numPr>
+        <w:rPr>
+          <w:sz w:val="24"/>
+          <w:szCs w:val="22"/>
+          <w:lang w:val="en-US"/>
+        </w:rPr>
+      </w:pPr>
+      <w:r>
+        <w:rPr>
+          <w:sz w:val="24"/>
+          <w:szCs w:val="22"/>
+          <w:lang w:val="en-US"/>
+        </w:rPr>
+        <w:t xml:space="preserve">QA team will create </w:t>
+      </w:r>
+      <w:r>
+        <w:rPr>
+          <w:b/>
+          <w:bCs/>
+          <w:sz w:val="24"/>
+          <w:szCs w:val="22"/>
+          <w:lang w:val="en-US"/>
+        </w:rPr>
+        <w:t>Feature File (1</w:t>
+      </w:r>
+      <w:r>
+        <w:rPr>
+          <w:b/>
+          <w:bCs/>
+          <w:sz w:val="24"/>
+          <w:szCs w:val="22"/>
+          <w:vertAlign w:val="superscript"/>
+          <w:lang w:val="en-US"/>
+        </w:rPr>
+        <w:t>st</w:t>
+      </w:r>
+      <w:r>
+        <w:rPr>
+          <w:b/>
+          <w:bCs/>
+          <w:sz w:val="24"/>
+          <w:szCs w:val="22"/>
+          <w:lang w:val="en-US"/>
+        </w:rPr>
+        <w:t xml:space="preserve"> Component of BDD)</w:t>
+      </w:r>
+    </w:p>
+    <w:p>
+      <w:pPr>
+        <w:pStyle w:val="ListParagraph"/>
+        <w:numPr>
+          <w:ilvl w:val="1"/>
+          <w:numId w:val="46"/>
+        </w:numPr>
+        <w:rPr>
+          <w:sz w:val="24"/>
+          <w:szCs w:val="22"/>
+          <w:lang w:val="en-US"/>
+        </w:rPr>
+      </w:pPr>
+      <w:r>
+        <w:rPr>
+          <w:sz w:val="24"/>
+          <w:szCs w:val="22"/>
+          <w:lang w:val="en-US"/>
+        </w:rPr>
+        <w:t>Feature file is collection of test scenarios</w:t>
+      </w:r>
+    </w:p>
+    <w:p>
+      <w:pPr>
+        <w:pStyle w:val="ListParagraph"/>
+        <w:numPr>
+          <w:ilvl w:val="0"/>
+          <w:numId w:val="46"/>
+        </w:numPr>
+        <w:rPr>
+          <w:sz w:val="24"/>
+          <w:szCs w:val="22"/>
+          <w:lang w:val="en-US"/>
+        </w:rPr>
+      </w:pPr>
+      <w:r>
+        <w:rPr>
+          <w:sz w:val="24"/>
+          <w:szCs w:val="22"/>
+          <w:lang w:val="en-US"/>
+        </w:rPr>
+        <w:t>Now the feature file will be shared with</w:t>
+      </w:r>
+    </w:p>
+    <w:p>
+      <w:pPr>
+        <w:pStyle w:val="ListParagraph"/>
+        <w:numPr>
+          <w:ilvl w:val="1"/>
+          <w:numId w:val="46"/>
+        </w:numPr>
+        <w:rPr>
+          <w:sz w:val="24"/>
+          <w:szCs w:val="22"/>
+          <w:lang w:val="en-US"/>
+        </w:rPr>
+      </w:pPr>
+      <w:r>
+        <w:rPr>
+          <w:sz w:val="24"/>
+          <w:szCs w:val="22"/>
+          <w:lang w:val="en-US"/>
+        </w:rPr>
+        <w:t>Development team</w:t>
+      </w:r>
+    </w:p>
+    <w:p>
+      <w:pPr>
+        <w:pStyle w:val="ListParagraph"/>
+        <w:numPr>
+          <w:ilvl w:val="1"/>
+          <w:numId w:val="46"/>
+        </w:numPr>
+        <w:rPr>
+          <w:sz w:val="24"/>
+          <w:szCs w:val="22"/>
+          <w:lang w:val="en-US"/>
+        </w:rPr>
+      </w:pPr>
+      <w:r>
+        <w:rPr>
+          <w:sz w:val="24"/>
+          <w:szCs w:val="22"/>
+          <w:lang w:val="en-US"/>
+        </w:rPr>
+        <w:t>Manual testers</w:t>
+      </w:r>
+    </w:p>
+    <w:p>
+      <w:pPr>
+        <w:pStyle w:val="ListParagraph"/>
+        <w:numPr>
+          <w:ilvl w:val="1"/>
+          <w:numId w:val="46"/>
+        </w:numPr>
+        <w:rPr>
+          <w:sz w:val="24"/>
+          <w:szCs w:val="22"/>
+          <w:lang w:val="en-US"/>
+        </w:rPr>
+      </w:pPr>
+      <w:r>
+        <w:rPr>
+          <w:sz w:val="24"/>
+          <w:szCs w:val="22"/>
+          <w:lang w:val="en-US"/>
+        </w:rPr>
+        <w:t>Automation testers</w:t>
+      </w:r>
+    </w:p>
+    <w:p>
+      <w:pPr>
+        <w:pStyle w:val="ListParagraph"/>
+        <w:numPr>
+          <w:ilvl w:val="0"/>
+          <w:numId w:val="46"/>
+        </w:numPr>
+        <w:rPr>
+          <w:sz w:val="24"/>
+          <w:szCs w:val="22"/>
+          <w:lang w:val="en-US"/>
+        </w:rPr>
+      </w:pPr>
+      <w:r>
+        <w:rPr>
+          <w:sz w:val="24"/>
+          <w:szCs w:val="22"/>
+          <w:lang w:val="en-US"/>
+        </w:rPr>
+        <w:t xml:space="preserve">Automation tester will execute this feature file and they will get </w:t>
+      </w:r>
+      <w:r>
+        <w:rPr>
+          <w:b/>
+          <w:bCs/>
+          <w:sz w:val="24"/>
+          <w:szCs w:val="22"/>
+          <w:lang w:val="en-US"/>
+        </w:rPr>
+        <w:t>Glue Code / Step Definition (2</w:t>
+      </w:r>
+      <w:r>
+        <w:rPr>
+          <w:b/>
+          <w:bCs/>
+          <w:sz w:val="24"/>
+          <w:szCs w:val="22"/>
+          <w:vertAlign w:val="superscript"/>
+          <w:lang w:val="en-US"/>
+        </w:rPr>
+        <w:t>nd</w:t>
+      </w:r>
+      <w:r>
+        <w:rPr>
+          <w:b/>
+          <w:bCs/>
+          <w:sz w:val="24"/>
+          <w:szCs w:val="22"/>
+          <w:lang w:val="en-US"/>
+        </w:rPr>
+        <w:t xml:space="preserve"> Component of BDD)</w:t>
+      </w:r>
+    </w:p>
+    <w:p>
+      <w:pPr>
+        <w:pStyle w:val="ListParagraph"/>
+        <w:numPr>
+          <w:ilvl w:val="1"/>
+          <w:numId w:val="46"/>
+        </w:numPr>
+        <w:rPr>
+          <w:sz w:val="24"/>
+          <w:szCs w:val="22"/>
+          <w:lang w:val="en-US"/>
+        </w:rPr>
+      </w:pPr>
+      <w:r>
+        <w:rPr>
+          <w:sz w:val="24"/>
+          <w:szCs w:val="22"/>
+          <w:lang w:val="en-US"/>
+        </w:rPr>
+        <w:t>Glue code is the skeleton for automation script</w:t>
+      </w:r>
+    </w:p>
+    <w:p>
+      <w:pPr>
+        <w:pStyle w:val="ListParagraph"/>
+        <w:numPr>
+          <w:ilvl w:val="0"/>
+          <w:numId w:val="46"/>
+        </w:numPr>
+        <w:rPr>
+          <w:sz w:val="24"/>
+          <w:szCs w:val="22"/>
+          <w:lang w:val="en-US"/>
+        </w:rPr>
+      </w:pPr>
+      <w:r>
+        <w:rPr>
+          <w:b/>
+          <w:bCs/>
+          <w:sz w:val="24"/>
+          <w:szCs w:val="22"/>
+          <w:lang w:val="en-US"/>
+        </w:rPr>
+        <w:t>Runner Class (3</w:t>
+      </w:r>
+      <w:r>
+        <w:rPr>
+          <w:b/>
+          <w:bCs/>
+          <w:sz w:val="24"/>
+          <w:szCs w:val="22"/>
+          <w:vertAlign w:val="superscript"/>
+          <w:lang w:val="en-US"/>
+        </w:rPr>
+        <w:t>rd</w:t>
+      </w:r>
+      <w:r>
+        <w:rPr>
+          <w:b/>
+          <w:bCs/>
+          <w:sz w:val="24"/>
+          <w:szCs w:val="22"/>
+          <w:lang w:val="en-US"/>
+        </w:rPr>
+        <w:t xml:space="preserve"> Component of BDD) </w:t>
+      </w:r>
+      <w:r>
+        <w:rPr>
+          <w:sz w:val="24"/>
+          <w:szCs w:val="22"/>
+          <w:lang w:val="en-US"/>
+        </w:rPr>
+        <w:t>used to execute the automation script.</w:t>
+      </w:r>
+    </w:p>
+    <w:p>
+      <w:pPr>
         <w:rPr>
           <w:sz w:val="24"/>
           <w:szCs w:val="22"/>
@@ -15563,6 +17050,45 @@
       </w:pPr>
       <w:bookmarkStart w:id="0" w:name="_GoBack"/>
       <w:bookmarkEnd w:id="0"/>
+    </w:p>
+    <w:p>
+      <w:pPr>
+        <w:rPr>
+          <w:b/>
+          <w:bCs/>
+          <w:sz w:val="24"/>
+          <w:szCs w:val="22"/>
+          <w:lang w:val="en-US"/>
+        </w:rPr>
+      </w:pPr>
+      <w:r>
+        <w:rPr>
+          <w:b/>
+          <w:bCs/>
+          <w:sz w:val="24"/>
+          <w:szCs w:val="22"/>
+          <w:lang w:val="en-US"/>
+        </w:rPr>
+        <w:t>Cucumber is the tool for implementation of BDD Approach</w:t>
+      </w:r>
+    </w:p>
+    <w:p>
+      <w:pPr>
+        <w:rPr>
+          <w:sz w:val="24"/>
+          <w:szCs w:val="22"/>
+          <w:lang w:val="en-US"/>
+        </w:rPr>
+      </w:pPr>
+    </w:p>
+    <w:p>
+      <w:pPr>
+        <w:rPr>
+          <w:sz w:val="24"/>
+          <w:szCs w:val="22"/>
+          <w:lang w:val="en-US"/>
+        </w:rPr>
+      </w:pPr>
     </w:p>
     <w:sectPr>
       <w:pgSz w:w="11906" w:h="16838"/>
@@ -18937,6 +20463,119 @@
     </w:lvl>
   </w:abstractNum>
   <w:abstractNum w:abstractNumId="33">
+    <w:nsid w:val="63F214DA"/>
+    <w:multiLevelType w:val="hybridMultilevel"/>
+    <w:tmpl w:val="5CC452E2"/>
+    <w:lvl w:ilvl="0" w:tplc="4009000D">
+      <w:start w:val="1"/>
+      <w:numFmt w:val="bullet"/>
+      <w:lvlText w:val=""/>
+      <w:lvlJc w:val="left"/>
+      <w:pPr>
+        <w:ind w:left="720" w:hanging="360"/>
+      </w:pPr>
+      <w:rPr>
+        <w:rFonts w:ascii="Wingdings" w:hAnsi="Wingdings" w:hint="default"/>
+      </w:rPr>
+    </w:lvl>
+    <w:lvl w:ilvl="1" w:tplc="40090003">
+      <w:start w:val="1"/>
+      <w:numFmt w:val="bullet"/>
+      <w:lvlText w:val="o"/>
+      <w:lvlJc w:val="left"/>
+      <w:pPr>
+        <w:ind w:left="1440" w:hanging="360"/>
+      </w:pPr>
+      <w:rPr>
+        <w:rFonts w:ascii="Courier New" w:hAnsi="Courier New" w:cs="Courier New" w:hint="default"/>
+      </w:rPr>
+    </w:lvl>
+    <w:lvl w:ilvl="2" w:tplc="40090005" w:tentative="1">
+      <w:start w:val="1"/>
+      <w:numFmt w:val="bullet"/>
+      <w:lvlText w:val=""/>
+      <w:lvlJc w:val="left"/>
+      <w:pPr>
+        <w:ind w:left="2160" w:hanging="360"/>
+      </w:pPr>
+      <w:rPr>
+        <w:rFonts w:ascii="Wingdings" w:hAnsi="Wingdings" w:hint="default"/>
+      </w:rPr>
+    </w:lvl>
+    <w:lvl w:ilvl="3" w:tplc="40090001" w:tentative="1">
+      <w:start w:val="1"/>
+      <w:numFmt w:val="bullet"/>
+      <w:lvlText w:val=""/>
+      <w:lvlJc w:val="left"/>
+      <w:pPr>
+        <w:ind w:left="2880" w:hanging="360"/>
+      </w:pPr>
+      <w:rPr>
+        <w:rFonts w:ascii="Symbol" w:hAnsi="Symbol" w:hint="default"/>
+      </w:rPr>
+    </w:lvl>
+    <w:lvl w:ilvl="4" w:tplc="40090003" w:tentative="1">
+      <w:start w:val="1"/>
+      <w:numFmt w:val="bullet"/>
+      <w:lvlText w:val="o"/>
+      <w:lvlJc w:val="left"/>
+      <w:pPr>
+        <w:ind w:left="3600" w:hanging="360"/>
+      </w:pPr>
+      <w:rPr>
+        <w:rFonts w:ascii="Courier New" w:hAnsi="Courier New" w:cs="Courier New" w:hint="default"/>
+      </w:rPr>
+    </w:lvl>
+    <w:lvl w:ilvl="5" w:tplc="40090005" w:tentative="1">
+      <w:start w:val="1"/>
+      <w:numFmt w:val="bullet"/>
+      <w:lvlText w:val=""/>
+      <w:lvlJc w:val="left"/>
+      <w:pPr>
+        <w:ind w:left="4320" w:hanging="360"/>
+      </w:pPr>
+      <w:rPr>
+        <w:rFonts w:ascii="Wingdings" w:hAnsi="Wingdings" w:hint="default"/>
+      </w:rPr>
+    </w:lvl>
+    <w:lvl w:ilvl="6" w:tplc="40090001" w:tentative="1">
+      <w:start w:val="1"/>
+      <w:numFmt w:val="bullet"/>
+      <w:lvlText w:val=""/>
+      <w:lvlJc w:val="left"/>
+      <w:pPr>
+        <w:ind w:left="5040" w:hanging="360"/>
+      </w:pPr>
+      <w:rPr>
+        <w:rFonts w:ascii="Symbol" w:hAnsi="Symbol" w:hint="default"/>
+      </w:rPr>
+    </w:lvl>
+    <w:lvl w:ilvl="7" w:tplc="40090003" w:tentative="1">
+      <w:start w:val="1"/>
+      <w:numFmt w:val="bullet"/>
+      <w:lvlText w:val="o"/>
+      <w:lvlJc w:val="left"/>
+      <w:pPr>
+        <w:ind w:left="5760" w:hanging="360"/>
+      </w:pPr>
+      <w:rPr>
+        <w:rFonts w:ascii="Courier New" w:hAnsi="Courier New" w:cs="Courier New" w:hint="default"/>
+      </w:rPr>
+    </w:lvl>
+    <w:lvl w:ilvl="8" w:tplc="40090005" w:tentative="1">
+      <w:start w:val="1"/>
+      <w:numFmt w:val="bullet"/>
+      <w:lvlText w:val=""/>
+      <w:lvlJc w:val="left"/>
+      <w:pPr>
+        <w:ind w:left="6480" w:hanging="360"/>
+      </w:pPr>
+      <w:rPr>
+        <w:rFonts w:ascii="Wingdings" w:hAnsi="Wingdings" w:hint="default"/>
+      </w:rPr>
+    </w:lvl>
+  </w:abstractNum>
+  <w:abstractNum w:abstractNumId="34">
     <w:nsid w:val="64887AB4"/>
     <w:multiLevelType w:val="hybridMultilevel"/>
     <w:tmpl w:val="D67CE9E8"/>
@@ -19025,7 +20664,7 @@
       </w:pPr>
     </w:lvl>
   </w:abstractNum>
-  <w:abstractNum w:abstractNumId="34">
+  <w:abstractNum w:abstractNumId="35">
     <w:nsid w:val="649E4E2C"/>
     <w:multiLevelType w:val="hybridMultilevel"/>
     <w:tmpl w:val="5DB8C8EC"/>
@@ -19138,7 +20777,96 @@
       </w:rPr>
     </w:lvl>
   </w:abstractNum>
-  <w:abstractNum w:abstractNumId="35">
+  <w:abstractNum w:abstractNumId="36">
+    <w:nsid w:val="65443B58"/>
+    <w:multiLevelType w:val="hybridMultilevel"/>
+    <w:tmpl w:val="FEE64C40"/>
+    <w:lvl w:ilvl="0" w:tplc="4009000F">
+      <w:start w:val="1"/>
+      <w:numFmt w:val="decimal"/>
+      <w:lvlText w:val="%1."/>
+      <w:lvlJc w:val="left"/>
+      <w:pPr>
+        <w:ind w:left="720" w:hanging="360"/>
+      </w:pPr>
+      <w:rPr>
+        <w:rFonts w:hint="default"/>
+      </w:rPr>
+    </w:lvl>
+    <w:lvl w:ilvl="1" w:tplc="40090019" w:tentative="1">
+      <w:start w:val="1"/>
+      <w:numFmt w:val="lowerLetter"/>
+      <w:lvlText w:val="%2."/>
+      <w:lvlJc w:val="left"/>
+      <w:pPr>
+        <w:ind w:left="1440" w:hanging="360"/>
+      </w:pPr>
+    </w:lvl>
+    <w:lvl w:ilvl="2" w:tplc="4009001B" w:tentative="1">
+      <w:start w:val="1"/>
+      <w:numFmt w:val="lowerRoman"/>
+      <w:lvlText w:val="%3."/>
+      <w:lvlJc w:val="right"/>
+      <w:pPr>
+        <w:ind w:left="2160" w:hanging="180"/>
+      </w:pPr>
+    </w:lvl>
+    <w:lvl w:ilvl="3" w:tplc="4009000F" w:tentative="1">
+      <w:start w:val="1"/>
+      <w:numFmt w:val="decimal"/>
+      <w:lvlText w:val="%4."/>
+      <w:lvlJc w:val="left"/>
+      <w:pPr>
+        <w:ind w:left="2880" w:hanging="360"/>
+      </w:pPr>
+    </w:lvl>
+    <w:lvl w:ilvl="4" w:tplc="40090019" w:tentative="1">
+      <w:start w:val="1"/>
+      <w:numFmt w:val="lowerLetter"/>
+      <w:lvlText w:val="%5."/>
+      <w:lvlJc w:val="left"/>
+      <w:pPr>
+        <w:ind w:left="3600" w:hanging="360"/>
+      </w:pPr>
+    </w:lvl>
+    <w:lvl w:ilvl="5" w:tplc="4009001B" w:tentative="1">
+      <w:start w:val="1"/>
+      <w:numFmt w:val="lowerRoman"/>
+      <w:lvlText w:val="%6."/>
+      <w:lvlJc w:val="right"/>
+      <w:pPr>
+        <w:ind w:left="4320" w:hanging="180"/>
+      </w:pPr>
+    </w:lvl>
+    <w:lvl w:ilvl="6" w:tplc="4009000F" w:tentative="1">
+      <w:start w:val="1"/>
+      <w:numFmt w:val="decimal"/>
+      <w:lvlText w:val="%7."/>
+      <w:lvlJc w:val="left"/>
+      <w:pPr>
+        <w:ind w:left="5040" w:hanging="360"/>
+      </w:pPr>
+    </w:lvl>
+    <w:lvl w:ilvl="7" w:tplc="40090019" w:tentative="1">
+      <w:start w:val="1"/>
+      <w:numFmt w:val="lowerLetter"/>
+      <w:lvlText w:val="%8."/>
+      <w:lvlJc w:val="left"/>
+      <w:pPr>
+        <w:ind w:left="5760" w:hanging="360"/>
+      </w:pPr>
+    </w:lvl>
+    <w:lvl w:ilvl="8" w:tplc="4009001B" w:tentative="1">
+      <w:start w:val="1"/>
+      <w:numFmt w:val="lowerRoman"/>
+      <w:lvlText w:val="%9."/>
+      <w:lvlJc w:val="right"/>
+      <w:pPr>
+        <w:ind w:left="6480" w:hanging="180"/>
+      </w:pPr>
+    </w:lvl>
+  </w:abstractNum>
+  <w:abstractNum w:abstractNumId="37">
     <w:nsid w:val="66C96AEF"/>
     <w:multiLevelType w:val="hybridMultilevel"/>
     <w:tmpl w:val="2DDCC122"/>
@@ -19251,7 +20979,7 @@
       </w:rPr>
     </w:lvl>
   </w:abstractNum>
-  <w:abstractNum w:abstractNumId="36">
+  <w:abstractNum w:abstractNumId="38">
     <w:nsid w:val="6C096D1C"/>
     <w:multiLevelType w:val="hybridMultilevel"/>
     <w:tmpl w:val="35CADD6E"/>
@@ -19364,7 +21092,7 @@
       </w:rPr>
     </w:lvl>
   </w:abstractNum>
-  <w:abstractNum w:abstractNumId="37">
+  <w:abstractNum w:abstractNumId="39">
     <w:nsid w:val="6DF222BD"/>
     <w:multiLevelType w:val="hybridMultilevel"/>
     <w:tmpl w:val="CB58A112"/>
@@ -19477,7 +21205,7 @@
       </w:rPr>
     </w:lvl>
   </w:abstractNum>
-  <w:abstractNum w:abstractNumId="38">
+  <w:abstractNum w:abstractNumId="40">
     <w:nsid w:val="700B3448"/>
     <w:multiLevelType w:val="hybridMultilevel"/>
     <w:tmpl w:val="D4F8B1EA"/>
@@ -19566,7 +21294,7 @@
       </w:pPr>
     </w:lvl>
   </w:abstractNum>
-  <w:abstractNum w:abstractNumId="39">
+  <w:abstractNum w:abstractNumId="41">
     <w:nsid w:val="75631C59"/>
     <w:multiLevelType w:val="hybridMultilevel"/>
     <w:tmpl w:val="7E6A29CC"/>
@@ -19679,7 +21407,7 @@
       </w:rPr>
     </w:lvl>
   </w:abstractNum>
-  <w:abstractNum w:abstractNumId="40">
+  <w:abstractNum w:abstractNumId="42">
     <w:nsid w:val="7BD5777C"/>
     <w:multiLevelType w:val="hybridMultilevel"/>
     <w:tmpl w:val="53D46EE2"/>
@@ -19768,7 +21496,7 @@
       </w:pPr>
     </w:lvl>
   </w:abstractNum>
-  <w:abstractNum w:abstractNumId="41">
+  <w:abstractNum w:abstractNumId="43">
     <w:nsid w:val="7BF715C6"/>
     <w:multiLevelType w:val="hybridMultilevel"/>
     <w:tmpl w:val="F8B83480"/>
@@ -19857,7 +21585,7 @@
       </w:pPr>
     </w:lvl>
   </w:abstractNum>
-  <w:abstractNum w:abstractNumId="42">
+  <w:abstractNum w:abstractNumId="44">
     <w:nsid w:val="7C2320E0"/>
     <w:multiLevelType w:val="hybridMultilevel"/>
     <w:tmpl w:val="B4EC2F1C"/>
@@ -19970,7 +21698,7 @@
       </w:rPr>
     </w:lvl>
   </w:abstractNum>
-  <w:abstractNum w:abstractNumId="43">
+  <w:abstractNum w:abstractNumId="45">
     <w:nsid w:val="7E2F2A24"/>
     <w:multiLevelType w:val="hybridMultilevel"/>
     <w:tmpl w:val="CF9414DC"/>
@@ -20090,7 +21818,7 @@
     <w:abstractNumId w:val="24"/>
   </w:num>
   <w:num w:numId="3">
-    <w:abstractNumId w:val="38"/>
+    <w:abstractNumId w:val="40"/>
   </w:num>
   <w:num w:numId="4">
     <w:abstractNumId w:val="16"/>
@@ -20102,7 +21830,7 @@
     <w:abstractNumId w:val="11"/>
   </w:num>
   <w:num w:numId="7">
-    <w:abstractNumId w:val="37"/>
+    <w:abstractNumId w:val="39"/>
   </w:num>
   <w:num w:numId="8">
     <w:abstractNumId w:val="25"/>
@@ -20126,7 +21854,7 @@
     <w:abstractNumId w:val="9"/>
   </w:num>
   <w:num w:numId="15">
-    <w:abstractNumId w:val="40"/>
+    <w:abstractNumId w:val="42"/>
   </w:num>
   <w:num w:numId="16">
     <w:abstractNumId w:val="3"/>
@@ -20144,13 +21872,13 @@
     <w:abstractNumId w:val="21"/>
   </w:num>
   <w:num w:numId="21">
-    <w:abstractNumId w:val="34"/>
+    <w:abstractNumId w:val="35"/>
   </w:num>
   <w:num w:numId="22">
     <w:abstractNumId w:val="6"/>
   </w:num>
   <w:num w:numId="23">
-    <w:abstractNumId w:val="42"/>
+    <w:abstractNumId w:val="44"/>
   </w:num>
   <w:num w:numId="24">
     <w:abstractNumId w:val="13"/>
@@ -20171,7 +21899,7 @@
     <w:abstractNumId w:val="5"/>
   </w:num>
   <w:num w:numId="30">
-    <w:abstractNumId w:val="35"/>
+    <w:abstractNumId w:val="37"/>
   </w:num>
   <w:num w:numId="31">
     <w:abstractNumId w:val="26"/>
@@ -20180,13 +21908,13 @@
     <w:abstractNumId w:val="30"/>
   </w:num>
   <w:num w:numId="33">
-    <w:abstractNumId w:val="33"/>
+    <w:abstractNumId w:val="34"/>
   </w:num>
   <w:num w:numId="34">
     <w:abstractNumId w:val="20"/>
   </w:num>
   <w:num w:numId="35">
-    <w:abstractNumId w:val="41"/>
+    <w:abstractNumId w:val="43"/>
   </w:num>
   <w:num w:numId="36">
     <w:abstractNumId w:val="29"/>
@@ -20198,22 +21926,28 @@
     <w:abstractNumId w:val="15"/>
   </w:num>
   <w:num w:numId="39">
-    <w:abstractNumId w:val="43"/>
+    <w:abstractNumId w:val="45"/>
   </w:num>
   <w:num w:numId="40">
     <w:abstractNumId w:val="27"/>
   </w:num>
   <w:num w:numId="41">
-    <w:abstractNumId w:val="39"/>
+    <w:abstractNumId w:val="41"/>
   </w:num>
   <w:num w:numId="42">
-    <w:abstractNumId w:val="36"/>
+    <w:abstractNumId w:val="38"/>
   </w:num>
   <w:num w:numId="43">
     <w:abstractNumId w:val="4"/>
   </w:num>
   <w:num w:numId="44">
     <w:abstractNumId w:val="7"/>
+  </w:num>
+  <w:num w:numId="45">
+    <w:abstractNumId w:val="36"/>
+  </w:num>
+  <w:num w:numId="46">
+    <w:abstractNumId w:val="33"/>
   </w:num>
 </w:numbering>
 </file>
@@ -21884,31 +23618,31 @@
     </dgm:pt>
   </dgm:ptLst>
   <dgm:cxnLst>
-    <dgm:cxn modelId="{2F032135-CAFE-452F-8127-7E762B7DCD5F}" type="presOf" srcId="{B2F67260-32B4-49EF-BEA7-6376ABEBC356}" destId="{45B120D8-A283-4DB0-AE48-CD1028B5A1CA}" srcOrd="0" destOrd="0" presId="urn:microsoft.com/office/officeart/2005/8/layout/process1"/>
-    <dgm:cxn modelId="{76FEEE46-CBBE-4BE5-A019-C699E9F39BA4}" type="presOf" srcId="{58F8E6FA-8E5F-4590-8E91-7D425686736E}" destId="{1C61394E-D32F-4A43-ADD4-F46D3A33D38F}" srcOrd="0" destOrd="0" presId="urn:microsoft.com/office/officeart/2005/8/layout/process1"/>
+    <dgm:cxn modelId="{1270BC73-59AE-44B8-9532-D496C38CA97F}" type="presOf" srcId="{58F8E6FA-8E5F-4590-8E91-7D425686736E}" destId="{1C61394E-D32F-4A43-ADD4-F46D3A33D38F}" srcOrd="0" destOrd="0" presId="urn:microsoft.com/office/officeart/2005/8/layout/process1"/>
+    <dgm:cxn modelId="{19632F9E-3584-4E9D-AA0E-FCE24982A921}" type="presOf" srcId="{CB734D05-6005-4A33-891F-8F6E9F0BE629}" destId="{9346448E-7772-4989-9A73-02FD2DA61B93}" srcOrd="0" destOrd="0" presId="urn:microsoft.com/office/officeart/2005/8/layout/process1"/>
+    <dgm:cxn modelId="{BF1CADDA-FDE9-4A8D-B2D1-E82E27C8E3B5}" type="presOf" srcId="{B0DAEDAB-33B3-4821-A91B-D05361312CE9}" destId="{FCE3B9A4-214A-4502-B3DF-ACB3E0BC61C7}" srcOrd="0" destOrd="0" presId="urn:microsoft.com/office/officeart/2005/8/layout/process1"/>
+    <dgm:cxn modelId="{3BE24E4C-F284-4834-A388-32165CC2DAF2}" type="presOf" srcId="{D4DE5EA1-C98A-4001-96ED-0D8A4099152C}" destId="{CA09568C-529F-4056-BB14-75FC27EA3A57}" srcOrd="0" destOrd="0" presId="urn:microsoft.com/office/officeart/2005/8/layout/process1"/>
     <dgm:cxn modelId="{916CD402-046A-49C3-919C-E8874C6452BD}" srcId="{C787D0C9-C4AA-4BF8-AAA9-EFDCDDDFB8C5}" destId="{B0DAEDAB-33B3-4821-A91B-D05361312CE9}" srcOrd="3" destOrd="0" parTransId="{1B396FDD-FE98-44AA-BBFD-EFDF9B52D4CD}" sibTransId="{2689B6F1-8FF1-4D68-9639-E8E505EA5AB0}"/>
-    <dgm:cxn modelId="{24B88B39-74DC-4C23-B2C5-1F856356ABE4}" type="presOf" srcId="{D4DE5EA1-C98A-4001-96ED-0D8A4099152C}" destId="{CA09568C-529F-4056-BB14-75FC27EA3A57}" srcOrd="0" destOrd="0" presId="urn:microsoft.com/office/officeart/2005/8/layout/process1"/>
-    <dgm:cxn modelId="{EF89E012-843D-4773-B462-990630480382}" type="presOf" srcId="{C787D0C9-C4AA-4BF8-AAA9-EFDCDDDFB8C5}" destId="{ECE2E50F-1EF0-49E9-A2A2-C09D34379E86}" srcOrd="0" destOrd="0" presId="urn:microsoft.com/office/officeart/2005/8/layout/process1"/>
-    <dgm:cxn modelId="{EF58C0EE-DE28-4DFF-9746-16C32CF4612E}" type="presOf" srcId="{B0DAEDAB-33B3-4821-A91B-D05361312CE9}" destId="{FCE3B9A4-214A-4502-B3DF-ACB3E0BC61C7}" srcOrd="0" destOrd="0" presId="urn:microsoft.com/office/officeart/2005/8/layout/process1"/>
-    <dgm:cxn modelId="{6FD0C3CD-8CC6-40FC-A77B-67563CBD191B}" type="presOf" srcId="{2F2C6037-AE48-4650-B998-EBABF88D0464}" destId="{ABB6D0E9-231F-49FF-8F6A-CBD756BB2A07}" srcOrd="0" destOrd="0" presId="urn:microsoft.com/office/officeart/2005/8/layout/process1"/>
-    <dgm:cxn modelId="{B838BD8A-FD59-4869-9840-3F7C3438E35E}" type="presOf" srcId="{CB734D05-6005-4A33-891F-8F6E9F0BE629}" destId="{9346448E-7772-4989-9A73-02FD2DA61B93}" srcOrd="0" destOrd="0" presId="urn:microsoft.com/office/officeart/2005/8/layout/process1"/>
+    <dgm:cxn modelId="{33ED9929-36EC-4E40-83E6-B0FEEC7E6EC6}" type="presOf" srcId="{58F8E6FA-8E5F-4590-8E91-7D425686736E}" destId="{38F30BB8-19AC-4F2C-997E-D6C87643D812}" srcOrd="1" destOrd="0" presId="urn:microsoft.com/office/officeart/2005/8/layout/process1"/>
+    <dgm:cxn modelId="{580953A6-5892-433A-AEAD-52C96BC6E471}" type="presOf" srcId="{C6470392-B547-42B7-BBE1-49D9BF3297A5}" destId="{E6A79763-2175-4FE6-AF39-65BAD7E8A94D}" srcOrd="0" destOrd="0" presId="urn:microsoft.com/office/officeart/2005/8/layout/process1"/>
     <dgm:cxn modelId="{407416C7-D9A4-49CF-A1D9-63129D12A5E9}" srcId="{C787D0C9-C4AA-4BF8-AAA9-EFDCDDDFB8C5}" destId="{B2F67260-32B4-49EF-BEA7-6376ABEBC356}" srcOrd="1" destOrd="0" parTransId="{452FD36E-8C97-458A-9189-BC15B3E0AB1F}" sibTransId="{58F8E6FA-8E5F-4590-8E91-7D425686736E}"/>
     <dgm:cxn modelId="{F27277EA-BDDA-4005-9170-FBB0A209E462}" srcId="{C787D0C9-C4AA-4BF8-AAA9-EFDCDDDFB8C5}" destId="{CB734D05-6005-4A33-891F-8F6E9F0BE629}" srcOrd="0" destOrd="0" parTransId="{D88A1106-7499-4EC1-A955-12C926757BDC}" sibTransId="{2F2C6037-AE48-4650-B998-EBABF88D0464}"/>
-    <dgm:cxn modelId="{EC1B6D80-3DB8-4840-A3D5-69302AD4F91B}" type="presOf" srcId="{2F2C6037-AE48-4650-B998-EBABF88D0464}" destId="{8D8E620F-A309-4628-986D-B0F92ABF739C}" srcOrd="1" destOrd="0" presId="urn:microsoft.com/office/officeart/2005/8/layout/process1"/>
-    <dgm:cxn modelId="{2B34C34C-058A-4024-BE7F-B910DAC69EE5}" type="presOf" srcId="{58F8E6FA-8E5F-4590-8E91-7D425686736E}" destId="{38F30BB8-19AC-4F2C-997E-D6C87643D812}" srcOrd="1" destOrd="0" presId="urn:microsoft.com/office/officeart/2005/8/layout/process1"/>
+    <dgm:cxn modelId="{B397E00B-1758-407A-B54F-5A0D4D6283F2}" type="presOf" srcId="{2F2C6037-AE48-4650-B998-EBABF88D0464}" destId="{ABB6D0E9-231F-49FF-8F6A-CBD756BB2A07}" srcOrd="0" destOrd="0" presId="urn:microsoft.com/office/officeart/2005/8/layout/process1"/>
     <dgm:cxn modelId="{A358B1AA-45ED-4C0A-A925-911C6E3E177E}" srcId="{C787D0C9-C4AA-4BF8-AAA9-EFDCDDDFB8C5}" destId="{D4DE5EA1-C98A-4001-96ED-0D8A4099152C}" srcOrd="2" destOrd="0" parTransId="{DDD45587-67C2-4B3F-892B-0153C2E010D0}" sibTransId="{C6470392-B547-42B7-BBE1-49D9BF3297A5}"/>
-    <dgm:cxn modelId="{64D29015-8CF2-477E-A2D2-D67077E290E1}" type="presOf" srcId="{C6470392-B547-42B7-BBE1-49D9BF3297A5}" destId="{D17F71C8-684F-40E9-B9CF-89D188A27816}" srcOrd="1" destOrd="0" presId="urn:microsoft.com/office/officeart/2005/8/layout/process1"/>
-    <dgm:cxn modelId="{E8E6CC04-DD6F-420B-9626-E8746F09C844}" type="presOf" srcId="{C6470392-B547-42B7-BBE1-49D9BF3297A5}" destId="{E6A79763-2175-4FE6-AF39-65BAD7E8A94D}" srcOrd="0" destOrd="0" presId="urn:microsoft.com/office/officeart/2005/8/layout/process1"/>
-    <dgm:cxn modelId="{402C3361-7A5E-41D7-8AFB-30F7AA44C7E7}" type="presParOf" srcId="{ECE2E50F-1EF0-49E9-A2A2-C09D34379E86}" destId="{9346448E-7772-4989-9A73-02FD2DA61B93}" srcOrd="0" destOrd="0" presId="urn:microsoft.com/office/officeart/2005/8/layout/process1"/>
-    <dgm:cxn modelId="{A390454B-1E30-4878-8417-1AD4B8455A3A}" type="presParOf" srcId="{ECE2E50F-1EF0-49E9-A2A2-C09D34379E86}" destId="{ABB6D0E9-231F-49FF-8F6A-CBD756BB2A07}" srcOrd="1" destOrd="0" presId="urn:microsoft.com/office/officeart/2005/8/layout/process1"/>
-    <dgm:cxn modelId="{3841CE9E-F6F4-42B0-BAA3-F976085D3DD2}" type="presParOf" srcId="{ABB6D0E9-231F-49FF-8F6A-CBD756BB2A07}" destId="{8D8E620F-A309-4628-986D-B0F92ABF739C}" srcOrd="0" destOrd="0" presId="urn:microsoft.com/office/officeart/2005/8/layout/process1"/>
-    <dgm:cxn modelId="{14FC35DB-A9AA-47F0-AA58-7A70F5AE11CA}" type="presParOf" srcId="{ECE2E50F-1EF0-49E9-A2A2-C09D34379E86}" destId="{45B120D8-A283-4DB0-AE48-CD1028B5A1CA}" srcOrd="2" destOrd="0" presId="urn:microsoft.com/office/officeart/2005/8/layout/process1"/>
-    <dgm:cxn modelId="{F92677AC-7062-413B-B8A7-82B5CCB19B9D}" type="presParOf" srcId="{ECE2E50F-1EF0-49E9-A2A2-C09D34379E86}" destId="{1C61394E-D32F-4A43-ADD4-F46D3A33D38F}" srcOrd="3" destOrd="0" presId="urn:microsoft.com/office/officeart/2005/8/layout/process1"/>
-    <dgm:cxn modelId="{02D4380E-5B30-4242-A96E-836D5A4201D2}" type="presParOf" srcId="{1C61394E-D32F-4A43-ADD4-F46D3A33D38F}" destId="{38F30BB8-19AC-4F2C-997E-D6C87643D812}" srcOrd="0" destOrd="0" presId="urn:microsoft.com/office/officeart/2005/8/layout/process1"/>
-    <dgm:cxn modelId="{E5DF3B55-7576-4BE5-80E4-7B574F619BA1}" type="presParOf" srcId="{ECE2E50F-1EF0-49E9-A2A2-C09D34379E86}" destId="{CA09568C-529F-4056-BB14-75FC27EA3A57}" srcOrd="4" destOrd="0" presId="urn:microsoft.com/office/officeart/2005/8/layout/process1"/>
-    <dgm:cxn modelId="{EC50ABAE-CFDB-4BA0-8872-9559915A60A1}" type="presParOf" srcId="{ECE2E50F-1EF0-49E9-A2A2-C09D34379E86}" destId="{E6A79763-2175-4FE6-AF39-65BAD7E8A94D}" srcOrd="5" destOrd="0" presId="urn:microsoft.com/office/officeart/2005/8/layout/process1"/>
-    <dgm:cxn modelId="{C270E239-D04C-43B5-A138-01C1FAB52CBF}" type="presParOf" srcId="{E6A79763-2175-4FE6-AF39-65BAD7E8A94D}" destId="{D17F71C8-684F-40E9-B9CF-89D188A27816}" srcOrd="0" destOrd="0" presId="urn:microsoft.com/office/officeart/2005/8/layout/process1"/>
-    <dgm:cxn modelId="{2EC8A510-63C3-4423-874F-8226F6E613E2}" type="presParOf" srcId="{ECE2E50F-1EF0-49E9-A2A2-C09D34379E86}" destId="{FCE3B9A4-214A-4502-B3DF-ACB3E0BC61C7}" srcOrd="6" destOrd="0" presId="urn:microsoft.com/office/officeart/2005/8/layout/process1"/>
+    <dgm:cxn modelId="{0D9BDE29-D41B-4653-9B47-CFB91598BA98}" type="presOf" srcId="{2F2C6037-AE48-4650-B998-EBABF88D0464}" destId="{8D8E620F-A309-4628-986D-B0F92ABF739C}" srcOrd="1" destOrd="0" presId="urn:microsoft.com/office/officeart/2005/8/layout/process1"/>
+    <dgm:cxn modelId="{0C1492FB-EE51-4212-BDE8-4DF230022CA3}" type="presOf" srcId="{B2F67260-32B4-49EF-BEA7-6376ABEBC356}" destId="{45B120D8-A283-4DB0-AE48-CD1028B5A1CA}" srcOrd="0" destOrd="0" presId="urn:microsoft.com/office/officeart/2005/8/layout/process1"/>
+    <dgm:cxn modelId="{882CA347-0C3D-49BA-B30E-8318202AEECB}" type="presOf" srcId="{C787D0C9-C4AA-4BF8-AAA9-EFDCDDDFB8C5}" destId="{ECE2E50F-1EF0-49E9-A2A2-C09D34379E86}" srcOrd="0" destOrd="0" presId="urn:microsoft.com/office/officeart/2005/8/layout/process1"/>
+    <dgm:cxn modelId="{AD1A9D2D-7DF4-4710-8F7A-B2BDCE173286}" type="presOf" srcId="{C6470392-B547-42B7-BBE1-49D9BF3297A5}" destId="{D17F71C8-684F-40E9-B9CF-89D188A27816}" srcOrd="1" destOrd="0" presId="urn:microsoft.com/office/officeart/2005/8/layout/process1"/>
+    <dgm:cxn modelId="{FCB43CD1-4A33-46AC-97FC-F7809E7607C7}" type="presParOf" srcId="{ECE2E50F-1EF0-49E9-A2A2-C09D34379E86}" destId="{9346448E-7772-4989-9A73-02FD2DA61B93}" srcOrd="0" destOrd="0" presId="urn:microsoft.com/office/officeart/2005/8/layout/process1"/>
+    <dgm:cxn modelId="{A5FB481F-B569-4012-A6CE-938BDC4D96A1}" type="presParOf" srcId="{ECE2E50F-1EF0-49E9-A2A2-C09D34379E86}" destId="{ABB6D0E9-231F-49FF-8F6A-CBD756BB2A07}" srcOrd="1" destOrd="0" presId="urn:microsoft.com/office/officeart/2005/8/layout/process1"/>
+    <dgm:cxn modelId="{EAA1FC5E-7B2B-4693-BB30-B3DC6EEC18D7}" type="presParOf" srcId="{ABB6D0E9-231F-49FF-8F6A-CBD756BB2A07}" destId="{8D8E620F-A309-4628-986D-B0F92ABF739C}" srcOrd="0" destOrd="0" presId="urn:microsoft.com/office/officeart/2005/8/layout/process1"/>
+    <dgm:cxn modelId="{9B38339E-AB43-43C0-A094-306917787FFA}" type="presParOf" srcId="{ECE2E50F-1EF0-49E9-A2A2-C09D34379E86}" destId="{45B120D8-A283-4DB0-AE48-CD1028B5A1CA}" srcOrd="2" destOrd="0" presId="urn:microsoft.com/office/officeart/2005/8/layout/process1"/>
+    <dgm:cxn modelId="{09993C8D-43CC-48F3-85F2-88215EF26AE7}" type="presParOf" srcId="{ECE2E50F-1EF0-49E9-A2A2-C09D34379E86}" destId="{1C61394E-D32F-4A43-ADD4-F46D3A33D38F}" srcOrd="3" destOrd="0" presId="urn:microsoft.com/office/officeart/2005/8/layout/process1"/>
+    <dgm:cxn modelId="{F5175F77-5372-42C7-A0B1-D90D109F98E9}" type="presParOf" srcId="{1C61394E-D32F-4A43-ADD4-F46D3A33D38F}" destId="{38F30BB8-19AC-4F2C-997E-D6C87643D812}" srcOrd="0" destOrd="0" presId="urn:microsoft.com/office/officeart/2005/8/layout/process1"/>
+    <dgm:cxn modelId="{ED69B9BE-DC26-425F-A7D8-6A7C63391AFF}" type="presParOf" srcId="{ECE2E50F-1EF0-49E9-A2A2-C09D34379E86}" destId="{CA09568C-529F-4056-BB14-75FC27EA3A57}" srcOrd="4" destOrd="0" presId="urn:microsoft.com/office/officeart/2005/8/layout/process1"/>
+    <dgm:cxn modelId="{41F98CA8-E91C-4CB7-B190-89BF9B0570DB}" type="presParOf" srcId="{ECE2E50F-1EF0-49E9-A2A2-C09D34379E86}" destId="{E6A79763-2175-4FE6-AF39-65BAD7E8A94D}" srcOrd="5" destOrd="0" presId="urn:microsoft.com/office/officeart/2005/8/layout/process1"/>
+    <dgm:cxn modelId="{429D3AEF-3060-4FFB-B378-58D5B7F51F8C}" type="presParOf" srcId="{E6A79763-2175-4FE6-AF39-65BAD7E8A94D}" destId="{D17F71C8-684F-40E9-B9CF-89D188A27816}" srcOrd="0" destOrd="0" presId="urn:microsoft.com/office/officeart/2005/8/layout/process1"/>
+    <dgm:cxn modelId="{B968B39B-9BA5-4231-B886-9CFFF6149C67}" type="presParOf" srcId="{ECE2E50F-1EF0-49E9-A2A2-C09D34379E86}" destId="{FCE3B9A4-214A-4502-B3DF-ACB3E0BC61C7}" srcOrd="6" destOrd="0" presId="urn:microsoft.com/office/officeart/2005/8/layout/process1"/>
   </dgm:cxnLst>
   <dgm:bg/>
   <dgm:whole/>

</xml_diff>

<commit_message>
Date: 07 May 2026
</commit_message>
<xml_diff>
--- a/Notes_SA2601010.docx
+++ b/Notes_SA2601010.docx
@@ -17048,47 +17048,1503 @@
           <w:lang w:val="en-US"/>
         </w:rPr>
       </w:pPr>
+    </w:p>
+    <w:p>
+      <w:pPr>
+        <w:rPr>
+          <w:b/>
+          <w:bCs/>
+          <w:sz w:val="24"/>
+          <w:szCs w:val="22"/>
+          <w:lang w:val="en-US"/>
+        </w:rPr>
+      </w:pPr>
+      <w:r>
+        <w:rPr>
+          <w:b/>
+          <w:bCs/>
+          <w:sz w:val="24"/>
+          <w:szCs w:val="22"/>
+          <w:lang w:val="en-US"/>
+        </w:rPr>
+        <w:t>Cucumber is the tool for implementation of BDD Approach</w:t>
+      </w:r>
+    </w:p>
+    <w:p>
+      <w:pPr>
+        <w:pBdr>
+          <w:bottom w:val="single" w:sz="6" w:space="1" w:color="auto"/>
+        </w:pBdr>
+        <w:rPr>
+          <w:sz w:val="24"/>
+          <w:szCs w:val="22"/>
+          <w:lang w:val="en-US"/>
+        </w:rPr>
+      </w:pPr>
+    </w:p>
+    <w:p>
+      <w:pPr>
+        <w:rPr>
+          <w:sz w:val="24"/>
+          <w:szCs w:val="22"/>
+          <w:lang w:val="en-US"/>
+        </w:rPr>
+      </w:pPr>
+    </w:p>
+    <w:p>
+      <w:pPr>
+        <w:rPr>
+          <w:b/>
+          <w:bCs/>
+          <w:sz w:val="24"/>
+          <w:szCs w:val="22"/>
+          <w:lang w:val="en-US"/>
+        </w:rPr>
+      </w:pPr>
+      <w:r>
+        <w:rPr>
+          <w:b/>
+          <w:bCs/>
+          <w:sz w:val="24"/>
+          <w:szCs w:val="22"/>
+          <w:lang w:val="en-US"/>
+        </w:rPr>
+        <w:t>Feature File</w:t>
+      </w:r>
+    </w:p>
+    <w:p>
+      <w:pPr>
+        <w:pStyle w:val="ListParagraph"/>
+        <w:numPr>
+          <w:ilvl w:val="0"/>
+          <w:numId w:val="47"/>
+        </w:numPr>
+        <w:rPr>
+          <w:sz w:val="24"/>
+          <w:szCs w:val="22"/>
+          <w:lang w:val="en-US"/>
+        </w:rPr>
+      </w:pPr>
+      <w:r>
+        <w:rPr>
+          <w:sz w:val="24"/>
+          <w:szCs w:val="22"/>
+          <w:lang w:val="en-US"/>
+        </w:rPr>
+        <w:t>Collection of test scenarios</w:t>
+      </w:r>
+    </w:p>
+    <w:p>
+      <w:pPr>
+        <w:pStyle w:val="ListParagraph"/>
+        <w:numPr>
+          <w:ilvl w:val="0"/>
+          <w:numId w:val="47"/>
+        </w:numPr>
+        <w:rPr>
+          <w:sz w:val="24"/>
+          <w:szCs w:val="22"/>
+          <w:lang w:val="en-US"/>
+        </w:rPr>
+      </w:pPr>
+      <w:r>
+        <w:rPr>
+          <w:sz w:val="24"/>
+          <w:szCs w:val="22"/>
+          <w:lang w:val="en-US"/>
+        </w:rPr>
+        <w:t>Having extension .feature</w:t>
+      </w:r>
+    </w:p>
+    <w:p>
+      <w:pPr>
+        <w:pStyle w:val="ListParagraph"/>
+        <w:numPr>
+          <w:ilvl w:val="0"/>
+          <w:numId w:val="47"/>
+        </w:numPr>
+        <w:rPr>
+          <w:sz w:val="24"/>
+          <w:szCs w:val="22"/>
+          <w:lang w:val="en-US"/>
+        </w:rPr>
+      </w:pPr>
+      <w:r>
+        <w:rPr>
+          <w:sz w:val="24"/>
+          <w:szCs w:val="22"/>
+          <w:lang w:val="en-US"/>
+        </w:rPr>
+        <w:t>Created using Gherkin language / syntax</w:t>
+      </w:r>
+    </w:p>
+    <w:p>
+      <w:pPr>
+        <w:pStyle w:val="ListParagraph"/>
+        <w:numPr>
+          <w:ilvl w:val="0"/>
+          <w:numId w:val="47"/>
+        </w:numPr>
+        <w:rPr>
+          <w:sz w:val="24"/>
+          <w:szCs w:val="22"/>
+          <w:lang w:val="en-US"/>
+        </w:rPr>
+      </w:pPr>
+      <w:r>
+        <w:rPr>
+          <w:sz w:val="24"/>
+          <w:szCs w:val="22"/>
+          <w:lang w:val="en-US"/>
+        </w:rPr>
+        <w:t>Uses keywords</w:t>
+      </w:r>
+    </w:p>
+    <w:p>
+      <w:pPr>
+        <w:pStyle w:val="ListParagraph"/>
+        <w:numPr>
+          <w:ilvl w:val="1"/>
+          <w:numId w:val="47"/>
+        </w:numPr>
+        <w:rPr>
+          <w:sz w:val="24"/>
+          <w:szCs w:val="22"/>
+          <w:lang w:val="en-US"/>
+        </w:rPr>
+      </w:pPr>
+      <w:r>
+        <w:rPr>
+          <w:sz w:val="24"/>
+          <w:szCs w:val="22"/>
+          <w:lang w:val="en-US"/>
+        </w:rPr>
+        <w:t xml:space="preserve">Feature: </w:t>
+      </w:r>
+      <w:r>
+        <w:rPr>
+          <w:sz w:val="24"/>
+          <w:szCs w:val="22"/>
+          <w:lang w:val="en-US"/>
+        </w:rPr>
+        <w:sym w:font="Wingdings" w:char="F0E0"/>
+      </w:r>
+      <w:r>
+        <w:rPr>
+          <w:sz w:val="24"/>
+          <w:szCs w:val="22"/>
+          <w:lang w:val="en-US"/>
+        </w:rPr>
+        <w:t xml:space="preserve"> Represents Requirement</w:t>
+      </w:r>
+    </w:p>
+    <w:p>
+      <w:pPr>
+        <w:pStyle w:val="ListParagraph"/>
+        <w:numPr>
+          <w:ilvl w:val="1"/>
+          <w:numId w:val="47"/>
+        </w:numPr>
+        <w:rPr>
+          <w:sz w:val="24"/>
+          <w:szCs w:val="22"/>
+          <w:lang w:val="en-US"/>
+        </w:rPr>
+      </w:pPr>
+      <w:r>
+        <w:rPr>
+          <w:sz w:val="24"/>
+          <w:szCs w:val="22"/>
+          <w:lang w:val="en-US"/>
+        </w:rPr>
+        <w:t xml:space="preserve">Scenario: </w:t>
+      </w:r>
+      <w:r>
+        <w:rPr>
+          <w:sz w:val="24"/>
+          <w:szCs w:val="22"/>
+          <w:lang w:val="en-US"/>
+        </w:rPr>
+        <w:sym w:font="Wingdings" w:char="F0E0"/>
+      </w:r>
+      <w:r>
+        <w:rPr>
+          <w:sz w:val="24"/>
+          <w:szCs w:val="22"/>
+          <w:lang w:val="en-US"/>
+        </w:rPr>
+        <w:t xml:space="preserve"> Represents test condition / test objective</w:t>
+      </w:r>
+    </w:p>
+    <w:p>
+      <w:pPr>
+        <w:pStyle w:val="ListParagraph"/>
+        <w:numPr>
+          <w:ilvl w:val="1"/>
+          <w:numId w:val="47"/>
+        </w:numPr>
+        <w:rPr>
+          <w:sz w:val="24"/>
+          <w:szCs w:val="22"/>
+          <w:lang w:val="en-US"/>
+        </w:rPr>
+      </w:pPr>
+      <w:r>
+        <w:rPr>
+          <w:sz w:val="24"/>
+          <w:szCs w:val="22"/>
+          <w:lang w:val="en-US"/>
+        </w:rPr>
+        <w:t xml:space="preserve">Given </w:t>
+      </w:r>
+      <w:r>
+        <w:rPr>
+          <w:sz w:val="24"/>
+          <w:szCs w:val="22"/>
+          <w:lang w:val="en-US"/>
+        </w:rPr>
+        <w:sym w:font="Wingdings" w:char="F0E0"/>
+      </w:r>
+      <w:r>
+        <w:rPr>
+          <w:sz w:val="24"/>
+          <w:szCs w:val="22"/>
+          <w:lang w:val="en-US"/>
+        </w:rPr>
+        <w:t xml:space="preserve"> Represents pre-requisite</w:t>
+      </w:r>
+    </w:p>
+    <w:p>
+      <w:pPr>
+        <w:pStyle w:val="ListParagraph"/>
+        <w:numPr>
+          <w:ilvl w:val="1"/>
+          <w:numId w:val="47"/>
+        </w:numPr>
+        <w:rPr>
+          <w:sz w:val="24"/>
+          <w:szCs w:val="22"/>
+          <w:lang w:val="en-US"/>
+        </w:rPr>
+      </w:pPr>
+      <w:r>
+        <w:rPr>
+          <w:sz w:val="24"/>
+          <w:szCs w:val="22"/>
+          <w:lang w:val="en-US"/>
+        </w:rPr>
+        <w:t xml:space="preserve">When </w:t>
+      </w:r>
+      <w:r>
+        <w:rPr>
+          <w:sz w:val="24"/>
+          <w:szCs w:val="22"/>
+          <w:lang w:val="en-US"/>
+        </w:rPr>
+        <w:sym w:font="Wingdings" w:char="F0E0"/>
+      </w:r>
+      <w:r>
+        <w:rPr>
+          <w:sz w:val="24"/>
+          <w:szCs w:val="22"/>
+          <w:lang w:val="en-US"/>
+        </w:rPr>
+        <w:t xml:space="preserve"> Represents single test step. Even you can combine multiple steps in single When statement</w:t>
+      </w:r>
+    </w:p>
+    <w:p>
+      <w:pPr>
+        <w:pStyle w:val="ListParagraph"/>
+        <w:numPr>
+          <w:ilvl w:val="1"/>
+          <w:numId w:val="47"/>
+        </w:numPr>
+        <w:rPr>
+          <w:sz w:val="24"/>
+          <w:szCs w:val="22"/>
+          <w:lang w:val="en-US"/>
+        </w:rPr>
+      </w:pPr>
+      <w:r>
+        <w:rPr>
+          <w:sz w:val="24"/>
+          <w:szCs w:val="22"/>
+          <w:lang w:val="en-US"/>
+        </w:rPr>
+        <w:t xml:space="preserve">And </w:t>
+      </w:r>
+      <w:r>
+        <w:rPr>
+          <w:sz w:val="24"/>
+          <w:szCs w:val="22"/>
+          <w:lang w:val="en-US"/>
+        </w:rPr>
+        <w:sym w:font="Wingdings" w:char="F0E0"/>
+      </w:r>
+      <w:r>
+        <w:rPr>
+          <w:sz w:val="24"/>
+          <w:szCs w:val="22"/>
+          <w:lang w:val="en-US"/>
+        </w:rPr>
+        <w:t xml:space="preserve"> </w:t>
+      </w:r>
+      <w:r>
+        <w:rPr>
+          <w:sz w:val="24"/>
+          <w:szCs w:val="22"/>
+          <w:lang w:val="en-US"/>
+        </w:rPr>
+        <w:t>Can be used to combine multiple When statements</w:t>
+      </w:r>
+    </w:p>
+    <w:p>
+      <w:pPr>
+        <w:pStyle w:val="ListParagraph"/>
+        <w:numPr>
+          <w:ilvl w:val="1"/>
+          <w:numId w:val="47"/>
+        </w:numPr>
+        <w:rPr>
+          <w:sz w:val="24"/>
+          <w:szCs w:val="22"/>
+          <w:lang w:val="en-US"/>
+        </w:rPr>
+      </w:pPr>
+      <w:r>
+        <w:rPr>
+          <w:sz w:val="24"/>
+          <w:szCs w:val="22"/>
+          <w:lang w:val="en-US"/>
+        </w:rPr>
+        <w:t xml:space="preserve">Then </w:t>
+      </w:r>
+      <w:r>
+        <w:rPr>
+          <w:sz w:val="24"/>
+          <w:szCs w:val="22"/>
+          <w:lang w:val="en-US"/>
+        </w:rPr>
+        <w:sym w:font="Wingdings" w:char="F0E0"/>
+      </w:r>
+      <w:r>
+        <w:rPr>
+          <w:sz w:val="24"/>
+          <w:szCs w:val="22"/>
+          <w:lang w:val="en-US"/>
+        </w:rPr>
+        <w:t xml:space="preserve"> </w:t>
+      </w:r>
+      <w:r>
+        <w:rPr>
+          <w:sz w:val="24"/>
+          <w:szCs w:val="22"/>
+          <w:lang w:val="en-US"/>
+        </w:rPr>
+        <w:t>Represents expected result</w:t>
+      </w:r>
+    </w:p>
+    <w:p>
+      <w:pPr>
+        <w:pStyle w:val="ListParagraph"/>
+        <w:numPr>
+          <w:ilvl w:val="1"/>
+          <w:numId w:val="47"/>
+        </w:numPr>
+        <w:rPr>
+          <w:sz w:val="24"/>
+          <w:szCs w:val="22"/>
+          <w:lang w:val="en-US"/>
+        </w:rPr>
+      </w:pPr>
+      <w:r>
+        <w:rPr>
+          <w:sz w:val="24"/>
+          <w:szCs w:val="22"/>
+          <w:lang w:val="en-US"/>
+        </w:rPr>
+        <w:t xml:space="preserve">Background: </w:t>
+      </w:r>
+      <w:r>
+        <w:rPr>
+          <w:sz w:val="24"/>
+          <w:szCs w:val="22"/>
+          <w:lang w:val="en-US"/>
+        </w:rPr>
+        <w:sym w:font="Wingdings" w:char="F0E0"/>
+      </w:r>
+      <w:r>
+        <w:rPr>
+          <w:sz w:val="24"/>
+          <w:szCs w:val="22"/>
+          <w:lang w:val="en-US"/>
+        </w:rPr>
+        <w:t xml:space="preserve"> Avoids using multiple Given statements</w:t>
+      </w:r>
+    </w:p>
+    <w:p>
+      <w:pPr>
+        <w:pStyle w:val="ListParagraph"/>
+        <w:numPr>
+          <w:ilvl w:val="1"/>
+          <w:numId w:val="47"/>
+        </w:numPr>
+        <w:rPr>
+          <w:sz w:val="24"/>
+          <w:szCs w:val="22"/>
+          <w:lang w:val="en-US"/>
+        </w:rPr>
+      </w:pPr>
+      <w:r>
+        <w:rPr>
+          <w:sz w:val="24"/>
+          <w:szCs w:val="22"/>
+          <w:lang w:val="en-US"/>
+        </w:rPr>
+        <w:t xml:space="preserve">Examples: </w:t>
+      </w:r>
+      <w:r>
+        <w:rPr>
+          <w:sz w:val="24"/>
+          <w:szCs w:val="22"/>
+          <w:lang w:val="en-US"/>
+        </w:rPr>
+        <w:sym w:font="Wingdings" w:char="F0E0"/>
+      </w:r>
+      <w:r>
+        <w:rPr>
+          <w:sz w:val="24"/>
+          <w:szCs w:val="22"/>
+          <w:lang w:val="en-US"/>
+        </w:rPr>
+        <w:t xml:space="preserve"> Used for data driven testing (like @DataProvider in TestNG)</w:t>
+      </w:r>
+    </w:p>
+    <w:p>
+      <w:pPr>
+        <w:pStyle w:val="ListParagraph"/>
+        <w:numPr>
+          <w:ilvl w:val="1"/>
+          <w:numId w:val="47"/>
+        </w:numPr>
+        <w:rPr>
+          <w:sz w:val="24"/>
+          <w:szCs w:val="22"/>
+          <w:lang w:val="en-US"/>
+        </w:rPr>
+      </w:pPr>
+      <w:r>
+        <w:rPr>
+          <w:sz w:val="24"/>
+          <w:szCs w:val="22"/>
+          <w:lang w:val="en-US"/>
+        </w:rPr>
+        <w:t xml:space="preserve">Scenario Outline: </w:t>
+      </w:r>
+      <w:r>
+        <w:rPr>
+          <w:sz w:val="24"/>
+          <w:szCs w:val="22"/>
+          <w:lang w:val="en-US"/>
+        </w:rPr>
+        <w:sym w:font="Wingdings" w:char="F0E0"/>
+      </w:r>
+      <w:r>
+        <w:rPr>
+          <w:sz w:val="24"/>
+          <w:szCs w:val="22"/>
+          <w:lang w:val="en-US"/>
+        </w:rPr>
+        <w:t xml:space="preserve"> </w:t>
+      </w:r>
+      <w:r>
+        <w:rPr>
+          <w:sz w:val="24"/>
+          <w:szCs w:val="22"/>
+          <w:lang w:val="en-US"/>
+        </w:rPr>
+        <w:t>Used in data driven testing instead of Scenario</w:t>
+      </w:r>
+    </w:p>
+    <w:p>
+      <w:pPr>
+        <w:pBdr>
+          <w:bottom w:val="single" w:sz="6" w:space="1" w:color="auto"/>
+        </w:pBdr>
+        <w:rPr>
+          <w:sz w:val="24"/>
+          <w:szCs w:val="22"/>
+          <w:lang w:val="en-US"/>
+        </w:rPr>
+      </w:pPr>
+    </w:p>
+    <w:p>
+      <w:pPr>
+        <w:rPr>
+          <w:sz w:val="24"/>
+          <w:szCs w:val="22"/>
+          <w:lang w:val="en-US"/>
+        </w:rPr>
+      </w:pPr>
+    </w:p>
+    <w:p>
+      <w:pPr>
+        <w:rPr>
+          <w:sz w:val="24"/>
+          <w:szCs w:val="22"/>
+          <w:lang w:val="en-US"/>
+        </w:rPr>
+      </w:pPr>
+      <w:r>
+        <w:rPr>
+          <w:sz w:val="24"/>
+          <w:szCs w:val="22"/>
+          <w:lang w:val="en-US"/>
+        </w:rPr>
+        <w:t>Requirement – Verify title of Google</w:t>
+      </w:r>
+    </w:p>
+    <w:p>
+      <w:pPr>
+        <w:pStyle w:val="ListParagraph"/>
+        <w:numPr>
+          <w:ilvl w:val="0"/>
+          <w:numId w:val="48"/>
+        </w:numPr>
+        <w:rPr>
+          <w:sz w:val="24"/>
+          <w:szCs w:val="22"/>
+          <w:lang w:val="en-US"/>
+        </w:rPr>
+      </w:pPr>
+      <w:r>
+        <w:rPr>
+          <w:sz w:val="24"/>
+          <w:szCs w:val="22"/>
+          <w:lang w:val="en-US"/>
+        </w:rPr>
+        <w:t>Open Google</w:t>
+      </w:r>
+    </w:p>
+    <w:p>
+      <w:pPr>
+        <w:pStyle w:val="ListParagraph"/>
+        <w:numPr>
+          <w:ilvl w:val="0"/>
+          <w:numId w:val="48"/>
+        </w:numPr>
+        <w:rPr>
+          <w:sz w:val="24"/>
+          <w:szCs w:val="22"/>
+          <w:lang w:val="en-US"/>
+        </w:rPr>
+      </w:pPr>
+      <w:r>
+        <w:rPr>
+          <w:sz w:val="24"/>
+          <w:szCs w:val="22"/>
+          <w:lang w:val="en-US"/>
+        </w:rPr>
+        <w:t>Capture / read the title</w:t>
+      </w:r>
+    </w:p>
+    <w:p>
+      <w:pPr>
+        <w:pStyle w:val="ListParagraph"/>
+        <w:numPr>
+          <w:ilvl w:val="0"/>
+          <w:numId w:val="48"/>
+        </w:numPr>
+        <w:rPr>
+          <w:sz w:val="24"/>
+          <w:szCs w:val="22"/>
+          <w:lang w:val="en-US"/>
+        </w:rPr>
+      </w:pPr>
+      <w:r>
+        <w:rPr>
+          <w:sz w:val="24"/>
+          <w:szCs w:val="22"/>
+          <w:lang w:val="en-US"/>
+        </w:rPr>
+        <w:t>Verify that title is Google</w:t>
+      </w:r>
+    </w:p>
+    <w:p>
+      <w:pPr>
+        <w:rPr>
+          <w:sz w:val="24"/>
+          <w:szCs w:val="22"/>
+          <w:lang w:val="en-US"/>
+        </w:rPr>
+      </w:pPr>
+      <w:r>
+        <w:rPr>
+          <w:sz w:val="24"/>
+          <w:szCs w:val="22"/>
+          <w:lang w:val="en-US"/>
+        </w:rPr>
+        <w:lastRenderedPageBreak/>
+        <w:t>Feature file</w:t>
+      </w:r>
+    </w:p>
+    <w:p>
+      <w:pPr>
+        <w:rPr>
+          <w:sz w:val="24"/>
+          <w:szCs w:val="22"/>
+          <w:lang w:val="en-US"/>
+        </w:rPr>
+      </w:pPr>
+      <w:r>
+        <w:rPr>
+          <w:sz w:val="24"/>
+          <w:szCs w:val="22"/>
+          <w:lang w:val="en-US"/>
+        </w:rPr>
+        <w:t>Feature: Google title</w:t>
+      </w:r>
+    </w:p>
+    <w:p>
+      <w:pPr>
+        <w:rPr>
+          <w:sz w:val="24"/>
+          <w:szCs w:val="22"/>
+          <w:lang w:val="en-US"/>
+        </w:rPr>
+      </w:pPr>
+      <w:r>
+        <w:rPr>
+          <w:sz w:val="24"/>
+          <w:szCs w:val="22"/>
+          <w:lang w:val="en-US"/>
+        </w:rPr>
+        <w:t>Scenario: To validate title of Google home page</w:t>
+      </w:r>
+    </w:p>
+    <w:p>
+      <w:pPr>
+        <w:rPr>
+          <w:sz w:val="24"/>
+          <w:szCs w:val="22"/>
+          <w:lang w:val="en-US"/>
+        </w:rPr>
+      </w:pPr>
+      <w:r>
+        <w:rPr>
+          <w:sz w:val="24"/>
+          <w:szCs w:val="22"/>
+          <w:lang w:val="en-US"/>
+        </w:rPr>
+        <w:t>Given Open Google</w:t>
+      </w:r>
+    </w:p>
+    <w:p>
+      <w:pPr>
+        <w:rPr>
+          <w:sz w:val="24"/>
+          <w:szCs w:val="22"/>
+          <w:lang w:val="en-US"/>
+        </w:rPr>
+      </w:pPr>
+      <w:r>
+        <w:rPr>
+          <w:sz w:val="24"/>
+          <w:szCs w:val="22"/>
+          <w:lang w:val="en-US"/>
+        </w:rPr>
+        <w:t>When Read the title</w:t>
+      </w:r>
+    </w:p>
+    <w:p>
+      <w:pPr>
+        <w:rPr>
+          <w:sz w:val="24"/>
+          <w:szCs w:val="22"/>
+          <w:lang w:val="en-US"/>
+        </w:rPr>
+      </w:pPr>
+      <w:r>
+        <w:rPr>
+          <w:sz w:val="24"/>
+          <w:szCs w:val="22"/>
+          <w:lang w:val="en-US"/>
+        </w:rPr>
+        <w:t>Then Title should be Google</w:t>
+      </w:r>
+    </w:p>
+    <w:p>
+      <w:pPr>
+        <w:pBdr>
+          <w:bottom w:val="single" w:sz="6" w:space="1" w:color="auto"/>
+        </w:pBdr>
+        <w:rPr>
+          <w:sz w:val="24"/>
+          <w:szCs w:val="22"/>
+          <w:lang w:val="en-US"/>
+        </w:rPr>
+      </w:pPr>
+    </w:p>
+    <w:p>
+      <w:pPr>
+        <w:rPr>
+          <w:b/>
+          <w:bCs/>
+          <w:sz w:val="24"/>
+          <w:szCs w:val="22"/>
+          <w:lang w:val="en-US"/>
+        </w:rPr>
+      </w:pPr>
+      <w:r>
+        <w:rPr>
+          <w:b/>
+          <w:bCs/>
+          <w:sz w:val="24"/>
+          <w:szCs w:val="22"/>
+          <w:lang w:val="en-US"/>
+        </w:rPr>
+        <w:t>Creating Cucumber project</w:t>
+      </w:r>
+    </w:p>
+    <w:p>
+      <w:pPr>
+        <w:pStyle w:val="ListParagraph"/>
+        <w:numPr>
+          <w:ilvl w:val="0"/>
+          <w:numId w:val="49"/>
+        </w:numPr>
+        <w:rPr>
+          <w:sz w:val="24"/>
+          <w:szCs w:val="22"/>
+          <w:lang w:val="en-US"/>
+        </w:rPr>
+      </w:pPr>
+      <w:r>
+        <w:rPr>
+          <w:sz w:val="24"/>
+          <w:szCs w:val="22"/>
+          <w:lang w:val="en-US"/>
+        </w:rPr>
+        <w:t xml:space="preserve">On Eclipse Click on File </w:t>
+      </w:r>
+      <w:r>
+        <w:rPr>
+          <w:sz w:val="24"/>
+          <w:szCs w:val="22"/>
+          <w:lang w:val="en-US"/>
+        </w:rPr>
+        <w:sym w:font="Wingdings" w:char="F0E0"/>
+      </w:r>
+      <w:r>
+        <w:rPr>
+          <w:sz w:val="24"/>
+          <w:szCs w:val="22"/>
+          <w:lang w:val="en-US"/>
+        </w:rPr>
+        <w:t xml:space="preserve"> New </w:t>
+      </w:r>
+      <w:r>
+        <w:rPr>
+          <w:sz w:val="24"/>
+          <w:szCs w:val="22"/>
+          <w:lang w:val="en-US"/>
+        </w:rPr>
+        <w:sym w:font="Wingdings" w:char="F0E0"/>
+      </w:r>
+      <w:r>
+        <w:rPr>
+          <w:sz w:val="24"/>
+          <w:szCs w:val="22"/>
+          <w:lang w:val="en-US"/>
+        </w:rPr>
+        <w:t xml:space="preserve"> Maven Project</w:t>
+      </w:r>
+    </w:p>
+    <w:p>
+      <w:pPr>
+        <w:pStyle w:val="ListParagraph"/>
+        <w:numPr>
+          <w:ilvl w:val="0"/>
+          <w:numId w:val="49"/>
+        </w:numPr>
+        <w:rPr>
+          <w:sz w:val="24"/>
+          <w:szCs w:val="22"/>
+          <w:lang w:val="en-US"/>
+        </w:rPr>
+      </w:pPr>
+      <w:r>
+        <w:rPr>
+          <w:sz w:val="24"/>
+          <w:szCs w:val="22"/>
+          <w:lang w:val="en-US"/>
+        </w:rPr>
+        <w:t>Select 3</w:t>
+      </w:r>
+      <w:r>
+        <w:rPr>
+          <w:sz w:val="24"/>
+          <w:szCs w:val="22"/>
+          <w:vertAlign w:val="superscript"/>
+          <w:lang w:val="en-US"/>
+        </w:rPr>
+        <w:t>rd</w:t>
+      </w:r>
+      <w:r>
+        <w:rPr>
+          <w:sz w:val="24"/>
+          <w:szCs w:val="22"/>
+          <w:lang w:val="en-US"/>
+        </w:rPr>
+        <w:t xml:space="preserve"> Check box (Add Project to Working set)</w:t>
+      </w:r>
+    </w:p>
+    <w:p>
+      <w:pPr>
+        <w:pStyle w:val="ListParagraph"/>
+        <w:numPr>
+          <w:ilvl w:val="0"/>
+          <w:numId w:val="49"/>
+        </w:numPr>
+        <w:rPr>
+          <w:sz w:val="24"/>
+          <w:szCs w:val="22"/>
+          <w:lang w:val="en-US"/>
+        </w:rPr>
+      </w:pPr>
+      <w:r>
+        <w:rPr>
+          <w:sz w:val="24"/>
+          <w:szCs w:val="22"/>
+          <w:lang w:val="en-US"/>
+        </w:rPr>
+        <w:t>Click on Next</w:t>
+      </w:r>
+    </w:p>
+    <w:p>
+      <w:pPr>
+        <w:pStyle w:val="ListParagraph"/>
+        <w:numPr>
+          <w:ilvl w:val="0"/>
+          <w:numId w:val="49"/>
+        </w:numPr>
+        <w:rPr>
+          <w:sz w:val="24"/>
+          <w:szCs w:val="22"/>
+          <w:lang w:val="en-US"/>
+        </w:rPr>
+      </w:pPr>
+      <w:r>
+        <w:rPr>
+          <w:sz w:val="24"/>
+          <w:szCs w:val="22"/>
+          <w:lang w:val="en-US"/>
+        </w:rPr>
+        <w:t xml:space="preserve">Type </w:t>
+      </w:r>
+      <w:r>
+        <w:rPr>
+          <w:b/>
+          <w:bCs/>
+          <w:sz w:val="24"/>
+          <w:szCs w:val="22"/>
+          <w:lang w:val="en-US"/>
+        </w:rPr>
+        <w:t xml:space="preserve">io.cucumber </w:t>
+      </w:r>
+      <w:r>
+        <w:rPr>
+          <w:sz w:val="24"/>
+          <w:szCs w:val="22"/>
+          <w:lang w:val="en-US"/>
+        </w:rPr>
+        <w:t>in Filter text box</w:t>
+      </w:r>
+    </w:p>
+    <w:p>
+      <w:pPr>
+        <w:pStyle w:val="ListParagraph"/>
+        <w:numPr>
+          <w:ilvl w:val="0"/>
+          <w:numId w:val="49"/>
+        </w:numPr>
+        <w:rPr>
+          <w:sz w:val="24"/>
+          <w:szCs w:val="22"/>
+          <w:lang w:val="en-US"/>
+        </w:rPr>
+      </w:pPr>
+      <w:r>
+        <w:rPr>
+          <w:sz w:val="24"/>
+          <w:szCs w:val="22"/>
+          <w:lang w:val="en-US"/>
+        </w:rPr>
+        <w:t xml:space="preserve">Select the Archetype that is coming </w:t>
+      </w:r>
+    </w:p>
+    <w:p>
+      <w:pPr>
+        <w:pStyle w:val="ListParagraph"/>
+        <w:numPr>
+          <w:ilvl w:val="0"/>
+          <w:numId w:val="49"/>
+        </w:numPr>
+        <w:rPr>
+          <w:sz w:val="24"/>
+          <w:szCs w:val="22"/>
+          <w:lang w:val="en-US"/>
+        </w:rPr>
+      </w:pPr>
+      <w:r>
+        <w:rPr>
+          <w:sz w:val="24"/>
+          <w:szCs w:val="22"/>
+          <w:lang w:val="en-US"/>
+        </w:rPr>
+        <w:t>Click on Next</w:t>
+      </w:r>
+    </w:p>
+    <w:p>
+      <w:pPr>
+        <w:pStyle w:val="ListParagraph"/>
+        <w:numPr>
+          <w:ilvl w:val="0"/>
+          <w:numId w:val="49"/>
+        </w:numPr>
+        <w:rPr>
+          <w:sz w:val="24"/>
+          <w:szCs w:val="22"/>
+          <w:lang w:val="en-US"/>
+        </w:rPr>
+      </w:pPr>
+      <w:r>
+        <w:rPr>
+          <w:sz w:val="24"/>
+          <w:szCs w:val="22"/>
+          <w:lang w:val="en-US"/>
+        </w:rPr>
+        <w:t xml:space="preserve">Add </w:t>
+      </w:r>
+      <w:proofErr w:type="spellStart"/>
+      <w:r>
+        <w:rPr>
+          <w:sz w:val="24"/>
+          <w:szCs w:val="22"/>
+          <w:lang w:val="en-US"/>
+        </w:rPr>
+        <w:t>GroupId</w:t>
+      </w:r>
+      <w:proofErr w:type="spellEnd"/>
+      <w:r>
+        <w:rPr>
+          <w:sz w:val="24"/>
+          <w:szCs w:val="22"/>
+          <w:lang w:val="en-US"/>
+        </w:rPr>
+        <w:t xml:space="preserve"> and </w:t>
+      </w:r>
+      <w:proofErr w:type="spellStart"/>
+      <w:r>
+        <w:rPr>
+          <w:sz w:val="24"/>
+          <w:szCs w:val="22"/>
+          <w:lang w:val="en-US"/>
+        </w:rPr>
+        <w:t>ArtifactID</w:t>
+      </w:r>
+      <w:proofErr w:type="spellEnd"/>
+      <w:r>
+        <w:rPr>
+          <w:sz w:val="24"/>
+          <w:szCs w:val="22"/>
+          <w:lang w:val="en-US"/>
+        </w:rPr>
+        <w:t xml:space="preserve"> (Both should be same)</w:t>
+      </w:r>
+    </w:p>
+    <w:p>
+      <w:pPr>
+        <w:pStyle w:val="ListParagraph"/>
+        <w:numPr>
+          <w:ilvl w:val="0"/>
+          <w:numId w:val="49"/>
+        </w:numPr>
+        <w:rPr>
+          <w:sz w:val="24"/>
+          <w:szCs w:val="22"/>
+          <w:lang w:val="en-US"/>
+        </w:rPr>
+      </w:pPr>
+      <w:r>
+        <w:rPr>
+          <w:sz w:val="24"/>
+          <w:szCs w:val="22"/>
+          <w:lang w:val="en-US"/>
+        </w:rPr>
+        <w:t>Click on Finish</w:t>
+      </w:r>
+    </w:p>
+    <w:p>
+      <w:pPr>
+        <w:pStyle w:val="ListParagraph"/>
+        <w:numPr>
+          <w:ilvl w:val="0"/>
+          <w:numId w:val="49"/>
+        </w:numPr>
+        <w:rPr>
+          <w:sz w:val="24"/>
+          <w:szCs w:val="22"/>
+          <w:lang w:val="en-US"/>
+        </w:rPr>
+      </w:pPr>
+      <w:r>
+        <w:rPr>
+          <w:sz w:val="24"/>
+          <w:szCs w:val="22"/>
+          <w:lang w:val="en-US"/>
+        </w:rPr>
+        <w:t>Open pom.xml file</w:t>
+      </w:r>
+    </w:p>
+    <w:p>
+      <w:pPr>
+        <w:pStyle w:val="ListParagraph"/>
+        <w:numPr>
+          <w:ilvl w:val="1"/>
+          <w:numId w:val="49"/>
+        </w:numPr>
+        <w:rPr>
+          <w:sz w:val="24"/>
+          <w:szCs w:val="22"/>
+          <w:lang w:val="en-US"/>
+        </w:rPr>
+      </w:pPr>
+      <w:r>
+        <w:rPr>
+          <w:sz w:val="24"/>
+          <w:szCs w:val="22"/>
+          <w:lang w:val="en-US"/>
+        </w:rPr>
+        <w:t>Delete the code from &lt;properties&gt; (Line no 12) till &lt;dependencies&gt; (Line no 67)</w:t>
+      </w:r>
+    </w:p>
+    <w:p>
+      <w:pPr>
+        <w:pStyle w:val="ListParagraph"/>
+        <w:numPr>
+          <w:ilvl w:val="0"/>
+          <w:numId w:val="49"/>
+        </w:numPr>
+        <w:rPr>
+          <w:sz w:val="24"/>
+          <w:szCs w:val="22"/>
+          <w:lang w:val="en-US"/>
+        </w:rPr>
+      </w:pPr>
+      <w:r>
+        <w:rPr>
+          <w:sz w:val="24"/>
+          <w:szCs w:val="22"/>
+          <w:lang w:val="en-US"/>
+        </w:rPr>
+        <w:t xml:space="preserve">Open </w:t>
+      </w:r>
+      <w:hyperlink r:id="rId16" w:history="1">
+        <w:r>
+          <w:rPr>
+            <w:rStyle w:val="Hyperlink"/>
+            <w:sz w:val="24"/>
+            <w:szCs w:val="22"/>
+            <w:lang w:val="en-US"/>
+          </w:rPr>
+          <w:t>https://github.com/cucumber/cucumber-java-skeleton/commit/d7249b50c570816eba27ce94557e1de7e9b0f97</w:t>
+        </w:r>
+      </w:hyperlink>
+    </w:p>
+    <w:p>
+      <w:pPr>
+        <w:pStyle w:val="ListParagraph"/>
+        <w:numPr>
+          <w:ilvl w:val="1"/>
+          <w:numId w:val="49"/>
+        </w:numPr>
+        <w:rPr>
+          <w:sz w:val="24"/>
+          <w:szCs w:val="22"/>
+          <w:lang w:val="en-US"/>
+        </w:rPr>
+      </w:pPr>
+      <w:r>
+        <w:rPr>
+          <w:sz w:val="24"/>
+          <w:szCs w:val="22"/>
+          <w:lang w:val="en-US"/>
+        </w:rPr>
+        <w:t>Select the code from &lt;properties&gt; (line no 11) till &lt;dependencies&gt; (Line no 41)</w:t>
+      </w:r>
+    </w:p>
+    <w:p>
+      <w:pPr>
+        <w:pStyle w:val="ListParagraph"/>
+        <w:numPr>
+          <w:ilvl w:val="0"/>
+          <w:numId w:val="49"/>
+        </w:numPr>
+        <w:rPr>
+          <w:sz w:val="24"/>
+          <w:szCs w:val="22"/>
+          <w:lang w:val="en-US"/>
+        </w:rPr>
+      </w:pPr>
+      <w:r>
+        <w:rPr>
+          <w:sz w:val="24"/>
+          <w:szCs w:val="22"/>
+          <w:lang w:val="en-US"/>
+        </w:rPr>
+        <w:t>Paste this code in pom.xml file where we have deleted the code in step no 9</w:t>
+      </w:r>
+    </w:p>
+    <w:p>
+      <w:pPr>
+        <w:pStyle w:val="ListParagraph"/>
+        <w:numPr>
+          <w:ilvl w:val="0"/>
+          <w:numId w:val="49"/>
+        </w:numPr>
+        <w:rPr>
+          <w:sz w:val="24"/>
+          <w:szCs w:val="22"/>
+          <w:lang w:val="en-US"/>
+        </w:rPr>
+      </w:pPr>
+      <w:r>
+        <w:rPr>
+          <w:sz w:val="24"/>
+          <w:szCs w:val="22"/>
+          <w:lang w:val="en-US"/>
+        </w:rPr>
+        <w:t>Change the Java version in following line</w:t>
+      </w:r>
+    </w:p>
+    <w:p>
+      <w:pPr>
+        <w:pStyle w:val="ListParagraph"/>
+        <w:numPr>
+          <w:ilvl w:val="1"/>
+          <w:numId w:val="49"/>
+        </w:numPr>
+        <w:rPr>
+          <w:sz w:val="24"/>
+          <w:szCs w:val="22"/>
+          <w:lang w:val="en-US"/>
+        </w:rPr>
+      </w:pPr>
+      <w:r>
+        <w:rPr>
+          <w:rFonts w:ascii="Consolas" w:hAnsi="Consolas" w:cs="Consolas"/>
+          <w:color w:val="000000"/>
+          <w:sz w:val="28"/>
+          <w:szCs w:val="28"/>
+          <w:shd w:val="clear" w:color="auto" w:fill="E8F2FE"/>
+        </w:rPr>
+        <w:t>&lt;</w:t>
+      </w:r>
+      <w:proofErr w:type="spellStart"/>
+      <w:r>
+        <w:rPr>
+          <w:rFonts w:ascii="Consolas" w:hAnsi="Consolas" w:cs="Consolas"/>
+          <w:color w:val="268BD2"/>
+          <w:sz w:val="28"/>
+          <w:szCs w:val="28"/>
+          <w:shd w:val="clear" w:color="auto" w:fill="E8F2FE"/>
+        </w:rPr>
+        <w:t>java.version</w:t>
+      </w:r>
+      <w:proofErr w:type="spellEnd"/>
+      <w:r>
+        <w:rPr>
+          <w:rFonts w:ascii="Consolas" w:hAnsi="Consolas" w:cs="Consolas"/>
+          <w:color w:val="000000"/>
+          <w:sz w:val="28"/>
+          <w:szCs w:val="28"/>
+          <w:shd w:val="clear" w:color="auto" w:fill="E8F2FE"/>
+        </w:rPr>
+        <w:t>&gt;1.8&lt;/</w:t>
+      </w:r>
+      <w:proofErr w:type="spellStart"/>
+      <w:r>
+        <w:rPr>
+          <w:rFonts w:ascii="Consolas" w:hAnsi="Consolas" w:cs="Consolas"/>
+          <w:color w:val="268BD2"/>
+          <w:sz w:val="28"/>
+          <w:szCs w:val="28"/>
+          <w:shd w:val="clear" w:color="auto" w:fill="E8F2FE"/>
+        </w:rPr>
+        <w:t>java.version</w:t>
+      </w:r>
+      <w:proofErr w:type="spellEnd"/>
+      <w:r>
+        <w:rPr>
+          <w:rFonts w:ascii="Consolas" w:hAnsi="Consolas" w:cs="Consolas"/>
+          <w:color w:val="000000"/>
+          <w:sz w:val="28"/>
+          <w:szCs w:val="28"/>
+          <w:shd w:val="clear" w:color="auto" w:fill="E8F2FE"/>
+        </w:rPr>
+        <w:t>&gt;</w:t>
+      </w:r>
+    </w:p>
+    <w:p>
+      <w:pPr>
+        <w:pStyle w:val="ListParagraph"/>
+        <w:numPr>
+          <w:ilvl w:val="0"/>
+          <w:numId w:val="49"/>
+        </w:numPr>
+        <w:rPr>
+          <w:sz w:val="24"/>
+          <w:szCs w:val="22"/>
+          <w:lang w:val="en-US"/>
+        </w:rPr>
+      </w:pPr>
+      <w:r>
+        <w:rPr>
+          <w:sz w:val="24"/>
+          <w:szCs w:val="22"/>
+          <w:lang w:val="en-US"/>
+        </w:rPr>
+        <w:t xml:space="preserve">Delete </w:t>
+      </w:r>
+      <w:r>
+        <w:rPr>
+          <w:sz w:val="24"/>
+          <w:szCs w:val="22"/>
+          <w:lang w:val="en-US"/>
+        </w:rPr>
+        <w:t>following lines</w:t>
+      </w:r>
+    </w:p>
+    <w:p>
+      <w:pPr>
+        <w:pStyle w:val="ListParagraph"/>
+        <w:numPr>
+          <w:ilvl w:val="1"/>
+          <w:numId w:val="49"/>
+        </w:numPr>
+        <w:rPr>
+          <w:sz w:val="24"/>
+          <w:szCs w:val="22"/>
+          <w:lang w:val="en-US"/>
+        </w:rPr>
+      </w:pPr>
+      <w:r>
+        <w:rPr>
+          <w:rFonts w:ascii="Consolas" w:hAnsi="Consolas" w:cs="Consolas"/>
+          <w:color w:val="000000"/>
+          <w:sz w:val="28"/>
+          <w:szCs w:val="28"/>
+          <w:shd w:val="clear" w:color="auto" w:fill="E8F2FE"/>
+        </w:rPr>
+        <w:t>&lt;</w:t>
+      </w:r>
+      <w:proofErr w:type="spellStart"/>
+      <w:r>
+        <w:rPr>
+          <w:rFonts w:ascii="Consolas" w:hAnsi="Consolas" w:cs="Consolas"/>
+          <w:color w:val="268BD2"/>
+          <w:sz w:val="28"/>
+          <w:szCs w:val="28"/>
+          <w:shd w:val="clear" w:color="auto" w:fill="E8F2FE"/>
+        </w:rPr>
+        <w:t>cucumber.version</w:t>
+      </w:r>
+      <w:proofErr w:type="spellEnd"/>
+      <w:r>
+        <w:rPr>
+          <w:rFonts w:ascii="Consolas" w:hAnsi="Consolas" w:cs="Consolas"/>
+          <w:color w:val="000000"/>
+          <w:sz w:val="28"/>
+          <w:szCs w:val="28"/>
+          <w:shd w:val="clear" w:color="auto" w:fill="E8F2FE"/>
+        </w:rPr>
+        <w:t>&gt;6.8.2&lt;/</w:t>
+      </w:r>
+      <w:proofErr w:type="spellStart"/>
+      <w:r>
+        <w:rPr>
+          <w:rFonts w:ascii="Consolas" w:hAnsi="Consolas" w:cs="Consolas"/>
+          <w:color w:val="268BD2"/>
+          <w:sz w:val="28"/>
+          <w:szCs w:val="28"/>
+          <w:shd w:val="clear" w:color="auto" w:fill="E8F2FE"/>
+        </w:rPr>
+        <w:t>cucumber.version</w:t>
+      </w:r>
+      <w:proofErr w:type="spellEnd"/>
+      <w:r>
+        <w:rPr>
+          <w:rFonts w:ascii="Consolas" w:hAnsi="Consolas" w:cs="Consolas"/>
+          <w:color w:val="000000"/>
+          <w:sz w:val="28"/>
+          <w:szCs w:val="28"/>
+          <w:shd w:val="clear" w:color="auto" w:fill="E8F2FE"/>
+        </w:rPr>
+        <w:t>&gt;</w:t>
+      </w:r>
+    </w:p>
+    <w:p>
+      <w:pPr>
+        <w:pStyle w:val="ListParagraph"/>
+        <w:numPr>
+          <w:ilvl w:val="1"/>
+          <w:numId w:val="49"/>
+        </w:numPr>
+        <w:autoSpaceDE w:val="0"/>
+        <w:autoSpaceDN w:val="0"/>
+        <w:adjustRightInd w:val="0"/>
+        <w:spacing w:after="0" w:line="240" w:lineRule="auto"/>
+        <w:rPr>
+          <w:rFonts w:ascii="Consolas" w:hAnsi="Consolas" w:cs="Consolas"/>
+          <w:szCs w:val="22"/>
+        </w:rPr>
+      </w:pPr>
+      <w:r>
+        <w:rPr>
+          <w:rFonts w:ascii="Consolas" w:hAnsi="Consolas" w:cs="Consolas"/>
+          <w:color w:val="000000"/>
+          <w:szCs w:val="22"/>
+        </w:rPr>
+        <w:t>&lt;</w:t>
+      </w:r>
+      <w:proofErr w:type="spellStart"/>
+      <w:r>
+        <w:rPr>
+          <w:rFonts w:ascii="Consolas" w:hAnsi="Consolas" w:cs="Consolas"/>
+          <w:color w:val="268BD2"/>
+          <w:szCs w:val="22"/>
+        </w:rPr>
+        <w:t>maven.compiler.version</w:t>
+      </w:r>
+      <w:proofErr w:type="spellEnd"/>
+      <w:r>
+        <w:rPr>
+          <w:rFonts w:ascii="Consolas" w:hAnsi="Consolas" w:cs="Consolas"/>
+          <w:color w:val="000000"/>
+          <w:szCs w:val="22"/>
+        </w:rPr>
+        <w:t>&gt;3.8.1&lt;/</w:t>
+      </w:r>
+      <w:proofErr w:type="spellStart"/>
+      <w:r>
+        <w:rPr>
+          <w:rFonts w:ascii="Consolas" w:hAnsi="Consolas" w:cs="Consolas"/>
+          <w:color w:val="268BD2"/>
+          <w:szCs w:val="22"/>
+        </w:rPr>
+        <w:t>maven.compiler.version</w:t>
+      </w:r>
+      <w:proofErr w:type="spellEnd"/>
+      <w:r>
+        <w:rPr>
+          <w:rFonts w:ascii="Consolas" w:hAnsi="Consolas" w:cs="Consolas"/>
+          <w:color w:val="000000"/>
+          <w:szCs w:val="22"/>
+        </w:rPr>
+        <w:t>&gt;</w:t>
+      </w:r>
+    </w:p>
+    <w:p>
+      <w:pPr>
+        <w:pStyle w:val="ListParagraph"/>
+        <w:numPr>
+          <w:ilvl w:val="1"/>
+          <w:numId w:val="49"/>
+        </w:numPr>
+        <w:rPr>
+          <w:sz w:val="18"/>
+          <w:szCs w:val="16"/>
+          <w:lang w:val="en-US"/>
+        </w:rPr>
+      </w:pPr>
+      <w:r>
+        <w:rPr>
+          <w:rFonts w:ascii="Consolas" w:hAnsi="Consolas" w:cs="Consolas"/>
+          <w:color w:val="000000"/>
+          <w:szCs w:val="22"/>
+        </w:rPr>
+        <w:t>&lt;</w:t>
+      </w:r>
+      <w:proofErr w:type="spellStart"/>
+      <w:r>
+        <w:rPr>
+          <w:rFonts w:ascii="Consolas" w:hAnsi="Consolas" w:cs="Consolas"/>
+          <w:color w:val="268BD2"/>
+          <w:szCs w:val="22"/>
+        </w:rPr>
+        <w:t>maven.surefire.version</w:t>
+      </w:r>
+      <w:proofErr w:type="spellEnd"/>
+      <w:r>
+        <w:rPr>
+          <w:rFonts w:ascii="Consolas" w:hAnsi="Consolas" w:cs="Consolas"/>
+          <w:color w:val="000000"/>
+          <w:szCs w:val="22"/>
+        </w:rPr>
+        <w:t>&gt;2.22.2&lt;/</w:t>
+      </w:r>
+      <w:proofErr w:type="spellStart"/>
+      <w:r>
+        <w:rPr>
+          <w:rFonts w:ascii="Consolas" w:hAnsi="Consolas" w:cs="Consolas"/>
+          <w:color w:val="268BD2"/>
+          <w:szCs w:val="22"/>
+        </w:rPr>
+        <w:t>maven.surefire.version</w:t>
+      </w:r>
+      <w:proofErr w:type="spellEnd"/>
+      <w:r>
+        <w:rPr>
+          <w:rFonts w:ascii="Consolas" w:hAnsi="Consolas" w:cs="Consolas"/>
+          <w:color w:val="000000"/>
+          <w:szCs w:val="22"/>
+        </w:rPr>
+        <w:t>&gt;</w:t>
+      </w:r>
+    </w:p>
+    <w:p>
+      <w:pPr>
+        <w:pStyle w:val="ListParagraph"/>
+        <w:numPr>
+          <w:ilvl w:val="0"/>
+          <w:numId w:val="49"/>
+        </w:numPr>
+        <w:rPr>
+          <w:sz w:val="24"/>
+          <w:szCs w:val="22"/>
+          <w:lang w:val="en-US"/>
+        </w:rPr>
+      </w:pPr>
+      <w:r>
+        <w:rPr>
+          <w:sz w:val="24"/>
+          <w:szCs w:val="22"/>
+          <w:lang w:val="en-US"/>
+        </w:rPr>
+        <w:t>Save this pom.xml file</w:t>
+      </w:r>
+    </w:p>
+    <w:p>
+      <w:pPr>
+        <w:rPr>
+          <w:sz w:val="24"/>
+          <w:szCs w:val="22"/>
+          <w:lang w:val="en-US"/>
+        </w:rPr>
+      </w:pPr>
       <w:bookmarkStart w:id="0" w:name="_GoBack"/>
       <w:bookmarkEnd w:id="0"/>
-    </w:p>
-    <w:p>
-      <w:pPr>
-        <w:rPr>
-          <w:b/>
-          <w:bCs/>
-          <w:sz w:val="24"/>
-          <w:szCs w:val="22"/>
-          <w:lang w:val="en-US"/>
-        </w:rPr>
-      </w:pPr>
-      <w:r>
-        <w:rPr>
-          <w:b/>
-          <w:bCs/>
-          <w:sz w:val="24"/>
-          <w:szCs w:val="22"/>
-          <w:lang w:val="en-US"/>
-        </w:rPr>
-        <w:t>Cucumber is the tool for implementation of BDD Approach</w:t>
-      </w:r>
-    </w:p>
-    <w:p>
-      <w:pPr>
-        <w:rPr>
-          <w:sz w:val="24"/>
-          <w:szCs w:val="22"/>
-          <w:lang w:val="en-US"/>
-        </w:rPr>
-      </w:pPr>
-    </w:p>
-    <w:p>
-      <w:pPr>
-        <w:rPr>
-          <w:sz w:val="24"/>
-          <w:szCs w:val="22"/>
-          <w:lang w:val="en-US"/>
-        </w:rPr>
-      </w:pPr>
     </w:p>
     <w:sectPr>
       <w:pgSz w:w="11906" w:h="16838"/>
@@ -17329,6 +18785,92 @@
     </w:lvl>
   </w:abstractNum>
   <w:abstractNum w:abstractNumId="2">
+    <w:nsid w:val="0A7A0CC9"/>
+    <w:multiLevelType w:val="hybridMultilevel"/>
+    <w:tmpl w:val="71DEC95A"/>
+    <w:lvl w:ilvl="0" w:tplc="40090019">
+      <w:start w:val="1"/>
+      <w:numFmt w:val="lowerLetter"/>
+      <w:lvlText w:val="%1."/>
+      <w:lvlJc w:val="left"/>
+      <w:pPr>
+        <w:ind w:left="1440" w:hanging="360"/>
+      </w:pPr>
+    </w:lvl>
+    <w:lvl w:ilvl="1" w:tplc="40090019" w:tentative="1">
+      <w:start w:val="1"/>
+      <w:numFmt w:val="lowerLetter"/>
+      <w:lvlText w:val="%2."/>
+      <w:lvlJc w:val="left"/>
+      <w:pPr>
+        <w:ind w:left="2160" w:hanging="360"/>
+      </w:pPr>
+    </w:lvl>
+    <w:lvl w:ilvl="2" w:tplc="4009001B" w:tentative="1">
+      <w:start w:val="1"/>
+      <w:numFmt w:val="lowerRoman"/>
+      <w:lvlText w:val="%3."/>
+      <w:lvlJc w:val="right"/>
+      <w:pPr>
+        <w:ind w:left="2880" w:hanging="180"/>
+      </w:pPr>
+    </w:lvl>
+    <w:lvl w:ilvl="3" w:tplc="4009000F" w:tentative="1">
+      <w:start w:val="1"/>
+      <w:numFmt w:val="decimal"/>
+      <w:lvlText w:val="%4."/>
+      <w:lvlJc w:val="left"/>
+      <w:pPr>
+        <w:ind w:left="3600" w:hanging="360"/>
+      </w:pPr>
+    </w:lvl>
+    <w:lvl w:ilvl="4" w:tplc="40090019" w:tentative="1">
+      <w:start w:val="1"/>
+      <w:numFmt w:val="lowerLetter"/>
+      <w:lvlText w:val="%5."/>
+      <w:lvlJc w:val="left"/>
+      <w:pPr>
+        <w:ind w:left="4320" w:hanging="360"/>
+      </w:pPr>
+    </w:lvl>
+    <w:lvl w:ilvl="5" w:tplc="4009001B" w:tentative="1">
+      <w:start w:val="1"/>
+      <w:numFmt w:val="lowerRoman"/>
+      <w:lvlText w:val="%6."/>
+      <w:lvlJc w:val="right"/>
+      <w:pPr>
+        <w:ind w:left="5040" w:hanging="180"/>
+      </w:pPr>
+    </w:lvl>
+    <w:lvl w:ilvl="6" w:tplc="4009000F" w:tentative="1">
+      <w:start w:val="1"/>
+      <w:numFmt w:val="decimal"/>
+      <w:lvlText w:val="%7."/>
+      <w:lvlJc w:val="left"/>
+      <w:pPr>
+        <w:ind w:left="5760" w:hanging="360"/>
+      </w:pPr>
+    </w:lvl>
+    <w:lvl w:ilvl="7" w:tplc="40090019" w:tentative="1">
+      <w:start w:val="1"/>
+      <w:numFmt w:val="lowerLetter"/>
+      <w:lvlText w:val="%8."/>
+      <w:lvlJc w:val="left"/>
+      <w:pPr>
+        <w:ind w:left="6480" w:hanging="360"/>
+      </w:pPr>
+    </w:lvl>
+    <w:lvl w:ilvl="8" w:tplc="4009001B" w:tentative="1">
+      <w:start w:val="1"/>
+      <w:numFmt w:val="lowerRoman"/>
+      <w:lvlText w:val="%9."/>
+      <w:lvlJc w:val="right"/>
+      <w:pPr>
+        <w:ind w:left="7200" w:hanging="180"/>
+      </w:pPr>
+    </w:lvl>
+  </w:abstractNum>
+  <w:abstractNum w:abstractNumId="3">
     <w:nsid w:val="0F5B4400"/>
     <w:multiLevelType w:val="hybridMultilevel"/>
     <w:tmpl w:val="EF82DA1A"/>
@@ -17441,7 +18983,7 @@
       </w:rPr>
     </w:lvl>
   </w:abstractNum>
-  <w:abstractNum w:abstractNumId="3">
+  <w:abstractNum w:abstractNumId="4">
     <w:nsid w:val="105D6FD0"/>
     <w:multiLevelType w:val="hybridMultilevel"/>
     <w:tmpl w:val="D66A1D8C"/>
@@ -17530,7 +19072,7 @@
       </w:pPr>
     </w:lvl>
   </w:abstractNum>
-  <w:abstractNum w:abstractNumId="4">
+  <w:abstractNum w:abstractNumId="5">
     <w:nsid w:val="134D1409"/>
     <w:multiLevelType w:val="hybridMultilevel"/>
     <w:tmpl w:val="7F265676"/>
@@ -17643,7 +19185,7 @@
       </w:rPr>
     </w:lvl>
   </w:abstractNum>
-  <w:abstractNum w:abstractNumId="5">
+  <w:abstractNum w:abstractNumId="6">
     <w:nsid w:val="13D740A2"/>
     <w:multiLevelType w:val="hybridMultilevel"/>
     <w:tmpl w:val="A53ECF44"/>
@@ -17756,7 +19298,7 @@
       </w:rPr>
     </w:lvl>
   </w:abstractNum>
-  <w:abstractNum w:abstractNumId="6">
+  <w:abstractNum w:abstractNumId="7">
     <w:nsid w:val="140F3A6B"/>
     <w:multiLevelType w:val="hybridMultilevel"/>
     <w:tmpl w:val="B1742718"/>
@@ -17869,7 +19411,7 @@
       </w:rPr>
     </w:lvl>
   </w:abstractNum>
-  <w:abstractNum w:abstractNumId="7">
+  <w:abstractNum w:abstractNumId="8">
     <w:nsid w:val="16043D20"/>
     <w:multiLevelType w:val="hybridMultilevel"/>
     <w:tmpl w:val="6A444494"/>
@@ -17955,7 +19497,7 @@
       </w:pPr>
     </w:lvl>
   </w:abstractNum>
-  <w:abstractNum w:abstractNumId="8">
+  <w:abstractNum w:abstractNumId="9">
     <w:nsid w:val="17A97564"/>
     <w:multiLevelType w:val="hybridMultilevel"/>
     <w:tmpl w:val="CA967136"/>
@@ -18044,7 +19586,7 @@
       </w:pPr>
     </w:lvl>
   </w:abstractNum>
-  <w:abstractNum w:abstractNumId="9">
+  <w:abstractNum w:abstractNumId="10">
     <w:nsid w:val="1DD814BD"/>
     <w:multiLevelType w:val="hybridMultilevel"/>
     <w:tmpl w:val="6052B25A"/>
@@ -18133,7 +19675,7 @@
       </w:pPr>
     </w:lvl>
   </w:abstractNum>
-  <w:abstractNum w:abstractNumId="10">
+  <w:abstractNum w:abstractNumId="11">
     <w:nsid w:val="20BE5C1D"/>
     <w:multiLevelType w:val="hybridMultilevel"/>
     <w:tmpl w:val="27D8D70E"/>
@@ -18246,7 +19788,7 @@
       </w:rPr>
     </w:lvl>
   </w:abstractNum>
-  <w:abstractNum w:abstractNumId="11">
+  <w:abstractNum w:abstractNumId="12">
     <w:nsid w:val="22D50F4A"/>
     <w:multiLevelType w:val="hybridMultilevel"/>
     <w:tmpl w:val="564C3158"/>
@@ -18359,7 +19901,7 @@
       </w:rPr>
     </w:lvl>
   </w:abstractNum>
-  <w:abstractNum w:abstractNumId="12">
+  <w:abstractNum w:abstractNumId="13">
     <w:nsid w:val="2AA11AFE"/>
     <w:multiLevelType w:val="hybridMultilevel"/>
     <w:tmpl w:val="551C87B4"/>
@@ -18448,7 +19990,7 @@
       </w:pPr>
     </w:lvl>
   </w:abstractNum>
-  <w:abstractNum w:abstractNumId="13">
+  <w:abstractNum w:abstractNumId="14">
     <w:nsid w:val="31D74EB3"/>
     <w:multiLevelType w:val="hybridMultilevel"/>
     <w:tmpl w:val="DFC4DDF0"/>
@@ -18561,7 +20103,7 @@
       </w:rPr>
     </w:lvl>
   </w:abstractNum>
-  <w:abstractNum w:abstractNumId="14">
+  <w:abstractNum w:abstractNumId="15">
     <w:nsid w:val="323F4A11"/>
     <w:multiLevelType w:val="hybridMultilevel"/>
     <w:tmpl w:val="5862F962"/>
@@ -18647,7 +20189,7 @@
       </w:pPr>
     </w:lvl>
   </w:abstractNum>
-  <w:abstractNum w:abstractNumId="15">
+  <w:abstractNum w:abstractNumId="16">
     <w:nsid w:val="353C7880"/>
     <w:multiLevelType w:val="hybridMultilevel"/>
     <w:tmpl w:val="38CAF664"/>
@@ -18760,7 +20302,7 @@
       </w:rPr>
     </w:lvl>
   </w:abstractNum>
-  <w:abstractNum w:abstractNumId="16">
+  <w:abstractNum w:abstractNumId="17">
     <w:nsid w:val="390953F8"/>
     <w:multiLevelType w:val="hybridMultilevel"/>
     <w:tmpl w:val="13E456E4"/>
@@ -18846,7 +20388,7 @@
       </w:pPr>
     </w:lvl>
   </w:abstractNum>
-  <w:abstractNum w:abstractNumId="17">
+  <w:abstractNum w:abstractNumId="18">
     <w:nsid w:val="39C87324"/>
     <w:multiLevelType w:val="hybridMultilevel"/>
     <w:tmpl w:val="DB9EB66C"/>
@@ -18959,7 +20501,7 @@
       </w:rPr>
     </w:lvl>
   </w:abstractNum>
-  <w:abstractNum w:abstractNumId="18">
+  <w:abstractNum w:abstractNumId="19">
     <w:nsid w:val="3A464A66"/>
     <w:multiLevelType w:val="hybridMultilevel"/>
     <w:tmpl w:val="B9BE5E06"/>
@@ -19048,7 +20590,7 @@
       </w:pPr>
     </w:lvl>
   </w:abstractNum>
-  <w:abstractNum w:abstractNumId="19">
+  <w:abstractNum w:abstractNumId="20">
     <w:nsid w:val="3C875259"/>
     <w:multiLevelType w:val="hybridMultilevel"/>
     <w:tmpl w:val="CA62BF82"/>
@@ -19137,7 +20679,7 @@
       </w:pPr>
     </w:lvl>
   </w:abstractNum>
-  <w:abstractNum w:abstractNumId="20">
+  <w:abstractNum w:abstractNumId="21">
     <w:nsid w:val="3FB25765"/>
     <w:multiLevelType w:val="hybridMultilevel"/>
     <w:tmpl w:val="2286C50C"/>
@@ -19226,7 +20768,7 @@
       </w:pPr>
     </w:lvl>
   </w:abstractNum>
-  <w:abstractNum w:abstractNumId="21">
+  <w:abstractNum w:abstractNumId="22">
     <w:nsid w:val="402B0604"/>
     <w:multiLevelType w:val="hybridMultilevel"/>
     <w:tmpl w:val="D8EEBC8C"/>
@@ -19339,7 +20881,7 @@
       </w:rPr>
     </w:lvl>
   </w:abstractNum>
-  <w:abstractNum w:abstractNumId="22">
+  <w:abstractNum w:abstractNumId="23">
     <w:nsid w:val="40FE0FCF"/>
     <w:multiLevelType w:val="hybridMultilevel"/>
     <w:tmpl w:val="39DC3034"/>
@@ -19452,7 +20994,7 @@
       </w:rPr>
     </w:lvl>
   </w:abstractNum>
-  <w:abstractNum w:abstractNumId="23">
+  <w:abstractNum w:abstractNumId="24">
     <w:nsid w:val="475E2AA1"/>
     <w:multiLevelType w:val="hybridMultilevel"/>
     <w:tmpl w:val="8A50C5CE"/>
@@ -19541,7 +21083,7 @@
       </w:pPr>
     </w:lvl>
   </w:abstractNum>
-  <w:abstractNum w:abstractNumId="24">
+  <w:abstractNum w:abstractNumId="25">
     <w:nsid w:val="496607A1"/>
     <w:multiLevelType w:val="hybridMultilevel"/>
     <w:tmpl w:val="D6727F44"/>
@@ -19654,7 +21196,7 @@
       </w:rPr>
     </w:lvl>
   </w:abstractNum>
-  <w:abstractNum w:abstractNumId="25">
+  <w:abstractNum w:abstractNumId="26">
     <w:nsid w:val="49B72ACE"/>
     <w:multiLevelType w:val="hybridMultilevel"/>
     <w:tmpl w:val="F09897B0"/>
@@ -19743,7 +21285,7 @@
       </w:pPr>
     </w:lvl>
   </w:abstractNum>
-  <w:abstractNum w:abstractNumId="26">
+  <w:abstractNum w:abstractNumId="27">
     <w:nsid w:val="52764C0C"/>
     <w:multiLevelType w:val="hybridMultilevel"/>
     <w:tmpl w:val="080E6010"/>
@@ -19832,7 +21374,7 @@
       </w:pPr>
     </w:lvl>
   </w:abstractNum>
-  <w:abstractNum w:abstractNumId="27">
+  <w:abstractNum w:abstractNumId="28">
     <w:nsid w:val="5406246A"/>
     <w:multiLevelType w:val="hybridMultilevel"/>
     <w:tmpl w:val="59A4463E"/>
@@ -19945,7 +21487,7 @@
       </w:rPr>
     </w:lvl>
   </w:abstractNum>
-  <w:abstractNum w:abstractNumId="28">
+  <w:abstractNum w:abstractNumId="29">
     <w:nsid w:val="56BB04A8"/>
     <w:multiLevelType w:val="hybridMultilevel"/>
     <w:tmpl w:val="7FDC8606"/>
@@ -20058,7 +21600,7 @@
       </w:rPr>
     </w:lvl>
   </w:abstractNum>
-  <w:abstractNum w:abstractNumId="29">
+  <w:abstractNum w:abstractNumId="30">
     <w:nsid w:val="58671E31"/>
     <w:multiLevelType w:val="hybridMultilevel"/>
     <w:tmpl w:val="D23271B4"/>
@@ -20147,7 +21689,7 @@
       </w:pPr>
     </w:lvl>
   </w:abstractNum>
-  <w:abstractNum w:abstractNumId="30">
+  <w:abstractNum w:abstractNumId="31">
     <w:nsid w:val="5963738B"/>
     <w:multiLevelType w:val="hybridMultilevel"/>
     <w:tmpl w:val="8D50AB70"/>
@@ -20236,7 +21778,7 @@
       </w:pPr>
     </w:lvl>
   </w:abstractNum>
-  <w:abstractNum w:abstractNumId="31">
+  <w:abstractNum w:abstractNumId="32">
     <w:nsid w:val="5C58581A"/>
     <w:multiLevelType w:val="hybridMultilevel"/>
     <w:tmpl w:val="3D4E3154"/>
@@ -20349,7 +21891,120 @@
       </w:rPr>
     </w:lvl>
   </w:abstractNum>
-  <w:abstractNum w:abstractNumId="32">
+  <w:abstractNum w:abstractNumId="33">
+    <w:nsid w:val="5D3510FE"/>
+    <w:multiLevelType w:val="hybridMultilevel"/>
+    <w:tmpl w:val="0AB41A9E"/>
+    <w:lvl w:ilvl="0" w:tplc="40090001">
+      <w:start w:val="1"/>
+      <w:numFmt w:val="bullet"/>
+      <w:lvlText w:val=""/>
+      <w:lvlJc w:val="left"/>
+      <w:pPr>
+        <w:ind w:left="720" w:hanging="360"/>
+      </w:pPr>
+      <w:rPr>
+        <w:rFonts w:ascii="Symbol" w:hAnsi="Symbol" w:hint="default"/>
+      </w:rPr>
+    </w:lvl>
+    <w:lvl w:ilvl="1" w:tplc="40090003">
+      <w:start w:val="1"/>
+      <w:numFmt w:val="bullet"/>
+      <w:lvlText w:val="o"/>
+      <w:lvlJc w:val="left"/>
+      <w:pPr>
+        <w:ind w:left="1440" w:hanging="360"/>
+      </w:pPr>
+      <w:rPr>
+        <w:rFonts w:ascii="Courier New" w:hAnsi="Courier New" w:cs="Courier New" w:hint="default"/>
+      </w:rPr>
+    </w:lvl>
+    <w:lvl w:ilvl="2" w:tplc="40090005" w:tentative="1">
+      <w:start w:val="1"/>
+      <w:numFmt w:val="bullet"/>
+      <w:lvlText w:val=""/>
+      <w:lvlJc w:val="left"/>
+      <w:pPr>
+        <w:ind w:left="2160" w:hanging="360"/>
+      </w:pPr>
+      <w:rPr>
+        <w:rFonts w:ascii="Wingdings" w:hAnsi="Wingdings" w:hint="default"/>
+      </w:rPr>
+    </w:lvl>
+    <w:lvl w:ilvl="3" w:tplc="40090001" w:tentative="1">
+      <w:start w:val="1"/>
+      <w:numFmt w:val="bullet"/>
+      <w:lvlText w:val=""/>
+      <w:lvlJc w:val="left"/>
+      <w:pPr>
+        <w:ind w:left="2880" w:hanging="360"/>
+      </w:pPr>
+      <w:rPr>
+        <w:rFonts w:ascii="Symbol" w:hAnsi="Symbol" w:hint="default"/>
+      </w:rPr>
+    </w:lvl>
+    <w:lvl w:ilvl="4" w:tplc="40090003" w:tentative="1">
+      <w:start w:val="1"/>
+      <w:numFmt w:val="bullet"/>
+      <w:lvlText w:val="o"/>
+      <w:lvlJc w:val="left"/>
+      <w:pPr>
+        <w:ind w:left="3600" w:hanging="360"/>
+      </w:pPr>
+      <w:rPr>
+        <w:rFonts w:ascii="Courier New" w:hAnsi="Courier New" w:cs="Courier New" w:hint="default"/>
+      </w:rPr>
+    </w:lvl>
+    <w:lvl w:ilvl="5" w:tplc="40090005" w:tentative="1">
+      <w:start w:val="1"/>
+      <w:numFmt w:val="bullet"/>
+      <w:lvlText w:val=""/>
+      <w:lvlJc w:val="left"/>
+      <w:pPr>
+        <w:ind w:left="4320" w:hanging="360"/>
+      </w:pPr>
+      <w:rPr>
+        <w:rFonts w:ascii="Wingdings" w:hAnsi="Wingdings" w:hint="default"/>
+      </w:rPr>
+    </w:lvl>
+    <w:lvl w:ilvl="6" w:tplc="40090001" w:tentative="1">
+      <w:start w:val="1"/>
+      <w:numFmt w:val="bullet"/>
+      <w:lvlText w:val=""/>
+      <w:lvlJc w:val="left"/>
+      <w:pPr>
+        <w:ind w:left="5040" w:hanging="360"/>
+      </w:pPr>
+      <w:rPr>
+        <w:rFonts w:ascii="Symbol" w:hAnsi="Symbol" w:hint="default"/>
+      </w:rPr>
+    </w:lvl>
+    <w:lvl w:ilvl="7" w:tplc="40090003" w:tentative="1">
+      <w:start w:val="1"/>
+      <w:numFmt w:val="bullet"/>
+      <w:lvlText w:val="o"/>
+      <w:lvlJc w:val="left"/>
+      <w:pPr>
+        <w:ind w:left="5760" w:hanging="360"/>
+      </w:pPr>
+      <w:rPr>
+        <w:rFonts w:ascii="Courier New" w:hAnsi="Courier New" w:cs="Courier New" w:hint="default"/>
+      </w:rPr>
+    </w:lvl>
+    <w:lvl w:ilvl="8" w:tplc="40090005" w:tentative="1">
+      <w:start w:val="1"/>
+      <w:numFmt w:val="bullet"/>
+      <w:lvlText w:val=""/>
+      <w:lvlJc w:val="left"/>
+      <w:pPr>
+        <w:ind w:left="6480" w:hanging="360"/>
+      </w:pPr>
+      <w:rPr>
+        <w:rFonts w:ascii="Wingdings" w:hAnsi="Wingdings" w:hint="default"/>
+      </w:rPr>
+    </w:lvl>
+  </w:abstractNum>
+  <w:abstractNum w:abstractNumId="34">
     <w:nsid w:val="5F383176"/>
     <w:multiLevelType w:val="hybridMultilevel"/>
     <w:tmpl w:val="4C76D014"/>
@@ -20462,7 +22117,7 @@
       </w:rPr>
     </w:lvl>
   </w:abstractNum>
-  <w:abstractNum w:abstractNumId="33">
+  <w:abstractNum w:abstractNumId="35">
     <w:nsid w:val="63F214DA"/>
     <w:multiLevelType w:val="hybridMultilevel"/>
     <w:tmpl w:val="5CC452E2"/>
@@ -20575,7 +22230,7 @@
       </w:rPr>
     </w:lvl>
   </w:abstractNum>
-  <w:abstractNum w:abstractNumId="34">
+  <w:abstractNum w:abstractNumId="36">
     <w:nsid w:val="64887AB4"/>
     <w:multiLevelType w:val="hybridMultilevel"/>
     <w:tmpl w:val="D67CE9E8"/>
@@ -20664,7 +22319,7 @@
       </w:pPr>
     </w:lvl>
   </w:abstractNum>
-  <w:abstractNum w:abstractNumId="35">
+  <w:abstractNum w:abstractNumId="37">
     <w:nsid w:val="649E4E2C"/>
     <w:multiLevelType w:val="hybridMultilevel"/>
     <w:tmpl w:val="5DB8C8EC"/>
@@ -20777,7 +22432,7 @@
       </w:rPr>
     </w:lvl>
   </w:abstractNum>
-  <w:abstractNum w:abstractNumId="36">
+  <w:abstractNum w:abstractNumId="38">
     <w:nsid w:val="65443B58"/>
     <w:multiLevelType w:val="hybridMultilevel"/>
     <w:tmpl w:val="FEE64C40"/>
@@ -20866,7 +22521,7 @@
       </w:pPr>
     </w:lvl>
   </w:abstractNum>
-  <w:abstractNum w:abstractNumId="37">
+  <w:abstractNum w:abstractNumId="39">
     <w:nsid w:val="66C96AEF"/>
     <w:multiLevelType w:val="hybridMultilevel"/>
     <w:tmpl w:val="2DDCC122"/>
@@ -20979,7 +22634,96 @@
       </w:rPr>
     </w:lvl>
   </w:abstractNum>
-  <w:abstractNum w:abstractNumId="38">
+  <w:abstractNum w:abstractNumId="40">
+    <w:nsid w:val="67C128B4"/>
+    <w:multiLevelType w:val="hybridMultilevel"/>
+    <w:tmpl w:val="84461B34"/>
+    <w:lvl w:ilvl="0" w:tplc="4009000F">
+      <w:start w:val="1"/>
+      <w:numFmt w:val="decimal"/>
+      <w:lvlText w:val="%1."/>
+      <w:lvlJc w:val="left"/>
+      <w:pPr>
+        <w:ind w:left="720" w:hanging="360"/>
+      </w:pPr>
+      <w:rPr>
+        <w:rFonts w:hint="default"/>
+      </w:rPr>
+    </w:lvl>
+    <w:lvl w:ilvl="1" w:tplc="40090019" w:tentative="1">
+      <w:start w:val="1"/>
+      <w:numFmt w:val="lowerLetter"/>
+      <w:lvlText w:val="%2."/>
+      <w:lvlJc w:val="left"/>
+      <w:pPr>
+        <w:ind w:left="1440" w:hanging="360"/>
+      </w:pPr>
+    </w:lvl>
+    <w:lvl w:ilvl="2" w:tplc="4009001B" w:tentative="1">
+      <w:start w:val="1"/>
+      <w:numFmt w:val="lowerRoman"/>
+      <w:lvlText w:val="%3."/>
+      <w:lvlJc w:val="right"/>
+      <w:pPr>
+        <w:ind w:left="2160" w:hanging="180"/>
+      </w:pPr>
+    </w:lvl>
+    <w:lvl w:ilvl="3" w:tplc="4009000F" w:tentative="1">
+      <w:start w:val="1"/>
+      <w:numFmt w:val="decimal"/>
+      <w:lvlText w:val="%4."/>
+      <w:lvlJc w:val="left"/>
+      <w:pPr>
+        <w:ind w:left="2880" w:hanging="360"/>
+      </w:pPr>
+    </w:lvl>
+    <w:lvl w:ilvl="4" w:tplc="40090019" w:tentative="1">
+      <w:start w:val="1"/>
+      <w:numFmt w:val="lowerLetter"/>
+      <w:lvlText w:val="%5."/>
+      <w:lvlJc w:val="left"/>
+      <w:pPr>
+        <w:ind w:left="3600" w:hanging="360"/>
+      </w:pPr>
+    </w:lvl>
+    <w:lvl w:ilvl="5" w:tplc="4009001B" w:tentative="1">
+      <w:start w:val="1"/>
+      <w:numFmt w:val="lowerRoman"/>
+      <w:lvlText w:val="%6."/>
+      <w:lvlJc w:val="right"/>
+      <w:pPr>
+        <w:ind w:left="4320" w:hanging="180"/>
+      </w:pPr>
+    </w:lvl>
+    <w:lvl w:ilvl="6" w:tplc="4009000F" w:tentative="1">
+      <w:start w:val="1"/>
+      <w:numFmt w:val="decimal"/>
+      <w:lvlText w:val="%7."/>
+      <w:lvlJc w:val="left"/>
+      <w:pPr>
+        <w:ind w:left="5040" w:hanging="360"/>
+      </w:pPr>
+    </w:lvl>
+    <w:lvl w:ilvl="7" w:tplc="40090019" w:tentative="1">
+      <w:start w:val="1"/>
+      <w:numFmt w:val="lowerLetter"/>
+      <w:lvlText w:val="%8."/>
+      <w:lvlJc w:val="left"/>
+      <w:pPr>
+        <w:ind w:left="5760" w:hanging="360"/>
+      </w:pPr>
+    </w:lvl>
+    <w:lvl w:ilvl="8" w:tplc="4009001B" w:tentative="1">
+      <w:start w:val="1"/>
+      <w:numFmt w:val="lowerRoman"/>
+      <w:lvlText w:val="%9."/>
+      <w:lvlJc w:val="right"/>
+      <w:pPr>
+        <w:ind w:left="6480" w:hanging="180"/>
+      </w:pPr>
+    </w:lvl>
+  </w:abstractNum>
+  <w:abstractNum w:abstractNumId="41">
     <w:nsid w:val="6C096D1C"/>
     <w:multiLevelType w:val="hybridMultilevel"/>
     <w:tmpl w:val="35CADD6E"/>
@@ -21092,7 +22836,7 @@
       </w:rPr>
     </w:lvl>
   </w:abstractNum>
-  <w:abstractNum w:abstractNumId="39">
+  <w:abstractNum w:abstractNumId="42">
     <w:nsid w:val="6DF222BD"/>
     <w:multiLevelType w:val="hybridMultilevel"/>
     <w:tmpl w:val="CB58A112"/>
@@ -21205,7 +22949,7 @@
       </w:rPr>
     </w:lvl>
   </w:abstractNum>
-  <w:abstractNum w:abstractNumId="40">
+  <w:abstractNum w:abstractNumId="43">
     <w:nsid w:val="700B3448"/>
     <w:multiLevelType w:val="hybridMultilevel"/>
     <w:tmpl w:val="D4F8B1EA"/>
@@ -21294,7 +23038,7 @@
       </w:pPr>
     </w:lvl>
   </w:abstractNum>
-  <w:abstractNum w:abstractNumId="41">
+  <w:abstractNum w:abstractNumId="44">
     <w:nsid w:val="75631C59"/>
     <w:multiLevelType w:val="hybridMultilevel"/>
     <w:tmpl w:val="7E6A29CC"/>
@@ -21407,7 +23151,93 @@
       </w:rPr>
     </w:lvl>
   </w:abstractNum>
-  <w:abstractNum w:abstractNumId="42">
+  <w:abstractNum w:abstractNumId="45">
+    <w:nsid w:val="76B71AC5"/>
+    <w:multiLevelType w:val="hybridMultilevel"/>
+    <w:tmpl w:val="3D7E92B6"/>
+    <w:lvl w:ilvl="0" w:tplc="4009000F">
+      <w:start w:val="1"/>
+      <w:numFmt w:val="decimal"/>
+      <w:lvlText w:val="%1."/>
+      <w:lvlJc w:val="left"/>
+      <w:pPr>
+        <w:ind w:left="720" w:hanging="360"/>
+      </w:pPr>
+    </w:lvl>
+    <w:lvl w:ilvl="1" w:tplc="40090019">
+      <w:start w:val="1"/>
+      <w:numFmt w:val="lowerLetter"/>
+      <w:lvlText w:val="%2."/>
+      <w:lvlJc w:val="left"/>
+      <w:pPr>
+        <w:ind w:left="1440" w:hanging="360"/>
+      </w:pPr>
+    </w:lvl>
+    <w:lvl w:ilvl="2" w:tplc="4009001B" w:tentative="1">
+      <w:start w:val="1"/>
+      <w:numFmt w:val="lowerRoman"/>
+      <w:lvlText w:val="%3."/>
+      <w:lvlJc w:val="right"/>
+      <w:pPr>
+        <w:ind w:left="2160" w:hanging="180"/>
+      </w:pPr>
+    </w:lvl>
+    <w:lvl w:ilvl="3" w:tplc="4009000F" w:tentative="1">
+      <w:start w:val="1"/>
+      <w:numFmt w:val="decimal"/>
+      <w:lvlText w:val="%4."/>
+      <w:lvlJc w:val="left"/>
+      <w:pPr>
+        <w:ind w:left="2880" w:hanging="360"/>
+      </w:pPr>
+    </w:lvl>
+    <w:lvl w:ilvl="4" w:tplc="40090019" w:tentative="1">
+      <w:start w:val="1"/>
+      <w:numFmt w:val="lowerLetter"/>
+      <w:lvlText w:val="%5."/>
+      <w:lvlJc w:val="left"/>
+      <w:pPr>
+        <w:ind w:left="3600" w:hanging="360"/>
+      </w:pPr>
+    </w:lvl>
+    <w:lvl w:ilvl="5" w:tplc="4009001B" w:tentative="1">
+      <w:start w:val="1"/>
+      <w:numFmt w:val="lowerRoman"/>
+      <w:lvlText w:val="%6."/>
+      <w:lvlJc w:val="right"/>
+      <w:pPr>
+        <w:ind w:left="4320" w:hanging="180"/>
+      </w:pPr>
+    </w:lvl>
+    <w:lvl w:ilvl="6" w:tplc="4009000F" w:tentative="1">
+      <w:start w:val="1"/>
+      <w:numFmt w:val="decimal"/>
+      <w:lvlText w:val="%7."/>
+      <w:lvlJc w:val="left"/>
+      <w:pPr>
+        <w:ind w:left="5040" w:hanging="360"/>
+      </w:pPr>
+    </w:lvl>
+    <w:lvl w:ilvl="7" w:tplc="40090019" w:tentative="1">
+      <w:start w:val="1"/>
+      <w:numFmt w:val="lowerLetter"/>
+      <w:lvlText w:val="%8."/>
+      <w:lvlJc w:val="left"/>
+      <w:pPr>
+        <w:ind w:left="5760" w:hanging="360"/>
+      </w:pPr>
+    </w:lvl>
+    <w:lvl w:ilvl="8" w:tplc="4009001B" w:tentative="1">
+      <w:start w:val="1"/>
+      <w:numFmt w:val="lowerRoman"/>
+      <w:lvlText w:val="%9."/>
+      <w:lvlJc w:val="right"/>
+      <w:pPr>
+        <w:ind w:left="6480" w:hanging="180"/>
+      </w:pPr>
+    </w:lvl>
+  </w:abstractNum>
+  <w:abstractNum w:abstractNumId="46">
     <w:nsid w:val="7BD5777C"/>
     <w:multiLevelType w:val="hybridMultilevel"/>
     <w:tmpl w:val="53D46EE2"/>
@@ -21496,7 +23326,7 @@
       </w:pPr>
     </w:lvl>
   </w:abstractNum>
-  <w:abstractNum w:abstractNumId="43">
+  <w:abstractNum w:abstractNumId="47">
     <w:nsid w:val="7BF715C6"/>
     <w:multiLevelType w:val="hybridMultilevel"/>
     <w:tmpl w:val="F8B83480"/>
@@ -21585,7 +23415,7 @@
       </w:pPr>
     </w:lvl>
   </w:abstractNum>
-  <w:abstractNum w:abstractNumId="44">
+  <w:abstractNum w:abstractNumId="48">
     <w:nsid w:val="7C2320E0"/>
     <w:multiLevelType w:val="hybridMultilevel"/>
     <w:tmpl w:val="B4EC2F1C"/>
@@ -21698,7 +23528,7 @@
       </w:rPr>
     </w:lvl>
   </w:abstractNum>
-  <w:abstractNum w:abstractNumId="45">
+  <w:abstractNum w:abstractNumId="49">
     <w:nsid w:val="7E2F2A24"/>
     <w:multiLevelType w:val="hybridMultilevel"/>
     <w:tmpl w:val="CF9414DC"/>
@@ -21812,142 +23642,154 @@
     </w:lvl>
   </w:abstractNum>
   <w:num w:numId="1">
-    <w:abstractNumId w:val="22"/>
+    <w:abstractNumId w:val="23"/>
   </w:num>
   <w:num w:numId="2">
-    <w:abstractNumId w:val="24"/>
+    <w:abstractNumId w:val="25"/>
   </w:num>
   <w:num w:numId="3">
-    <w:abstractNumId w:val="40"/>
+    <w:abstractNumId w:val="43"/>
   </w:num>
   <w:num w:numId="4">
-    <w:abstractNumId w:val="16"/>
+    <w:abstractNumId w:val="17"/>
   </w:num>
   <w:num w:numId="5">
-    <w:abstractNumId w:val="2"/>
+    <w:abstractNumId w:val="3"/>
   </w:num>
   <w:num w:numId="6">
-    <w:abstractNumId w:val="11"/>
+    <w:abstractNumId w:val="12"/>
   </w:num>
   <w:num w:numId="7">
-    <w:abstractNumId w:val="39"/>
+    <w:abstractNumId w:val="42"/>
   </w:num>
   <w:num w:numId="8">
-    <w:abstractNumId w:val="25"/>
+    <w:abstractNumId w:val="26"/>
   </w:num>
   <w:num w:numId="9">
-    <w:abstractNumId w:val="14"/>
+    <w:abstractNumId w:val="15"/>
   </w:num>
   <w:num w:numId="10">
-    <w:abstractNumId w:val="31"/>
+    <w:abstractNumId w:val="32"/>
   </w:num>
   <w:num w:numId="11">
-    <w:abstractNumId w:val="32"/>
+    <w:abstractNumId w:val="34"/>
   </w:num>
   <w:num w:numId="12">
-    <w:abstractNumId w:val="28"/>
+    <w:abstractNumId w:val="29"/>
   </w:num>
   <w:num w:numId="13">
-    <w:abstractNumId w:val="12"/>
+    <w:abstractNumId w:val="13"/>
   </w:num>
   <w:num w:numId="14">
-    <w:abstractNumId w:val="9"/>
+    <w:abstractNumId w:val="10"/>
   </w:num>
   <w:num w:numId="15">
-    <w:abstractNumId w:val="42"/>
+    <w:abstractNumId w:val="46"/>
   </w:num>
   <w:num w:numId="16">
-    <w:abstractNumId w:val="3"/>
+    <w:abstractNumId w:val="4"/>
   </w:num>
   <w:num w:numId="17">
-    <w:abstractNumId w:val="19"/>
+    <w:abstractNumId w:val="20"/>
   </w:num>
   <w:num w:numId="18">
     <w:abstractNumId w:val="1"/>
   </w:num>
   <w:num w:numId="19">
-    <w:abstractNumId w:val="8"/>
+    <w:abstractNumId w:val="9"/>
   </w:num>
   <w:num w:numId="20">
+    <w:abstractNumId w:val="22"/>
+  </w:num>
+  <w:num w:numId="21">
+    <w:abstractNumId w:val="37"/>
+  </w:num>
+  <w:num w:numId="22">
+    <w:abstractNumId w:val="7"/>
+  </w:num>
+  <w:num w:numId="23">
+    <w:abstractNumId w:val="48"/>
+  </w:num>
+  <w:num w:numId="24">
+    <w:abstractNumId w:val="14"/>
+  </w:num>
+  <w:num w:numId="25">
+    <w:abstractNumId w:val="18"/>
+  </w:num>
+  <w:num w:numId="26">
+    <w:abstractNumId w:val="19"/>
+  </w:num>
+  <w:num w:numId="27">
+    <w:abstractNumId w:val="24"/>
+  </w:num>
+  <w:num w:numId="28">
+    <w:abstractNumId w:val="11"/>
+  </w:num>
+  <w:num w:numId="29">
+    <w:abstractNumId w:val="6"/>
+  </w:num>
+  <w:num w:numId="30">
+    <w:abstractNumId w:val="39"/>
+  </w:num>
+  <w:num w:numId="31">
+    <w:abstractNumId w:val="27"/>
+  </w:num>
+  <w:num w:numId="32">
+    <w:abstractNumId w:val="31"/>
+  </w:num>
+  <w:num w:numId="33">
+    <w:abstractNumId w:val="36"/>
+  </w:num>
+  <w:num w:numId="34">
     <w:abstractNumId w:val="21"/>
   </w:num>
-  <w:num w:numId="21">
-    <w:abstractNumId w:val="35"/>
-  </w:num>
-  <w:num w:numId="22">
-    <w:abstractNumId w:val="6"/>
-  </w:num>
-  <w:num w:numId="23">
-    <w:abstractNumId w:val="44"/>
-  </w:num>
-  <w:num w:numId="24">
-    <w:abstractNumId w:val="13"/>
-  </w:num>
-  <w:num w:numId="25">
-    <w:abstractNumId w:val="17"/>
-  </w:num>
-  <w:num w:numId="26">
-    <w:abstractNumId w:val="18"/>
-  </w:num>
-  <w:num w:numId="27">
-    <w:abstractNumId w:val="23"/>
-  </w:num>
-  <w:num w:numId="28">
-    <w:abstractNumId w:val="10"/>
-  </w:num>
-  <w:num w:numId="29">
-    <w:abstractNumId w:val="5"/>
-  </w:num>
-  <w:num w:numId="30">
-    <w:abstractNumId w:val="37"/>
-  </w:num>
-  <w:num w:numId="31">
-    <w:abstractNumId w:val="26"/>
-  </w:num>
-  <w:num w:numId="32">
-    <w:abstractNumId w:val="30"/>
-  </w:num>
-  <w:num w:numId="33">
-    <w:abstractNumId w:val="34"/>
-  </w:num>
-  <w:num w:numId="34">
-    <w:abstractNumId w:val="20"/>
-  </w:num>
   <w:num w:numId="35">
-    <w:abstractNumId w:val="43"/>
+    <w:abstractNumId w:val="47"/>
   </w:num>
   <w:num w:numId="36">
-    <w:abstractNumId w:val="29"/>
+    <w:abstractNumId w:val="30"/>
   </w:num>
   <w:num w:numId="37">
     <w:abstractNumId w:val="0"/>
   </w:num>
   <w:num w:numId="38">
-    <w:abstractNumId w:val="15"/>
+    <w:abstractNumId w:val="16"/>
   </w:num>
   <w:num w:numId="39">
+    <w:abstractNumId w:val="49"/>
+  </w:num>
+  <w:num w:numId="40">
+    <w:abstractNumId w:val="28"/>
+  </w:num>
+  <w:num w:numId="41">
+    <w:abstractNumId w:val="44"/>
+  </w:num>
+  <w:num w:numId="42">
+    <w:abstractNumId w:val="41"/>
+  </w:num>
+  <w:num w:numId="43">
+    <w:abstractNumId w:val="5"/>
+  </w:num>
+  <w:num w:numId="44">
+    <w:abstractNumId w:val="8"/>
+  </w:num>
+  <w:num w:numId="45">
+    <w:abstractNumId w:val="38"/>
+  </w:num>
+  <w:num w:numId="46">
+    <w:abstractNumId w:val="35"/>
+  </w:num>
+  <w:num w:numId="47">
+    <w:abstractNumId w:val="33"/>
+  </w:num>
+  <w:num w:numId="48">
+    <w:abstractNumId w:val="40"/>
+  </w:num>
+  <w:num w:numId="49">
     <w:abstractNumId w:val="45"/>
   </w:num>
-  <w:num w:numId="40">
-    <w:abstractNumId w:val="27"/>
-  </w:num>
-  <w:num w:numId="41">
-    <w:abstractNumId w:val="41"/>
-  </w:num>
-  <w:num w:numId="42">
-    <w:abstractNumId w:val="38"/>
-  </w:num>
-  <w:num w:numId="43">
-    <w:abstractNumId w:val="4"/>
-  </w:num>
-  <w:num w:numId="44">
-    <w:abstractNumId w:val="7"/>
-  </w:num>
-  <w:num w:numId="45">
-    <w:abstractNumId w:val="36"/>
-  </w:num>
-  <w:num w:numId="46">
-    <w:abstractNumId w:val="33"/>
+  <w:num w:numId="50">
+    <w:abstractNumId w:val="2"/>
   </w:num>
 </w:numbering>
 </file>
@@ -23618,31 +25460,31 @@
     </dgm:pt>
   </dgm:ptLst>
   <dgm:cxnLst>
-    <dgm:cxn modelId="{1270BC73-59AE-44B8-9532-D496C38CA97F}" type="presOf" srcId="{58F8E6FA-8E5F-4590-8E91-7D425686736E}" destId="{1C61394E-D32F-4A43-ADD4-F46D3A33D38F}" srcOrd="0" destOrd="0" presId="urn:microsoft.com/office/officeart/2005/8/layout/process1"/>
-    <dgm:cxn modelId="{19632F9E-3584-4E9D-AA0E-FCE24982A921}" type="presOf" srcId="{CB734D05-6005-4A33-891F-8F6E9F0BE629}" destId="{9346448E-7772-4989-9A73-02FD2DA61B93}" srcOrd="0" destOrd="0" presId="urn:microsoft.com/office/officeart/2005/8/layout/process1"/>
-    <dgm:cxn modelId="{BF1CADDA-FDE9-4A8D-B2D1-E82E27C8E3B5}" type="presOf" srcId="{B0DAEDAB-33B3-4821-A91B-D05361312CE9}" destId="{FCE3B9A4-214A-4502-B3DF-ACB3E0BC61C7}" srcOrd="0" destOrd="0" presId="urn:microsoft.com/office/officeart/2005/8/layout/process1"/>
-    <dgm:cxn modelId="{3BE24E4C-F284-4834-A388-32165CC2DAF2}" type="presOf" srcId="{D4DE5EA1-C98A-4001-96ED-0D8A4099152C}" destId="{CA09568C-529F-4056-BB14-75FC27EA3A57}" srcOrd="0" destOrd="0" presId="urn:microsoft.com/office/officeart/2005/8/layout/process1"/>
+    <dgm:cxn modelId="{407416C7-D9A4-49CF-A1D9-63129D12A5E9}" srcId="{C787D0C9-C4AA-4BF8-AAA9-EFDCDDDFB8C5}" destId="{B2F67260-32B4-49EF-BEA7-6376ABEBC356}" srcOrd="1" destOrd="0" parTransId="{452FD36E-8C97-458A-9189-BC15B3E0AB1F}" sibTransId="{58F8E6FA-8E5F-4590-8E91-7D425686736E}"/>
+    <dgm:cxn modelId="{E763EF8E-83DE-4D79-97DD-1B6BE4326185}" type="presOf" srcId="{D4DE5EA1-C98A-4001-96ED-0D8A4099152C}" destId="{CA09568C-529F-4056-BB14-75FC27EA3A57}" srcOrd="0" destOrd="0" presId="urn:microsoft.com/office/officeart/2005/8/layout/process1"/>
+    <dgm:cxn modelId="{942ADE11-8D19-411C-9EA7-2521FD3A91EF}" type="presOf" srcId="{C6470392-B547-42B7-BBE1-49D9BF3297A5}" destId="{E6A79763-2175-4FE6-AF39-65BAD7E8A94D}" srcOrd="0" destOrd="0" presId="urn:microsoft.com/office/officeart/2005/8/layout/process1"/>
+    <dgm:cxn modelId="{E0A87B50-97F3-44DC-A316-EA678772AE0F}" type="presOf" srcId="{B0DAEDAB-33B3-4821-A91B-D05361312CE9}" destId="{FCE3B9A4-214A-4502-B3DF-ACB3E0BC61C7}" srcOrd="0" destOrd="0" presId="urn:microsoft.com/office/officeart/2005/8/layout/process1"/>
+    <dgm:cxn modelId="{FF2E73D5-6556-48B6-9F73-168B2297F7B1}" type="presOf" srcId="{B2F67260-32B4-49EF-BEA7-6376ABEBC356}" destId="{45B120D8-A283-4DB0-AE48-CD1028B5A1CA}" srcOrd="0" destOrd="0" presId="urn:microsoft.com/office/officeart/2005/8/layout/process1"/>
+    <dgm:cxn modelId="{0F876F75-C940-4193-B0C3-DEF30E10B60E}" type="presOf" srcId="{2F2C6037-AE48-4650-B998-EBABF88D0464}" destId="{ABB6D0E9-231F-49FF-8F6A-CBD756BB2A07}" srcOrd="0" destOrd="0" presId="urn:microsoft.com/office/officeart/2005/8/layout/process1"/>
+    <dgm:cxn modelId="{6256F90C-7C94-4AEE-9C96-329FAAC3CAB8}" type="presOf" srcId="{58F8E6FA-8E5F-4590-8E91-7D425686736E}" destId="{1C61394E-D32F-4A43-ADD4-F46D3A33D38F}" srcOrd="0" destOrd="0" presId="urn:microsoft.com/office/officeart/2005/8/layout/process1"/>
+    <dgm:cxn modelId="{DB58C5FA-08D7-43FA-BD46-12EBCA59BB25}" type="presOf" srcId="{2F2C6037-AE48-4650-B998-EBABF88D0464}" destId="{8D8E620F-A309-4628-986D-B0F92ABF739C}" srcOrd="1" destOrd="0" presId="urn:microsoft.com/office/officeart/2005/8/layout/process1"/>
+    <dgm:cxn modelId="{EF21A6FB-5E42-4F78-BFAC-84F6420D3F46}" type="presOf" srcId="{58F8E6FA-8E5F-4590-8E91-7D425686736E}" destId="{38F30BB8-19AC-4F2C-997E-D6C87643D812}" srcOrd="1" destOrd="0" presId="urn:microsoft.com/office/officeart/2005/8/layout/process1"/>
+    <dgm:cxn modelId="{36E018D9-C225-414E-9059-F263C87EFDD1}" type="presOf" srcId="{C787D0C9-C4AA-4BF8-AAA9-EFDCDDDFB8C5}" destId="{ECE2E50F-1EF0-49E9-A2A2-C09D34379E86}" srcOrd="0" destOrd="0" presId="urn:microsoft.com/office/officeart/2005/8/layout/process1"/>
+    <dgm:cxn modelId="{A358B1AA-45ED-4C0A-A925-911C6E3E177E}" srcId="{C787D0C9-C4AA-4BF8-AAA9-EFDCDDDFB8C5}" destId="{D4DE5EA1-C98A-4001-96ED-0D8A4099152C}" srcOrd="2" destOrd="0" parTransId="{DDD45587-67C2-4B3F-892B-0153C2E010D0}" sibTransId="{C6470392-B547-42B7-BBE1-49D9BF3297A5}"/>
+    <dgm:cxn modelId="{783A2C37-6C2B-4D40-9564-97CEA7CBF962}" type="presOf" srcId="{C6470392-B547-42B7-BBE1-49D9BF3297A5}" destId="{D17F71C8-684F-40E9-B9CF-89D188A27816}" srcOrd="1" destOrd="0" presId="urn:microsoft.com/office/officeart/2005/8/layout/process1"/>
     <dgm:cxn modelId="{916CD402-046A-49C3-919C-E8874C6452BD}" srcId="{C787D0C9-C4AA-4BF8-AAA9-EFDCDDDFB8C5}" destId="{B0DAEDAB-33B3-4821-A91B-D05361312CE9}" srcOrd="3" destOrd="0" parTransId="{1B396FDD-FE98-44AA-BBFD-EFDF9B52D4CD}" sibTransId="{2689B6F1-8FF1-4D68-9639-E8E505EA5AB0}"/>
-    <dgm:cxn modelId="{33ED9929-36EC-4E40-83E6-B0FEEC7E6EC6}" type="presOf" srcId="{58F8E6FA-8E5F-4590-8E91-7D425686736E}" destId="{38F30BB8-19AC-4F2C-997E-D6C87643D812}" srcOrd="1" destOrd="0" presId="urn:microsoft.com/office/officeart/2005/8/layout/process1"/>
-    <dgm:cxn modelId="{580953A6-5892-433A-AEAD-52C96BC6E471}" type="presOf" srcId="{C6470392-B547-42B7-BBE1-49D9BF3297A5}" destId="{E6A79763-2175-4FE6-AF39-65BAD7E8A94D}" srcOrd="0" destOrd="0" presId="urn:microsoft.com/office/officeart/2005/8/layout/process1"/>
-    <dgm:cxn modelId="{407416C7-D9A4-49CF-A1D9-63129D12A5E9}" srcId="{C787D0C9-C4AA-4BF8-AAA9-EFDCDDDFB8C5}" destId="{B2F67260-32B4-49EF-BEA7-6376ABEBC356}" srcOrd="1" destOrd="0" parTransId="{452FD36E-8C97-458A-9189-BC15B3E0AB1F}" sibTransId="{58F8E6FA-8E5F-4590-8E91-7D425686736E}"/>
     <dgm:cxn modelId="{F27277EA-BDDA-4005-9170-FBB0A209E462}" srcId="{C787D0C9-C4AA-4BF8-AAA9-EFDCDDDFB8C5}" destId="{CB734D05-6005-4A33-891F-8F6E9F0BE629}" srcOrd="0" destOrd="0" parTransId="{D88A1106-7499-4EC1-A955-12C926757BDC}" sibTransId="{2F2C6037-AE48-4650-B998-EBABF88D0464}"/>
-    <dgm:cxn modelId="{B397E00B-1758-407A-B54F-5A0D4D6283F2}" type="presOf" srcId="{2F2C6037-AE48-4650-B998-EBABF88D0464}" destId="{ABB6D0E9-231F-49FF-8F6A-CBD756BB2A07}" srcOrd="0" destOrd="0" presId="urn:microsoft.com/office/officeart/2005/8/layout/process1"/>
-    <dgm:cxn modelId="{A358B1AA-45ED-4C0A-A925-911C6E3E177E}" srcId="{C787D0C9-C4AA-4BF8-AAA9-EFDCDDDFB8C5}" destId="{D4DE5EA1-C98A-4001-96ED-0D8A4099152C}" srcOrd="2" destOrd="0" parTransId="{DDD45587-67C2-4B3F-892B-0153C2E010D0}" sibTransId="{C6470392-B547-42B7-BBE1-49D9BF3297A5}"/>
-    <dgm:cxn modelId="{0D9BDE29-D41B-4653-9B47-CFB91598BA98}" type="presOf" srcId="{2F2C6037-AE48-4650-B998-EBABF88D0464}" destId="{8D8E620F-A309-4628-986D-B0F92ABF739C}" srcOrd="1" destOrd="0" presId="urn:microsoft.com/office/officeart/2005/8/layout/process1"/>
-    <dgm:cxn modelId="{0C1492FB-EE51-4212-BDE8-4DF230022CA3}" type="presOf" srcId="{B2F67260-32B4-49EF-BEA7-6376ABEBC356}" destId="{45B120D8-A283-4DB0-AE48-CD1028B5A1CA}" srcOrd="0" destOrd="0" presId="urn:microsoft.com/office/officeart/2005/8/layout/process1"/>
-    <dgm:cxn modelId="{882CA347-0C3D-49BA-B30E-8318202AEECB}" type="presOf" srcId="{C787D0C9-C4AA-4BF8-AAA9-EFDCDDDFB8C5}" destId="{ECE2E50F-1EF0-49E9-A2A2-C09D34379E86}" srcOrd="0" destOrd="0" presId="urn:microsoft.com/office/officeart/2005/8/layout/process1"/>
-    <dgm:cxn modelId="{AD1A9D2D-7DF4-4710-8F7A-B2BDCE173286}" type="presOf" srcId="{C6470392-B547-42B7-BBE1-49D9BF3297A5}" destId="{D17F71C8-684F-40E9-B9CF-89D188A27816}" srcOrd="1" destOrd="0" presId="urn:microsoft.com/office/officeart/2005/8/layout/process1"/>
-    <dgm:cxn modelId="{FCB43CD1-4A33-46AC-97FC-F7809E7607C7}" type="presParOf" srcId="{ECE2E50F-1EF0-49E9-A2A2-C09D34379E86}" destId="{9346448E-7772-4989-9A73-02FD2DA61B93}" srcOrd="0" destOrd="0" presId="urn:microsoft.com/office/officeart/2005/8/layout/process1"/>
-    <dgm:cxn modelId="{A5FB481F-B569-4012-A6CE-938BDC4D96A1}" type="presParOf" srcId="{ECE2E50F-1EF0-49E9-A2A2-C09D34379E86}" destId="{ABB6D0E9-231F-49FF-8F6A-CBD756BB2A07}" srcOrd="1" destOrd="0" presId="urn:microsoft.com/office/officeart/2005/8/layout/process1"/>
-    <dgm:cxn modelId="{EAA1FC5E-7B2B-4693-BB30-B3DC6EEC18D7}" type="presParOf" srcId="{ABB6D0E9-231F-49FF-8F6A-CBD756BB2A07}" destId="{8D8E620F-A309-4628-986D-B0F92ABF739C}" srcOrd="0" destOrd="0" presId="urn:microsoft.com/office/officeart/2005/8/layout/process1"/>
-    <dgm:cxn modelId="{9B38339E-AB43-43C0-A094-306917787FFA}" type="presParOf" srcId="{ECE2E50F-1EF0-49E9-A2A2-C09D34379E86}" destId="{45B120D8-A283-4DB0-AE48-CD1028B5A1CA}" srcOrd="2" destOrd="0" presId="urn:microsoft.com/office/officeart/2005/8/layout/process1"/>
-    <dgm:cxn modelId="{09993C8D-43CC-48F3-85F2-88215EF26AE7}" type="presParOf" srcId="{ECE2E50F-1EF0-49E9-A2A2-C09D34379E86}" destId="{1C61394E-D32F-4A43-ADD4-F46D3A33D38F}" srcOrd="3" destOrd="0" presId="urn:microsoft.com/office/officeart/2005/8/layout/process1"/>
-    <dgm:cxn modelId="{F5175F77-5372-42C7-A0B1-D90D109F98E9}" type="presParOf" srcId="{1C61394E-D32F-4A43-ADD4-F46D3A33D38F}" destId="{38F30BB8-19AC-4F2C-997E-D6C87643D812}" srcOrd="0" destOrd="0" presId="urn:microsoft.com/office/officeart/2005/8/layout/process1"/>
-    <dgm:cxn modelId="{ED69B9BE-DC26-425F-A7D8-6A7C63391AFF}" type="presParOf" srcId="{ECE2E50F-1EF0-49E9-A2A2-C09D34379E86}" destId="{CA09568C-529F-4056-BB14-75FC27EA3A57}" srcOrd="4" destOrd="0" presId="urn:microsoft.com/office/officeart/2005/8/layout/process1"/>
-    <dgm:cxn modelId="{41F98CA8-E91C-4CB7-B190-89BF9B0570DB}" type="presParOf" srcId="{ECE2E50F-1EF0-49E9-A2A2-C09D34379E86}" destId="{E6A79763-2175-4FE6-AF39-65BAD7E8A94D}" srcOrd="5" destOrd="0" presId="urn:microsoft.com/office/officeart/2005/8/layout/process1"/>
-    <dgm:cxn modelId="{429D3AEF-3060-4FFB-B378-58D5B7F51F8C}" type="presParOf" srcId="{E6A79763-2175-4FE6-AF39-65BAD7E8A94D}" destId="{D17F71C8-684F-40E9-B9CF-89D188A27816}" srcOrd="0" destOrd="0" presId="urn:microsoft.com/office/officeart/2005/8/layout/process1"/>
-    <dgm:cxn modelId="{B968B39B-9BA5-4231-B886-9CFFF6149C67}" type="presParOf" srcId="{ECE2E50F-1EF0-49E9-A2A2-C09D34379E86}" destId="{FCE3B9A4-214A-4502-B3DF-ACB3E0BC61C7}" srcOrd="6" destOrd="0" presId="urn:microsoft.com/office/officeart/2005/8/layout/process1"/>
+    <dgm:cxn modelId="{B7988933-8E5E-4798-95E2-537210B41221}" type="presOf" srcId="{CB734D05-6005-4A33-891F-8F6E9F0BE629}" destId="{9346448E-7772-4989-9A73-02FD2DA61B93}" srcOrd="0" destOrd="0" presId="urn:microsoft.com/office/officeart/2005/8/layout/process1"/>
+    <dgm:cxn modelId="{998320B8-B7A1-4884-AA28-647CD9C3FDCB}" type="presParOf" srcId="{ECE2E50F-1EF0-49E9-A2A2-C09D34379E86}" destId="{9346448E-7772-4989-9A73-02FD2DA61B93}" srcOrd="0" destOrd="0" presId="urn:microsoft.com/office/officeart/2005/8/layout/process1"/>
+    <dgm:cxn modelId="{146DF15F-8C91-416E-922E-F83D04D74626}" type="presParOf" srcId="{ECE2E50F-1EF0-49E9-A2A2-C09D34379E86}" destId="{ABB6D0E9-231F-49FF-8F6A-CBD756BB2A07}" srcOrd="1" destOrd="0" presId="urn:microsoft.com/office/officeart/2005/8/layout/process1"/>
+    <dgm:cxn modelId="{19F1635D-C8CF-4D03-9BFF-8B91D5495243}" type="presParOf" srcId="{ABB6D0E9-231F-49FF-8F6A-CBD756BB2A07}" destId="{8D8E620F-A309-4628-986D-B0F92ABF739C}" srcOrd="0" destOrd="0" presId="urn:microsoft.com/office/officeart/2005/8/layout/process1"/>
+    <dgm:cxn modelId="{407DA4E1-11B0-4376-AFD8-E2C870B0CC20}" type="presParOf" srcId="{ECE2E50F-1EF0-49E9-A2A2-C09D34379E86}" destId="{45B120D8-A283-4DB0-AE48-CD1028B5A1CA}" srcOrd="2" destOrd="0" presId="urn:microsoft.com/office/officeart/2005/8/layout/process1"/>
+    <dgm:cxn modelId="{2471CBF3-EAE8-4DD8-8790-3F87BD349145}" type="presParOf" srcId="{ECE2E50F-1EF0-49E9-A2A2-C09D34379E86}" destId="{1C61394E-D32F-4A43-ADD4-F46D3A33D38F}" srcOrd="3" destOrd="0" presId="urn:microsoft.com/office/officeart/2005/8/layout/process1"/>
+    <dgm:cxn modelId="{250B991D-4E3E-42DC-A020-7BD08BDC2291}" type="presParOf" srcId="{1C61394E-D32F-4A43-ADD4-F46D3A33D38F}" destId="{38F30BB8-19AC-4F2C-997E-D6C87643D812}" srcOrd="0" destOrd="0" presId="urn:microsoft.com/office/officeart/2005/8/layout/process1"/>
+    <dgm:cxn modelId="{4A46E325-1878-4698-854E-793A82307502}" type="presParOf" srcId="{ECE2E50F-1EF0-49E9-A2A2-C09D34379E86}" destId="{CA09568C-529F-4056-BB14-75FC27EA3A57}" srcOrd="4" destOrd="0" presId="urn:microsoft.com/office/officeart/2005/8/layout/process1"/>
+    <dgm:cxn modelId="{1150CE70-8F5F-4922-81DA-08F355A1DB0C}" type="presParOf" srcId="{ECE2E50F-1EF0-49E9-A2A2-C09D34379E86}" destId="{E6A79763-2175-4FE6-AF39-65BAD7E8A94D}" srcOrd="5" destOrd="0" presId="urn:microsoft.com/office/officeart/2005/8/layout/process1"/>
+    <dgm:cxn modelId="{D147E826-34BB-4430-8214-9CC2F9366217}" type="presParOf" srcId="{E6A79763-2175-4FE6-AF39-65BAD7E8A94D}" destId="{D17F71C8-684F-40E9-B9CF-89D188A27816}" srcOrd="0" destOrd="0" presId="urn:microsoft.com/office/officeart/2005/8/layout/process1"/>
+    <dgm:cxn modelId="{D5D15A48-4BA3-4459-AFF6-D38933580A3E}" type="presParOf" srcId="{ECE2E50F-1EF0-49E9-A2A2-C09D34379E86}" destId="{FCE3B9A4-214A-4502-B3DF-ACB3E0BC61C7}" srcOrd="6" destOrd="0" presId="urn:microsoft.com/office/officeart/2005/8/layout/process1"/>
   </dgm:cxnLst>
   <dgm:bg/>
   <dgm:whole/>

</xml_diff>

<commit_message>
Date: 08 May 2026
</commit_message>
<xml_diff>
--- a/Notes_SA2601010.docx
+++ b/Notes_SA2601010.docx
@@ -18537,7 +18537,351 @@
     </w:p>
     <w:p>
       <w:pPr>
-        <w:rPr>
+        <w:pBdr>
+          <w:bottom w:val="single" w:sz="6" w:space="1" w:color="auto"/>
+        </w:pBdr>
+        <w:rPr>
+          <w:sz w:val="24"/>
+          <w:szCs w:val="22"/>
+          <w:lang w:val="en-US"/>
+        </w:rPr>
+      </w:pPr>
+    </w:p>
+    <w:p>
+      <w:pPr>
+        <w:rPr>
+          <w:b/>
+          <w:bCs/>
+          <w:sz w:val="24"/>
+          <w:szCs w:val="22"/>
+          <w:lang w:val="en-US"/>
+        </w:rPr>
+      </w:pPr>
+      <w:r>
+        <w:rPr>
+          <w:b/>
+          <w:bCs/>
+          <w:sz w:val="24"/>
+          <w:szCs w:val="22"/>
+          <w:lang w:val="en-US"/>
+        </w:rPr>
+        <w:t>Tags in Cucumber</w:t>
+      </w:r>
+    </w:p>
+    <w:p>
+      <w:pPr>
+        <w:pStyle w:val="ListParagraph"/>
+        <w:numPr>
+          <w:ilvl w:val="0"/>
+          <w:numId w:val="50"/>
+        </w:numPr>
+        <w:rPr>
+          <w:sz w:val="24"/>
+          <w:szCs w:val="22"/>
+          <w:lang w:val="en-US"/>
+        </w:rPr>
+      </w:pPr>
+      <w:r>
+        <w:rPr>
+          <w:sz w:val="24"/>
+          <w:szCs w:val="22"/>
+          <w:lang w:val="en-US"/>
+        </w:rPr>
+        <w:t>Tags are the words which starts with @</w:t>
+      </w:r>
+    </w:p>
+    <w:p>
+      <w:pPr>
+        <w:pStyle w:val="ListParagraph"/>
+        <w:numPr>
+          <w:ilvl w:val="0"/>
+          <w:numId w:val="50"/>
+        </w:numPr>
+        <w:rPr>
+          <w:sz w:val="24"/>
+          <w:szCs w:val="22"/>
+          <w:lang w:val="en-US"/>
+        </w:rPr>
+      </w:pPr>
+      <w:r>
+        <w:rPr>
+          <w:sz w:val="24"/>
+          <w:szCs w:val="22"/>
+          <w:lang w:val="en-US"/>
+        </w:rPr>
+        <w:t>Tags allows to execute / skip single scenario / multiple scenarios</w:t>
+      </w:r>
+    </w:p>
+    <w:p>
+      <w:pPr>
+        <w:pStyle w:val="ListParagraph"/>
+        <w:numPr>
+          <w:ilvl w:val="0"/>
+          <w:numId w:val="50"/>
+        </w:numPr>
+        <w:rPr>
+          <w:sz w:val="24"/>
+          <w:szCs w:val="22"/>
+          <w:lang w:val="en-US"/>
+        </w:rPr>
+      </w:pPr>
+      <w:r>
+        <w:rPr>
+          <w:sz w:val="24"/>
+          <w:szCs w:val="22"/>
+          <w:lang w:val="en-US"/>
+        </w:rPr>
+        <w:t>Tags needs to be defined in feature file</w:t>
+      </w:r>
+    </w:p>
+    <w:p>
+      <w:pPr>
+        <w:pStyle w:val="ListParagraph"/>
+        <w:numPr>
+          <w:ilvl w:val="0"/>
+          <w:numId w:val="50"/>
+        </w:numPr>
+        <w:pBdr>
+          <w:bottom w:val="single" w:sz="6" w:space="1" w:color="auto"/>
+        </w:pBdr>
+        <w:rPr>
+          <w:sz w:val="24"/>
+          <w:szCs w:val="22"/>
+          <w:lang w:val="en-US"/>
+        </w:rPr>
+      </w:pPr>
+      <w:r>
+        <w:rPr>
+          <w:sz w:val="24"/>
+          <w:szCs w:val="22"/>
+          <w:lang w:val="en-US"/>
+        </w:rPr>
+        <w:t>Execution criteria needs to be specified in Runner class</w:t>
+      </w:r>
+    </w:p>
+    <w:p>
+      <w:pPr>
+        <w:rPr>
+          <w:b/>
+          <w:bCs/>
+          <w:sz w:val="24"/>
+          <w:szCs w:val="22"/>
+          <w:lang w:val="en-US"/>
+        </w:rPr>
+      </w:pPr>
+      <w:r>
+        <w:rPr>
+          <w:b/>
+          <w:bCs/>
+          <w:sz w:val="24"/>
+          <w:szCs w:val="22"/>
+          <w:lang w:val="en-US"/>
+        </w:rPr>
+        <w:lastRenderedPageBreak/>
+        <w:t>Hooks in Cucumber</w:t>
+      </w:r>
+    </w:p>
+    <w:p>
+      <w:pPr>
+        <w:pStyle w:val="ListParagraph"/>
+        <w:numPr>
+          <w:ilvl w:val="0"/>
+          <w:numId w:val="51"/>
+        </w:numPr>
+        <w:rPr>
+          <w:b/>
+          <w:bCs/>
+          <w:sz w:val="24"/>
+          <w:szCs w:val="22"/>
+          <w:lang w:val="en-US"/>
+        </w:rPr>
+      </w:pPr>
+      <w:r>
+        <w:rPr>
+          <w:sz w:val="24"/>
+          <w:szCs w:val="22"/>
+          <w:lang w:val="en-US"/>
+        </w:rPr>
+        <w:t xml:space="preserve">These are special methods those get executed before and after </w:t>
+      </w:r>
+      <w:r>
+        <w:rPr>
+          <w:b/>
+          <w:bCs/>
+          <w:sz w:val="24"/>
+          <w:szCs w:val="22"/>
+          <w:lang w:val="en-US"/>
+        </w:rPr>
+        <w:t xml:space="preserve">every </w:t>
+      </w:r>
+      <w:r>
+        <w:rPr>
+          <w:b/>
+          <w:bCs/>
+          <w:sz w:val="24"/>
+          <w:szCs w:val="22"/>
+          <w:lang w:val="en-US"/>
+        </w:rPr>
+        <w:t>scenario.</w:t>
+      </w:r>
+    </w:p>
+    <w:p>
+      <w:pPr>
+        <w:pStyle w:val="ListParagraph"/>
+        <w:numPr>
+          <w:ilvl w:val="0"/>
+          <w:numId w:val="51"/>
+        </w:numPr>
+        <w:rPr>
+          <w:b/>
+          <w:bCs/>
+          <w:sz w:val="24"/>
+          <w:szCs w:val="22"/>
+          <w:lang w:val="en-US"/>
+        </w:rPr>
+      </w:pPr>
+      <w:r>
+        <w:rPr>
+          <w:sz w:val="24"/>
+          <w:szCs w:val="22"/>
+          <w:lang w:val="en-US"/>
+        </w:rPr>
+        <w:t>There are two scenarios in Cucumber</w:t>
+      </w:r>
+    </w:p>
+    <w:p>
+      <w:pPr>
+        <w:pStyle w:val="ListParagraph"/>
+        <w:numPr>
+          <w:ilvl w:val="1"/>
+          <w:numId w:val="51"/>
+        </w:numPr>
+        <w:rPr>
+          <w:b/>
+          <w:bCs/>
+          <w:sz w:val="24"/>
+          <w:szCs w:val="22"/>
+          <w:lang w:val="en-US"/>
+        </w:rPr>
+      </w:pPr>
+      <w:r>
+        <w:rPr>
+          <w:sz w:val="24"/>
+          <w:szCs w:val="22"/>
+          <w:lang w:val="en-US"/>
+        </w:rPr>
+        <w:t xml:space="preserve">@Before </w:t>
+      </w:r>
+      <w:r>
+        <w:rPr>
+          <w:sz w:val="24"/>
+          <w:szCs w:val="22"/>
+          <w:lang w:val="en-US"/>
+        </w:rPr>
+        <w:sym w:font="Wingdings" w:char="F0E0"/>
+      </w:r>
+      <w:r>
+        <w:rPr>
+          <w:sz w:val="24"/>
+          <w:szCs w:val="22"/>
+          <w:lang w:val="en-US"/>
+        </w:rPr>
+        <w:t xml:space="preserve"> This is the method that will get executed before every scenario</w:t>
+      </w:r>
+    </w:p>
+    <w:p>
+      <w:pPr>
+        <w:pStyle w:val="ListParagraph"/>
+        <w:numPr>
+          <w:ilvl w:val="1"/>
+          <w:numId w:val="51"/>
+        </w:numPr>
+        <w:rPr>
+          <w:b/>
+          <w:bCs/>
+          <w:sz w:val="24"/>
+          <w:szCs w:val="22"/>
+          <w:lang w:val="en-US"/>
+        </w:rPr>
+      </w:pPr>
+      <w:r>
+        <w:rPr>
+          <w:sz w:val="24"/>
+          <w:szCs w:val="22"/>
+          <w:lang w:val="en-US"/>
+        </w:rPr>
+        <w:t xml:space="preserve">@After </w:t>
+      </w:r>
+      <w:r>
+        <w:rPr>
+          <w:sz w:val="24"/>
+          <w:szCs w:val="22"/>
+          <w:lang w:val="en-US"/>
+        </w:rPr>
+        <w:sym w:font="Wingdings" w:char="F0E0"/>
+      </w:r>
+      <w:r>
+        <w:rPr>
+          <w:sz w:val="24"/>
+          <w:szCs w:val="22"/>
+          <w:lang w:val="en-US"/>
+        </w:rPr>
+        <w:t xml:space="preserve"> This is the method that will get executed after every scenario</w:t>
+      </w:r>
+    </w:p>
+    <w:p>
+      <w:pPr>
+        <w:pStyle w:val="ListParagraph"/>
+        <w:numPr>
+          <w:ilvl w:val="0"/>
+          <w:numId w:val="51"/>
+        </w:numPr>
+        <w:rPr>
+          <w:b/>
+          <w:bCs/>
+          <w:sz w:val="24"/>
+          <w:szCs w:val="22"/>
+          <w:lang w:val="en-US"/>
+        </w:rPr>
+      </w:pPr>
+      <w:r>
+        <w:rPr>
+          <w:sz w:val="24"/>
+          <w:szCs w:val="22"/>
+          <w:lang w:val="en-US"/>
+        </w:rPr>
+        <w:t>Hooks are the never part of feature file.</w:t>
+      </w:r>
+    </w:p>
+    <w:p>
+      <w:pPr>
+        <w:pStyle w:val="ListParagraph"/>
+        <w:numPr>
+          <w:ilvl w:val="0"/>
+          <w:numId w:val="51"/>
+        </w:numPr>
+        <w:rPr>
+          <w:b/>
+          <w:bCs/>
+          <w:sz w:val="24"/>
+          <w:szCs w:val="22"/>
+          <w:lang w:val="en-US"/>
+        </w:rPr>
+      </w:pPr>
+      <w:r>
+        <w:rPr>
+          <w:sz w:val="24"/>
+          <w:szCs w:val="22"/>
+          <w:lang w:val="en-US"/>
+        </w:rPr>
+        <w:t>They can be added in any one of the step definition or even you can create a separate class for defining hooks</w:t>
+      </w:r>
+    </w:p>
+    <w:p>
+      <w:pPr>
+        <w:rPr>
+          <w:b/>
+          <w:bCs/>
           <w:sz w:val="24"/>
           <w:szCs w:val="22"/>
           <w:lang w:val="en-US"/>
@@ -18785,92 +19129,6 @@
     </w:lvl>
   </w:abstractNum>
   <w:abstractNum w:abstractNumId="2">
-    <w:nsid w:val="0A7A0CC9"/>
-    <w:multiLevelType w:val="hybridMultilevel"/>
-    <w:tmpl w:val="71DEC95A"/>
-    <w:lvl w:ilvl="0" w:tplc="40090019">
-      <w:start w:val="1"/>
-      <w:numFmt w:val="lowerLetter"/>
-      <w:lvlText w:val="%1."/>
-      <w:lvlJc w:val="left"/>
-      <w:pPr>
-        <w:ind w:left="1440" w:hanging="360"/>
-      </w:pPr>
-    </w:lvl>
-    <w:lvl w:ilvl="1" w:tplc="40090019" w:tentative="1">
-      <w:start w:val="1"/>
-      <w:numFmt w:val="lowerLetter"/>
-      <w:lvlText w:val="%2."/>
-      <w:lvlJc w:val="left"/>
-      <w:pPr>
-        <w:ind w:left="2160" w:hanging="360"/>
-      </w:pPr>
-    </w:lvl>
-    <w:lvl w:ilvl="2" w:tplc="4009001B" w:tentative="1">
-      <w:start w:val="1"/>
-      <w:numFmt w:val="lowerRoman"/>
-      <w:lvlText w:val="%3."/>
-      <w:lvlJc w:val="right"/>
-      <w:pPr>
-        <w:ind w:left="2880" w:hanging="180"/>
-      </w:pPr>
-    </w:lvl>
-    <w:lvl w:ilvl="3" w:tplc="4009000F" w:tentative="1">
-      <w:start w:val="1"/>
-      <w:numFmt w:val="decimal"/>
-      <w:lvlText w:val="%4."/>
-      <w:lvlJc w:val="left"/>
-      <w:pPr>
-        <w:ind w:left="3600" w:hanging="360"/>
-      </w:pPr>
-    </w:lvl>
-    <w:lvl w:ilvl="4" w:tplc="40090019" w:tentative="1">
-      <w:start w:val="1"/>
-      <w:numFmt w:val="lowerLetter"/>
-      <w:lvlText w:val="%5."/>
-      <w:lvlJc w:val="left"/>
-      <w:pPr>
-        <w:ind w:left="4320" w:hanging="360"/>
-      </w:pPr>
-    </w:lvl>
-    <w:lvl w:ilvl="5" w:tplc="4009001B" w:tentative="1">
-      <w:start w:val="1"/>
-      <w:numFmt w:val="lowerRoman"/>
-      <w:lvlText w:val="%6."/>
-      <w:lvlJc w:val="right"/>
-      <w:pPr>
-        <w:ind w:left="5040" w:hanging="180"/>
-      </w:pPr>
-    </w:lvl>
-    <w:lvl w:ilvl="6" w:tplc="4009000F" w:tentative="1">
-      <w:start w:val="1"/>
-      <w:numFmt w:val="decimal"/>
-      <w:lvlText w:val="%7."/>
-      <w:lvlJc w:val="left"/>
-      <w:pPr>
-        <w:ind w:left="5760" w:hanging="360"/>
-      </w:pPr>
-    </w:lvl>
-    <w:lvl w:ilvl="7" w:tplc="40090019" w:tentative="1">
-      <w:start w:val="1"/>
-      <w:numFmt w:val="lowerLetter"/>
-      <w:lvlText w:val="%8."/>
-      <w:lvlJc w:val="left"/>
-      <w:pPr>
-        <w:ind w:left="6480" w:hanging="360"/>
-      </w:pPr>
-    </w:lvl>
-    <w:lvl w:ilvl="8" w:tplc="4009001B" w:tentative="1">
-      <w:start w:val="1"/>
-      <w:numFmt w:val="lowerRoman"/>
-      <w:lvlText w:val="%9."/>
-      <w:lvlJc w:val="right"/>
-      <w:pPr>
-        <w:ind w:left="7200" w:hanging="180"/>
-      </w:pPr>
-    </w:lvl>
-  </w:abstractNum>
-  <w:abstractNum w:abstractNumId="3">
     <w:nsid w:val="0F5B4400"/>
     <w:multiLevelType w:val="hybridMultilevel"/>
     <w:tmpl w:val="EF82DA1A"/>
@@ -18983,7 +19241,7 @@
       </w:rPr>
     </w:lvl>
   </w:abstractNum>
-  <w:abstractNum w:abstractNumId="4">
+  <w:abstractNum w:abstractNumId="3">
     <w:nsid w:val="105D6FD0"/>
     <w:multiLevelType w:val="hybridMultilevel"/>
     <w:tmpl w:val="D66A1D8C"/>
@@ -19072,7 +19330,7 @@
       </w:pPr>
     </w:lvl>
   </w:abstractNum>
-  <w:abstractNum w:abstractNumId="5">
+  <w:abstractNum w:abstractNumId="4">
     <w:nsid w:val="134D1409"/>
     <w:multiLevelType w:val="hybridMultilevel"/>
     <w:tmpl w:val="7F265676"/>
@@ -19185,7 +19443,7 @@
       </w:rPr>
     </w:lvl>
   </w:abstractNum>
-  <w:abstractNum w:abstractNumId="6">
+  <w:abstractNum w:abstractNumId="5">
     <w:nsid w:val="13D740A2"/>
     <w:multiLevelType w:val="hybridMultilevel"/>
     <w:tmpl w:val="A53ECF44"/>
@@ -19298,7 +19556,7 @@
       </w:rPr>
     </w:lvl>
   </w:abstractNum>
-  <w:abstractNum w:abstractNumId="7">
+  <w:abstractNum w:abstractNumId="6">
     <w:nsid w:val="140F3A6B"/>
     <w:multiLevelType w:val="hybridMultilevel"/>
     <w:tmpl w:val="B1742718"/>
@@ -19411,7 +19669,7 @@
       </w:rPr>
     </w:lvl>
   </w:abstractNum>
-  <w:abstractNum w:abstractNumId="8">
+  <w:abstractNum w:abstractNumId="7">
     <w:nsid w:val="16043D20"/>
     <w:multiLevelType w:val="hybridMultilevel"/>
     <w:tmpl w:val="6A444494"/>
@@ -19497,7 +19755,7 @@
       </w:pPr>
     </w:lvl>
   </w:abstractNum>
-  <w:abstractNum w:abstractNumId="9">
+  <w:abstractNum w:abstractNumId="8">
     <w:nsid w:val="17A97564"/>
     <w:multiLevelType w:val="hybridMultilevel"/>
     <w:tmpl w:val="CA967136"/>
@@ -19586,7 +19844,7 @@
       </w:pPr>
     </w:lvl>
   </w:abstractNum>
-  <w:abstractNum w:abstractNumId="10">
+  <w:abstractNum w:abstractNumId="9">
     <w:nsid w:val="1DD814BD"/>
     <w:multiLevelType w:val="hybridMultilevel"/>
     <w:tmpl w:val="6052B25A"/>
@@ -19675,7 +19933,7 @@
       </w:pPr>
     </w:lvl>
   </w:abstractNum>
-  <w:abstractNum w:abstractNumId="11">
+  <w:abstractNum w:abstractNumId="10">
     <w:nsid w:val="20BE5C1D"/>
     <w:multiLevelType w:val="hybridMultilevel"/>
     <w:tmpl w:val="27D8D70E"/>
@@ -19788,7 +20046,7 @@
       </w:rPr>
     </w:lvl>
   </w:abstractNum>
-  <w:abstractNum w:abstractNumId="12">
+  <w:abstractNum w:abstractNumId="11">
     <w:nsid w:val="22D50F4A"/>
     <w:multiLevelType w:val="hybridMultilevel"/>
     <w:tmpl w:val="564C3158"/>
@@ -19901,7 +20159,7 @@
       </w:rPr>
     </w:lvl>
   </w:abstractNum>
-  <w:abstractNum w:abstractNumId="13">
+  <w:abstractNum w:abstractNumId="12">
     <w:nsid w:val="2AA11AFE"/>
     <w:multiLevelType w:val="hybridMultilevel"/>
     <w:tmpl w:val="551C87B4"/>
@@ -19988,6 +20246,119 @@
       <w:pPr>
         <w:ind w:left="6480" w:hanging="180"/>
       </w:pPr>
+    </w:lvl>
+  </w:abstractNum>
+  <w:abstractNum w:abstractNumId="13">
+    <w:nsid w:val="2F865AC0"/>
+    <w:multiLevelType w:val="hybridMultilevel"/>
+    <w:tmpl w:val="6150A382"/>
+    <w:lvl w:ilvl="0" w:tplc="40090001">
+      <w:start w:val="1"/>
+      <w:numFmt w:val="bullet"/>
+      <w:lvlText w:val=""/>
+      <w:lvlJc w:val="left"/>
+      <w:pPr>
+        <w:ind w:left="720" w:hanging="360"/>
+      </w:pPr>
+      <w:rPr>
+        <w:rFonts w:ascii="Symbol" w:hAnsi="Symbol" w:hint="default"/>
+      </w:rPr>
+    </w:lvl>
+    <w:lvl w:ilvl="1" w:tplc="40090003" w:tentative="1">
+      <w:start w:val="1"/>
+      <w:numFmt w:val="bullet"/>
+      <w:lvlText w:val="o"/>
+      <w:lvlJc w:val="left"/>
+      <w:pPr>
+        <w:ind w:left="1440" w:hanging="360"/>
+      </w:pPr>
+      <w:rPr>
+        <w:rFonts w:ascii="Courier New" w:hAnsi="Courier New" w:cs="Courier New" w:hint="default"/>
+      </w:rPr>
+    </w:lvl>
+    <w:lvl w:ilvl="2" w:tplc="40090005" w:tentative="1">
+      <w:start w:val="1"/>
+      <w:numFmt w:val="bullet"/>
+      <w:lvlText w:val=""/>
+      <w:lvlJc w:val="left"/>
+      <w:pPr>
+        <w:ind w:left="2160" w:hanging="360"/>
+      </w:pPr>
+      <w:rPr>
+        <w:rFonts w:ascii="Wingdings" w:hAnsi="Wingdings" w:hint="default"/>
+      </w:rPr>
+    </w:lvl>
+    <w:lvl w:ilvl="3" w:tplc="40090001" w:tentative="1">
+      <w:start w:val="1"/>
+      <w:numFmt w:val="bullet"/>
+      <w:lvlText w:val=""/>
+      <w:lvlJc w:val="left"/>
+      <w:pPr>
+        <w:ind w:left="2880" w:hanging="360"/>
+      </w:pPr>
+      <w:rPr>
+        <w:rFonts w:ascii="Symbol" w:hAnsi="Symbol" w:hint="default"/>
+      </w:rPr>
+    </w:lvl>
+    <w:lvl w:ilvl="4" w:tplc="40090003" w:tentative="1">
+      <w:start w:val="1"/>
+      <w:numFmt w:val="bullet"/>
+      <w:lvlText w:val="o"/>
+      <w:lvlJc w:val="left"/>
+      <w:pPr>
+        <w:ind w:left="3600" w:hanging="360"/>
+      </w:pPr>
+      <w:rPr>
+        <w:rFonts w:ascii="Courier New" w:hAnsi="Courier New" w:cs="Courier New" w:hint="default"/>
+      </w:rPr>
+    </w:lvl>
+    <w:lvl w:ilvl="5" w:tplc="40090005" w:tentative="1">
+      <w:start w:val="1"/>
+      <w:numFmt w:val="bullet"/>
+      <w:lvlText w:val=""/>
+      <w:lvlJc w:val="left"/>
+      <w:pPr>
+        <w:ind w:left="4320" w:hanging="360"/>
+      </w:pPr>
+      <w:rPr>
+        <w:rFonts w:ascii="Wingdings" w:hAnsi="Wingdings" w:hint="default"/>
+      </w:rPr>
+    </w:lvl>
+    <w:lvl w:ilvl="6" w:tplc="40090001" w:tentative="1">
+      <w:start w:val="1"/>
+      <w:numFmt w:val="bullet"/>
+      <w:lvlText w:val=""/>
+      <w:lvlJc w:val="left"/>
+      <w:pPr>
+        <w:ind w:left="5040" w:hanging="360"/>
+      </w:pPr>
+      <w:rPr>
+        <w:rFonts w:ascii="Symbol" w:hAnsi="Symbol" w:hint="default"/>
+      </w:rPr>
+    </w:lvl>
+    <w:lvl w:ilvl="7" w:tplc="40090003" w:tentative="1">
+      <w:start w:val="1"/>
+      <w:numFmt w:val="bullet"/>
+      <w:lvlText w:val="o"/>
+      <w:lvlJc w:val="left"/>
+      <w:pPr>
+        <w:ind w:left="5760" w:hanging="360"/>
+      </w:pPr>
+      <w:rPr>
+        <w:rFonts w:ascii="Courier New" w:hAnsi="Courier New" w:cs="Courier New" w:hint="default"/>
+      </w:rPr>
+    </w:lvl>
+    <w:lvl w:ilvl="8" w:tplc="40090005" w:tentative="1">
+      <w:start w:val="1"/>
+      <w:numFmt w:val="bullet"/>
+      <w:lvlText w:val=""/>
+      <w:lvlJc w:val="left"/>
+      <w:pPr>
+        <w:ind w:left="6480" w:hanging="360"/>
+      </w:pPr>
+      <w:rPr>
+        <w:rFonts w:ascii="Wingdings" w:hAnsi="Wingdings" w:hint="default"/>
+      </w:rPr>
     </w:lvl>
   </w:abstractNum>
   <w:abstractNum w:abstractNumId="14">
@@ -23039,6 +23410,119 @@
     </w:lvl>
   </w:abstractNum>
   <w:abstractNum w:abstractNumId="44">
+    <w:nsid w:val="74FC2DD9"/>
+    <w:multiLevelType w:val="hybridMultilevel"/>
+    <w:tmpl w:val="38F0D536"/>
+    <w:lvl w:ilvl="0" w:tplc="40090001">
+      <w:start w:val="1"/>
+      <w:numFmt w:val="bullet"/>
+      <w:lvlText w:val=""/>
+      <w:lvlJc w:val="left"/>
+      <w:pPr>
+        <w:ind w:left="720" w:hanging="360"/>
+      </w:pPr>
+      <w:rPr>
+        <w:rFonts w:ascii="Symbol" w:hAnsi="Symbol" w:hint="default"/>
+      </w:rPr>
+    </w:lvl>
+    <w:lvl w:ilvl="1" w:tplc="40090003">
+      <w:start w:val="1"/>
+      <w:numFmt w:val="bullet"/>
+      <w:lvlText w:val="o"/>
+      <w:lvlJc w:val="left"/>
+      <w:pPr>
+        <w:ind w:left="1440" w:hanging="360"/>
+      </w:pPr>
+      <w:rPr>
+        <w:rFonts w:ascii="Courier New" w:hAnsi="Courier New" w:cs="Courier New" w:hint="default"/>
+      </w:rPr>
+    </w:lvl>
+    <w:lvl w:ilvl="2" w:tplc="40090005" w:tentative="1">
+      <w:start w:val="1"/>
+      <w:numFmt w:val="bullet"/>
+      <w:lvlText w:val=""/>
+      <w:lvlJc w:val="left"/>
+      <w:pPr>
+        <w:ind w:left="2160" w:hanging="360"/>
+      </w:pPr>
+      <w:rPr>
+        <w:rFonts w:ascii="Wingdings" w:hAnsi="Wingdings" w:hint="default"/>
+      </w:rPr>
+    </w:lvl>
+    <w:lvl w:ilvl="3" w:tplc="40090001" w:tentative="1">
+      <w:start w:val="1"/>
+      <w:numFmt w:val="bullet"/>
+      <w:lvlText w:val=""/>
+      <w:lvlJc w:val="left"/>
+      <w:pPr>
+        <w:ind w:left="2880" w:hanging="360"/>
+      </w:pPr>
+      <w:rPr>
+        <w:rFonts w:ascii="Symbol" w:hAnsi="Symbol" w:hint="default"/>
+      </w:rPr>
+    </w:lvl>
+    <w:lvl w:ilvl="4" w:tplc="40090003" w:tentative="1">
+      <w:start w:val="1"/>
+      <w:numFmt w:val="bullet"/>
+      <w:lvlText w:val="o"/>
+      <w:lvlJc w:val="left"/>
+      <w:pPr>
+        <w:ind w:left="3600" w:hanging="360"/>
+      </w:pPr>
+      <w:rPr>
+        <w:rFonts w:ascii="Courier New" w:hAnsi="Courier New" w:cs="Courier New" w:hint="default"/>
+      </w:rPr>
+    </w:lvl>
+    <w:lvl w:ilvl="5" w:tplc="40090005" w:tentative="1">
+      <w:start w:val="1"/>
+      <w:numFmt w:val="bullet"/>
+      <w:lvlText w:val=""/>
+      <w:lvlJc w:val="left"/>
+      <w:pPr>
+        <w:ind w:left="4320" w:hanging="360"/>
+      </w:pPr>
+      <w:rPr>
+        <w:rFonts w:ascii="Wingdings" w:hAnsi="Wingdings" w:hint="default"/>
+      </w:rPr>
+    </w:lvl>
+    <w:lvl w:ilvl="6" w:tplc="40090001" w:tentative="1">
+      <w:start w:val="1"/>
+      <w:numFmt w:val="bullet"/>
+      <w:lvlText w:val=""/>
+      <w:lvlJc w:val="left"/>
+      <w:pPr>
+        <w:ind w:left="5040" w:hanging="360"/>
+      </w:pPr>
+      <w:rPr>
+        <w:rFonts w:ascii="Symbol" w:hAnsi="Symbol" w:hint="default"/>
+      </w:rPr>
+    </w:lvl>
+    <w:lvl w:ilvl="7" w:tplc="40090003" w:tentative="1">
+      <w:start w:val="1"/>
+      <w:numFmt w:val="bullet"/>
+      <w:lvlText w:val="o"/>
+      <w:lvlJc w:val="left"/>
+      <w:pPr>
+        <w:ind w:left="5760" w:hanging="360"/>
+      </w:pPr>
+      <w:rPr>
+        <w:rFonts w:ascii="Courier New" w:hAnsi="Courier New" w:cs="Courier New" w:hint="default"/>
+      </w:rPr>
+    </w:lvl>
+    <w:lvl w:ilvl="8" w:tplc="40090005" w:tentative="1">
+      <w:start w:val="1"/>
+      <w:numFmt w:val="bullet"/>
+      <w:lvlText w:val=""/>
+      <w:lvlJc w:val="left"/>
+      <w:pPr>
+        <w:ind w:left="6480" w:hanging="360"/>
+      </w:pPr>
+      <w:rPr>
+        <w:rFonts w:ascii="Wingdings" w:hAnsi="Wingdings" w:hint="default"/>
+      </w:rPr>
+    </w:lvl>
+  </w:abstractNum>
+  <w:abstractNum w:abstractNumId="45">
     <w:nsid w:val="75631C59"/>
     <w:multiLevelType w:val="hybridMultilevel"/>
     <w:tmpl w:val="7E6A29CC"/>
@@ -23151,7 +23635,7 @@
       </w:rPr>
     </w:lvl>
   </w:abstractNum>
-  <w:abstractNum w:abstractNumId="45">
+  <w:abstractNum w:abstractNumId="46">
     <w:nsid w:val="76B71AC5"/>
     <w:multiLevelType w:val="hybridMultilevel"/>
     <w:tmpl w:val="3D7E92B6"/>
@@ -23237,7 +23721,7 @@
       </w:pPr>
     </w:lvl>
   </w:abstractNum>
-  <w:abstractNum w:abstractNumId="46">
+  <w:abstractNum w:abstractNumId="47">
     <w:nsid w:val="7BD5777C"/>
     <w:multiLevelType w:val="hybridMultilevel"/>
     <w:tmpl w:val="53D46EE2"/>
@@ -23326,7 +23810,7 @@
       </w:pPr>
     </w:lvl>
   </w:abstractNum>
-  <w:abstractNum w:abstractNumId="47">
+  <w:abstractNum w:abstractNumId="48">
     <w:nsid w:val="7BF715C6"/>
     <w:multiLevelType w:val="hybridMultilevel"/>
     <w:tmpl w:val="F8B83480"/>
@@ -23415,7 +23899,7 @@
       </w:pPr>
     </w:lvl>
   </w:abstractNum>
-  <w:abstractNum w:abstractNumId="48">
+  <w:abstractNum w:abstractNumId="49">
     <w:nsid w:val="7C2320E0"/>
     <w:multiLevelType w:val="hybridMultilevel"/>
     <w:tmpl w:val="B4EC2F1C"/>
@@ -23528,7 +24012,7 @@
       </w:rPr>
     </w:lvl>
   </w:abstractNum>
-  <w:abstractNum w:abstractNumId="49">
+  <w:abstractNum w:abstractNumId="50">
     <w:nsid w:val="7E2F2A24"/>
     <w:multiLevelType w:val="hybridMultilevel"/>
     <w:tmpl w:val="CF9414DC"/>
@@ -23654,10 +24138,10 @@
     <w:abstractNumId w:val="17"/>
   </w:num>
   <w:num w:numId="5">
-    <w:abstractNumId w:val="3"/>
+    <w:abstractNumId w:val="2"/>
   </w:num>
   <w:num w:numId="6">
-    <w:abstractNumId w:val="12"/>
+    <w:abstractNumId w:val="11"/>
   </w:num>
   <w:num w:numId="7">
     <w:abstractNumId w:val="42"/>
@@ -23678,16 +24162,16 @@
     <w:abstractNumId w:val="29"/>
   </w:num>
   <w:num w:numId="13">
-    <w:abstractNumId w:val="13"/>
+    <w:abstractNumId w:val="12"/>
   </w:num>
   <w:num w:numId="14">
-    <w:abstractNumId w:val="10"/>
+    <w:abstractNumId w:val="9"/>
   </w:num>
   <w:num w:numId="15">
-    <w:abstractNumId w:val="46"/>
+    <w:abstractNumId w:val="47"/>
   </w:num>
   <w:num w:numId="16">
-    <w:abstractNumId w:val="4"/>
+    <w:abstractNumId w:val="3"/>
   </w:num>
   <w:num w:numId="17">
     <w:abstractNumId w:val="20"/>
@@ -23696,7 +24180,7 @@
     <w:abstractNumId w:val="1"/>
   </w:num>
   <w:num w:numId="19">
-    <w:abstractNumId w:val="9"/>
+    <w:abstractNumId w:val="8"/>
   </w:num>
   <w:num w:numId="20">
     <w:abstractNumId w:val="22"/>
@@ -23705,10 +24189,10 @@
     <w:abstractNumId w:val="37"/>
   </w:num>
   <w:num w:numId="22">
-    <w:abstractNumId w:val="7"/>
+    <w:abstractNumId w:val="6"/>
   </w:num>
   <w:num w:numId="23">
-    <w:abstractNumId w:val="48"/>
+    <w:abstractNumId w:val="49"/>
   </w:num>
   <w:num w:numId="24">
     <w:abstractNumId w:val="14"/>
@@ -23723,10 +24207,10 @@
     <w:abstractNumId w:val="24"/>
   </w:num>
   <w:num w:numId="28">
-    <w:abstractNumId w:val="11"/>
+    <w:abstractNumId w:val="10"/>
   </w:num>
   <w:num w:numId="29">
-    <w:abstractNumId w:val="6"/>
+    <w:abstractNumId w:val="5"/>
   </w:num>
   <w:num w:numId="30">
     <w:abstractNumId w:val="39"/>
@@ -23744,7 +24228,7 @@
     <w:abstractNumId w:val="21"/>
   </w:num>
   <w:num w:numId="35">
-    <w:abstractNumId w:val="47"/>
+    <w:abstractNumId w:val="48"/>
   </w:num>
   <w:num w:numId="36">
     <w:abstractNumId w:val="30"/>
@@ -23756,22 +24240,22 @@
     <w:abstractNumId w:val="16"/>
   </w:num>
   <w:num w:numId="39">
-    <w:abstractNumId w:val="49"/>
+    <w:abstractNumId w:val="50"/>
   </w:num>
   <w:num w:numId="40">
     <w:abstractNumId w:val="28"/>
   </w:num>
   <w:num w:numId="41">
-    <w:abstractNumId w:val="44"/>
+    <w:abstractNumId w:val="45"/>
   </w:num>
   <w:num w:numId="42">
     <w:abstractNumId w:val="41"/>
   </w:num>
   <w:num w:numId="43">
-    <w:abstractNumId w:val="5"/>
+    <w:abstractNumId w:val="4"/>
   </w:num>
   <w:num w:numId="44">
-    <w:abstractNumId w:val="8"/>
+    <w:abstractNumId w:val="7"/>
   </w:num>
   <w:num w:numId="45">
     <w:abstractNumId w:val="38"/>
@@ -23786,11 +24270,15 @@
     <w:abstractNumId w:val="40"/>
   </w:num>
   <w:num w:numId="49">
-    <w:abstractNumId w:val="45"/>
+    <w:abstractNumId w:val="46"/>
   </w:num>
   <w:num w:numId="50">
-    <w:abstractNumId w:val="2"/>
+    <w:abstractNumId w:val="13"/>
   </w:num>
+  <w:num w:numId="51">
+    <w:abstractNumId w:val="44"/>
+  </w:num>
+  <w:numIdMacAtCleanup w:val="51"/>
 </w:numbering>
 </file>
 
@@ -25460,31 +25948,31 @@
     </dgm:pt>
   </dgm:ptLst>
   <dgm:cxnLst>
+    <dgm:cxn modelId="{89C71CB9-9B36-47BD-8EAF-C381C3D44482}" type="presOf" srcId="{58F8E6FA-8E5F-4590-8E91-7D425686736E}" destId="{1C61394E-D32F-4A43-ADD4-F46D3A33D38F}" srcOrd="0" destOrd="0" presId="urn:microsoft.com/office/officeart/2005/8/layout/process1"/>
+    <dgm:cxn modelId="{665A82A0-3586-48A3-98E3-66CE5AE92E3E}" type="presOf" srcId="{B2F67260-32B4-49EF-BEA7-6376ABEBC356}" destId="{45B120D8-A283-4DB0-AE48-CD1028B5A1CA}" srcOrd="0" destOrd="0" presId="urn:microsoft.com/office/officeart/2005/8/layout/process1"/>
+    <dgm:cxn modelId="{0D114128-7025-493C-950C-C695526AC991}" type="presOf" srcId="{C787D0C9-C4AA-4BF8-AAA9-EFDCDDDFB8C5}" destId="{ECE2E50F-1EF0-49E9-A2A2-C09D34379E86}" srcOrd="0" destOrd="0" presId="urn:microsoft.com/office/officeart/2005/8/layout/process1"/>
+    <dgm:cxn modelId="{D4EC419A-282A-4D55-B6AC-ECFF1B6A2DB7}" type="presOf" srcId="{D4DE5EA1-C98A-4001-96ED-0D8A4099152C}" destId="{CA09568C-529F-4056-BB14-75FC27EA3A57}" srcOrd="0" destOrd="0" presId="urn:microsoft.com/office/officeart/2005/8/layout/process1"/>
+    <dgm:cxn modelId="{9297E046-2C2B-4846-AC65-0DAD61590F30}" type="presOf" srcId="{2F2C6037-AE48-4650-B998-EBABF88D0464}" destId="{ABB6D0E9-231F-49FF-8F6A-CBD756BB2A07}" srcOrd="0" destOrd="0" presId="urn:microsoft.com/office/officeart/2005/8/layout/process1"/>
+    <dgm:cxn modelId="{916CD402-046A-49C3-919C-E8874C6452BD}" srcId="{C787D0C9-C4AA-4BF8-AAA9-EFDCDDDFB8C5}" destId="{B0DAEDAB-33B3-4821-A91B-D05361312CE9}" srcOrd="3" destOrd="0" parTransId="{1B396FDD-FE98-44AA-BBFD-EFDF9B52D4CD}" sibTransId="{2689B6F1-8FF1-4D68-9639-E8E505EA5AB0}"/>
+    <dgm:cxn modelId="{C3CA6E56-0CBE-4E1A-9FD7-2CC59285851D}" type="presOf" srcId="{B0DAEDAB-33B3-4821-A91B-D05361312CE9}" destId="{FCE3B9A4-214A-4502-B3DF-ACB3E0BC61C7}" srcOrd="0" destOrd="0" presId="urn:microsoft.com/office/officeart/2005/8/layout/process1"/>
     <dgm:cxn modelId="{407416C7-D9A4-49CF-A1D9-63129D12A5E9}" srcId="{C787D0C9-C4AA-4BF8-AAA9-EFDCDDDFB8C5}" destId="{B2F67260-32B4-49EF-BEA7-6376ABEBC356}" srcOrd="1" destOrd="0" parTransId="{452FD36E-8C97-458A-9189-BC15B3E0AB1F}" sibTransId="{58F8E6FA-8E5F-4590-8E91-7D425686736E}"/>
-    <dgm:cxn modelId="{E763EF8E-83DE-4D79-97DD-1B6BE4326185}" type="presOf" srcId="{D4DE5EA1-C98A-4001-96ED-0D8A4099152C}" destId="{CA09568C-529F-4056-BB14-75FC27EA3A57}" srcOrd="0" destOrd="0" presId="urn:microsoft.com/office/officeart/2005/8/layout/process1"/>
-    <dgm:cxn modelId="{942ADE11-8D19-411C-9EA7-2521FD3A91EF}" type="presOf" srcId="{C6470392-B547-42B7-BBE1-49D9BF3297A5}" destId="{E6A79763-2175-4FE6-AF39-65BAD7E8A94D}" srcOrd="0" destOrd="0" presId="urn:microsoft.com/office/officeart/2005/8/layout/process1"/>
-    <dgm:cxn modelId="{E0A87B50-97F3-44DC-A316-EA678772AE0F}" type="presOf" srcId="{B0DAEDAB-33B3-4821-A91B-D05361312CE9}" destId="{FCE3B9A4-214A-4502-B3DF-ACB3E0BC61C7}" srcOrd="0" destOrd="0" presId="urn:microsoft.com/office/officeart/2005/8/layout/process1"/>
-    <dgm:cxn modelId="{FF2E73D5-6556-48B6-9F73-168B2297F7B1}" type="presOf" srcId="{B2F67260-32B4-49EF-BEA7-6376ABEBC356}" destId="{45B120D8-A283-4DB0-AE48-CD1028B5A1CA}" srcOrd="0" destOrd="0" presId="urn:microsoft.com/office/officeart/2005/8/layout/process1"/>
-    <dgm:cxn modelId="{0F876F75-C940-4193-B0C3-DEF30E10B60E}" type="presOf" srcId="{2F2C6037-AE48-4650-B998-EBABF88D0464}" destId="{ABB6D0E9-231F-49FF-8F6A-CBD756BB2A07}" srcOrd="0" destOrd="0" presId="urn:microsoft.com/office/officeart/2005/8/layout/process1"/>
-    <dgm:cxn modelId="{6256F90C-7C94-4AEE-9C96-329FAAC3CAB8}" type="presOf" srcId="{58F8E6FA-8E5F-4590-8E91-7D425686736E}" destId="{1C61394E-D32F-4A43-ADD4-F46D3A33D38F}" srcOrd="0" destOrd="0" presId="urn:microsoft.com/office/officeart/2005/8/layout/process1"/>
-    <dgm:cxn modelId="{DB58C5FA-08D7-43FA-BD46-12EBCA59BB25}" type="presOf" srcId="{2F2C6037-AE48-4650-B998-EBABF88D0464}" destId="{8D8E620F-A309-4628-986D-B0F92ABF739C}" srcOrd="1" destOrd="0" presId="urn:microsoft.com/office/officeart/2005/8/layout/process1"/>
-    <dgm:cxn modelId="{EF21A6FB-5E42-4F78-BFAC-84F6420D3F46}" type="presOf" srcId="{58F8E6FA-8E5F-4590-8E91-7D425686736E}" destId="{38F30BB8-19AC-4F2C-997E-D6C87643D812}" srcOrd="1" destOrd="0" presId="urn:microsoft.com/office/officeart/2005/8/layout/process1"/>
-    <dgm:cxn modelId="{36E018D9-C225-414E-9059-F263C87EFDD1}" type="presOf" srcId="{C787D0C9-C4AA-4BF8-AAA9-EFDCDDDFB8C5}" destId="{ECE2E50F-1EF0-49E9-A2A2-C09D34379E86}" srcOrd="0" destOrd="0" presId="urn:microsoft.com/office/officeart/2005/8/layout/process1"/>
+    <dgm:cxn modelId="{F27277EA-BDDA-4005-9170-FBB0A209E462}" srcId="{C787D0C9-C4AA-4BF8-AAA9-EFDCDDDFB8C5}" destId="{CB734D05-6005-4A33-891F-8F6E9F0BE629}" srcOrd="0" destOrd="0" parTransId="{D88A1106-7499-4EC1-A955-12C926757BDC}" sibTransId="{2F2C6037-AE48-4650-B998-EBABF88D0464}"/>
     <dgm:cxn modelId="{A358B1AA-45ED-4C0A-A925-911C6E3E177E}" srcId="{C787D0C9-C4AA-4BF8-AAA9-EFDCDDDFB8C5}" destId="{D4DE5EA1-C98A-4001-96ED-0D8A4099152C}" srcOrd="2" destOrd="0" parTransId="{DDD45587-67C2-4B3F-892B-0153C2E010D0}" sibTransId="{C6470392-B547-42B7-BBE1-49D9BF3297A5}"/>
-    <dgm:cxn modelId="{783A2C37-6C2B-4D40-9564-97CEA7CBF962}" type="presOf" srcId="{C6470392-B547-42B7-BBE1-49D9BF3297A5}" destId="{D17F71C8-684F-40E9-B9CF-89D188A27816}" srcOrd="1" destOrd="0" presId="urn:microsoft.com/office/officeart/2005/8/layout/process1"/>
-    <dgm:cxn modelId="{916CD402-046A-49C3-919C-E8874C6452BD}" srcId="{C787D0C9-C4AA-4BF8-AAA9-EFDCDDDFB8C5}" destId="{B0DAEDAB-33B3-4821-A91B-D05361312CE9}" srcOrd="3" destOrd="0" parTransId="{1B396FDD-FE98-44AA-BBFD-EFDF9B52D4CD}" sibTransId="{2689B6F1-8FF1-4D68-9639-E8E505EA5AB0}"/>
-    <dgm:cxn modelId="{F27277EA-BDDA-4005-9170-FBB0A209E462}" srcId="{C787D0C9-C4AA-4BF8-AAA9-EFDCDDDFB8C5}" destId="{CB734D05-6005-4A33-891F-8F6E9F0BE629}" srcOrd="0" destOrd="0" parTransId="{D88A1106-7499-4EC1-A955-12C926757BDC}" sibTransId="{2F2C6037-AE48-4650-B998-EBABF88D0464}"/>
-    <dgm:cxn modelId="{B7988933-8E5E-4798-95E2-537210B41221}" type="presOf" srcId="{CB734D05-6005-4A33-891F-8F6E9F0BE629}" destId="{9346448E-7772-4989-9A73-02FD2DA61B93}" srcOrd="0" destOrd="0" presId="urn:microsoft.com/office/officeart/2005/8/layout/process1"/>
-    <dgm:cxn modelId="{998320B8-B7A1-4884-AA28-647CD9C3FDCB}" type="presParOf" srcId="{ECE2E50F-1EF0-49E9-A2A2-C09D34379E86}" destId="{9346448E-7772-4989-9A73-02FD2DA61B93}" srcOrd="0" destOrd="0" presId="urn:microsoft.com/office/officeart/2005/8/layout/process1"/>
-    <dgm:cxn modelId="{146DF15F-8C91-416E-922E-F83D04D74626}" type="presParOf" srcId="{ECE2E50F-1EF0-49E9-A2A2-C09D34379E86}" destId="{ABB6D0E9-231F-49FF-8F6A-CBD756BB2A07}" srcOrd="1" destOrd="0" presId="urn:microsoft.com/office/officeart/2005/8/layout/process1"/>
-    <dgm:cxn modelId="{19F1635D-C8CF-4D03-9BFF-8B91D5495243}" type="presParOf" srcId="{ABB6D0E9-231F-49FF-8F6A-CBD756BB2A07}" destId="{8D8E620F-A309-4628-986D-B0F92ABF739C}" srcOrd="0" destOrd="0" presId="urn:microsoft.com/office/officeart/2005/8/layout/process1"/>
-    <dgm:cxn modelId="{407DA4E1-11B0-4376-AFD8-E2C870B0CC20}" type="presParOf" srcId="{ECE2E50F-1EF0-49E9-A2A2-C09D34379E86}" destId="{45B120D8-A283-4DB0-AE48-CD1028B5A1CA}" srcOrd="2" destOrd="0" presId="urn:microsoft.com/office/officeart/2005/8/layout/process1"/>
-    <dgm:cxn modelId="{2471CBF3-EAE8-4DD8-8790-3F87BD349145}" type="presParOf" srcId="{ECE2E50F-1EF0-49E9-A2A2-C09D34379E86}" destId="{1C61394E-D32F-4A43-ADD4-F46D3A33D38F}" srcOrd="3" destOrd="0" presId="urn:microsoft.com/office/officeart/2005/8/layout/process1"/>
-    <dgm:cxn modelId="{250B991D-4E3E-42DC-A020-7BD08BDC2291}" type="presParOf" srcId="{1C61394E-D32F-4A43-ADD4-F46D3A33D38F}" destId="{38F30BB8-19AC-4F2C-997E-D6C87643D812}" srcOrd="0" destOrd="0" presId="urn:microsoft.com/office/officeart/2005/8/layout/process1"/>
-    <dgm:cxn modelId="{4A46E325-1878-4698-854E-793A82307502}" type="presParOf" srcId="{ECE2E50F-1EF0-49E9-A2A2-C09D34379E86}" destId="{CA09568C-529F-4056-BB14-75FC27EA3A57}" srcOrd="4" destOrd="0" presId="urn:microsoft.com/office/officeart/2005/8/layout/process1"/>
-    <dgm:cxn modelId="{1150CE70-8F5F-4922-81DA-08F355A1DB0C}" type="presParOf" srcId="{ECE2E50F-1EF0-49E9-A2A2-C09D34379E86}" destId="{E6A79763-2175-4FE6-AF39-65BAD7E8A94D}" srcOrd="5" destOrd="0" presId="urn:microsoft.com/office/officeart/2005/8/layout/process1"/>
-    <dgm:cxn modelId="{D147E826-34BB-4430-8214-9CC2F9366217}" type="presParOf" srcId="{E6A79763-2175-4FE6-AF39-65BAD7E8A94D}" destId="{D17F71C8-684F-40E9-B9CF-89D188A27816}" srcOrd="0" destOrd="0" presId="urn:microsoft.com/office/officeart/2005/8/layout/process1"/>
-    <dgm:cxn modelId="{D5D15A48-4BA3-4459-AFF6-D38933580A3E}" type="presParOf" srcId="{ECE2E50F-1EF0-49E9-A2A2-C09D34379E86}" destId="{FCE3B9A4-214A-4502-B3DF-ACB3E0BC61C7}" srcOrd="6" destOrd="0" presId="urn:microsoft.com/office/officeart/2005/8/layout/process1"/>
+    <dgm:cxn modelId="{97E33157-8AFE-41EA-A598-561CD15D94E2}" type="presOf" srcId="{CB734D05-6005-4A33-891F-8F6E9F0BE629}" destId="{9346448E-7772-4989-9A73-02FD2DA61B93}" srcOrd="0" destOrd="0" presId="urn:microsoft.com/office/officeart/2005/8/layout/process1"/>
+    <dgm:cxn modelId="{731CC2F1-A4B9-4B23-B9FC-23001D6A8EF5}" type="presOf" srcId="{2F2C6037-AE48-4650-B998-EBABF88D0464}" destId="{8D8E620F-A309-4628-986D-B0F92ABF739C}" srcOrd="1" destOrd="0" presId="urn:microsoft.com/office/officeart/2005/8/layout/process1"/>
+    <dgm:cxn modelId="{F0667919-BDDD-4547-8192-5A6731217706}" type="presOf" srcId="{C6470392-B547-42B7-BBE1-49D9BF3297A5}" destId="{E6A79763-2175-4FE6-AF39-65BAD7E8A94D}" srcOrd="0" destOrd="0" presId="urn:microsoft.com/office/officeart/2005/8/layout/process1"/>
+    <dgm:cxn modelId="{25857476-9427-439F-B462-6AF7B7D76E1E}" type="presOf" srcId="{58F8E6FA-8E5F-4590-8E91-7D425686736E}" destId="{38F30BB8-19AC-4F2C-997E-D6C87643D812}" srcOrd="1" destOrd="0" presId="urn:microsoft.com/office/officeart/2005/8/layout/process1"/>
+    <dgm:cxn modelId="{02BE05A6-9807-43FC-94AF-6015E2E47149}" type="presOf" srcId="{C6470392-B547-42B7-BBE1-49D9BF3297A5}" destId="{D17F71C8-684F-40E9-B9CF-89D188A27816}" srcOrd="1" destOrd="0" presId="urn:microsoft.com/office/officeart/2005/8/layout/process1"/>
+    <dgm:cxn modelId="{92E9777C-F563-45F2-8C8D-561638CBBF97}" type="presParOf" srcId="{ECE2E50F-1EF0-49E9-A2A2-C09D34379E86}" destId="{9346448E-7772-4989-9A73-02FD2DA61B93}" srcOrd="0" destOrd="0" presId="urn:microsoft.com/office/officeart/2005/8/layout/process1"/>
+    <dgm:cxn modelId="{16983A88-9B0A-47E4-A413-4FB85D0263A9}" type="presParOf" srcId="{ECE2E50F-1EF0-49E9-A2A2-C09D34379E86}" destId="{ABB6D0E9-231F-49FF-8F6A-CBD756BB2A07}" srcOrd="1" destOrd="0" presId="urn:microsoft.com/office/officeart/2005/8/layout/process1"/>
+    <dgm:cxn modelId="{1BB7AB4D-C258-4BB4-8BA5-0A71F5D535FF}" type="presParOf" srcId="{ABB6D0E9-231F-49FF-8F6A-CBD756BB2A07}" destId="{8D8E620F-A309-4628-986D-B0F92ABF739C}" srcOrd="0" destOrd="0" presId="urn:microsoft.com/office/officeart/2005/8/layout/process1"/>
+    <dgm:cxn modelId="{ACF9254C-CB80-4B3B-ADB7-9B72B5C8D5BE}" type="presParOf" srcId="{ECE2E50F-1EF0-49E9-A2A2-C09D34379E86}" destId="{45B120D8-A283-4DB0-AE48-CD1028B5A1CA}" srcOrd="2" destOrd="0" presId="urn:microsoft.com/office/officeart/2005/8/layout/process1"/>
+    <dgm:cxn modelId="{68E81CF6-C906-4D58-80F1-A79990DF4529}" type="presParOf" srcId="{ECE2E50F-1EF0-49E9-A2A2-C09D34379E86}" destId="{1C61394E-D32F-4A43-ADD4-F46D3A33D38F}" srcOrd="3" destOrd="0" presId="urn:microsoft.com/office/officeart/2005/8/layout/process1"/>
+    <dgm:cxn modelId="{56A45560-1CD6-47F7-86FC-85B9F7F1BDBA}" type="presParOf" srcId="{1C61394E-D32F-4A43-ADD4-F46D3A33D38F}" destId="{38F30BB8-19AC-4F2C-997E-D6C87643D812}" srcOrd="0" destOrd="0" presId="urn:microsoft.com/office/officeart/2005/8/layout/process1"/>
+    <dgm:cxn modelId="{51491B25-290E-4126-8FFE-6125E60F2D11}" type="presParOf" srcId="{ECE2E50F-1EF0-49E9-A2A2-C09D34379E86}" destId="{CA09568C-529F-4056-BB14-75FC27EA3A57}" srcOrd="4" destOrd="0" presId="urn:microsoft.com/office/officeart/2005/8/layout/process1"/>
+    <dgm:cxn modelId="{27A7E6C3-D0B6-4A29-83DC-4C156C749456}" type="presParOf" srcId="{ECE2E50F-1EF0-49E9-A2A2-C09D34379E86}" destId="{E6A79763-2175-4FE6-AF39-65BAD7E8A94D}" srcOrd="5" destOrd="0" presId="urn:microsoft.com/office/officeart/2005/8/layout/process1"/>
+    <dgm:cxn modelId="{1445C938-5CFB-4980-968F-DD693EB4E677}" type="presParOf" srcId="{E6A79763-2175-4FE6-AF39-65BAD7E8A94D}" destId="{D17F71C8-684F-40E9-B9CF-89D188A27816}" srcOrd="0" destOrd="0" presId="urn:microsoft.com/office/officeart/2005/8/layout/process1"/>
+    <dgm:cxn modelId="{4C2EE628-B775-45AB-82B9-2E5FF75A9CB5}" type="presParOf" srcId="{ECE2E50F-1EF0-49E9-A2A2-C09D34379E86}" destId="{FCE3B9A4-214A-4502-B3DF-ACB3E0BC61C7}" srcOrd="6" destOrd="0" presId="urn:microsoft.com/office/officeart/2005/8/layout/process1"/>
   </dgm:cxnLst>
   <dgm:bg/>
   <dgm:whole/>

</xml_diff>